<commit_message>
Airport database part 2 update
</commit_message>
<xml_diff>
--- a/2. Airport Database System/40841063_HLUM HTET AUNG Part 2 - Database/40841063_Part 2 Database Report.docx
+++ b/2. Airport Database System/40841063_HLUM HTET AUNG Part 2 - Database/40841063_Part 2 Database Report.docx
@@ -137,14 +137,13 @@
           <w:r>
             <w:fldChar w:fldCharType="separate"/>
           </w:r>
-          <w:hyperlink w:anchor="_Toc236649197" w:history="1">
+          <w:hyperlink w:anchor="_Toc237113727" w:history="1">
             <w:r>
               <w:rPr>
                 <w:rStyle w:val="Hyperlink"/>
                 <w:noProof/>
-                <w:lang w:val="en-GB"/>
               </w:rPr>
-              <w:t>Assessment Cover Sheet</w:t>
+              <w:t>Task C</w:t>
             </w:r>
             <w:r>
               <w:rPr>
@@ -165,7 +164,7 @@
                 <w:noProof/>
                 <w:webHidden/>
               </w:rPr>
-              <w:instrText xml:space="preserve"> PAGEREF _Toc236649197 \h </w:instrText>
+              <w:instrText xml:space="preserve"> PAGEREF _Toc237113727 \h </w:instrText>
             </w:r>
             <w:r>
               <w:rPr>
@@ -186,75 +185,6 @@
                 <w:webHidden/>
               </w:rPr>
               <w:t>3</w:t>
-            </w:r>
-            <w:r>
-              <w:rPr>
-                <w:noProof/>
-                <w:webHidden/>
-              </w:rPr>
-              <w:fldChar w:fldCharType="end"/>
-            </w:r>
-          </w:hyperlink>
-        </w:p>
-        <w:p>
-          <w:pPr>
-            <w:pStyle w:val="TOC1"/>
-            <w:tabs>
-              <w:tab w:val="right" w:leader="dot" w:pos="9350"/>
-            </w:tabs>
-            <w:rPr>
-              <w:rFonts w:asciiTheme="minorHAnsi" w:eastAsiaTheme="minorEastAsia" w:hAnsiTheme="minorHAnsi"/>
-              <w:noProof/>
-            </w:rPr>
-          </w:pPr>
-          <w:hyperlink w:anchor="_Toc236649198" w:history="1">
-            <w:r>
-              <w:rPr>
-                <w:rStyle w:val="Hyperlink"/>
-                <w:noProof/>
-              </w:rPr>
-              <w:t>Task C</w:t>
-            </w:r>
-            <w:r>
-              <w:rPr>
-                <w:noProof/>
-                <w:webHidden/>
-              </w:rPr>
-              <w:tab/>
-            </w:r>
-            <w:r>
-              <w:rPr>
-                <w:noProof/>
-                <w:webHidden/>
-              </w:rPr>
-              <w:fldChar w:fldCharType="begin"/>
-            </w:r>
-            <w:r>
-              <w:rPr>
-                <w:noProof/>
-                <w:webHidden/>
-              </w:rPr>
-              <w:instrText xml:space="preserve"> PAGEREF _Toc236649198 \h </w:instrText>
-            </w:r>
-            <w:r>
-              <w:rPr>
-                <w:noProof/>
-                <w:webHidden/>
-              </w:rPr>
-            </w:r>
-            <w:r>
-              <w:rPr>
-                <w:noProof/>
-                <w:webHidden/>
-              </w:rPr>
-              <w:fldChar w:fldCharType="separate"/>
-            </w:r>
-            <w:r>
-              <w:rPr>
-                <w:noProof/>
-                <w:webHidden/>
-              </w:rPr>
-              <w:t>4</w:t>
             </w:r>
             <w:r>
               <w:rPr>
@@ -276,7 +206,7 @@
               <w:noProof/>
             </w:rPr>
           </w:pPr>
-          <w:hyperlink w:anchor="_Toc236649199" w:history="1">
+          <w:hyperlink w:anchor="_Toc237113728" w:history="1">
             <w:r>
               <w:rPr>
                 <w:rStyle w:val="Hyperlink"/>
@@ -303,7 +233,7 @@
                 <w:noProof/>
                 <w:webHidden/>
               </w:rPr>
-              <w:instrText xml:space="preserve"> PAGEREF _Toc236649199 \h </w:instrText>
+              <w:instrText xml:space="preserve"> PAGEREF _Toc237113728 \h </w:instrText>
             </w:r>
             <w:r>
               <w:rPr>
@@ -323,214 +253,7 @@
                 <w:noProof/>
                 <w:webHidden/>
               </w:rPr>
-              <w:t>4</w:t>
-            </w:r>
-            <w:r>
-              <w:rPr>
-                <w:noProof/>
-                <w:webHidden/>
-              </w:rPr>
-              <w:fldChar w:fldCharType="end"/>
-            </w:r>
-          </w:hyperlink>
-        </w:p>
-        <w:p>
-          <w:pPr>
-            <w:pStyle w:val="TOC2"/>
-            <w:tabs>
-              <w:tab w:val="right" w:leader="dot" w:pos="9350"/>
-            </w:tabs>
-            <w:rPr>
-              <w:rFonts w:asciiTheme="minorHAnsi" w:eastAsiaTheme="minorEastAsia" w:hAnsiTheme="minorHAnsi"/>
-              <w:noProof/>
-            </w:rPr>
-          </w:pPr>
-          <w:hyperlink w:anchor="_Toc236649200" w:history="1">
-            <w:r>
-              <w:rPr>
-                <w:rStyle w:val="Hyperlink"/>
-                <w:noProof/>
-              </w:rPr>
-              <w:t>Normalization</w:t>
-            </w:r>
-            <w:r>
-              <w:rPr>
-                <w:noProof/>
-                <w:webHidden/>
-              </w:rPr>
-              <w:tab/>
-            </w:r>
-            <w:r>
-              <w:rPr>
-                <w:noProof/>
-                <w:webHidden/>
-              </w:rPr>
-              <w:fldChar w:fldCharType="begin"/>
-            </w:r>
-            <w:r>
-              <w:rPr>
-                <w:noProof/>
-                <w:webHidden/>
-              </w:rPr>
-              <w:instrText xml:space="preserve"> PAGEREF _Toc236649200 \h </w:instrText>
-            </w:r>
-            <w:r>
-              <w:rPr>
-                <w:noProof/>
-                <w:webHidden/>
-              </w:rPr>
-            </w:r>
-            <w:r>
-              <w:rPr>
-                <w:noProof/>
-                <w:webHidden/>
-              </w:rPr>
-              <w:fldChar w:fldCharType="separate"/>
-            </w:r>
-            <w:r>
-              <w:rPr>
-                <w:noProof/>
-                <w:webHidden/>
-              </w:rPr>
-              <w:t>5</w:t>
-            </w:r>
-            <w:r>
-              <w:rPr>
-                <w:noProof/>
-                <w:webHidden/>
-              </w:rPr>
-              <w:fldChar w:fldCharType="end"/>
-            </w:r>
-          </w:hyperlink>
-        </w:p>
-        <w:p>
-          <w:pPr>
-            <w:pStyle w:val="TOC3"/>
-            <w:tabs>
-              <w:tab w:val="right" w:leader="dot" w:pos="9350"/>
-            </w:tabs>
-            <w:rPr>
-              <w:rFonts w:asciiTheme="minorHAnsi" w:eastAsiaTheme="minorEastAsia" w:hAnsiTheme="minorHAnsi"/>
-              <w:noProof/>
-            </w:rPr>
-          </w:pPr>
-          <w:hyperlink w:anchor="_Toc236649201" w:history="1">
-            <w:r>
-              <w:rPr>
-                <w:rStyle w:val="Hyperlink"/>
-                <w:noProof/>
-              </w:rPr>
-              <w:t>First Normalization</w:t>
-            </w:r>
-            <w:r>
-              <w:rPr>
-                <w:noProof/>
-                <w:webHidden/>
-              </w:rPr>
-              <w:tab/>
-            </w:r>
-            <w:r>
-              <w:rPr>
-                <w:noProof/>
-                <w:webHidden/>
-              </w:rPr>
-              <w:fldChar w:fldCharType="begin"/>
-            </w:r>
-            <w:r>
-              <w:rPr>
-                <w:noProof/>
-                <w:webHidden/>
-              </w:rPr>
-              <w:instrText xml:space="preserve"> PAGEREF _Toc236649201 \h </w:instrText>
-            </w:r>
-            <w:r>
-              <w:rPr>
-                <w:noProof/>
-                <w:webHidden/>
-              </w:rPr>
-            </w:r>
-            <w:r>
-              <w:rPr>
-                <w:noProof/>
-                <w:webHidden/>
-              </w:rPr>
-              <w:fldChar w:fldCharType="separate"/>
-            </w:r>
-            <w:r>
-              <w:rPr>
-                <w:noProof/>
-                <w:webHidden/>
-              </w:rPr>
-              <w:t>5</w:t>
-            </w:r>
-            <w:r>
-              <w:rPr>
-                <w:noProof/>
-                <w:webHidden/>
-              </w:rPr>
-              <w:fldChar w:fldCharType="end"/>
-            </w:r>
-          </w:hyperlink>
-        </w:p>
-        <w:p>
-          <w:pPr>
-            <w:pStyle w:val="TOC3"/>
-            <w:tabs>
-              <w:tab w:val="right" w:leader="dot" w:pos="9350"/>
-            </w:tabs>
-            <w:rPr>
-              <w:rFonts w:asciiTheme="minorHAnsi" w:eastAsiaTheme="minorEastAsia" w:hAnsiTheme="minorHAnsi"/>
-              <w:noProof/>
-            </w:rPr>
-          </w:pPr>
-          <w:hyperlink w:anchor="_Toc236649202" w:history="1">
-            <w:r>
-              <w:rPr>
-                <w:rStyle w:val="Hyperlink"/>
-                <w:noProof/>
-              </w:rPr>
-              <w:t>Second Normalization</w:t>
-            </w:r>
-            <w:r>
-              <w:rPr>
-                <w:noProof/>
-                <w:webHidden/>
-              </w:rPr>
-              <w:tab/>
-            </w:r>
-            <w:r>
-              <w:rPr>
-                <w:noProof/>
-                <w:webHidden/>
-              </w:rPr>
-              <w:fldChar w:fldCharType="begin"/>
-            </w:r>
-            <w:r>
-              <w:rPr>
-                <w:noProof/>
-                <w:webHidden/>
-              </w:rPr>
-              <w:instrText xml:space="preserve"> PAGEREF _Toc236649202 \h </w:instrText>
-            </w:r>
-            <w:r>
-              <w:rPr>
-                <w:noProof/>
-                <w:webHidden/>
-              </w:rPr>
-            </w:r>
-            <w:r>
-              <w:rPr>
-                <w:noProof/>
-                <w:webHidden/>
-              </w:rPr>
-              <w:fldChar w:fldCharType="separate"/>
-            </w:r>
-            <w:r>
-              <w:rPr>
-                <w:noProof/>
-                <w:webHidden/>
-              </w:rPr>
-              <w:t>5</w:t>
+              <w:t>3</w:t>
             </w:r>
             <w:r>
               <w:rPr>
@@ -554,6 +277,9 @@
       </w:sdtContent>
     </w:sdt>
     <w:p>
+      <w:pPr>
+        <w:pStyle w:val="Heading1"/>
+      </w:pPr>
       <w:r>
         <w:br w:type="page"/>
       </w:r>
@@ -561,520 +287,733 @@
     <w:p>
       <w:pPr>
         <w:pStyle w:val="Heading1"/>
-        <w:rPr>
-          <w:lang w:val="en-GB"/>
-        </w:rPr>
-      </w:pPr>
-      <w:bookmarkStart w:id="0" w:name="_Toc236649197"/>
-      <w:r>
-        <w:rPr>
-          <w:lang w:val="en-GB"/>
-        </w:rPr>
+      </w:pPr>
+      <w:bookmarkStart w:id="0" w:name="_Toc237113727"/>
+      <w:r>
         <w:lastRenderedPageBreak/>
-        <w:t>Assessment Cover Sheet</w:t>
+        <w:t>Task C</w:t>
       </w:r>
       <w:bookmarkEnd w:id="0"/>
     </w:p>
     <w:p>
       <w:pPr>
-        <w:spacing w:line="278" w:lineRule="auto"/>
-        <w:jc w:val="left"/>
-        <w:rPr>
-          <w:b/>
-          <w:bCs/>
-        </w:rPr>
-      </w:pPr>
-      <w:r>
-        <w:rPr>
-          <w:b/>
-          <w:bCs/>
-          <w:lang w:val="en-GB"/>
-        </w:rPr>
-        <w:t xml:space="preserve">MODULE NUMBER: </w:t>
-      </w:r>
-      <w:r>
-        <w:rPr>
-          <w:b/>
-          <w:bCs/>
-        </w:rPr>
-        <w:t>XL003332_2025-6_TR3_001 - Database Systems (SET09801/SET11801) TR3</w:t>
-      </w:r>
-    </w:p>
-    <w:p>
-      <w:pPr>
-        <w:spacing w:line="278" w:lineRule="auto"/>
-        <w:jc w:val="left"/>
-        <w:rPr>
-          <w:b/>
-          <w:bCs/>
-          <w:lang w:val="en-GB"/>
-        </w:rPr>
-      </w:pPr>
-      <w:r>
-        <w:rPr>
-          <w:b/>
-          <w:bCs/>
-          <w:lang w:val="en-GB"/>
-        </w:rPr>
-        <w:t>TRIMESTER AND ACADEMIC YEAR:</w:t>
-      </w:r>
-      <w:r>
-        <w:rPr>
-          <w:b/>
-          <w:bCs/>
-          <w:lang w:val="en-GB"/>
-        </w:rPr>
-        <w:t xml:space="preserve"> 2025-2026</w:t>
-      </w:r>
-    </w:p>
-    <w:p>
-      <w:pPr>
-        <w:spacing w:line="278" w:lineRule="auto"/>
-        <w:jc w:val="left"/>
-        <w:rPr>
-          <w:i/>
-          <w:iCs/>
-          <w:lang w:val="en-GB"/>
-        </w:rPr>
-      </w:pPr>
-      <w:r>
-        <w:rPr>
-          <w:i/>
-          <w:iCs/>
-          <w:lang w:val="en-GB"/>
-        </w:rPr>
-        <w:t xml:space="preserve">I declare that, except where explicit reference is made to the contribution of others*, that this assignment is the result of my own work and has not been submitted for any module or programme degree at the Edinburgh Napier University or any other institution. This is in accordance with </w:t>
-      </w:r>
-      <w:hyperlink r:id="rId8" w:history="1">
-        <w:r>
-          <w:rPr>
-            <w:rStyle w:val="Hyperlink"/>
-            <w:i/>
-            <w:iCs/>
-            <w:lang w:val="en-GB"/>
-          </w:rPr>
-          <w:t>Edinburgh Napier University’s Academic Integrity Regulations</w:t>
-        </w:r>
-      </w:hyperlink>
-      <w:r>
-        <w:rPr>
-          <w:i/>
-          <w:iCs/>
-          <w:lang w:val="en-GB"/>
-        </w:rPr>
-        <w:t>.</w:t>
-      </w:r>
-    </w:p>
-    <w:p>
-      <w:pPr>
-        <w:spacing w:line="278" w:lineRule="auto"/>
-        <w:jc w:val="left"/>
-        <w:rPr>
-          <w:b/>
-          <w:bCs/>
-          <w:i/>
-          <w:iCs/>
-          <w:lang w:val="en-GB"/>
-        </w:rPr>
-      </w:pPr>
-    </w:p>
-    <w:p>
-      <w:pPr>
-        <w:spacing w:line="278" w:lineRule="auto"/>
-        <w:jc w:val="left"/>
-        <w:rPr>
-          <w:lang w:val="en-GB"/>
-        </w:rPr>
-      </w:pPr>
-      <w:r>
-        <w:rPr>
-          <w:b/>
-          <w:bCs/>
-          <w:i/>
-          <w:iCs/>
-          <w:lang w:val="en-GB"/>
-        </w:rPr>
-        <w:t>*IMPORTANT:</w:t>
-      </w:r>
-      <w:r>
-        <w:rPr>
-          <w:i/>
-          <w:iCs/>
-          <w:lang w:val="en-GB"/>
-        </w:rPr>
-        <w:t xml:space="preserve"> Please declare here whether you have used </w:t>
-      </w:r>
-      <w:r>
-        <w:rPr>
-          <w:b/>
-          <w:bCs/>
-          <w:i/>
-          <w:iCs/>
-          <w:lang w:val="en-GB"/>
-        </w:rPr>
-        <w:t>Artificial Intelligence (AI) tools</w:t>
-      </w:r>
-      <w:r>
-        <w:rPr>
-          <w:i/>
-          <w:iCs/>
-          <w:lang w:val="en-GB"/>
-        </w:rPr>
-        <w:t>, and to what extent</w:t>
-      </w:r>
-      <w:r>
-        <w:rPr>
-          <w:lang w:val="en-GB"/>
-        </w:rPr>
-        <w:t>:</w:t>
-      </w:r>
-    </w:p>
-    <w:p>
-      <w:pPr>
-        <w:spacing w:line="278" w:lineRule="auto"/>
-        <w:jc w:val="left"/>
-        <w:rPr>
-          <w:lang w:val="en-GB"/>
-        </w:rPr>
-      </w:pPr>
-      <w:r>
-        <w:rPr>
-          <w:rFonts w:ascii="Segoe UI Symbol" w:hAnsi="Segoe UI Symbol" w:cs="Segoe UI Symbol"/>
-          <w:lang w:val="en-GB"/>
-        </w:rPr>
-        <w:t>☐</w:t>
-      </w:r>
-      <w:r>
-        <w:rPr>
-          <w:lang w:val="en-GB"/>
-        </w:rPr>
-        <w:t xml:space="preserve"> No, I have not used such tools</w:t>
-      </w:r>
-    </w:p>
-    <w:p>
-      <w:pPr>
-        <w:spacing w:line="278" w:lineRule="auto"/>
-        <w:jc w:val="left"/>
-        <w:rPr>
-          <w:rFonts w:ascii="Segoe UI Symbol" w:hAnsi="Segoe UI Symbol" w:cs="Segoe UI Symbol"/>
-        </w:rPr>
-      </w:pPr>
-      <w:r>
-        <w:rPr>
-          <w:rFonts w:ascii="Segoe UI Symbol" w:hAnsi="Segoe UI Symbol" w:cs="Segoe UI Symbol"/>
-        </w:rPr>
-        <w:t>☒</w:t>
-      </w:r>
-      <w:r>
-        <w:rPr>
-          <w:rFonts w:ascii="Segoe UI Symbol" w:hAnsi="Segoe UI Symbol" w:cs="Segoe UI Symbol"/>
-        </w:rPr>
-        <w:t xml:space="preserve"> </w:t>
-      </w:r>
-      <w:r>
-        <w:rPr>
-          <w:lang w:val="en-GB"/>
-        </w:rPr>
-        <w:t>Yes, I have used such tools</w:t>
-      </w:r>
-    </w:p>
-    <w:p>
-      <w:pPr>
-        <w:spacing w:line="278" w:lineRule="auto"/>
-        <w:jc w:val="left"/>
-        <w:rPr>
-          <w:lang w:val="en-GB"/>
-        </w:rPr>
-      </w:pPr>
-      <w:r>
-        <w:rPr>
-          <w:lang w:val="en-GB"/>
-        </w:rPr>
-        <w:t>If you answered YES here, please, in around 150 words, describe how (and at which points) you have used such tools to support your completion of this assessment:</w:t>
-      </w:r>
-    </w:p>
-    <w:p>
-      <w:pPr>
-        <w:spacing w:line="278" w:lineRule="auto"/>
-        <w:jc w:val="left"/>
-        <w:rPr>
-          <w:lang w:val="en-GB"/>
-        </w:rPr>
-      </w:pPr>
-      <w:r>
-        <w:rPr>
-          <w:noProof/>
-          <w:lang w:val="en-GB"/>
-        </w:rPr>
-        <mc:AlternateContent>
-          <mc:Choice Requires="wps">
-            <w:drawing>
-              <wp:anchor distT="0" distB="0" distL="114300" distR="114300" simplePos="0" relativeHeight="251659264" behindDoc="0" locked="0" layoutInCell="1" allowOverlap="1" wp14:anchorId="213CE1B4" wp14:editId="5FDA62EB">
-                <wp:simplePos x="0" y="0"/>
-                <wp:positionH relativeFrom="column">
-                  <wp:posOffset>-7620</wp:posOffset>
-                </wp:positionH>
-                <wp:positionV relativeFrom="paragraph">
-                  <wp:posOffset>89535</wp:posOffset>
-                </wp:positionV>
-                <wp:extent cx="5989320" cy="2644140"/>
-                <wp:effectExtent l="0" t="0" r="11430" b="22860"/>
-                <wp:wrapNone/>
-                <wp:docPr id="501203176" name="Text Box 4"/>
-                <wp:cNvGraphicFramePr>
-                  <a:graphicFrameLocks xmlns:a="http://schemas.openxmlformats.org/drawingml/2006/main"/>
-                </wp:cNvGraphicFramePr>
-                <a:graphic xmlns:a="http://schemas.openxmlformats.org/drawingml/2006/main">
-                  <a:graphicData uri="http://schemas.microsoft.com/office/word/2010/wordprocessingShape">
-                    <wps:wsp>
-                      <wps:cNvSpPr txBox="1">
-                        <a:spLocks/>
-                      </wps:cNvSpPr>
-                      <wps:spPr>
-                        <a:xfrm>
-                          <a:off x="0" y="0"/>
-                          <a:ext cx="5989320" cy="2644140"/>
-                        </a:xfrm>
-                        <a:prstGeom prst="rect">
-                          <a:avLst/>
-                        </a:prstGeom>
-                        <a:solidFill>
-                          <a:schemeClr val="lt1"/>
-                        </a:solidFill>
-                        <a:ln w="6350">
-                          <a:solidFill>
-                            <a:prstClr val="black"/>
-                          </a:solidFill>
-                        </a:ln>
-                      </wps:spPr>
-                      <wps:txbx>
-                        <w:txbxContent>
-                          <w:p>
-                            <w:r>
-                              <w:t xml:space="preserve">I have used AI tools to check grammar for my paragraphs, with careful practices not to change any original meaning or context of my text. As English is not my first language, there are some minor grammar mistakes in my report. To fix these, AI tools Grammarly and Quill bot are used in order to improve my writing </w:t>
-                            </w:r>
-                            <w:r>
-                              <w:t>and make it more academic.</w:t>
-                            </w:r>
-                          </w:p>
-                          <w:p/>
-                          <w:p/>
-                          <w:p/>
-                          <w:p/>
-                          <w:p/>
-                          <w:p/>
-                        </w:txbxContent>
-                      </wps:txbx>
-                      <wps:bodyPr rot="0" spcFirstLastPara="0" vertOverflow="clip" horzOverflow="clip" vert="horz" wrap="square" lIns="91440" tIns="45720" rIns="91440" bIns="45720" numCol="1" spcCol="0" rtlCol="0" fromWordArt="0" anchor="t" anchorCtr="0" forceAA="0" compatLnSpc="1">
-                        <a:prstTxWarp prst="textNoShape">
-                          <a:avLst/>
-                        </a:prstTxWarp>
-                        <a:noAutofit/>
-                      </wps:bodyPr>
-                    </wps:wsp>
-                  </a:graphicData>
-                </a:graphic>
-                <wp14:sizeRelH relativeFrom="page">
-                  <wp14:pctWidth>0</wp14:pctWidth>
-                </wp14:sizeRelH>
-                <wp14:sizeRelV relativeFrom="margin">
-                  <wp14:pctHeight>0</wp14:pctHeight>
-                </wp14:sizeRelV>
-              </wp:anchor>
-            </w:drawing>
-          </mc:Choice>
-          <mc:Fallback>
-            <w:pict>
-              <v:shapetype w14:anchorId="213CE1B4" id="_x0000_t202" coordsize="21600,21600" o:spt="202" path="m,l,21600r21600,l21600,xe">
-                <v:stroke joinstyle="miter"/>
-                <v:path gradientshapeok="t" o:connecttype="rect"/>
-              </v:shapetype>
-              <v:shape id="Text Box 4" o:spid="_x0000_s1026" type="#_x0000_t202" style="position:absolute;margin-left:-.6pt;margin-top:7.05pt;width:471.6pt;height:208.2pt;z-index:251659264;visibility:visible;mso-wrap-style:square;mso-width-percent:0;mso-height-percent:0;mso-wrap-distance-left:9pt;mso-wrap-distance-top:0;mso-wrap-distance-right:9pt;mso-wrap-distance-bottom:0;mso-position-horizontal:absolute;mso-position-horizontal-relative:text;mso-position-vertical:absolute;mso-position-vertical-relative:text;mso-width-percent:0;mso-height-percent:0;mso-width-relative:page;mso-height-relative:margin;v-text-anchor:top" o:gfxdata="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" fillcolor="white [3201]" strokeweight=".5pt">
-                <v:path arrowok="t"/>
-                <v:textbox>
-                  <w:txbxContent>
-                    <w:p>
-                      <w:r>
-                        <w:t xml:space="preserve">I have used AI tools to check grammar for my paragraphs, with careful practices not to change any original meaning or context of my text. As English is not my first language, there are some minor grammar mistakes in my report. To fix these, AI tools Grammarly and Quill bot are used in order to improve my writing </w:t>
-                      </w:r>
-                      <w:r>
-                        <w:t>and make it more academic.</w:t>
-                      </w:r>
-                    </w:p>
-                    <w:p/>
-                    <w:p/>
-                    <w:p/>
-                    <w:p/>
-                    <w:p/>
-                    <w:p/>
-                  </w:txbxContent>
-                </v:textbox>
-              </v:shape>
-            </w:pict>
-          </mc:Fallback>
-        </mc:AlternateContent>
-      </w:r>
-    </w:p>
-    <w:p>
-      <w:pPr>
-        <w:spacing w:line="278" w:lineRule="auto"/>
-        <w:jc w:val="left"/>
-        <w:rPr>
-          <w:lang w:val="en-GB"/>
-        </w:rPr>
-      </w:pPr>
-    </w:p>
-    <w:p>
-      <w:pPr>
-        <w:spacing w:line="278" w:lineRule="auto"/>
-        <w:jc w:val="left"/>
-        <w:rPr>
-          <w:lang w:val="en-GB"/>
-        </w:rPr>
-      </w:pPr>
-    </w:p>
-    <w:p>
-      <w:pPr>
-        <w:spacing w:line="278" w:lineRule="auto"/>
-        <w:jc w:val="left"/>
-        <w:rPr>
-          <w:lang w:val="en-GB"/>
-        </w:rPr>
-      </w:pPr>
-    </w:p>
-    <w:p>
-      <w:pPr>
-        <w:spacing w:line="278" w:lineRule="auto"/>
-        <w:jc w:val="left"/>
-        <w:rPr>
-          <w:lang w:val="en-GB"/>
-        </w:rPr>
-      </w:pPr>
-    </w:p>
-    <w:p>
-      <w:pPr>
-        <w:spacing w:line="278" w:lineRule="auto"/>
-        <w:jc w:val="left"/>
-        <w:rPr>
-          <w:lang w:val="en-GB"/>
-        </w:rPr>
-      </w:pPr>
-    </w:p>
-    <w:p>
-      <w:pPr>
-        <w:spacing w:line="278" w:lineRule="auto"/>
-        <w:jc w:val="left"/>
-        <w:rPr>
-          <w:lang w:val="en-GB"/>
-        </w:rPr>
-      </w:pPr>
-    </w:p>
-    <w:p>
-      <w:pPr>
-        <w:spacing w:line="278" w:lineRule="auto"/>
-        <w:jc w:val="left"/>
-        <w:rPr>
-          <w:lang w:val="en-GB"/>
-        </w:rPr>
-      </w:pPr>
-    </w:p>
-    <w:p>
-      <w:pPr>
-        <w:spacing w:line="278" w:lineRule="auto"/>
-        <w:jc w:val="left"/>
-        <w:rPr>
-          <w:lang w:val="en-GB"/>
-        </w:rPr>
-      </w:pPr>
-    </w:p>
-    <w:p>
-      <w:pPr>
-        <w:spacing w:line="278" w:lineRule="auto"/>
-        <w:jc w:val="left"/>
-        <w:rPr>
-          <w:lang w:val="en-GB"/>
-        </w:rPr>
-      </w:pPr>
-    </w:p>
-    <w:p>
-      <w:pPr>
-        <w:spacing w:line="278" w:lineRule="auto"/>
-        <w:jc w:val="left"/>
-        <w:rPr>
-          <w:lang w:val="en-GB"/>
-        </w:rPr>
-      </w:pPr>
-      <w:r>
-        <w:rPr>
-          <w:lang w:val="en-GB"/>
-        </w:rPr>
-        <w:t>NAME:</w:t>
-      </w:r>
-      <w:r>
-        <w:rPr>
-          <w:lang w:val="en-GB"/>
-        </w:rPr>
-        <w:t xml:space="preserve"> HLUM HTET AUNG</w:t>
-      </w:r>
-    </w:p>
-    <w:p>
-      <w:pPr>
-        <w:spacing w:line="278" w:lineRule="auto"/>
-        <w:jc w:val="left"/>
-        <w:rPr>
-          <w:lang w:val="en-GB"/>
-        </w:rPr>
-      </w:pPr>
-      <w:r>
-        <w:rPr>
-          <w:lang w:val="en-GB"/>
-        </w:rPr>
-        <w:t xml:space="preserve">STUDENT NUMBER: </w:t>
-      </w:r>
-      <w:r>
-        <w:rPr>
-          <w:lang w:val="en-GB"/>
-        </w:rPr>
-        <w:t>40841063</w:t>
-      </w:r>
-    </w:p>
-    <w:p>
-      <w:pPr>
-        <w:spacing w:line="278" w:lineRule="auto"/>
-        <w:jc w:val="left"/>
-        <w:rPr>
-          <w:lang w:val="en-GB"/>
-        </w:rPr>
-      </w:pPr>
-      <w:r>
-        <w:rPr>
-          <w:lang w:val="en-GB"/>
-        </w:rPr>
-        <w:br w:type="page"/>
-      </w:r>
-    </w:p>
-    <w:p>
-      <w:pPr>
-        <w:pStyle w:val="Heading1"/>
-      </w:pPr>
-      <w:bookmarkStart w:id="1" w:name="_Toc236649198"/>
-      <w:r>
-        <w:lastRenderedPageBreak/>
-        <w:t>Task C</w:t>
+        <w:pStyle w:val="Heading2"/>
+      </w:pPr>
+      <w:bookmarkStart w:id="1" w:name="_Toc237113728"/>
+      <w:r>
+        <w:t>Relational Schema</w:t>
       </w:r>
       <w:bookmarkEnd w:id="1"/>
     </w:p>
     <w:p>
-      <w:pPr>
-        <w:pStyle w:val="Heading2"/>
-      </w:pPr>
-      <w:bookmarkStart w:id="2" w:name="_Toc236649199"/>
-      <w:r>
-        <w:t>Relational Schema</w:t>
-      </w:r>
-      <w:bookmarkEnd w:id="2"/>
+      <w:r>
+        <w:tab/>
+      </w:r>
+      <w:r>
+        <w:t>The entity relation diagram of the airport database system include</w:t>
+      </w:r>
+      <w:r>
+        <w:t xml:space="preserve">s 3 main tables – Employee, Airplane, and Test Events. These tables have sub-tables, lookup tables, and composite tables that </w:t>
+      </w:r>
+      <w:r>
+        <w:t>join</w:t>
+      </w:r>
+      <w:r>
+        <w:t xml:space="preserve"> them together.</w:t>
+      </w:r>
+      <w:r>
+        <w:t xml:space="preserve"> The relational schema of the database system is –</w:t>
+      </w:r>
     </w:p>
     <w:p>
+      <w:r>
+        <w:rPr>
+          <w:b/>
+          <w:bCs/>
+        </w:rPr>
+        <w:t>Employee</w:t>
+      </w:r>
+      <w:r>
+        <w:t xml:space="preserve"> (</w:t>
+      </w:r>
+      <w:r>
+        <w:rPr>
+          <w:u w:val="single"/>
+        </w:rPr>
+        <w:t>social security number</w:t>
+      </w:r>
+      <w:r>
+        <w:t xml:space="preserve">, name, address, phone number, salary, </w:t>
+      </w:r>
+      <w:r>
+        <w:rPr>
+          <w:i/>
+          <w:iCs/>
+        </w:rPr>
+        <w:t>union id</w:t>
+      </w:r>
+      <w:r>
+        <w:t>)</w:t>
+      </w:r>
+    </w:p>
+    <w:p>
+      <w:r>
+        <w:rPr>
+          <w:b/>
+          <w:bCs/>
+        </w:rPr>
+        <w:t>Union</w:t>
+      </w:r>
+      <w:r>
+        <w:t xml:space="preserve"> (</w:t>
+      </w:r>
+      <w:r>
+        <w:rPr>
+          <w:u w:val="single"/>
+        </w:rPr>
+        <w:t>union id</w:t>
+      </w:r>
+      <w:r>
+        <w:t>, union name</w:t>
+      </w:r>
+      <w:r>
+        <w:t>, membership status</w:t>
+      </w:r>
+      <w:r>
+        <w:t>)</w:t>
+      </w:r>
+    </w:p>
+    <w:p>
+      <w:r>
+        <w:rPr>
+          <w:b/>
+          <w:bCs/>
+        </w:rPr>
+        <w:t>Airplane</w:t>
+      </w:r>
+      <w:r>
+        <w:t xml:space="preserve"> (</w:t>
+      </w:r>
+      <w:r>
+        <w:rPr>
+          <w:u w:val="single"/>
+        </w:rPr>
+        <w:t>registration number</w:t>
+      </w:r>
+      <w:r>
+        <w:t xml:space="preserve">, </w:t>
+      </w:r>
+      <w:r>
+        <w:rPr>
+          <w:i/>
+          <w:iCs/>
+        </w:rPr>
+        <w:t>model number</w:t>
+      </w:r>
+      <w:r>
+        <w:t>)</w:t>
+      </w:r>
+    </w:p>
+    <w:p>
+      <w:pPr>
+        <w:pStyle w:val="ListParagraph"/>
+        <w:numPr>
+          <w:ilvl w:val="0"/>
+          <w:numId w:val="12"/>
+        </w:numPr>
+      </w:pPr>
+      <w:r>
+        <w:rPr>
+          <w:i/>
+          <w:iCs/>
+        </w:rPr>
+        <w:t xml:space="preserve">Model number </w:t>
+      </w:r>
+      <w:r>
+        <w:rPr>
+          <w:i/>
+          <w:iCs/>
+        </w:rPr>
+        <w:t>→</w:t>
+      </w:r>
+      <w:r>
+        <w:rPr>
+          <w:i/>
+          <w:iCs/>
+        </w:rPr>
+        <w:t xml:space="preserve"> </w:t>
+      </w:r>
+      <w:r>
+        <w:rPr>
+          <w:b/>
+          <w:bCs/>
+        </w:rPr>
+        <w:t xml:space="preserve">Airplane models </w:t>
+      </w:r>
+      <w:r>
+        <w:t>(</w:t>
+      </w:r>
+      <w:r>
+        <w:rPr>
+          <w:u w:val="single"/>
+        </w:rPr>
+        <w:t>model number</w:t>
+      </w:r>
+      <w:r>
+        <w:t>)</w:t>
+      </w:r>
+    </w:p>
+    <w:p>
+      <w:r>
+        <w:rPr>
+          <w:b/>
+          <w:bCs/>
+        </w:rPr>
+        <w:t>Test Events</w:t>
+      </w:r>
+      <w:r>
+        <w:t xml:space="preserve"> (</w:t>
+      </w:r>
+      <w:r>
+        <w:rPr>
+          <w:u w:val="single"/>
+        </w:rPr>
+        <w:t>test event number</w:t>
+      </w:r>
+      <w:r>
+        <w:t xml:space="preserve">, </w:t>
+      </w:r>
+      <w:r>
+        <w:rPr>
+          <w:i/>
+          <w:iCs/>
+        </w:rPr>
+        <w:t>test number</w:t>
+      </w:r>
+      <w:r>
+        <w:t xml:space="preserve">, </w:t>
+      </w:r>
+      <w:r>
+        <w:rPr>
+          <w:i/>
+          <w:iCs/>
+        </w:rPr>
+        <w:t>registration number</w:t>
+      </w:r>
+      <w:r>
+        <w:t xml:space="preserve">, </w:t>
+      </w:r>
+      <w:r>
+        <w:rPr>
+          <w:i/>
+          <w:iCs/>
+        </w:rPr>
+        <w:t>social security number</w:t>
+      </w:r>
+      <w:r>
+        <w:t>, date, hours spent, score)</w:t>
+      </w:r>
+    </w:p>
+    <w:p>
+      <w:pPr>
+        <w:pStyle w:val="ListParagraph"/>
+        <w:numPr>
+          <w:ilvl w:val="0"/>
+          <w:numId w:val="12"/>
+        </w:numPr>
+      </w:pPr>
+      <w:r>
+        <w:rPr>
+          <w:i/>
+          <w:iCs/>
+        </w:rPr>
+        <w:t xml:space="preserve">Test number </w:t>
+      </w:r>
+      <w:r>
+        <w:rPr>
+          <w:i/>
+          <w:iCs/>
+        </w:rPr>
+        <w:t>→</w:t>
+      </w:r>
+      <w:r>
+        <w:rPr>
+          <w:i/>
+          <w:iCs/>
+        </w:rPr>
+        <w:t xml:space="preserve"> </w:t>
+      </w:r>
+      <w:r>
+        <w:rPr>
+          <w:b/>
+          <w:bCs/>
+        </w:rPr>
+        <w:t xml:space="preserve">Airworthy test model </w:t>
+      </w:r>
+      <w:r>
+        <w:t>(</w:t>
+      </w:r>
+      <w:r>
+        <w:rPr>
+          <w:u w:val="single"/>
+        </w:rPr>
+        <w:t>test number</w:t>
+      </w:r>
+      <w:r>
+        <w:t>)</w:t>
+      </w:r>
+    </w:p>
+    <w:p>
+      <w:pPr>
+        <w:pStyle w:val="ListParagraph"/>
+        <w:numPr>
+          <w:ilvl w:val="0"/>
+          <w:numId w:val="12"/>
+        </w:numPr>
+      </w:pPr>
+      <w:r>
+        <w:rPr>
+          <w:i/>
+          <w:iCs/>
+        </w:rPr>
+        <w:t xml:space="preserve">Registration number </w:t>
+      </w:r>
+      <w:r>
+        <w:rPr>
+          <w:i/>
+          <w:iCs/>
+        </w:rPr>
+        <w:t>→</w:t>
+      </w:r>
+      <w:r>
+        <w:rPr>
+          <w:i/>
+          <w:iCs/>
+        </w:rPr>
+        <w:t xml:space="preserve"> </w:t>
+      </w:r>
+      <w:r>
+        <w:rPr>
+          <w:b/>
+          <w:bCs/>
+        </w:rPr>
+        <w:t xml:space="preserve">Airplane </w:t>
+      </w:r>
+      <w:r>
+        <w:t>(</w:t>
+      </w:r>
+      <w:r>
+        <w:rPr>
+          <w:u w:val="single"/>
+        </w:rPr>
+        <w:t>Registration number</w:t>
+      </w:r>
+      <w:r>
+        <w:t>)</w:t>
+      </w:r>
+    </w:p>
+    <w:p>
+      <w:pPr>
+        <w:pStyle w:val="ListParagraph"/>
+        <w:numPr>
+          <w:ilvl w:val="0"/>
+          <w:numId w:val="12"/>
+        </w:numPr>
+      </w:pPr>
+      <w:r>
+        <w:rPr>
+          <w:i/>
+          <w:iCs/>
+        </w:rPr>
+        <w:t xml:space="preserve">Social security number </w:t>
+      </w:r>
+      <w:r>
+        <w:rPr>
+          <w:i/>
+          <w:iCs/>
+        </w:rPr>
+        <w:t>→</w:t>
+      </w:r>
+      <w:r>
+        <w:rPr>
+          <w:i/>
+          <w:iCs/>
+        </w:rPr>
+        <w:t xml:space="preserve"> </w:t>
+      </w:r>
+      <w:r>
+        <w:rPr>
+          <w:b/>
+          <w:bCs/>
+        </w:rPr>
+        <w:t xml:space="preserve">Technicians </w:t>
+      </w:r>
+      <w:r>
+        <w:t>(</w:t>
+      </w:r>
+      <w:r>
+        <w:rPr>
+          <w:u w:val="single"/>
+        </w:rPr>
+        <w:t>social security number</w:t>
+      </w:r>
+      <w:r>
+        <w:t>)</w:t>
+      </w:r>
+    </w:p>
+    <w:p>
+      <w:r>
+        <w:rPr>
+          <w:b/>
+          <w:bCs/>
+        </w:rPr>
+        <w:t>Technicians</w:t>
+      </w:r>
+      <w:r>
+        <w:t xml:space="preserve"> (</w:t>
+      </w:r>
+      <w:r>
+        <w:rPr>
+          <w:i/>
+          <w:iCs/>
+          <w:u w:val="single"/>
+        </w:rPr>
+        <w:t>social security number</w:t>
+      </w:r>
+      <w:r>
+        <w:t>, hourly rate, specialization area</w:t>
+      </w:r>
+      <w:r>
+        <w:t>)</w:t>
+      </w:r>
+    </w:p>
+    <w:p>
+      <w:pPr>
+        <w:pStyle w:val="ListParagraph"/>
+        <w:numPr>
+          <w:ilvl w:val="0"/>
+          <w:numId w:val="12"/>
+        </w:numPr>
+      </w:pPr>
+      <w:r>
+        <w:rPr>
+          <w:i/>
+          <w:iCs/>
+        </w:rPr>
+        <w:t xml:space="preserve">Social security number </w:t>
+      </w:r>
+      <w:r>
+        <w:rPr>
+          <w:i/>
+          <w:iCs/>
+        </w:rPr>
+        <w:t>→</w:t>
+      </w:r>
+      <w:r>
+        <w:rPr>
+          <w:i/>
+          <w:iCs/>
+        </w:rPr>
+        <w:t xml:space="preserve"> </w:t>
+      </w:r>
+      <w:r>
+        <w:rPr>
+          <w:b/>
+          <w:bCs/>
+        </w:rPr>
+        <w:t xml:space="preserve">Employee </w:t>
+      </w:r>
+      <w:r>
+        <w:t>(</w:t>
+      </w:r>
+      <w:r>
+        <w:rPr>
+          <w:u w:val="single"/>
+        </w:rPr>
+        <w:t>social security number</w:t>
+      </w:r>
+      <w:r>
+        <w:t>)</w:t>
+      </w:r>
+    </w:p>
+    <w:p>
+      <w:r>
+        <w:rPr>
+          <w:b/>
+          <w:bCs/>
+        </w:rPr>
+        <w:t>Traffic controllers</w:t>
+      </w:r>
+      <w:r>
+        <w:rPr>
+          <w:b/>
+          <w:bCs/>
+        </w:rPr>
+        <w:t xml:space="preserve"> </w:t>
+      </w:r>
+      <w:r>
+        <w:t>(</w:t>
+      </w:r>
+      <w:r>
+        <w:rPr>
+          <w:i/>
+          <w:iCs/>
+          <w:u w:val="single"/>
+        </w:rPr>
+        <w:t>social security number</w:t>
+      </w:r>
+      <w:r>
+        <w:t xml:space="preserve">, </w:t>
+      </w:r>
+      <w:r>
+        <w:t xml:space="preserve">hourly rate, </w:t>
+      </w:r>
+      <w:r>
+        <w:t>last examination date)</w:t>
+      </w:r>
+    </w:p>
+    <w:p>
+      <w:pPr>
+        <w:pStyle w:val="ListParagraph"/>
+        <w:numPr>
+          <w:ilvl w:val="0"/>
+          <w:numId w:val="12"/>
+        </w:numPr>
+      </w:pPr>
+      <w:r>
+        <w:rPr>
+          <w:i/>
+          <w:iCs/>
+        </w:rPr>
+        <w:t xml:space="preserve">Social security number </w:t>
+      </w:r>
+      <w:r>
+        <w:rPr>
+          <w:i/>
+          <w:iCs/>
+        </w:rPr>
+        <w:t>→</w:t>
+      </w:r>
+      <w:r>
+        <w:rPr>
+          <w:i/>
+          <w:iCs/>
+        </w:rPr>
+        <w:t xml:space="preserve"> </w:t>
+      </w:r>
+      <w:r>
+        <w:rPr>
+          <w:b/>
+          <w:bCs/>
+        </w:rPr>
+        <w:t xml:space="preserve">Employee </w:t>
+      </w:r>
+      <w:r>
+        <w:t>(</w:t>
+      </w:r>
+      <w:r>
+        <w:rPr>
+          <w:u w:val="single"/>
+        </w:rPr>
+        <w:t>social security number</w:t>
+      </w:r>
+      <w:r>
+        <w:t>)</w:t>
+      </w:r>
+    </w:p>
+    <w:p>
+      <w:r>
+        <w:rPr>
+          <w:b/>
+          <w:bCs/>
+        </w:rPr>
+        <w:t>Airworthy test</w:t>
+      </w:r>
+      <w:r>
+        <w:rPr>
+          <w:b/>
+          <w:bCs/>
+        </w:rPr>
+        <w:t xml:space="preserve"> model</w:t>
+      </w:r>
+      <w:r>
+        <w:t xml:space="preserve"> (</w:t>
+      </w:r>
+      <w:r>
+        <w:rPr>
+          <w:u w:val="single"/>
+        </w:rPr>
+        <w:t>test number</w:t>
+      </w:r>
+      <w:r>
+        <w:t>, name, max score)</w:t>
+      </w:r>
+    </w:p>
+    <w:p>
+      <w:r>
+        <w:rPr>
+          <w:b/>
+          <w:bCs/>
+        </w:rPr>
+        <w:t>Airplane models</w:t>
+      </w:r>
+      <w:r>
+        <w:t xml:space="preserve"> (</w:t>
+      </w:r>
+      <w:r>
+        <w:rPr>
+          <w:u w:val="single"/>
+        </w:rPr>
+        <w:t>model number</w:t>
+      </w:r>
+      <w:r>
+        <w:t>, capacity, weight</w:t>
+      </w:r>
+      <w:r>
+        <w:t>, seats, max speed</w:t>
+      </w:r>
+      <w:r>
+        <w:t>)</w:t>
+      </w:r>
+    </w:p>
+    <w:p>
+      <w:r>
+        <w:rPr>
+          <w:b/>
+          <w:bCs/>
+        </w:rPr>
+        <w:t>Technicians’ expertise</w:t>
+      </w:r>
+      <w:r>
+        <w:t xml:space="preserve"> (</w:t>
+      </w:r>
+      <w:r>
+        <w:rPr>
+          <w:i/>
+          <w:iCs/>
+          <w:u w:val="single"/>
+        </w:rPr>
+        <w:t>model number</w:t>
+      </w:r>
+      <w:r>
+        <w:t xml:space="preserve">, </w:t>
+      </w:r>
+      <w:r>
+        <w:rPr>
+          <w:i/>
+          <w:iCs/>
+          <w:u w:val="single"/>
+        </w:rPr>
+        <w:t>social security number</w:t>
+      </w:r>
+      <w:r>
+        <w:t>)</w:t>
+      </w:r>
+    </w:p>
+    <w:p>
+      <w:pPr>
+        <w:pStyle w:val="ListParagraph"/>
+        <w:numPr>
+          <w:ilvl w:val="0"/>
+          <w:numId w:val="12"/>
+        </w:numPr>
+      </w:pPr>
+      <w:r>
+        <w:rPr>
+          <w:i/>
+          <w:iCs/>
+        </w:rPr>
+        <w:t xml:space="preserve">Model number </w:t>
+      </w:r>
+      <w:r>
+        <w:rPr>
+          <w:i/>
+          <w:iCs/>
+        </w:rPr>
+        <w:t>→</w:t>
+      </w:r>
+      <w:r>
+        <w:rPr>
+          <w:i/>
+          <w:iCs/>
+        </w:rPr>
+        <w:t xml:space="preserve"> </w:t>
+      </w:r>
+      <w:r>
+        <w:rPr>
+          <w:b/>
+          <w:bCs/>
+        </w:rPr>
+        <w:t xml:space="preserve">Airplane models </w:t>
+      </w:r>
+      <w:r>
+        <w:t>(</w:t>
+      </w:r>
+      <w:r>
+        <w:rPr>
+          <w:u w:val="single"/>
+        </w:rPr>
+        <w:t>model number</w:t>
+      </w:r>
+      <w:r>
+        <w:t>)</w:t>
+      </w:r>
+    </w:p>
+    <w:p>
+      <w:pPr>
+        <w:pStyle w:val="ListParagraph"/>
+        <w:numPr>
+          <w:ilvl w:val="0"/>
+          <w:numId w:val="12"/>
+        </w:numPr>
+      </w:pPr>
+      <w:r>
+        <w:rPr>
+          <w:i/>
+          <w:iCs/>
+        </w:rPr>
+        <w:t xml:space="preserve">Social security number </w:t>
+      </w:r>
+      <w:r>
+        <w:rPr>
+          <w:i/>
+          <w:iCs/>
+        </w:rPr>
+        <w:t>→</w:t>
+      </w:r>
+      <w:r>
+        <w:rPr>
+          <w:i/>
+          <w:iCs/>
+        </w:rPr>
+        <w:t xml:space="preserve"> </w:t>
+      </w:r>
+      <w:r>
+        <w:rPr>
+          <w:b/>
+          <w:bCs/>
+        </w:rPr>
+        <w:t xml:space="preserve">Technicians </w:t>
+      </w:r>
+      <w:r>
+        <w:t>(</w:t>
+      </w:r>
+      <w:r>
+        <w:rPr>
+          <w:u w:val="single"/>
+        </w:rPr>
+        <w:t>social security number</w:t>
+      </w:r>
+      <w:r>
+        <w:t>)</w:t>
+      </w:r>
+    </w:p>
+    <w:p>
+      <w:r>
+        <w:t>*Note: The underlined attributes are primary key, and the italic attributes are foreign key.</w:t>
+      </w:r>
+    </w:p>
+    <w:p>
       <w:pPr>
         <w:keepNext/>
         <w:jc w:val="center"/>
@@ -1083,11 +1022,12 @@
         <w:rPr>
           <w:noProof/>
         </w:rPr>
+        <w:lastRenderedPageBreak/>
         <w:drawing>
-          <wp:inline distT="0" distB="0" distL="0" distR="0" wp14:anchorId="41271F81" wp14:editId="3D6396B5">
-            <wp:extent cx="5284470" cy="2265660"/>
-            <wp:effectExtent l="19050" t="19050" r="11430" b="20955"/>
-            <wp:docPr id="922370564" name="Picture 2"/>
+          <wp:inline distT="0" distB="0" distL="0" distR="0" wp14:anchorId="4B49F65C" wp14:editId="76963B6F">
+            <wp:extent cx="5943600" cy="2566670"/>
+            <wp:effectExtent l="19050" t="19050" r="19050" b="24130"/>
+            <wp:docPr id="1009114155" name="Picture 1"/>
             <wp:cNvGraphicFramePr>
               <a:graphicFrameLocks xmlns:a="http://schemas.openxmlformats.org/drawingml/2006/main" noChangeAspect="1"/>
             </wp:cNvGraphicFramePr>
@@ -1101,7 +1041,7 @@
                     </pic:cNvPicPr>
                   </pic:nvPicPr>
                   <pic:blipFill>
-                    <a:blip r:embed="rId9">
+                    <a:blip r:embed="rId8">
                       <a:extLst>
                         <a:ext uri="{28A0092B-C50C-407E-A947-70E740481C1C}">
                           <a14:useLocalDpi xmlns:a14="http://schemas.microsoft.com/office/drawing/2010/main" val="0"/>
@@ -1116,7 +1056,7 @@
                   <pic:spPr bwMode="auto">
                     <a:xfrm>
                       <a:off x="0" y="0"/>
-                      <a:ext cx="5293018" cy="2269325"/>
+                      <a:ext cx="5943600" cy="2566670"/>
                     </a:xfrm>
                     <a:prstGeom prst="rect">
                       <a:avLst/>
@@ -1151,1080 +1091,522 @@
         </w:r>
       </w:fldSimple>
       <w:r>
-        <w:t xml:space="preserve"> </w:t>
-      </w:r>
-      <w:r>
-        <w:t xml:space="preserve">old </w:t>
-      </w:r>
-      <w:r>
-        <w:t>ERD of Airport database</w:t>
+        <w:t xml:space="preserve"> Updated Airport Database ERD</w:t>
       </w:r>
     </w:p>
     <w:p>
       <w:pPr>
-        <w:keepNext/>
+        <w:pStyle w:val="Heading3"/>
+      </w:pPr>
+      <w:r>
+        <w:t>Relational Schema Table</w:t>
+      </w:r>
+    </w:p>
+    <w:tbl>
+      <w:tblPr>
+        <w:tblStyle w:val="TableGrid"/>
+        <w:tblW w:w="0" w:type="auto"/>
+        <w:tblLook w:val="04A0" w:firstRow="1" w:lastRow="0" w:firstColumn="1" w:lastColumn="0" w:noHBand="0" w:noVBand="1"/>
+      </w:tblPr>
+      <w:tblGrid>
+        <w:gridCol w:w="2337"/>
+        <w:gridCol w:w="2337"/>
+        <w:gridCol w:w="2338"/>
+        <w:gridCol w:w="2338"/>
+      </w:tblGrid>
+      <w:tr>
+        <w:tc>
+          <w:tcPr>
+            <w:tcW w:w="2337" w:type="dxa"/>
+          </w:tcPr>
+          <w:p>
+            <w:r>
+              <w:t>Table Name</w:t>
+            </w:r>
+          </w:p>
+        </w:tc>
+        <w:tc>
+          <w:tcPr>
+            <w:tcW w:w="2337" w:type="dxa"/>
+          </w:tcPr>
+          <w:p>
+            <w:r>
+              <w:t>Attributes</w:t>
+            </w:r>
+          </w:p>
+        </w:tc>
+        <w:tc>
+          <w:tcPr>
+            <w:tcW w:w="2338" w:type="dxa"/>
+          </w:tcPr>
+          <w:p>
+            <w:r>
+              <w:t>Primary Key</w:t>
+            </w:r>
+          </w:p>
+        </w:tc>
+        <w:tc>
+          <w:tcPr>
+            <w:tcW w:w="2338" w:type="dxa"/>
+          </w:tcPr>
+          <w:p>
+            <w:r>
+              <w:t>Foreign Key</w:t>
+            </w:r>
+          </w:p>
+        </w:tc>
+      </w:tr>
+      <w:tr>
+        <w:tc>
+          <w:tcPr>
+            <w:tcW w:w="2337" w:type="dxa"/>
+          </w:tcPr>
+          <w:p>
+            <w:r>
+              <w:t>Union</w:t>
+            </w:r>
+          </w:p>
+        </w:tc>
+        <w:tc>
+          <w:tcPr>
+            <w:tcW w:w="2337" w:type="dxa"/>
+          </w:tcPr>
+          <w:p>
+            <w:r>
+              <w:t>U</w:t>
+            </w:r>
+            <w:r>
+              <w:t>nion</w:t>
+            </w:r>
+            <w:r>
+              <w:t xml:space="preserve"> </w:t>
+            </w:r>
+            <w:r>
+              <w:t>id, union</w:t>
+            </w:r>
+            <w:r>
+              <w:t xml:space="preserve"> </w:t>
+            </w:r>
+            <w:r>
+              <w:t>name, membership</w:t>
+            </w:r>
+            <w:r>
+              <w:t xml:space="preserve"> </w:t>
+            </w:r>
+            <w:r>
+              <w:t>status</w:t>
+            </w:r>
+          </w:p>
+        </w:tc>
+        <w:tc>
+          <w:tcPr>
+            <w:tcW w:w="2338" w:type="dxa"/>
+          </w:tcPr>
+          <w:p>
+            <w:r>
+              <w:t>U</w:t>
+            </w:r>
+            <w:r>
+              <w:t>nion</w:t>
+            </w:r>
+            <w:r>
+              <w:t xml:space="preserve"> </w:t>
+            </w:r>
+            <w:r>
+              <w:t>id</w:t>
+            </w:r>
+          </w:p>
+        </w:tc>
+        <w:tc>
+          <w:tcPr>
+            <w:tcW w:w="2338" w:type="dxa"/>
+          </w:tcPr>
+          <w:p>
+            <w:r>
+              <w:t>None</w:t>
+            </w:r>
+          </w:p>
+        </w:tc>
+      </w:tr>
+      <w:tr>
+        <w:tc>
+          <w:tcPr>
+            <w:tcW w:w="2337" w:type="dxa"/>
+          </w:tcPr>
+          <w:p>
+            <w:r>
+              <w:t>Employee</w:t>
+            </w:r>
+          </w:p>
+        </w:tc>
+        <w:tc>
+          <w:tcPr>
+            <w:tcW w:w="2337" w:type="dxa"/>
+          </w:tcPr>
+          <w:p>
+            <w:r>
+              <w:t>Social security number, name, address, phone number, salary, union id</w:t>
+            </w:r>
+          </w:p>
+        </w:tc>
+        <w:tc>
+          <w:tcPr>
+            <w:tcW w:w="2338" w:type="dxa"/>
+          </w:tcPr>
+          <w:p>
+            <w:r>
+              <w:t>Social security number</w:t>
+            </w:r>
+          </w:p>
+        </w:tc>
+        <w:tc>
+          <w:tcPr>
+            <w:tcW w:w="2338" w:type="dxa"/>
+          </w:tcPr>
+          <w:p>
+            <w:r>
+              <w:t>Union id</w:t>
+            </w:r>
+          </w:p>
+        </w:tc>
+      </w:tr>
+      <w:tr>
+        <w:tc>
+          <w:tcPr>
+            <w:tcW w:w="2337" w:type="dxa"/>
+          </w:tcPr>
+          <w:p>
+            <w:r>
+              <w:t>Technicians</w:t>
+            </w:r>
+          </w:p>
+        </w:tc>
+        <w:tc>
+          <w:tcPr>
+            <w:tcW w:w="2337" w:type="dxa"/>
+          </w:tcPr>
+          <w:p>
+            <w:r>
+              <w:t xml:space="preserve">Social security number, </w:t>
+            </w:r>
+            <w:r>
+              <w:t>hourly rate, specialization area</w:t>
+            </w:r>
+          </w:p>
+        </w:tc>
+        <w:tc>
+          <w:tcPr>
+            <w:tcW w:w="2338" w:type="dxa"/>
+          </w:tcPr>
+          <w:p>
+            <w:r>
+              <w:t>Social security number</w:t>
+            </w:r>
+          </w:p>
+        </w:tc>
+        <w:tc>
+          <w:tcPr>
+            <w:tcW w:w="2338" w:type="dxa"/>
+          </w:tcPr>
+          <w:p>
+            <w:r>
+              <w:t>Social security number</w:t>
+            </w:r>
+          </w:p>
+        </w:tc>
+      </w:tr>
+      <w:tr>
+        <w:tc>
+          <w:tcPr>
+            <w:tcW w:w="2337" w:type="dxa"/>
+          </w:tcPr>
+          <w:p>
+            <w:r>
+              <w:t>Traffic controllers</w:t>
+            </w:r>
+          </w:p>
+        </w:tc>
+        <w:tc>
+          <w:tcPr>
+            <w:tcW w:w="2337" w:type="dxa"/>
+          </w:tcPr>
+          <w:p>
+            <w:r>
+              <w:t>Social security number, hourly rate, last examination date</w:t>
+            </w:r>
+          </w:p>
+        </w:tc>
+        <w:tc>
+          <w:tcPr>
+            <w:tcW w:w="2338" w:type="dxa"/>
+          </w:tcPr>
+          <w:p>
+            <w:r>
+              <w:t>Social security number</w:t>
+            </w:r>
+          </w:p>
+        </w:tc>
+        <w:tc>
+          <w:tcPr>
+            <w:tcW w:w="2338" w:type="dxa"/>
+          </w:tcPr>
+          <w:p>
+            <w:r>
+              <w:t>Social security number</w:t>
+            </w:r>
+          </w:p>
+        </w:tc>
+      </w:tr>
+      <w:tr>
+        <w:tc>
+          <w:tcPr>
+            <w:tcW w:w="2337" w:type="dxa"/>
+          </w:tcPr>
+          <w:p>
+            <w:r>
+              <w:t>Airplane models</w:t>
+            </w:r>
+          </w:p>
+        </w:tc>
+        <w:tc>
+          <w:tcPr>
+            <w:tcW w:w="2337" w:type="dxa"/>
+          </w:tcPr>
+          <w:p>
+            <w:r>
+              <w:t>Model number, capacity, weight, seats, max speed</w:t>
+            </w:r>
+          </w:p>
+        </w:tc>
+        <w:tc>
+          <w:tcPr>
+            <w:tcW w:w="2338" w:type="dxa"/>
+          </w:tcPr>
+          <w:p>
+            <w:r>
+              <w:t>Model number</w:t>
+            </w:r>
+          </w:p>
+        </w:tc>
+        <w:tc>
+          <w:tcPr>
+            <w:tcW w:w="2338" w:type="dxa"/>
+          </w:tcPr>
+          <w:p>
+            <w:r>
+              <w:t>None</w:t>
+            </w:r>
+          </w:p>
+        </w:tc>
+      </w:tr>
+      <w:tr>
+        <w:tc>
+          <w:tcPr>
+            <w:tcW w:w="2337" w:type="dxa"/>
+          </w:tcPr>
+          <w:p>
+            <w:r>
+              <w:lastRenderedPageBreak/>
+              <w:t>Airplane</w:t>
+            </w:r>
+          </w:p>
+        </w:tc>
+        <w:tc>
+          <w:tcPr>
+            <w:tcW w:w="2337" w:type="dxa"/>
+          </w:tcPr>
+          <w:p>
+            <w:r>
+              <w:t>Registration number, model number</w:t>
+            </w:r>
+          </w:p>
+        </w:tc>
+        <w:tc>
+          <w:tcPr>
+            <w:tcW w:w="2338" w:type="dxa"/>
+          </w:tcPr>
+          <w:p>
+            <w:r>
+              <w:t>Registration number</w:t>
+            </w:r>
+          </w:p>
+        </w:tc>
+        <w:tc>
+          <w:tcPr>
+            <w:tcW w:w="2338" w:type="dxa"/>
+          </w:tcPr>
+          <w:p>
+            <w:r>
+              <w:t>Model number</w:t>
+            </w:r>
+          </w:p>
+        </w:tc>
+      </w:tr>
+      <w:tr>
+        <w:tc>
+          <w:tcPr>
+            <w:tcW w:w="2337" w:type="dxa"/>
+          </w:tcPr>
+          <w:p>
+            <w:r>
+              <w:t>Airworthy test model</w:t>
+            </w:r>
+          </w:p>
+        </w:tc>
+        <w:tc>
+          <w:tcPr>
+            <w:tcW w:w="2337" w:type="dxa"/>
+          </w:tcPr>
+          <w:p>
+            <w:r>
+              <w:t>Test number, name, max score</w:t>
+            </w:r>
+          </w:p>
+        </w:tc>
+        <w:tc>
+          <w:tcPr>
+            <w:tcW w:w="2338" w:type="dxa"/>
+          </w:tcPr>
+          <w:p>
+            <w:r>
+              <w:t>Test number</w:t>
+            </w:r>
+          </w:p>
+        </w:tc>
+        <w:tc>
+          <w:tcPr>
+            <w:tcW w:w="2338" w:type="dxa"/>
+          </w:tcPr>
+          <w:p>
+            <w:r>
+              <w:t>None</w:t>
+            </w:r>
+          </w:p>
+        </w:tc>
+      </w:tr>
+      <w:tr>
+        <w:tc>
+          <w:tcPr>
+            <w:tcW w:w="2337" w:type="dxa"/>
+          </w:tcPr>
+          <w:p>
+            <w:r>
+              <w:t>Test event</w:t>
+            </w:r>
+          </w:p>
+        </w:tc>
+        <w:tc>
+          <w:tcPr>
+            <w:tcW w:w="2337" w:type="dxa"/>
+          </w:tcPr>
+          <w:p>
+            <w:r>
+              <w:t>Test event number, test number, registration number, social security number, date, hours spent, score</w:t>
+            </w:r>
+          </w:p>
+        </w:tc>
+        <w:tc>
+          <w:tcPr>
+            <w:tcW w:w="2338" w:type="dxa"/>
+          </w:tcPr>
+          <w:p>
+            <w:r>
+              <w:t>Test event number</w:t>
+            </w:r>
+          </w:p>
+        </w:tc>
+        <w:tc>
+          <w:tcPr>
+            <w:tcW w:w="2338" w:type="dxa"/>
+          </w:tcPr>
+          <w:p>
+            <w:r>
+              <w:t>Test number, registration number, social security number</w:t>
+            </w:r>
+          </w:p>
+        </w:tc>
+      </w:tr>
+      <w:tr>
+        <w:tc>
+          <w:tcPr>
+            <w:tcW w:w="2337" w:type="dxa"/>
+          </w:tcPr>
+          <w:p>
+            <w:r>
+              <w:t>Technicians’ expertise</w:t>
+            </w:r>
+          </w:p>
+        </w:tc>
+        <w:tc>
+          <w:tcPr>
+            <w:tcW w:w="2337" w:type="dxa"/>
+          </w:tcPr>
+          <w:p>
+            <w:r>
+              <w:t xml:space="preserve">Model number, </w:t>
+            </w:r>
+            <w:r>
+              <w:t>social security number</w:t>
+            </w:r>
+          </w:p>
+        </w:tc>
+        <w:tc>
+          <w:tcPr>
+            <w:tcW w:w="2338" w:type="dxa"/>
+          </w:tcPr>
+          <w:p>
+            <w:r>
+              <w:t>Model number, social security number</w:t>
+            </w:r>
+          </w:p>
+        </w:tc>
+        <w:tc>
+          <w:tcPr>
+            <w:tcW w:w="2338" w:type="dxa"/>
+          </w:tcPr>
+          <w:p>
+            <w:pPr>
+              <w:keepNext/>
+            </w:pPr>
+            <w:r>
+              <w:t>Model number, social security number</w:t>
+            </w:r>
+          </w:p>
+        </w:tc>
+      </w:tr>
+    </w:tbl>
+    <w:p>
+      <w:pPr>
         <w:jc w:val="center"/>
       </w:pPr>
       <w:r>
-        <w:rPr>
-          <w:noProof/>
-        </w:rPr>
-        <w:drawing>
-          <wp:inline distT="0" distB="0" distL="0" distR="0" wp14:anchorId="5219F64A" wp14:editId="258A645B">
-            <wp:extent cx="5276216" cy="2239010"/>
-            <wp:effectExtent l="19050" t="19050" r="19685" b="27940"/>
-            <wp:docPr id="211493148" name="Picture 2"/>
-            <wp:cNvGraphicFramePr>
-              <a:graphicFrameLocks xmlns:a="http://schemas.openxmlformats.org/drawingml/2006/main" noChangeAspect="1"/>
-            </wp:cNvGraphicFramePr>
-            <a:graphic xmlns:a="http://schemas.openxmlformats.org/drawingml/2006/main">
-              <a:graphicData uri="http://schemas.openxmlformats.org/drawingml/2006/picture">
-                <pic:pic xmlns:pic="http://schemas.openxmlformats.org/drawingml/2006/picture">
-                  <pic:nvPicPr>
-                    <pic:cNvPr id="0" name="Picture 1"/>
-                    <pic:cNvPicPr>
-                      <a:picLocks noChangeAspect="1" noChangeArrowheads="1"/>
-                    </pic:cNvPicPr>
-                  </pic:nvPicPr>
-                  <pic:blipFill>
-                    <a:blip r:embed="rId10">
-                      <a:extLst>
-                        <a:ext uri="{28A0092B-C50C-407E-A947-70E740481C1C}">
-                          <a14:useLocalDpi xmlns:a14="http://schemas.microsoft.com/office/drawing/2010/main" val="0"/>
-                        </a:ext>
-                      </a:extLst>
-                    </a:blip>
-                    <a:srcRect/>
-                    <a:stretch>
-                      <a:fillRect/>
-                    </a:stretch>
-                  </pic:blipFill>
-                  <pic:spPr bwMode="auto">
-                    <a:xfrm>
-                      <a:off x="0" y="0"/>
-                      <a:ext cx="5297292" cy="2247954"/>
-                    </a:xfrm>
-                    <a:prstGeom prst="rect">
-                      <a:avLst/>
-                    </a:prstGeom>
-                    <a:noFill/>
-                    <a:ln>
-                      <a:solidFill>
-                        <a:schemeClr val="tx1"/>
-                      </a:solidFill>
-                    </a:ln>
-                  </pic:spPr>
-                </pic:pic>
-              </a:graphicData>
-            </a:graphic>
-          </wp:inline>
-        </w:drawing>
-      </w:r>
-    </w:p>
-    <w:p>
-      <w:pPr>
-        <w:jc w:val="center"/>
-      </w:pPr>
-      <w:r>
-        <w:t xml:space="preserve">Figure </w:t>
-      </w:r>
-      <w:fldSimple w:instr=" SEQ Figure \* ARABIC ">
+        <w:t xml:space="preserve">Table </w:t>
+      </w:r>
+      <w:fldSimple w:instr=" SEQ Table \* ARABIC ">
         <w:r>
           <w:rPr>
             <w:noProof/>
           </w:rPr>
-          <w:t>2</w:t>
+          <w:t>1</w:t>
         </w:r>
       </w:fldSimple>
       <w:r>
-        <w:t xml:space="preserve"> </w:t>
-      </w:r>
-      <w:r>
-        <w:t>normalized ERD</w:t>
+        <w:t xml:space="preserve"> Relational Schema Table</w:t>
       </w:r>
     </w:p>
     <w:p>
-      <w:r>
-        <w:tab/>
-      </w:r>
-      <w:r>
-        <w:t>The entity relation diagram of the airport database system include</w:t>
-      </w:r>
-      <w:r>
-        <w:t xml:space="preserve">s 3 main tables – Employee, Airplane, and Test Events. These tables have sub-tables, lookup tables, and composite tables that </w:t>
-      </w:r>
-      <w:r>
-        <w:t>join</w:t>
-      </w:r>
-      <w:r>
-        <w:t xml:space="preserve"> them together.</w:t>
-      </w:r>
-      <w:r>
-        <w:t xml:space="preserve"> The relational schema of the database system is –</w:t>
+      <w:pPr>
+        <w:pStyle w:val="Heading2"/>
+      </w:pPr>
+      <w:r>
+        <w:t>Normalization</w:t>
       </w:r>
     </w:p>
     <w:p>
       <w:r>
-        <w:rPr>
-          <w:b/>
-          <w:bCs/>
-        </w:rPr>
-        <w:t>Employee</w:t>
-      </w:r>
-      <w:r>
-        <w:t xml:space="preserve"> (</w:t>
-      </w:r>
-      <w:r>
-        <w:rPr>
-          <w:u w:val="single"/>
-        </w:rPr>
-        <w:t>social security number</w:t>
-      </w:r>
-      <w:r>
-        <w:t xml:space="preserve">, name, address, phone number, salary, </w:t>
-      </w:r>
-      <w:r>
-        <w:t>union id</w:t>
-      </w:r>
-      <w:r>
-        <w:t xml:space="preserve"> (unique key)</w:t>
-      </w:r>
-      <w:r>
-        <w:t>)</w:t>
+        <w:tab/>
       </w:r>
     </w:p>
-    <w:p/>
-    <w:p>
-      <w:r>
-        <w:rPr>
-          <w:b/>
-          <w:bCs/>
-        </w:rPr>
-        <w:lastRenderedPageBreak/>
-        <w:t>Airplane</w:t>
-      </w:r>
-      <w:r>
-        <w:t xml:space="preserve"> (</w:t>
-      </w:r>
-      <w:r>
-        <w:rPr>
-          <w:u w:val="single"/>
-        </w:rPr>
-        <w:t>registration number</w:t>
-      </w:r>
-      <w:r>
-        <w:t xml:space="preserve">, </w:t>
-      </w:r>
-      <w:r>
-        <w:rPr>
-          <w:i/>
-          <w:iCs/>
-        </w:rPr>
-        <w:t>model number</w:t>
-      </w:r>
-      <w:r>
-        <w:t>)</w:t>
-      </w:r>
-    </w:p>
-    <w:p>
-      <w:pPr>
-        <w:pStyle w:val="ListParagraph"/>
-        <w:numPr>
-          <w:ilvl w:val="0"/>
-          <w:numId w:val="12"/>
-        </w:numPr>
-      </w:pPr>
-      <w:r>
-        <w:rPr>
-          <w:i/>
-          <w:iCs/>
-        </w:rPr>
-        <w:t xml:space="preserve">Model number </w:t>
-      </w:r>
-      <w:r>
-        <w:rPr>
-          <w:i/>
-          <w:iCs/>
-        </w:rPr>
-        <w:t>→</w:t>
-      </w:r>
-      <w:r>
-        <w:rPr>
-          <w:i/>
-          <w:iCs/>
-        </w:rPr>
-        <w:t xml:space="preserve"> </w:t>
-      </w:r>
-      <w:r>
-        <w:rPr>
-          <w:b/>
-          <w:bCs/>
-        </w:rPr>
-        <w:t xml:space="preserve">Airplane models </w:t>
-      </w:r>
-      <w:r>
-        <w:t>(</w:t>
-      </w:r>
-      <w:r>
-        <w:rPr>
-          <w:u w:val="single"/>
-        </w:rPr>
-        <w:t>model number</w:t>
-      </w:r>
-      <w:r>
-        <w:t>)</w:t>
-      </w:r>
-    </w:p>
-    <w:p>
-      <w:r>
-        <w:rPr>
-          <w:b/>
-          <w:bCs/>
-        </w:rPr>
-        <w:t>Test Events</w:t>
-      </w:r>
-      <w:r>
-        <w:t xml:space="preserve"> (</w:t>
-      </w:r>
-      <w:r>
-        <w:rPr>
-          <w:u w:val="single"/>
-        </w:rPr>
-        <w:t>test event number</w:t>
-      </w:r>
-      <w:r>
-        <w:t xml:space="preserve">, </w:t>
-      </w:r>
-      <w:r>
-        <w:rPr>
-          <w:i/>
-          <w:iCs/>
-        </w:rPr>
-        <w:t>test number</w:t>
-      </w:r>
-      <w:r>
-        <w:t xml:space="preserve">, </w:t>
-      </w:r>
-      <w:r>
-        <w:rPr>
-          <w:i/>
-          <w:iCs/>
-        </w:rPr>
-        <w:t>registration number</w:t>
-      </w:r>
-      <w:r>
-        <w:t xml:space="preserve">, </w:t>
-      </w:r>
-      <w:r>
-        <w:rPr>
-          <w:i/>
-          <w:iCs/>
-        </w:rPr>
-        <w:t>social security number</w:t>
-      </w:r>
-      <w:r>
-        <w:t>, date, hours spent, score)</w:t>
-      </w:r>
-    </w:p>
-    <w:p>
-      <w:pPr>
-        <w:pStyle w:val="ListParagraph"/>
-        <w:numPr>
-          <w:ilvl w:val="0"/>
-          <w:numId w:val="12"/>
-        </w:numPr>
-      </w:pPr>
-      <w:r>
-        <w:rPr>
-          <w:i/>
-          <w:iCs/>
-        </w:rPr>
-        <w:t>Test number</w:t>
-      </w:r>
-      <w:r>
-        <w:rPr>
-          <w:i/>
-          <w:iCs/>
-        </w:rPr>
-        <w:t xml:space="preserve"> </w:t>
-      </w:r>
-      <w:r>
-        <w:rPr>
-          <w:i/>
-          <w:iCs/>
-        </w:rPr>
-        <w:t>→</w:t>
-      </w:r>
-      <w:r>
-        <w:rPr>
-          <w:i/>
-          <w:iCs/>
-        </w:rPr>
-        <w:t xml:space="preserve"> </w:t>
-      </w:r>
-      <w:r>
-        <w:rPr>
-          <w:b/>
-          <w:bCs/>
-        </w:rPr>
-        <w:t>Airworthy test model</w:t>
-      </w:r>
-      <w:r>
-        <w:rPr>
-          <w:b/>
-          <w:bCs/>
-        </w:rPr>
-        <w:t xml:space="preserve"> </w:t>
-      </w:r>
-      <w:r>
-        <w:t>(</w:t>
-      </w:r>
-      <w:r>
-        <w:rPr>
-          <w:u w:val="single"/>
-        </w:rPr>
-        <w:t>test number</w:t>
-      </w:r>
-      <w:r>
-        <w:t>)</w:t>
-      </w:r>
-    </w:p>
-    <w:p>
-      <w:pPr>
-        <w:pStyle w:val="ListParagraph"/>
-        <w:numPr>
-          <w:ilvl w:val="0"/>
-          <w:numId w:val="12"/>
-        </w:numPr>
-      </w:pPr>
-      <w:r>
-        <w:rPr>
-          <w:i/>
-          <w:iCs/>
-        </w:rPr>
-        <w:t>Registration number</w:t>
-      </w:r>
-      <w:r>
-        <w:rPr>
-          <w:i/>
-          <w:iCs/>
-        </w:rPr>
-        <w:t xml:space="preserve"> </w:t>
-      </w:r>
-      <w:r>
-        <w:rPr>
-          <w:i/>
-          <w:iCs/>
-        </w:rPr>
-        <w:t>→</w:t>
-      </w:r>
-      <w:r>
-        <w:rPr>
-          <w:i/>
-          <w:iCs/>
-        </w:rPr>
-        <w:t xml:space="preserve"> </w:t>
-      </w:r>
-      <w:r>
-        <w:rPr>
-          <w:b/>
-          <w:bCs/>
-        </w:rPr>
-        <w:t>Airplane</w:t>
-      </w:r>
-      <w:r>
-        <w:rPr>
-          <w:b/>
-          <w:bCs/>
-        </w:rPr>
-        <w:t xml:space="preserve"> </w:t>
-      </w:r>
-      <w:r>
-        <w:t>(</w:t>
-      </w:r>
-      <w:r>
-        <w:rPr>
-          <w:u w:val="single"/>
-        </w:rPr>
-        <w:t>Registration number</w:t>
-      </w:r>
-      <w:r>
-        <w:t>)</w:t>
-      </w:r>
-    </w:p>
-    <w:p>
-      <w:pPr>
-        <w:pStyle w:val="ListParagraph"/>
-        <w:numPr>
-          <w:ilvl w:val="0"/>
-          <w:numId w:val="12"/>
-        </w:numPr>
-      </w:pPr>
-      <w:r>
-        <w:rPr>
-          <w:i/>
-          <w:iCs/>
-        </w:rPr>
-        <w:t>Social security number</w:t>
-      </w:r>
-      <w:r>
-        <w:rPr>
-          <w:i/>
-          <w:iCs/>
-        </w:rPr>
-        <w:t xml:space="preserve"> </w:t>
-      </w:r>
-      <w:r>
-        <w:rPr>
-          <w:i/>
-          <w:iCs/>
-        </w:rPr>
-        <w:t>→</w:t>
-      </w:r>
-      <w:r>
-        <w:rPr>
-          <w:i/>
-          <w:iCs/>
-        </w:rPr>
-        <w:t xml:space="preserve"> </w:t>
-      </w:r>
-      <w:r>
-        <w:rPr>
-          <w:b/>
-          <w:bCs/>
-        </w:rPr>
-        <w:t>Technicians</w:t>
-      </w:r>
-      <w:r>
-        <w:rPr>
-          <w:b/>
-          <w:bCs/>
-        </w:rPr>
-        <w:t xml:space="preserve"> </w:t>
-      </w:r>
-      <w:r>
-        <w:t>(</w:t>
-      </w:r>
-      <w:r>
-        <w:rPr>
-          <w:u w:val="single"/>
-        </w:rPr>
-        <w:t>social security number</w:t>
-      </w:r>
-      <w:r>
-        <w:t>)</w:t>
-      </w:r>
-    </w:p>
-    <w:p>
-      <w:r>
-        <w:rPr>
-          <w:b/>
-          <w:bCs/>
-        </w:rPr>
-        <w:t>Technicians</w:t>
-      </w:r>
-      <w:r>
-        <w:t xml:space="preserve"> (</w:t>
-      </w:r>
-      <w:r>
-        <w:rPr>
-          <w:i/>
-          <w:iCs/>
-          <w:u w:val="single"/>
-        </w:rPr>
-        <w:t>social security number</w:t>
-      </w:r>
-      <w:r>
-        <w:t>)</w:t>
-      </w:r>
-    </w:p>
-    <w:p>
-      <w:pPr>
-        <w:pStyle w:val="ListParagraph"/>
-        <w:numPr>
-          <w:ilvl w:val="0"/>
-          <w:numId w:val="12"/>
-        </w:numPr>
-      </w:pPr>
-      <w:r>
-        <w:rPr>
-          <w:i/>
-          <w:iCs/>
-        </w:rPr>
-        <w:t xml:space="preserve">Social security number </w:t>
-      </w:r>
-      <w:r>
-        <w:rPr>
-          <w:i/>
-          <w:iCs/>
-        </w:rPr>
-        <w:t>→</w:t>
-      </w:r>
-      <w:r>
-        <w:rPr>
-          <w:i/>
-          <w:iCs/>
-        </w:rPr>
-        <w:t xml:space="preserve"> </w:t>
-      </w:r>
-      <w:r>
-        <w:rPr>
-          <w:b/>
-          <w:bCs/>
-        </w:rPr>
-        <w:t>Employee</w:t>
-      </w:r>
-      <w:r>
-        <w:rPr>
-          <w:b/>
-          <w:bCs/>
-        </w:rPr>
-        <w:t xml:space="preserve"> </w:t>
-      </w:r>
-      <w:r>
-        <w:t>(</w:t>
-      </w:r>
-      <w:r>
-        <w:rPr>
-          <w:u w:val="single"/>
-        </w:rPr>
-        <w:t>social security number</w:t>
-      </w:r>
-      <w:r>
-        <w:t>)</w:t>
-      </w:r>
-    </w:p>
-    <w:p>
-      <w:r>
-        <w:rPr>
-          <w:b/>
-          <w:bCs/>
-        </w:rPr>
-        <w:t>Traffic controllers</w:t>
-      </w:r>
-      <w:r>
-        <w:rPr>
-          <w:b/>
-          <w:bCs/>
-        </w:rPr>
-        <w:t xml:space="preserve"> </w:t>
-      </w:r>
-      <w:r>
-        <w:t>(</w:t>
-      </w:r>
-      <w:r>
-        <w:rPr>
-          <w:i/>
-          <w:iCs/>
-          <w:u w:val="single"/>
-        </w:rPr>
-        <w:t>social security number</w:t>
-      </w:r>
-      <w:r>
-        <w:t>, last examination date)</w:t>
-      </w:r>
-    </w:p>
-    <w:p>
-      <w:pPr>
-        <w:pStyle w:val="ListParagraph"/>
-        <w:numPr>
-          <w:ilvl w:val="0"/>
-          <w:numId w:val="12"/>
-        </w:numPr>
-      </w:pPr>
-      <w:r>
-        <w:rPr>
-          <w:i/>
-          <w:iCs/>
-        </w:rPr>
-        <w:t xml:space="preserve">Social security number </w:t>
-      </w:r>
-      <w:r>
-        <w:rPr>
-          <w:i/>
-          <w:iCs/>
-        </w:rPr>
-        <w:t>→</w:t>
-      </w:r>
-      <w:r>
-        <w:rPr>
-          <w:i/>
-          <w:iCs/>
-        </w:rPr>
-        <w:t xml:space="preserve"> </w:t>
-      </w:r>
-      <w:r>
-        <w:rPr>
-          <w:b/>
-          <w:bCs/>
-        </w:rPr>
-        <w:t xml:space="preserve">Employee </w:t>
-      </w:r>
-      <w:r>
-        <w:t>(</w:t>
-      </w:r>
-      <w:r>
-        <w:rPr>
-          <w:u w:val="single"/>
-        </w:rPr>
-        <w:t>social security number</w:t>
-      </w:r>
-      <w:r>
-        <w:t>)</w:t>
-      </w:r>
-    </w:p>
-    <w:p>
-      <w:r>
-        <w:rPr>
-          <w:b/>
-          <w:bCs/>
-        </w:rPr>
-        <w:t>Airworthy test</w:t>
-      </w:r>
-      <w:r>
-        <w:t xml:space="preserve"> (</w:t>
-      </w:r>
-      <w:r>
-        <w:rPr>
-          <w:u w:val="single"/>
-        </w:rPr>
-        <w:t>test number</w:t>
-      </w:r>
-      <w:r>
-        <w:t>, name, max score)</w:t>
-      </w:r>
-    </w:p>
-    <w:p>
-      <w:r>
-        <w:rPr>
-          <w:b/>
-          <w:bCs/>
-        </w:rPr>
-        <w:t>Airplane models</w:t>
-      </w:r>
-      <w:r>
-        <w:t xml:space="preserve"> (</w:t>
-      </w:r>
-      <w:r>
-        <w:rPr>
-          <w:u w:val="single"/>
-        </w:rPr>
-        <w:t>model number</w:t>
-      </w:r>
-      <w:r>
-        <w:t>, capacity, weight</w:t>
-      </w:r>
-      <w:r>
-        <w:t>, seats, max speed</w:t>
-      </w:r>
-      <w:r>
-        <w:t>)</w:t>
-      </w:r>
-    </w:p>
-    <w:p>
-      <w:r>
-        <w:rPr>
-          <w:b/>
-          <w:bCs/>
-        </w:rPr>
-        <w:t>Technicians’ expertise</w:t>
-      </w:r>
-      <w:r>
-        <w:t xml:space="preserve"> (</w:t>
-      </w:r>
-      <w:r>
-        <w:rPr>
-          <w:i/>
-          <w:iCs/>
-          <w:u w:val="single"/>
-        </w:rPr>
-        <w:t>model number</w:t>
-      </w:r>
-      <w:r>
-        <w:t xml:space="preserve">, </w:t>
-      </w:r>
-      <w:r>
-        <w:rPr>
-          <w:i/>
-          <w:iCs/>
-          <w:u w:val="single"/>
-        </w:rPr>
-        <w:t>social security number</w:t>
-      </w:r>
-      <w:r>
-        <w:t>)</w:t>
-      </w:r>
-    </w:p>
-    <w:p>
-      <w:pPr>
-        <w:pStyle w:val="ListParagraph"/>
-        <w:numPr>
-          <w:ilvl w:val="0"/>
-          <w:numId w:val="12"/>
-        </w:numPr>
-      </w:pPr>
-      <w:r>
-        <w:rPr>
-          <w:i/>
-          <w:iCs/>
-        </w:rPr>
-        <w:t xml:space="preserve">Model number </w:t>
-      </w:r>
-      <w:r>
-        <w:rPr>
-          <w:i/>
-          <w:iCs/>
-        </w:rPr>
-        <w:t>→</w:t>
-      </w:r>
-      <w:r>
-        <w:rPr>
-          <w:i/>
-          <w:iCs/>
-        </w:rPr>
-        <w:t xml:space="preserve"> </w:t>
-      </w:r>
-      <w:r>
-        <w:rPr>
-          <w:b/>
-          <w:bCs/>
-        </w:rPr>
-        <w:t xml:space="preserve">Airplane models </w:t>
-      </w:r>
-      <w:r>
-        <w:t>(</w:t>
-      </w:r>
-      <w:r>
-        <w:rPr>
-          <w:u w:val="single"/>
-        </w:rPr>
-        <w:t>model number</w:t>
-      </w:r>
-      <w:r>
-        <w:t>)</w:t>
-      </w:r>
-    </w:p>
-    <w:p>
-      <w:pPr>
-        <w:pStyle w:val="ListParagraph"/>
-        <w:numPr>
-          <w:ilvl w:val="0"/>
-          <w:numId w:val="12"/>
-        </w:numPr>
-      </w:pPr>
-      <w:r>
-        <w:rPr>
-          <w:i/>
-          <w:iCs/>
-        </w:rPr>
-        <w:t xml:space="preserve">Social security number </w:t>
-      </w:r>
-      <w:r>
-        <w:rPr>
-          <w:i/>
-          <w:iCs/>
-        </w:rPr>
-        <w:t>→</w:t>
-      </w:r>
-      <w:r>
-        <w:rPr>
-          <w:i/>
-          <w:iCs/>
-        </w:rPr>
-        <w:t xml:space="preserve"> </w:t>
-      </w:r>
-      <w:r>
-        <w:rPr>
-          <w:b/>
-          <w:bCs/>
-        </w:rPr>
-        <w:t xml:space="preserve">Technicians </w:t>
-      </w:r>
-      <w:r>
-        <w:t>(</w:t>
-      </w:r>
-      <w:r>
-        <w:rPr>
-          <w:u w:val="single"/>
-        </w:rPr>
-        <w:t>social security number</w:t>
-      </w:r>
-      <w:r>
-        <w:t>)</w:t>
-      </w:r>
-    </w:p>
-    <w:p>
-      <w:r>
-        <w:t>*Note: The underlined attributes are primary key, and the italic attributes are foreign key.</w:t>
-      </w:r>
-    </w:p>
-    <w:p/>
-    <w:p/>
-    <w:p/>
-    <w:p/>
-    <w:p>
-      <w:pPr>
-        <w:pStyle w:val="Heading2"/>
-      </w:pPr>
-      <w:bookmarkStart w:id="3" w:name="_Toc236649200"/>
-      <w:r>
-        <w:lastRenderedPageBreak/>
-        <w:t>Normalization</w:t>
-      </w:r>
-      <w:bookmarkEnd w:id="3"/>
-    </w:p>
-    <w:p>
-      <w:r>
-        <w:tab/>
-      </w:r>
-      <w:r>
-        <w:t xml:space="preserve">The relational </w:t>
-      </w:r>
-      <w:r>
-        <w:t>schem</w:t>
-      </w:r>
-      <w:r>
-        <w:t>a</w:t>
-      </w:r>
-      <w:r>
-        <w:t xml:space="preserve"> of the </w:t>
-      </w:r>
-      <w:r>
-        <w:t>airport database system already meets the 3NF</w:t>
-      </w:r>
-      <w:r>
-        <w:t xml:space="preserve">, since the ERD of the database. Although there were no values included, it will be ensured that attributes in every </w:t>
-      </w:r>
-      <w:r>
-        <w:t>cell</w:t>
-      </w:r>
-      <w:r>
-        <w:t xml:space="preserve"> only contain one single value.</w:t>
-      </w:r>
-    </w:p>
-    <w:p>
-      <w:pPr>
-        <w:pStyle w:val="Heading3"/>
-      </w:pPr>
-      <w:bookmarkStart w:id="4" w:name="_Toc236649201"/>
-      <w:r>
-        <w:t>First Normalization</w:t>
-      </w:r>
-      <w:bookmarkEnd w:id="4"/>
-    </w:p>
-    <w:p>
-      <w:r>
-        <w:tab/>
-      </w:r>
-      <w:r>
-        <w:t xml:space="preserve">Every cell in the airport database entities will have only one single value. </w:t>
-      </w:r>
-      <w:r>
-        <w:t>The entities in the airport database don’t have repeating groups, such as duplicated column names as well as no multi-values in each cell. Due to these, the ERD fulfills the 1NF form of the three normalization steps.</w:t>
-      </w:r>
-    </w:p>
-    <w:p>
-      <w:pPr>
-        <w:pStyle w:val="Heading3"/>
-      </w:pPr>
-      <w:bookmarkStart w:id="5" w:name="_Toc236649202"/>
-      <w:r>
-        <w:t>Second Normalization</w:t>
-      </w:r>
-      <w:bookmarkEnd w:id="5"/>
-    </w:p>
-    <w:p>
-      <w:r>
-        <w:tab/>
-      </w:r>
-      <w:r>
-        <w:t>The entities of airport database satisfy 2NF</w:t>
-      </w:r>
-      <w:r>
-        <w:t>. The ERD already satisfy first normalization form, and as there are only one primary keys for each table, the entities also satisfy second normalization form. For example, in an employee table, the social security number of an employee is the only primary key. Thus, all other non-key</w:t>
-      </w:r>
-      <w:r>
-        <w:t xml:space="preserve"> and key</w:t>
-      </w:r>
-      <w:r>
-        <w:t xml:space="preserve"> columns depend solely on one key</w:t>
-      </w:r>
-      <w:r>
-        <w:t>,</w:t>
-      </w:r>
-      <w:r>
-        <w:t xml:space="preserve"> which is a primary key. Additionally,</w:t>
-      </w:r>
-      <w:r>
-        <w:t xml:space="preserve"> there are no composite primary keys in every table except for the composite table.</w:t>
-      </w:r>
-    </w:p>
-    <w:p>
-      <w:pPr>
-        <w:pStyle w:val="Heading3"/>
-      </w:pPr>
-      <w:r>
-        <w:t>Third Normalization</w:t>
-      </w:r>
-    </w:p>
-    <w:p>
-      <w:r>
-        <w:tab/>
-      </w:r>
-      <w:r>
-        <w:t xml:space="preserve">As the system is already in second normalization form, the next step is to put them in third normalization form 3NF. </w:t>
-      </w:r>
-      <w:r>
-        <w:t>Every</w:t>
-      </w:r>
-      <w:r>
-        <w:t xml:space="preserve"> entity in the airplane table already follows 3NF as </w:t>
-      </w:r>
-      <w:r>
-        <w:t>none</w:t>
-      </w:r>
-      <w:r>
-        <w:t xml:space="preserve"> of the non-key </w:t>
-      </w:r>
-      <w:r>
-        <w:t>attributes</w:t>
-      </w:r>
-      <w:r>
-        <w:t xml:space="preserve"> determines another non-key attribute. There </w:t>
-      </w:r>
-      <w:r>
-        <w:t>are</w:t>
-      </w:r>
-      <w:r>
-        <w:t xml:space="preserve"> no transitive dependencies within every table. </w:t>
-      </w:r>
-      <w:r>
-        <w:t>However, the airplane entity has transitive dependency, where the plane’s seats and max speed can depend on airplane’s</w:t>
-      </w:r>
-      <w:r>
-        <w:t xml:space="preserve"> model number, which is a foreign key. </w:t>
-      </w:r>
-      <w:r>
-        <w:t>To fix this, the seats and max speed attributes will be moved to the airplane models table to eliminate transitive dependency.</w:t>
-      </w:r>
-    </w:p>
-    <w:p>
-      <w:pPr>
-        <w:keepNext/>
-        <w:jc w:val="center"/>
-      </w:pPr>
-      <w:r>
-        <w:rPr>
-          <w:noProof/>
-        </w:rPr>
-        <w:lastRenderedPageBreak/>
-        <w:drawing>
-          <wp:inline distT="0" distB="0" distL="0" distR="0" wp14:anchorId="51195B49" wp14:editId="58EA9E51">
-            <wp:extent cx="5943600" cy="2522220"/>
-            <wp:effectExtent l="19050" t="19050" r="19050" b="11430"/>
-            <wp:docPr id="719003747" name="Picture 2"/>
-            <wp:cNvGraphicFramePr>
-              <a:graphicFrameLocks xmlns:a="http://schemas.openxmlformats.org/drawingml/2006/main" noChangeAspect="1"/>
-            </wp:cNvGraphicFramePr>
-            <a:graphic xmlns:a="http://schemas.openxmlformats.org/drawingml/2006/main">
-              <a:graphicData uri="http://schemas.openxmlformats.org/drawingml/2006/picture">
-                <pic:pic xmlns:pic="http://schemas.openxmlformats.org/drawingml/2006/picture">
-                  <pic:nvPicPr>
-                    <pic:cNvPr id="0" name="Picture 1"/>
-                    <pic:cNvPicPr>
-                      <a:picLocks noChangeAspect="1" noChangeArrowheads="1"/>
-                    </pic:cNvPicPr>
-                  </pic:nvPicPr>
-                  <pic:blipFill>
-                    <a:blip r:embed="rId10">
-                      <a:extLst>
-                        <a:ext uri="{28A0092B-C50C-407E-A947-70E740481C1C}">
-                          <a14:useLocalDpi xmlns:a14="http://schemas.microsoft.com/office/drawing/2010/main" val="0"/>
-                        </a:ext>
-                      </a:extLst>
-                    </a:blip>
-                    <a:srcRect/>
-                    <a:stretch>
-                      <a:fillRect/>
-                    </a:stretch>
-                  </pic:blipFill>
-                  <pic:spPr bwMode="auto">
-                    <a:xfrm>
-                      <a:off x="0" y="0"/>
-                      <a:ext cx="5943600" cy="2522220"/>
-                    </a:xfrm>
-                    <a:prstGeom prst="rect">
-                      <a:avLst/>
-                    </a:prstGeom>
-                    <a:noFill/>
-                    <a:ln>
-                      <a:solidFill>
-                        <a:schemeClr val="tx1"/>
-                      </a:solidFill>
-                    </a:ln>
-                  </pic:spPr>
-                </pic:pic>
-              </a:graphicData>
-            </a:graphic>
-          </wp:inline>
-        </w:drawing>
-      </w:r>
-    </w:p>
-    <w:p>
-      <w:pPr>
-        <w:jc w:val="center"/>
-      </w:pPr>
-      <w:r>
-        <w:t xml:space="preserve">Figure </w:t>
-      </w:r>
-      <w:fldSimple w:instr=" SEQ Figure \* ARABIC ">
-        <w:r>
-          <w:rPr>
-            <w:noProof/>
-          </w:rPr>
-          <w:t>3</w:t>
-        </w:r>
-      </w:fldSimple>
-      <w:r>
-        <w:t xml:space="preserve"> Amended ERD</w:t>
-      </w:r>
-    </w:p>
-    <w:p>
-      <w:r>
-        <w:tab/>
-      </w:r>
-      <w:r>
-        <w:t>The ERD above has amended entity for airplane and airplane models. The attributes in each entity</w:t>
-      </w:r>
-      <w:r>
-        <w:t xml:space="preserve"> are now only dependent on primary </w:t>
-      </w:r>
-      <w:r>
-        <w:t>key,</w:t>
-      </w:r>
-      <w:r>
-        <w:t xml:space="preserve"> and they are no longer dependent on the other non-key attributes.</w:t>
-      </w:r>
-    </w:p>
-    <w:p>
-      <w:pPr>
-        <w:spacing w:line="278" w:lineRule="auto"/>
-        <w:jc w:val="left"/>
-      </w:pPr>
-      <w:r>
-        <w:br w:type="page"/>
-      </w:r>
-    </w:p>
-    <w:p>
-      <w:pPr>
-        <w:pStyle w:val="Heading1"/>
-      </w:pPr>
-      <w:r>
-        <w:lastRenderedPageBreak/>
-        <w:t>Task D</w:t>
-      </w:r>
-    </w:p>
-    <w:p/>
     <w:sectPr>
       <w:pgSz w:w="12240" w:h="15840"/>
       <w:pgMar w:top="1440" w:right="1440" w:bottom="1440" w:left="1440" w:header="720" w:footer="720" w:gutter="0"/>
@@ -4240,7 +3622,6 @@
   <w:style w:type="character" w:default="1" w:styleId="DefaultParagraphFont">
     <w:name w:val="Default Paragraph Font"/>
     <w:uiPriority w:val="1"/>
-    <w:semiHidden/>
     <w:unhideWhenUsed/>
   </w:style>
   <w:style w:type="table" w:default="1" w:styleId="TableNormal">

</xml_diff>

<commit_message>
Airport database update 9 Aug
</commit_message>
<xml_diff>
--- a/2. Airport Database System/40841063_HLUM HTET AUNG Part 2 - Database/40841063_Part 2 Database Report.docx
+++ b/2. Airport Database System/40841063_HLUM HTET AUNG Part 2 - Database/40841063_Part 2 Database Report.docx
@@ -137,7 +137,7 @@
           <w:r>
             <w:fldChar w:fldCharType="separate"/>
           </w:r>
-          <w:hyperlink w:anchor="_Toc237113727" w:history="1">
+          <w:hyperlink w:anchor="_Toc237195862" w:history="1">
             <w:r>
               <w:rPr>
                 <w:rStyle w:val="Hyperlink"/>
@@ -164,7 +164,7 @@
                 <w:noProof/>
                 <w:webHidden/>
               </w:rPr>
-              <w:instrText xml:space="preserve"> PAGEREF _Toc237113727 \h </w:instrText>
+              <w:instrText xml:space="preserve"> PAGEREF _Toc237195862 \h </w:instrText>
             </w:r>
             <w:r>
               <w:rPr>
@@ -206,7 +206,7 @@
               <w:noProof/>
             </w:rPr>
           </w:pPr>
-          <w:hyperlink w:anchor="_Toc237113728" w:history="1">
+          <w:hyperlink w:anchor="_Toc237195863" w:history="1">
             <w:r>
               <w:rPr>
                 <w:rStyle w:val="Hyperlink"/>
@@ -233,7 +233,7 @@
                 <w:noProof/>
                 <w:webHidden/>
               </w:rPr>
-              <w:instrText xml:space="preserve"> PAGEREF _Toc237113728 \h </w:instrText>
+              <w:instrText xml:space="preserve"> PAGEREF _Toc237195863 \h </w:instrText>
             </w:r>
             <w:r>
               <w:rPr>
@@ -254,6 +254,351 @@
                 <w:webHidden/>
               </w:rPr>
               <w:t>3</w:t>
+            </w:r>
+            <w:r>
+              <w:rPr>
+                <w:noProof/>
+                <w:webHidden/>
+              </w:rPr>
+              <w:fldChar w:fldCharType="end"/>
+            </w:r>
+          </w:hyperlink>
+        </w:p>
+        <w:p>
+          <w:pPr>
+            <w:pStyle w:val="TOC3"/>
+            <w:tabs>
+              <w:tab w:val="right" w:leader="dot" w:pos="9350"/>
+            </w:tabs>
+            <w:rPr>
+              <w:rFonts w:asciiTheme="minorHAnsi" w:eastAsiaTheme="minorEastAsia" w:hAnsiTheme="minorHAnsi"/>
+              <w:noProof/>
+            </w:rPr>
+          </w:pPr>
+          <w:hyperlink w:anchor="_Toc237195864" w:history="1">
+            <w:r>
+              <w:rPr>
+                <w:rStyle w:val="Hyperlink"/>
+                <w:noProof/>
+              </w:rPr>
+              <w:t>Relational Schema Table</w:t>
+            </w:r>
+            <w:r>
+              <w:rPr>
+                <w:noProof/>
+                <w:webHidden/>
+              </w:rPr>
+              <w:tab/>
+            </w:r>
+            <w:r>
+              <w:rPr>
+                <w:noProof/>
+                <w:webHidden/>
+              </w:rPr>
+              <w:fldChar w:fldCharType="begin"/>
+            </w:r>
+            <w:r>
+              <w:rPr>
+                <w:noProof/>
+                <w:webHidden/>
+              </w:rPr>
+              <w:instrText xml:space="preserve"> PAGEREF _Toc237195864 \h </w:instrText>
+            </w:r>
+            <w:r>
+              <w:rPr>
+                <w:noProof/>
+                <w:webHidden/>
+              </w:rPr>
+            </w:r>
+            <w:r>
+              <w:rPr>
+                <w:noProof/>
+                <w:webHidden/>
+              </w:rPr>
+              <w:fldChar w:fldCharType="separate"/>
+            </w:r>
+            <w:r>
+              <w:rPr>
+                <w:noProof/>
+                <w:webHidden/>
+              </w:rPr>
+              <w:t>4</w:t>
+            </w:r>
+            <w:r>
+              <w:rPr>
+                <w:noProof/>
+                <w:webHidden/>
+              </w:rPr>
+              <w:fldChar w:fldCharType="end"/>
+            </w:r>
+          </w:hyperlink>
+        </w:p>
+        <w:p>
+          <w:pPr>
+            <w:pStyle w:val="TOC2"/>
+            <w:tabs>
+              <w:tab w:val="right" w:leader="dot" w:pos="9350"/>
+            </w:tabs>
+            <w:rPr>
+              <w:rFonts w:asciiTheme="minorHAnsi" w:eastAsiaTheme="minorEastAsia" w:hAnsiTheme="minorHAnsi"/>
+              <w:noProof/>
+            </w:rPr>
+          </w:pPr>
+          <w:hyperlink w:anchor="_Toc237195865" w:history="1">
+            <w:r>
+              <w:rPr>
+                <w:rStyle w:val="Hyperlink"/>
+                <w:noProof/>
+              </w:rPr>
+              <w:t>Normalization</w:t>
+            </w:r>
+            <w:r>
+              <w:rPr>
+                <w:noProof/>
+                <w:webHidden/>
+              </w:rPr>
+              <w:tab/>
+            </w:r>
+            <w:r>
+              <w:rPr>
+                <w:noProof/>
+                <w:webHidden/>
+              </w:rPr>
+              <w:fldChar w:fldCharType="begin"/>
+            </w:r>
+            <w:r>
+              <w:rPr>
+                <w:noProof/>
+                <w:webHidden/>
+              </w:rPr>
+              <w:instrText xml:space="preserve"> PAGEREF _Toc237195865 \h </w:instrText>
+            </w:r>
+            <w:r>
+              <w:rPr>
+                <w:noProof/>
+                <w:webHidden/>
+              </w:rPr>
+            </w:r>
+            <w:r>
+              <w:rPr>
+                <w:noProof/>
+                <w:webHidden/>
+              </w:rPr>
+              <w:fldChar w:fldCharType="separate"/>
+            </w:r>
+            <w:r>
+              <w:rPr>
+                <w:noProof/>
+                <w:webHidden/>
+              </w:rPr>
+              <w:t>5</w:t>
+            </w:r>
+            <w:r>
+              <w:rPr>
+                <w:noProof/>
+                <w:webHidden/>
+              </w:rPr>
+              <w:fldChar w:fldCharType="end"/>
+            </w:r>
+          </w:hyperlink>
+        </w:p>
+        <w:p>
+          <w:pPr>
+            <w:pStyle w:val="TOC3"/>
+            <w:tabs>
+              <w:tab w:val="right" w:leader="dot" w:pos="9350"/>
+            </w:tabs>
+            <w:rPr>
+              <w:rFonts w:asciiTheme="minorHAnsi" w:eastAsiaTheme="minorEastAsia" w:hAnsiTheme="minorHAnsi"/>
+              <w:noProof/>
+            </w:rPr>
+          </w:pPr>
+          <w:hyperlink w:anchor="_Toc237195866" w:history="1">
+            <w:r>
+              <w:rPr>
+                <w:rStyle w:val="Hyperlink"/>
+                <w:noProof/>
+              </w:rPr>
+              <w:t>First Normal Form (1NF)</w:t>
+            </w:r>
+            <w:r>
+              <w:rPr>
+                <w:noProof/>
+                <w:webHidden/>
+              </w:rPr>
+              <w:tab/>
+            </w:r>
+            <w:r>
+              <w:rPr>
+                <w:noProof/>
+                <w:webHidden/>
+              </w:rPr>
+              <w:fldChar w:fldCharType="begin"/>
+            </w:r>
+            <w:r>
+              <w:rPr>
+                <w:noProof/>
+                <w:webHidden/>
+              </w:rPr>
+              <w:instrText xml:space="preserve"> PAGEREF _Toc237195866 \h </w:instrText>
+            </w:r>
+            <w:r>
+              <w:rPr>
+                <w:noProof/>
+                <w:webHidden/>
+              </w:rPr>
+            </w:r>
+            <w:r>
+              <w:rPr>
+                <w:noProof/>
+                <w:webHidden/>
+              </w:rPr>
+              <w:fldChar w:fldCharType="separate"/>
+            </w:r>
+            <w:r>
+              <w:rPr>
+                <w:noProof/>
+                <w:webHidden/>
+              </w:rPr>
+              <w:t>5</w:t>
+            </w:r>
+            <w:r>
+              <w:rPr>
+                <w:noProof/>
+                <w:webHidden/>
+              </w:rPr>
+              <w:fldChar w:fldCharType="end"/>
+            </w:r>
+          </w:hyperlink>
+        </w:p>
+        <w:p>
+          <w:pPr>
+            <w:pStyle w:val="TOC3"/>
+            <w:tabs>
+              <w:tab w:val="right" w:leader="dot" w:pos="9350"/>
+            </w:tabs>
+            <w:rPr>
+              <w:rFonts w:asciiTheme="minorHAnsi" w:eastAsiaTheme="minorEastAsia" w:hAnsiTheme="minorHAnsi"/>
+              <w:noProof/>
+            </w:rPr>
+          </w:pPr>
+          <w:hyperlink w:anchor="_Toc237195867" w:history="1">
+            <w:r>
+              <w:rPr>
+                <w:rStyle w:val="Hyperlink"/>
+                <w:noProof/>
+              </w:rPr>
+              <w:t>Second Normal Form (2NF)</w:t>
+            </w:r>
+            <w:r>
+              <w:rPr>
+                <w:noProof/>
+                <w:webHidden/>
+              </w:rPr>
+              <w:tab/>
+            </w:r>
+            <w:r>
+              <w:rPr>
+                <w:noProof/>
+                <w:webHidden/>
+              </w:rPr>
+              <w:fldChar w:fldCharType="begin"/>
+            </w:r>
+            <w:r>
+              <w:rPr>
+                <w:noProof/>
+                <w:webHidden/>
+              </w:rPr>
+              <w:instrText xml:space="preserve"> PAGEREF _Toc237195867 \h </w:instrText>
+            </w:r>
+            <w:r>
+              <w:rPr>
+                <w:noProof/>
+                <w:webHidden/>
+              </w:rPr>
+            </w:r>
+            <w:r>
+              <w:rPr>
+                <w:noProof/>
+                <w:webHidden/>
+              </w:rPr>
+              <w:fldChar w:fldCharType="separate"/>
+            </w:r>
+            <w:r>
+              <w:rPr>
+                <w:noProof/>
+                <w:webHidden/>
+              </w:rPr>
+              <w:t>6</w:t>
+            </w:r>
+            <w:r>
+              <w:rPr>
+                <w:noProof/>
+                <w:webHidden/>
+              </w:rPr>
+              <w:fldChar w:fldCharType="end"/>
+            </w:r>
+          </w:hyperlink>
+        </w:p>
+        <w:p>
+          <w:pPr>
+            <w:pStyle w:val="TOC3"/>
+            <w:tabs>
+              <w:tab w:val="right" w:leader="dot" w:pos="9350"/>
+            </w:tabs>
+            <w:rPr>
+              <w:rFonts w:asciiTheme="minorHAnsi" w:eastAsiaTheme="minorEastAsia" w:hAnsiTheme="minorHAnsi"/>
+              <w:noProof/>
+            </w:rPr>
+          </w:pPr>
+          <w:hyperlink w:anchor="_Toc237195868" w:history="1">
+            <w:r>
+              <w:rPr>
+                <w:rStyle w:val="Hyperlink"/>
+                <w:noProof/>
+              </w:rPr>
+              <w:t>Third Normal Form (3NF)</w:t>
+            </w:r>
+            <w:r>
+              <w:rPr>
+                <w:noProof/>
+                <w:webHidden/>
+              </w:rPr>
+              <w:tab/>
+            </w:r>
+            <w:r>
+              <w:rPr>
+                <w:noProof/>
+                <w:webHidden/>
+              </w:rPr>
+              <w:fldChar w:fldCharType="begin"/>
+            </w:r>
+            <w:r>
+              <w:rPr>
+                <w:noProof/>
+                <w:webHidden/>
+              </w:rPr>
+              <w:instrText xml:space="preserve"> PAGEREF _Toc237195868 \h </w:instrText>
+            </w:r>
+            <w:r>
+              <w:rPr>
+                <w:noProof/>
+                <w:webHidden/>
+              </w:rPr>
+            </w:r>
+            <w:r>
+              <w:rPr>
+                <w:noProof/>
+                <w:webHidden/>
+              </w:rPr>
+              <w:fldChar w:fldCharType="separate"/>
+            </w:r>
+            <w:r>
+              <w:rPr>
+                <w:noProof/>
+                <w:webHidden/>
+              </w:rPr>
+              <w:t>6</w:t>
             </w:r>
             <w:r>
               <w:rPr>
@@ -288,7 +633,7 @@
       <w:pPr>
         <w:pStyle w:val="Heading1"/>
       </w:pPr>
-      <w:bookmarkStart w:id="0" w:name="_Toc237113727"/>
+      <w:bookmarkStart w:id="0" w:name="_Toc237195862"/>
       <w:r>
         <w:lastRenderedPageBreak/>
         <w:t>Task C</w:t>
@@ -299,7 +644,7 @@
       <w:pPr>
         <w:pStyle w:val="Heading2"/>
       </w:pPr>
-      <w:bookmarkStart w:id="1" w:name="_Toc237113728"/>
+      <w:bookmarkStart w:id="1" w:name="_Toc237195863"/>
       <w:r>
         <w:t>Relational Schema</w:t>
       </w:r>
@@ -1098,9 +1443,11 @@
       <w:pPr>
         <w:pStyle w:val="Heading3"/>
       </w:pPr>
+      <w:bookmarkStart w:id="2" w:name="_Toc237195864"/>
       <w:r>
         <w:t>Relational Schema Table</w:t>
       </w:r>
+      <w:bookmarkEnd w:id="2"/>
     </w:p>
     <w:tbl>
       <w:tblPr>
@@ -1592,25 +1939,37 @@
       <w:pPr>
         <w:pStyle w:val="Heading2"/>
       </w:pPr>
+      <w:bookmarkStart w:id="3" w:name="_Toc237195865"/>
       <w:r>
         <w:t>Normalization</w:t>
       </w:r>
+      <w:bookmarkEnd w:id="3"/>
     </w:p>
     <w:p>
       <w:r>
         <w:tab/>
       </w:r>
       <w:r>
-        <w:t>The database tables are normalized into 3NF. The normalization was done since the implementation of entity relation diagram, with minor changes in the part 2.</w:t>
+        <w:t xml:space="preserve">The database tables are normalized into 3NF. The normalization was done since the implementation of entity relation diagram, with minor changes in </w:t>
+      </w:r>
+      <w:proofErr w:type="gramStart"/>
+      <w:r>
+        <w:t>the part</w:t>
+      </w:r>
+      <w:proofErr w:type="gramEnd"/>
+      <w:r>
+        <w:t xml:space="preserve"> 2.</w:t>
       </w:r>
     </w:p>
     <w:p>
       <w:pPr>
         <w:pStyle w:val="Heading3"/>
       </w:pPr>
+      <w:bookmarkStart w:id="4" w:name="_Toc237195866"/>
       <w:r>
         <w:t>First Normal Form (1NF)</w:t>
       </w:r>
+      <w:bookmarkEnd w:id="4"/>
     </w:p>
     <w:p>
       <w:r>
@@ -1665,10 +2024,12 @@
       <w:pPr>
         <w:pStyle w:val="Heading3"/>
       </w:pPr>
+      <w:bookmarkStart w:id="5" w:name="_Toc237195867"/>
       <w:r>
         <w:lastRenderedPageBreak/>
         <w:t>Second Normal Form (2NF)</w:t>
       </w:r>
+      <w:bookmarkEnd w:id="5"/>
     </w:p>
     <w:p>
       <w:r>
@@ -1710,9 +2071,11 @@
       <w:pPr>
         <w:pStyle w:val="Heading3"/>
       </w:pPr>
+      <w:bookmarkStart w:id="6" w:name="_Toc237195868"/>
       <w:r>
         <w:t>Third Normal Form (3NF)</w:t>
       </w:r>
+      <w:bookmarkEnd w:id="6"/>
     </w:p>
     <w:p>
       <w:r>
@@ -1753,6 +2116,92 @@
       </w:r>
       <w:r>
         <w:t xml:space="preserve">After separating union table and the employee table, </w:t>
+      </w:r>
+      <w:r>
+        <w:t>the transitive attributes in the employee tables, where a non-key attribute depending on another non-key attribute is eliminated.</w:t>
+      </w:r>
+    </w:p>
+    <w:p>
+      <w:pPr>
+        <w:pStyle w:val="ListParagraph"/>
+        <w:numPr>
+          <w:ilvl w:val="0"/>
+          <w:numId w:val="15"/>
+        </w:numPr>
+      </w:pPr>
+      <w:r>
+        <w:t>Separation of Model Specifications – Storing model specifications (capacity, weight, seats, max speed) directly in Airplane table like in part 1 diagram creates transitive dependency.</w:t>
+      </w:r>
+      <w:r>
+        <w:t xml:space="preserve"> To </w:t>
+      </w:r>
+      <w:r>
+        <w:t>fix</w:t>
+      </w:r>
+      <w:r>
+        <w:t xml:space="preserve"> this, these dependencies are relocated into Airplane Model table to </w:t>
+      </w:r>
+      <w:r>
+        <w:t>ensure</w:t>
+      </w:r>
+      <w:r>
+        <w:t xml:space="preserve"> non-key attributes in Airplane table depend directly on its primary key (registration number).</w:t>
+      </w:r>
+    </w:p>
+    <w:p>
+      <w:pPr>
+        <w:pStyle w:val="ListParagraph"/>
+        <w:numPr>
+          <w:ilvl w:val="0"/>
+          <w:numId w:val="15"/>
+        </w:numPr>
+      </w:pPr>
+      <w:r>
+        <w:t xml:space="preserve">Subtype Tables (Technicians and Traffic controllers) </w:t>
+      </w:r>
+      <w:r>
+        <w:t>–</w:t>
+      </w:r>
+      <w:r>
+        <w:t xml:space="preserve"> </w:t>
+      </w:r>
+      <w:r>
+        <w:t xml:space="preserve">While attributes that are common for both technicians and traffic controllers are stored in Employee table, they also have their specific values (specialization area, </w:t>
+      </w:r>
+      <w:r>
+        <w:t xml:space="preserve">hourly rate, and last examination dates) that depend directly on their primary key social security number within Technicians and Traffic </w:t>
+      </w:r>
+      <w:r>
+        <w:t>controllers’</w:t>
+      </w:r>
+      <w:r>
+        <w:t xml:space="preserve"> tables.</w:t>
+      </w:r>
+    </w:p>
+    <w:p>
+      <w:r>
+        <w:rPr>
+          <w:b/>
+          <w:bCs/>
+          <w:i/>
+          <w:iCs/>
+        </w:rPr>
+        <w:t xml:space="preserve">Note: </w:t>
+      </w:r>
+      <w:r>
+        <w:t xml:space="preserve">The hourly rate in subtype tables, although common, is </w:t>
+      </w:r>
+      <w:r>
+        <w:t>put on</w:t>
+      </w:r>
+      <w:r>
+        <w:t xml:space="preserve"> respective tables and not employee table is to avoid null values. In </w:t>
+      </w:r>
+      <w:r>
+        <w:t>employee table</w:t>
+      </w:r>
+      <w:r>
+        <w:t>, every employee already has a salary amount but not everyone can have an hourly rate where they are paid for overtime or if an employee is non-hourly employee, who has a set amount of salary.</w:t>
       </w:r>
     </w:p>
     <w:sectPr>

</xml_diff>

<commit_message>
10 Aug Database Update
</commit_message>
<xml_diff>
--- a/2. Airport Database System/40841063_HLUM HTET AUNG Part 2 - Database/40841063_Part 2 Database Report.docx
+++ b/2. Airport Database System/40841063_HLUM HTET AUNG Part 2 - Database/40841063_Part 2 Database Report.docx
@@ -137,13 +137,13 @@
           <w:r>
             <w:fldChar w:fldCharType="separate"/>
           </w:r>
-          <w:hyperlink w:anchor="_Toc237195862" w:history="1">
+          <w:hyperlink w:anchor="_Toc237254948" w:history="1">
             <w:r>
               <w:rPr>
                 <w:rStyle w:val="Hyperlink"/>
                 <w:noProof/>
               </w:rPr>
-              <w:t>Task C</w:t>
+              <w:t>Feedback Updates</w:t>
             </w:r>
             <w:r>
               <w:rPr>
@@ -164,7 +164,7 @@
                 <w:noProof/>
                 <w:webHidden/>
               </w:rPr>
-              <w:instrText xml:space="preserve"> PAGEREF _Toc237195862 \h </w:instrText>
+              <w:instrText xml:space="preserve"> PAGEREF _Toc237254948 \h </w:instrText>
             </w:r>
             <w:r>
               <w:rPr>
@@ -206,12 +206,150 @@
               <w:noProof/>
             </w:rPr>
           </w:pPr>
-          <w:hyperlink w:anchor="_Toc237195863" w:history="1">
+          <w:hyperlink w:anchor="_Toc237254949" w:history="1">
             <w:r>
               <w:rPr>
                 <w:rStyle w:val="Hyperlink"/>
                 <w:noProof/>
               </w:rPr>
+              <w:t>Union Table Separation</w:t>
+            </w:r>
+            <w:r>
+              <w:rPr>
+                <w:noProof/>
+                <w:webHidden/>
+              </w:rPr>
+              <w:tab/>
+            </w:r>
+            <w:r>
+              <w:rPr>
+                <w:noProof/>
+                <w:webHidden/>
+              </w:rPr>
+              <w:fldChar w:fldCharType="begin"/>
+            </w:r>
+            <w:r>
+              <w:rPr>
+                <w:noProof/>
+                <w:webHidden/>
+              </w:rPr>
+              <w:instrText xml:space="preserve"> PAGEREF _Toc237254949 \h </w:instrText>
+            </w:r>
+            <w:r>
+              <w:rPr>
+                <w:noProof/>
+                <w:webHidden/>
+              </w:rPr>
+            </w:r>
+            <w:r>
+              <w:rPr>
+                <w:noProof/>
+                <w:webHidden/>
+              </w:rPr>
+              <w:fldChar w:fldCharType="separate"/>
+            </w:r>
+            <w:r>
+              <w:rPr>
+                <w:noProof/>
+                <w:webHidden/>
+              </w:rPr>
+              <w:t>3</w:t>
+            </w:r>
+            <w:r>
+              <w:rPr>
+                <w:noProof/>
+                <w:webHidden/>
+              </w:rPr>
+              <w:fldChar w:fldCharType="end"/>
+            </w:r>
+          </w:hyperlink>
+        </w:p>
+        <w:p>
+          <w:pPr>
+            <w:pStyle w:val="TOC1"/>
+            <w:tabs>
+              <w:tab w:val="right" w:leader="dot" w:pos="9350"/>
+            </w:tabs>
+            <w:rPr>
+              <w:rFonts w:asciiTheme="minorHAnsi" w:eastAsiaTheme="minorEastAsia" w:hAnsiTheme="minorHAnsi"/>
+              <w:noProof/>
+            </w:rPr>
+          </w:pPr>
+          <w:hyperlink w:anchor="_Toc237254950" w:history="1">
+            <w:r>
+              <w:rPr>
+                <w:rStyle w:val="Hyperlink"/>
+                <w:noProof/>
+              </w:rPr>
+              <w:t>Task C</w:t>
+            </w:r>
+            <w:r>
+              <w:rPr>
+                <w:noProof/>
+                <w:webHidden/>
+              </w:rPr>
+              <w:tab/>
+            </w:r>
+            <w:r>
+              <w:rPr>
+                <w:noProof/>
+                <w:webHidden/>
+              </w:rPr>
+              <w:fldChar w:fldCharType="begin"/>
+            </w:r>
+            <w:r>
+              <w:rPr>
+                <w:noProof/>
+                <w:webHidden/>
+              </w:rPr>
+              <w:instrText xml:space="preserve"> PAGEREF _Toc237254950 \h </w:instrText>
+            </w:r>
+            <w:r>
+              <w:rPr>
+                <w:noProof/>
+                <w:webHidden/>
+              </w:rPr>
+            </w:r>
+            <w:r>
+              <w:rPr>
+                <w:noProof/>
+                <w:webHidden/>
+              </w:rPr>
+              <w:fldChar w:fldCharType="separate"/>
+            </w:r>
+            <w:r>
+              <w:rPr>
+                <w:noProof/>
+                <w:webHidden/>
+              </w:rPr>
+              <w:t>4</w:t>
+            </w:r>
+            <w:r>
+              <w:rPr>
+                <w:noProof/>
+                <w:webHidden/>
+              </w:rPr>
+              <w:fldChar w:fldCharType="end"/>
+            </w:r>
+          </w:hyperlink>
+        </w:p>
+        <w:p>
+          <w:pPr>
+            <w:pStyle w:val="TOC2"/>
+            <w:tabs>
+              <w:tab w:val="right" w:leader="dot" w:pos="9350"/>
+            </w:tabs>
+            <w:rPr>
+              <w:rFonts w:asciiTheme="minorHAnsi" w:eastAsiaTheme="minorEastAsia" w:hAnsiTheme="minorHAnsi"/>
+              <w:noProof/>
+            </w:rPr>
+          </w:pPr>
+          <w:hyperlink w:anchor="_Toc237254951" w:history="1">
+            <w:r>
+              <w:rPr>
+                <w:rStyle w:val="Hyperlink"/>
+                <w:noProof/>
+              </w:rPr>
               <w:t>Relational Schema</w:t>
             </w:r>
             <w:r>
@@ -233,7 +371,7 @@
                 <w:noProof/>
                 <w:webHidden/>
               </w:rPr>
-              <w:instrText xml:space="preserve"> PAGEREF _Toc237195863 \h </w:instrText>
+              <w:instrText xml:space="preserve"> PAGEREF _Toc237254951 \h </w:instrText>
             </w:r>
             <w:r>
               <w:rPr>
@@ -253,7 +391,7 @@
                 <w:noProof/>
                 <w:webHidden/>
               </w:rPr>
-              <w:t>3</w:t>
+              <w:t>4</w:t>
             </w:r>
             <w:r>
               <w:rPr>
@@ -275,7 +413,7 @@
               <w:noProof/>
             </w:rPr>
           </w:pPr>
-          <w:hyperlink w:anchor="_Toc237195864" w:history="1">
+          <w:hyperlink w:anchor="_Toc237254952" w:history="1">
             <w:r>
               <w:rPr>
                 <w:rStyle w:val="Hyperlink"/>
@@ -302,7 +440,7 @@
                 <w:noProof/>
                 <w:webHidden/>
               </w:rPr>
-              <w:instrText xml:space="preserve"> PAGEREF _Toc237195864 \h </w:instrText>
+              <w:instrText xml:space="preserve"> PAGEREF _Toc237254952 \h </w:instrText>
             </w:r>
             <w:r>
               <w:rPr>
@@ -322,7 +460,7 @@
                 <w:noProof/>
                 <w:webHidden/>
               </w:rPr>
-              <w:t>4</w:t>
+              <w:t>5</w:t>
             </w:r>
             <w:r>
               <w:rPr>
@@ -344,7 +482,7 @@
               <w:noProof/>
             </w:rPr>
           </w:pPr>
-          <w:hyperlink w:anchor="_Toc237195865" w:history="1">
+          <w:hyperlink w:anchor="_Toc237254953" w:history="1">
             <w:r>
               <w:rPr>
                 <w:rStyle w:val="Hyperlink"/>
@@ -371,7 +509,7 @@
                 <w:noProof/>
                 <w:webHidden/>
               </w:rPr>
-              <w:instrText xml:space="preserve"> PAGEREF _Toc237195865 \h </w:instrText>
+              <w:instrText xml:space="preserve"> PAGEREF _Toc237254953 \h </w:instrText>
             </w:r>
             <w:r>
               <w:rPr>
@@ -391,7 +529,7 @@
                 <w:noProof/>
                 <w:webHidden/>
               </w:rPr>
-              <w:t>5</w:t>
+              <w:t>6</w:t>
             </w:r>
             <w:r>
               <w:rPr>
@@ -413,7 +551,7 @@
               <w:noProof/>
             </w:rPr>
           </w:pPr>
-          <w:hyperlink w:anchor="_Toc237195866" w:history="1">
+          <w:hyperlink w:anchor="_Toc237254954" w:history="1">
             <w:r>
               <w:rPr>
                 <w:rStyle w:val="Hyperlink"/>
@@ -440,7 +578,7 @@
                 <w:noProof/>
                 <w:webHidden/>
               </w:rPr>
-              <w:instrText xml:space="preserve"> PAGEREF _Toc237195866 \h </w:instrText>
+              <w:instrText xml:space="preserve"> PAGEREF _Toc237254954 \h </w:instrText>
             </w:r>
             <w:r>
               <w:rPr>
@@ -460,7 +598,7 @@
                 <w:noProof/>
                 <w:webHidden/>
               </w:rPr>
-              <w:t>5</w:t>
+              <w:t>6</w:t>
             </w:r>
             <w:r>
               <w:rPr>
@@ -482,7 +620,7 @@
               <w:noProof/>
             </w:rPr>
           </w:pPr>
-          <w:hyperlink w:anchor="_Toc237195867" w:history="1">
+          <w:hyperlink w:anchor="_Toc237254955" w:history="1">
             <w:r>
               <w:rPr>
                 <w:rStyle w:val="Hyperlink"/>
@@ -509,7 +647,7 @@
                 <w:noProof/>
                 <w:webHidden/>
               </w:rPr>
-              <w:instrText xml:space="preserve"> PAGEREF _Toc237195867 \h </w:instrText>
+              <w:instrText xml:space="preserve"> PAGEREF _Toc237254955 \h </w:instrText>
             </w:r>
             <w:r>
               <w:rPr>
@@ -529,7 +667,7 @@
                 <w:noProof/>
                 <w:webHidden/>
               </w:rPr>
-              <w:t>6</w:t>
+              <w:t>7</w:t>
             </w:r>
             <w:r>
               <w:rPr>
@@ -551,7 +689,7 @@
               <w:noProof/>
             </w:rPr>
           </w:pPr>
-          <w:hyperlink w:anchor="_Toc237195868" w:history="1">
+          <w:hyperlink w:anchor="_Toc237254956" w:history="1">
             <w:r>
               <w:rPr>
                 <w:rStyle w:val="Hyperlink"/>
@@ -578,7 +716,7 @@
                 <w:noProof/>
                 <w:webHidden/>
               </w:rPr>
-              <w:instrText xml:space="preserve"> PAGEREF _Toc237195868 \h </w:instrText>
+              <w:instrText xml:space="preserve"> PAGEREF _Toc237254956 \h </w:instrText>
             </w:r>
             <w:r>
               <w:rPr>
@@ -598,7 +736,7 @@
                 <w:noProof/>
                 <w:webHidden/>
               </w:rPr>
-              <w:t>6</w:t>
+              <w:t>7</w:t>
             </w:r>
             <w:r>
               <w:rPr>
@@ -633,22 +771,491 @@
       <w:pPr>
         <w:pStyle w:val="Heading1"/>
       </w:pPr>
-      <w:bookmarkStart w:id="0" w:name="_Toc237195862"/>
+      <w:bookmarkStart w:id="0" w:name="_Toc237254948"/>
+      <w:r>
+        <w:lastRenderedPageBreak/>
+        <w:t>Feedback Updates</w:t>
+      </w:r>
+      <w:bookmarkEnd w:id="0"/>
+    </w:p>
+    <w:p>
+      <w:r>
+        <w:tab/>
+      </w:r>
+      <w:r>
+        <w:t>This section mainly focuses on updating the database design and test plan so that it matches the feedback.</w:t>
+      </w:r>
+    </w:p>
+    <w:p>
+      <w:pPr>
+        <w:pStyle w:val="Heading2"/>
+      </w:pPr>
+      <w:bookmarkStart w:id="1" w:name="_Toc237254949"/>
+      <w:r>
+        <w:t>Union Table Separation</w:t>
+      </w:r>
+      <w:bookmarkEnd w:id="1"/>
+    </w:p>
+    <w:p>
+      <w:pPr>
+        <w:keepNext/>
+        <w:jc w:val="center"/>
+      </w:pPr>
+      <w:r>
+        <w:rPr>
+          <w:noProof/>
+        </w:rPr>
+        <w:drawing>
+          <wp:inline distT="0" distB="0" distL="0" distR="0" wp14:anchorId="187AF5F9" wp14:editId="09EEA98D">
+            <wp:extent cx="5943600" cy="2566670"/>
+            <wp:effectExtent l="19050" t="19050" r="19050" b="24130"/>
+            <wp:docPr id="77765325" name="Picture 1"/>
+            <wp:cNvGraphicFramePr>
+              <a:graphicFrameLocks xmlns:a="http://schemas.openxmlformats.org/drawingml/2006/main" noChangeAspect="1"/>
+            </wp:cNvGraphicFramePr>
+            <a:graphic xmlns:a="http://schemas.openxmlformats.org/drawingml/2006/main">
+              <a:graphicData uri="http://schemas.openxmlformats.org/drawingml/2006/picture">
+                <pic:pic xmlns:pic="http://schemas.openxmlformats.org/drawingml/2006/picture">
+                  <pic:nvPicPr>
+                    <pic:cNvPr id="0" name="Picture 1"/>
+                    <pic:cNvPicPr>
+                      <a:picLocks noChangeAspect="1" noChangeArrowheads="1"/>
+                    </pic:cNvPicPr>
+                  </pic:nvPicPr>
+                  <pic:blipFill>
+                    <a:blip r:embed="rId8">
+                      <a:extLst>
+                        <a:ext uri="{28A0092B-C50C-407E-A947-70E740481C1C}">
+                          <a14:useLocalDpi xmlns:a14="http://schemas.microsoft.com/office/drawing/2010/main" val="0"/>
+                        </a:ext>
+                      </a:extLst>
+                    </a:blip>
+                    <a:srcRect/>
+                    <a:stretch>
+                      <a:fillRect/>
+                    </a:stretch>
+                  </pic:blipFill>
+                  <pic:spPr bwMode="auto">
+                    <a:xfrm>
+                      <a:off x="0" y="0"/>
+                      <a:ext cx="5943600" cy="2566670"/>
+                    </a:xfrm>
+                    <a:prstGeom prst="rect">
+                      <a:avLst/>
+                    </a:prstGeom>
+                    <a:noFill/>
+                    <a:ln>
+                      <a:solidFill>
+                        <a:schemeClr val="tx1"/>
+                      </a:solidFill>
+                    </a:ln>
+                  </pic:spPr>
+                </pic:pic>
+              </a:graphicData>
+            </a:graphic>
+          </wp:inline>
+        </w:drawing>
+      </w:r>
+    </w:p>
+    <w:p>
+      <w:pPr>
+        <w:jc w:val="center"/>
+      </w:pPr>
+      <w:r>
+        <w:t xml:space="preserve">Figure </w:t>
+      </w:r>
+      <w:fldSimple w:instr=" SEQ Figure \* ARABIC ">
+        <w:r>
+          <w:rPr>
+            <w:noProof/>
+          </w:rPr>
+          <w:t>1</w:t>
+        </w:r>
+      </w:fldSimple>
+      <w:r>
+        <w:t xml:space="preserve"> Union Table separated</w:t>
+      </w:r>
+    </w:p>
+    <w:p>
+      <w:r>
+        <w:tab/>
+        <w:t xml:space="preserve">The union table </w:t>
+      </w:r>
+      <w:r>
+        <w:t xml:space="preserve">is separated from employee table for satisfying 3NF in normalization stages. The details for this separation will be </w:t>
+      </w:r>
+      <w:r>
+        <w:t>discussed</w:t>
+      </w:r>
+      <w:r>
+        <w:t xml:space="preserve"> further in Normalization (Third Normal Form (3NF)) topic.</w:t>
+      </w:r>
+    </w:p>
+    <w:p>
+      <w:pPr>
+        <w:pStyle w:val="Heading2"/>
+      </w:pPr>
+      <w:r>
+        <w:t>Additional Attributes for technicians and traffic controllers</w:t>
+      </w:r>
+    </w:p>
+    <w:p>
+      <w:pPr>
+        <w:rPr>
+          <w:b/>
+          <w:bCs/>
+        </w:rPr>
+      </w:pPr>
+      <w:r>
+        <w:tab/>
+        <w:t xml:space="preserve">Additional attributes for technicians and controllers are added to ensure that the table is realistic. For technicians, hourly rate and specialization area is added, whereas traffic controllers table has additional hourly rate and last examination date (already exists). These are the unique attributes where Employee table can’t summarize. </w:t>
+      </w:r>
+      <w:r>
+        <w:rPr>
+          <w:b/>
+          <w:bCs/>
+        </w:rPr>
+        <w:t>Hourly rates can be seen in both technicians and traffic controllers.</w:t>
+      </w:r>
+    </w:p>
+    <w:p>
+      <w:r>
+        <w:rPr>
+          <w:b/>
+          <w:bCs/>
+          <w:i/>
+          <w:iCs/>
+        </w:rPr>
+        <w:t xml:space="preserve">Note: </w:t>
+      </w:r>
+      <w:r>
+        <w:t>The hourly rate in subtype tables, although common, is put on respective tables and not employee table is to avoid null values. In employee table, every employee already has a salary amount but not everyone can have an hourly rate where they are paid for overtime or if an employee is non-hourly employee, who has a set amount of salary.</w:t>
+      </w:r>
+    </w:p>
+    <w:p>
+      <w:pPr>
+        <w:pStyle w:val="Heading2"/>
+      </w:pPr>
+      <w:r>
+        <w:lastRenderedPageBreak/>
+        <w:t>Updated Justifications/Assumptions</w:t>
+      </w:r>
+      <w:r>
+        <w:t xml:space="preserve"> (From Part 1)</w:t>
+      </w:r>
+    </w:p>
+    <w:p>
+      <w:r>
+        <w:tab/>
+        <w:t>This section of the report will explain the relations between tables in the airport database. The relation between the tables is –</w:t>
+      </w:r>
+    </w:p>
+    <w:p>
+      <w:pPr>
+        <w:pStyle w:val="ListParagraph"/>
+        <w:numPr>
+          <w:ilvl w:val="0"/>
+          <w:numId w:val="7"/>
+        </w:numPr>
+      </w:pPr>
+      <w:r>
+        <w:t>(</w:t>
+      </w:r>
+      <w:r>
+        <w:t>Union Table</w:t>
+      </w:r>
+      <w:r>
+        <w:t xml:space="preserve"> 1:1--------1: * </w:t>
+      </w:r>
+      <w:r>
+        <w:t>Employee</w:t>
+      </w:r>
+      <w:r>
+        <w:t>)</w:t>
+      </w:r>
+      <w:r>
+        <w:t xml:space="preserve"> – A </w:t>
+      </w:r>
+      <w:r>
+        <w:t>one to many</w:t>
+      </w:r>
+      <w:r>
+        <w:t xml:space="preserve"> </w:t>
+      </w:r>
+      <w:r>
+        <w:t>relationships</w:t>
+      </w:r>
+      <w:r>
+        <w:t xml:space="preserve"> where an employee can belong to at most one labor union, while a single union can represent multiple employees. Union Table’s primary key union_id acts as foreign key in Employee table.</w:t>
+      </w:r>
+    </w:p>
+    <w:p>
+      <w:pPr>
+        <w:pStyle w:val="ListParagraph"/>
+        <w:numPr>
+          <w:ilvl w:val="0"/>
+          <w:numId w:val="7"/>
+        </w:numPr>
+      </w:pPr>
+      <w:r>
+        <w:t xml:space="preserve">(Airplane models 1:1--------1: * Airplane) – </w:t>
+      </w:r>
+      <w:r>
+        <w:t xml:space="preserve">one to many </w:t>
+      </w:r>
+      <w:r>
+        <w:t>relations</w:t>
+      </w:r>
+      <w:r>
+        <w:t xml:space="preserve"> where </w:t>
+      </w:r>
+      <w:r>
+        <w:t xml:space="preserve">an airplane model can have many physical registered aircraft, but each plane </w:t>
+      </w:r>
+      <w:r>
+        <w:t>belongs</w:t>
+      </w:r>
+      <w:r>
+        <w:t xml:space="preserve"> to one model. Model wide specifications (seats, max speed, capacity, weight) are stored in airplane model </w:t>
+      </w:r>
+      <w:r>
+        <w:t>tables</w:t>
+      </w:r>
+      <w:r>
+        <w:t>.</w:t>
+      </w:r>
+    </w:p>
+    <w:p>
+      <w:pPr>
+        <w:pStyle w:val="ListParagraph"/>
+        <w:numPr>
+          <w:ilvl w:val="0"/>
+          <w:numId w:val="7"/>
+        </w:numPr>
+      </w:pPr>
+      <w:r>
+        <w:t xml:space="preserve">(Airplane 1:1-------0: * Test events) – </w:t>
+      </w:r>
+      <w:r>
+        <w:t xml:space="preserve">one (optional) to many relations where an airplane can optionally have zero or more test events. </w:t>
+      </w:r>
+      <w:r>
+        <w:t>However, each testing event must be associated with one airplane.</w:t>
+      </w:r>
+    </w:p>
+    <w:p>
+      <w:pPr>
+        <w:pStyle w:val="ListParagraph"/>
+        <w:numPr>
+          <w:ilvl w:val="0"/>
+          <w:numId w:val="7"/>
+        </w:numPr>
+      </w:pPr>
+      <w:r>
+        <w:t xml:space="preserve">(Test events 1: *-------1:1 Airworthy test model) – </w:t>
+      </w:r>
+      <w:r>
+        <w:t>one to many relations where a airworthiness test template can be used across many test events. However, each test event is used in exactly one test model.</w:t>
+      </w:r>
+    </w:p>
+    <w:p>
+      <w:pPr>
+        <w:pStyle w:val="ListParagraph"/>
+        <w:numPr>
+          <w:ilvl w:val="0"/>
+          <w:numId w:val="7"/>
+        </w:numPr>
+      </w:pPr>
+      <w:r>
+        <w:t xml:space="preserve">(Test events 0: *-------1:1 Technicians) – </w:t>
+      </w:r>
+      <w:r>
+        <w:t>optional one to many relations where a test event is conducted by one certified technician, while a technician can perform many test events.</w:t>
+      </w:r>
+    </w:p>
+    <w:p>
+      <w:pPr>
+        <w:pStyle w:val="ListParagraph"/>
+        <w:numPr>
+          <w:ilvl w:val="0"/>
+          <w:numId w:val="7"/>
+        </w:numPr>
+      </w:pPr>
+      <w:r>
+        <w:t xml:space="preserve">(Technicians 1:1-------1:1 Employee) – </w:t>
+      </w:r>
+      <w:r>
+        <w:t>one to one parent and child table relation. Employee stores shared personal attributes for both technicians and traffic controllers, while technician specific attributes are stored in Technicians using ssn as a primary key and foreign key.</w:t>
+      </w:r>
+    </w:p>
+    <w:p>
+      <w:pPr>
+        <w:pStyle w:val="ListParagraph"/>
+        <w:numPr>
+          <w:ilvl w:val="0"/>
+          <w:numId w:val="7"/>
+        </w:numPr>
+      </w:pPr>
+      <w:r>
+        <w:t xml:space="preserve">(Traffic controllers 1:1-------1:1 Employee) – </w:t>
+      </w:r>
+      <w:r>
+        <w:t xml:space="preserve">table relation and structure </w:t>
+      </w:r>
+      <w:r>
+        <w:t>are</w:t>
+      </w:r>
+      <w:r>
+        <w:t xml:space="preserve"> same as technicians and employee, except the specific attributes difference.</w:t>
+      </w:r>
+    </w:p>
+    <w:p>
+      <w:pPr>
+        <w:pStyle w:val="ListParagraph"/>
+        <w:numPr>
+          <w:ilvl w:val="0"/>
+          <w:numId w:val="7"/>
+        </w:numPr>
+      </w:pPr>
+      <w:r>
+        <w:t xml:space="preserve">(Technicians 1:1-------1: * Technician expertise) – </w:t>
+      </w:r>
+      <w:r>
+        <w:t>many to many relations where a technician can be certified for many airplanes</w:t>
+      </w:r>
+    </w:p>
+    <w:p>
+      <w:pPr>
+        <w:pStyle w:val="ListParagraph"/>
+        <w:numPr>
+          <w:ilvl w:val="0"/>
+          <w:numId w:val="7"/>
+        </w:numPr>
+      </w:pPr>
+      <w:r>
+        <w:t xml:space="preserve">(Airplane models 1:1-------1: * Technician expertise) – </w:t>
+      </w:r>
+      <w:r>
+        <w:t xml:space="preserve">many to many </w:t>
+      </w:r>
+      <w:r>
+        <w:t>relations</w:t>
+      </w:r>
+      <w:r>
+        <w:t xml:space="preserve">, where </w:t>
+      </w:r>
+      <w:r>
+        <w:t>an</w:t>
+      </w:r>
+      <w:r>
+        <w:t xml:space="preserve"> airplane models can have one or many certified technicians</w:t>
+      </w:r>
+    </w:p>
+    <w:p>
+      <w:r>
+        <w:t xml:space="preserve">There is an original relation between Technicians and Airplane models. However, a composition table is used because </w:t>
+      </w:r>
+      <w:r>
+        <w:t xml:space="preserve">it is not possible to store many </w:t>
+      </w:r>
+      <w:r>
+        <w:t>too</w:t>
+      </w:r>
+      <w:r>
+        <w:t xml:space="preserve"> many relation without violating first normal form, where there are multi-valued attributes in a table.</w:t>
+      </w:r>
+    </w:p>
+    <w:p>
+      <w:pPr>
+        <w:pStyle w:val="Heading2"/>
+      </w:pPr>
+      <w:r>
+        <w:lastRenderedPageBreak/>
+        <w:t>Justification/Assumption for keys</w:t>
+      </w:r>
+    </w:p>
+    <w:p>
+      <w:r>
+        <w:tab/>
+      </w:r>
+      <w:r>
+        <w:t>This section will discuss the reason for choosing primary keys in the table –</w:t>
+      </w:r>
+    </w:p>
+    <w:p>
+      <w:pPr>
+        <w:pStyle w:val="ListParagraph"/>
+        <w:numPr>
+          <w:ilvl w:val="0"/>
+          <w:numId w:val="16"/>
+        </w:numPr>
+      </w:pPr>
+      <w:r>
+        <w:t>Natural Primary Key</w:t>
+      </w:r>
+      <w:r>
+        <w:t xml:space="preserve"> – ssn from Employee table, registration number from Airplane table are chosen because they are guaranteed to be unique for each employee and airplane.</w:t>
+      </w:r>
+    </w:p>
+    <w:p>
+      <w:pPr>
+        <w:pStyle w:val="ListParagraph"/>
+        <w:numPr>
+          <w:ilvl w:val="0"/>
+          <w:numId w:val="16"/>
+        </w:numPr>
+      </w:pPr>
+      <w:r>
+        <w:t>Surrogate Primary Key – test even number from Test events table, union id from Union table is chosen as auto-incremented surrogate integer keys to avoid using composite keys.</w:t>
+      </w:r>
+    </w:p>
+    <w:p>
+      <w:pPr>
+        <w:pStyle w:val="ListParagraph"/>
+        <w:numPr>
+          <w:ilvl w:val="0"/>
+          <w:numId w:val="16"/>
+        </w:numPr>
+      </w:pPr>
+      <w:r>
+        <w:t xml:space="preserve">Shared Primary/Foreign Keys – Technicians table’s ssn and Traffic controller’s table’s ssn are used as both primary key and foreign key to reference employee table. This is to ensure that the relation enforce strict one-to-one </w:t>
+      </w:r>
+      <w:r>
+        <w:t>relations</w:t>
+      </w:r>
+      <w:r>
+        <w:t>.</w:t>
+      </w:r>
+    </w:p>
+    <w:p>
+      <w:pPr>
+        <w:spacing w:line="278" w:lineRule="auto"/>
+        <w:jc w:val="left"/>
+      </w:pPr>
+      <w:r>
+        <w:br w:type="page"/>
+      </w:r>
+    </w:p>
+    <w:p>
+      <w:pPr>
+        <w:pStyle w:val="Heading1"/>
+      </w:pPr>
+      <w:bookmarkStart w:id="2" w:name="_Toc237254950"/>
       <w:r>
         <w:lastRenderedPageBreak/>
         <w:t>Task C</w:t>
       </w:r>
-      <w:bookmarkEnd w:id="0"/>
+      <w:bookmarkEnd w:id="2"/>
     </w:p>
     <w:p>
       <w:pPr>
         <w:pStyle w:val="Heading2"/>
       </w:pPr>
-      <w:bookmarkStart w:id="1" w:name="_Toc237195863"/>
+      <w:bookmarkStart w:id="3" w:name="_Toc237254951"/>
       <w:r>
         <w:t>Relational Schema</w:t>
       </w:r>
-      <w:bookmarkEnd w:id="1"/>
+      <w:bookmarkEnd w:id="3"/>
     </w:p>
     <w:p>
       <w:r>
@@ -1432,7 +2039,7 @@
           <w:rPr>
             <w:noProof/>
           </w:rPr>
-          <w:t>1</w:t>
+          <w:t>2</w:t>
         </w:r>
       </w:fldSimple>
       <w:r>
@@ -1443,11 +2050,11 @@
       <w:pPr>
         <w:pStyle w:val="Heading3"/>
       </w:pPr>
-      <w:bookmarkStart w:id="2" w:name="_Toc237195864"/>
+      <w:bookmarkStart w:id="4" w:name="_Toc237254952"/>
       <w:r>
         <w:t>Relational Schema Table</w:t>
       </w:r>
-      <w:bookmarkEnd w:id="2"/>
+      <w:bookmarkEnd w:id="4"/>
     </w:p>
     <w:tbl>
       <w:tblPr>
@@ -1939,37 +2546,29 @@
       <w:pPr>
         <w:pStyle w:val="Heading2"/>
       </w:pPr>
-      <w:bookmarkStart w:id="3" w:name="_Toc237195865"/>
+      <w:bookmarkStart w:id="5" w:name="_Toc237254953"/>
       <w:r>
         <w:t>Normalization</w:t>
       </w:r>
-      <w:bookmarkEnd w:id="3"/>
+      <w:bookmarkEnd w:id="5"/>
     </w:p>
     <w:p>
       <w:r>
         <w:tab/>
       </w:r>
       <w:r>
-        <w:t xml:space="preserve">The database tables are normalized into 3NF. The normalization was done since the implementation of entity relation diagram, with minor changes in </w:t>
-      </w:r>
-      <w:proofErr w:type="gramStart"/>
-      <w:r>
-        <w:t>the part</w:t>
-      </w:r>
-      <w:proofErr w:type="gramEnd"/>
-      <w:r>
-        <w:t xml:space="preserve"> 2.</w:t>
+        <w:t>The database tables are normalized into 3NF. The normalization was done since the implementation of entity relation diagram, with minor changes in the part 2.</w:t>
       </w:r>
     </w:p>
     <w:p>
       <w:pPr>
         <w:pStyle w:val="Heading3"/>
       </w:pPr>
-      <w:bookmarkStart w:id="4" w:name="_Toc237195866"/>
+      <w:bookmarkStart w:id="6" w:name="_Toc237254954"/>
       <w:r>
         <w:t>First Normal Form (1NF)</w:t>
       </w:r>
-      <w:bookmarkEnd w:id="4"/>
+      <w:bookmarkEnd w:id="6"/>
     </w:p>
     <w:p>
       <w:r>
@@ -2024,12 +2623,12 @@
       <w:pPr>
         <w:pStyle w:val="Heading3"/>
       </w:pPr>
-      <w:bookmarkStart w:id="5" w:name="_Toc237195867"/>
+      <w:bookmarkStart w:id="7" w:name="_Toc237254955"/>
       <w:r>
         <w:lastRenderedPageBreak/>
         <w:t>Second Normal Form (2NF)</w:t>
       </w:r>
-      <w:bookmarkEnd w:id="5"/>
+      <w:bookmarkEnd w:id="7"/>
     </w:p>
     <w:p>
       <w:r>
@@ -2071,11 +2670,11 @@
       <w:pPr>
         <w:pStyle w:val="Heading3"/>
       </w:pPr>
-      <w:bookmarkStart w:id="6" w:name="_Toc237195868"/>
+      <w:bookmarkStart w:id="8" w:name="_Toc237254956"/>
       <w:r>
         <w:t>Third Normal Form (3NF)</w:t>
       </w:r>
-      <w:bookmarkEnd w:id="6"/>
+      <w:bookmarkEnd w:id="8"/>
     </w:p>
     <w:p>
       <w:r>
@@ -2176,32 +2775,6 @@
       </w:r>
       <w:r>
         <w:t xml:space="preserve"> tables.</w:t>
-      </w:r>
-    </w:p>
-    <w:p>
-      <w:r>
-        <w:rPr>
-          <w:b/>
-          <w:bCs/>
-          <w:i/>
-          <w:iCs/>
-        </w:rPr>
-        <w:t xml:space="preserve">Note: </w:t>
-      </w:r>
-      <w:r>
-        <w:t xml:space="preserve">The hourly rate in subtype tables, although common, is </w:t>
-      </w:r>
-      <w:r>
-        <w:t>put on</w:t>
-      </w:r>
-      <w:r>
-        <w:t xml:space="preserve"> respective tables and not employee table is to avoid null values. In </w:t>
-      </w:r>
-      <w:r>
-        <w:t>employee table</w:t>
-      </w:r>
-      <w:r>
-        <w:t>, every employee already has a salary amount but not everyone can have an hourly rate where they are paid for overtime or if an employee is non-hourly employee, who has a set amount of salary.</w:t>
       </w:r>
     </w:p>
     <w:sectPr>
@@ -3798,6 +4371,119 @@
     </w:lvl>
   </w:abstractNum>
   <w:abstractNum w:abstractNumId="14" w15:restartNumberingAfterBreak="0">
+    <w:nsid w:val="70D86119"/>
+    <w:multiLevelType w:val="hybridMultilevel"/>
+    <w:tmpl w:val="83F49EE8"/>
+    <w:lvl w:ilvl="0" w:tplc="04090001">
+      <w:start w:val="1"/>
+      <w:numFmt w:val="bullet"/>
+      <w:lvlText w:val=""/>
+      <w:lvlJc w:val="left"/>
+      <w:pPr>
+        <w:ind w:left="720" w:hanging="360"/>
+      </w:pPr>
+      <w:rPr>
+        <w:rFonts w:ascii="Symbol" w:hAnsi="Symbol" w:hint="default"/>
+      </w:rPr>
+    </w:lvl>
+    <w:lvl w:ilvl="1" w:tplc="04090003" w:tentative="1">
+      <w:start w:val="1"/>
+      <w:numFmt w:val="bullet"/>
+      <w:lvlText w:val="o"/>
+      <w:lvlJc w:val="left"/>
+      <w:pPr>
+        <w:ind w:left="1440" w:hanging="360"/>
+      </w:pPr>
+      <w:rPr>
+        <w:rFonts w:ascii="Courier New" w:hAnsi="Courier New" w:cs="Courier New" w:hint="default"/>
+      </w:rPr>
+    </w:lvl>
+    <w:lvl w:ilvl="2" w:tplc="04090005" w:tentative="1">
+      <w:start w:val="1"/>
+      <w:numFmt w:val="bullet"/>
+      <w:lvlText w:val=""/>
+      <w:lvlJc w:val="left"/>
+      <w:pPr>
+        <w:ind w:left="2160" w:hanging="360"/>
+      </w:pPr>
+      <w:rPr>
+        <w:rFonts w:ascii="Wingdings" w:hAnsi="Wingdings" w:hint="default"/>
+      </w:rPr>
+    </w:lvl>
+    <w:lvl w:ilvl="3" w:tplc="04090001" w:tentative="1">
+      <w:start w:val="1"/>
+      <w:numFmt w:val="bullet"/>
+      <w:lvlText w:val=""/>
+      <w:lvlJc w:val="left"/>
+      <w:pPr>
+        <w:ind w:left="2880" w:hanging="360"/>
+      </w:pPr>
+      <w:rPr>
+        <w:rFonts w:ascii="Symbol" w:hAnsi="Symbol" w:hint="default"/>
+      </w:rPr>
+    </w:lvl>
+    <w:lvl w:ilvl="4" w:tplc="04090003" w:tentative="1">
+      <w:start w:val="1"/>
+      <w:numFmt w:val="bullet"/>
+      <w:lvlText w:val="o"/>
+      <w:lvlJc w:val="left"/>
+      <w:pPr>
+        <w:ind w:left="3600" w:hanging="360"/>
+      </w:pPr>
+      <w:rPr>
+        <w:rFonts w:ascii="Courier New" w:hAnsi="Courier New" w:cs="Courier New" w:hint="default"/>
+      </w:rPr>
+    </w:lvl>
+    <w:lvl w:ilvl="5" w:tplc="04090005" w:tentative="1">
+      <w:start w:val="1"/>
+      <w:numFmt w:val="bullet"/>
+      <w:lvlText w:val=""/>
+      <w:lvlJc w:val="left"/>
+      <w:pPr>
+        <w:ind w:left="4320" w:hanging="360"/>
+      </w:pPr>
+      <w:rPr>
+        <w:rFonts w:ascii="Wingdings" w:hAnsi="Wingdings" w:hint="default"/>
+      </w:rPr>
+    </w:lvl>
+    <w:lvl w:ilvl="6" w:tplc="04090001" w:tentative="1">
+      <w:start w:val="1"/>
+      <w:numFmt w:val="bullet"/>
+      <w:lvlText w:val=""/>
+      <w:lvlJc w:val="left"/>
+      <w:pPr>
+        <w:ind w:left="5040" w:hanging="360"/>
+      </w:pPr>
+      <w:rPr>
+        <w:rFonts w:ascii="Symbol" w:hAnsi="Symbol" w:hint="default"/>
+      </w:rPr>
+    </w:lvl>
+    <w:lvl w:ilvl="7" w:tplc="04090003" w:tentative="1">
+      <w:start w:val="1"/>
+      <w:numFmt w:val="bullet"/>
+      <w:lvlText w:val="o"/>
+      <w:lvlJc w:val="left"/>
+      <w:pPr>
+        <w:ind w:left="5760" w:hanging="360"/>
+      </w:pPr>
+      <w:rPr>
+        <w:rFonts w:ascii="Courier New" w:hAnsi="Courier New" w:cs="Courier New" w:hint="default"/>
+      </w:rPr>
+    </w:lvl>
+    <w:lvl w:ilvl="8" w:tplc="04090005" w:tentative="1">
+      <w:start w:val="1"/>
+      <w:numFmt w:val="bullet"/>
+      <w:lvlText w:val=""/>
+      <w:lvlJc w:val="left"/>
+      <w:pPr>
+        <w:ind w:left="6480" w:hanging="360"/>
+      </w:pPr>
+      <w:rPr>
+        <w:rFonts w:ascii="Wingdings" w:hAnsi="Wingdings" w:hint="default"/>
+      </w:rPr>
+    </w:lvl>
+  </w:abstractNum>
+  <w:abstractNum w:abstractNumId="15" w15:restartNumberingAfterBreak="0">
     <w:nsid w:val="7ADD4547"/>
     <w:multiLevelType w:val="hybridMultilevel"/>
     <w:tmpl w:val="AA9C9600"/>
@@ -3914,7 +4600,7 @@
     <w:abstractNumId w:val="5"/>
   </w:num>
   <w:num w:numId="2" w16cid:durableId="627665801">
-    <w:abstractNumId w:val="14"/>
+    <w:abstractNumId w:val="15"/>
   </w:num>
   <w:num w:numId="3" w16cid:durableId="282733127">
     <w:abstractNumId w:val="2"/>
@@ -3954,6 +4640,9 @@
   </w:num>
   <w:num w:numId="15" w16cid:durableId="1283805297">
     <w:abstractNumId w:val="6"/>
+  </w:num>
+  <w:num w:numId="16" w16cid:durableId="1537161579">
+    <w:abstractNumId w:val="14"/>
   </w:num>
 </w:numbering>
 </file>

</xml_diff>

<commit_message>
Airport database report update
</commit_message>
<xml_diff>
--- a/2. Airport Database System/40841063_HLUM HTET AUNG Part 2 - Database/40841063_Part 2 Database Report.docx
+++ b/2. Airport Database System/40841063_HLUM HTET AUNG Part 2 - Database/40841063_Part 2 Database Report.docx
@@ -137,7 +137,7 @@
           <w:r>
             <w:fldChar w:fldCharType="separate"/>
           </w:r>
-          <w:hyperlink w:anchor="_Toc237254948" w:history="1">
+          <w:hyperlink w:anchor="_Toc237270756" w:history="1">
             <w:r>
               <w:rPr>
                 <w:rStyle w:val="Hyperlink"/>
@@ -164,7 +164,7 @@
                 <w:noProof/>
                 <w:webHidden/>
               </w:rPr>
-              <w:instrText xml:space="preserve"> PAGEREF _Toc237254948 \h </w:instrText>
+              <w:instrText xml:space="preserve"> PAGEREF _Toc237270756 \h </w:instrText>
             </w:r>
             <w:r>
               <w:rPr>
@@ -206,7 +206,7 @@
               <w:noProof/>
             </w:rPr>
           </w:pPr>
-          <w:hyperlink w:anchor="_Toc237254949" w:history="1">
+          <w:hyperlink w:anchor="_Toc237270757" w:history="1">
             <w:r>
               <w:rPr>
                 <w:rStyle w:val="Hyperlink"/>
@@ -233,7 +233,7 @@
                 <w:noProof/>
                 <w:webHidden/>
               </w:rPr>
-              <w:instrText xml:space="preserve"> PAGEREF _Toc237254949 \h </w:instrText>
+              <w:instrText xml:space="preserve"> PAGEREF _Toc237270757 \h </w:instrText>
             </w:r>
             <w:r>
               <w:rPr>
@@ -254,6 +254,696 @@
                 <w:webHidden/>
               </w:rPr>
               <w:t>3</w:t>
+            </w:r>
+            <w:r>
+              <w:rPr>
+                <w:noProof/>
+                <w:webHidden/>
+              </w:rPr>
+              <w:fldChar w:fldCharType="end"/>
+            </w:r>
+          </w:hyperlink>
+        </w:p>
+        <w:p>
+          <w:pPr>
+            <w:pStyle w:val="TOC2"/>
+            <w:tabs>
+              <w:tab w:val="right" w:leader="dot" w:pos="9350"/>
+            </w:tabs>
+            <w:rPr>
+              <w:rFonts w:asciiTheme="minorHAnsi" w:eastAsiaTheme="minorEastAsia" w:hAnsiTheme="minorHAnsi"/>
+              <w:noProof/>
+            </w:rPr>
+          </w:pPr>
+          <w:hyperlink w:anchor="_Toc237270758" w:history="1">
+            <w:r>
+              <w:rPr>
+                <w:rStyle w:val="Hyperlink"/>
+                <w:noProof/>
+              </w:rPr>
+              <w:t>Additional Attributes for technicians and traffic controllers</w:t>
+            </w:r>
+            <w:r>
+              <w:rPr>
+                <w:noProof/>
+                <w:webHidden/>
+              </w:rPr>
+              <w:tab/>
+            </w:r>
+            <w:r>
+              <w:rPr>
+                <w:noProof/>
+                <w:webHidden/>
+              </w:rPr>
+              <w:fldChar w:fldCharType="begin"/>
+            </w:r>
+            <w:r>
+              <w:rPr>
+                <w:noProof/>
+                <w:webHidden/>
+              </w:rPr>
+              <w:instrText xml:space="preserve"> PAGEREF _Toc237270758 \h </w:instrText>
+            </w:r>
+            <w:r>
+              <w:rPr>
+                <w:noProof/>
+                <w:webHidden/>
+              </w:rPr>
+            </w:r>
+            <w:r>
+              <w:rPr>
+                <w:noProof/>
+                <w:webHidden/>
+              </w:rPr>
+              <w:fldChar w:fldCharType="separate"/>
+            </w:r>
+            <w:r>
+              <w:rPr>
+                <w:noProof/>
+                <w:webHidden/>
+              </w:rPr>
+              <w:t>3</w:t>
+            </w:r>
+            <w:r>
+              <w:rPr>
+                <w:noProof/>
+                <w:webHidden/>
+              </w:rPr>
+              <w:fldChar w:fldCharType="end"/>
+            </w:r>
+          </w:hyperlink>
+        </w:p>
+        <w:p>
+          <w:pPr>
+            <w:pStyle w:val="TOC2"/>
+            <w:tabs>
+              <w:tab w:val="right" w:leader="dot" w:pos="9350"/>
+            </w:tabs>
+            <w:rPr>
+              <w:rFonts w:asciiTheme="minorHAnsi" w:eastAsiaTheme="minorEastAsia" w:hAnsiTheme="minorHAnsi"/>
+              <w:noProof/>
+            </w:rPr>
+          </w:pPr>
+          <w:hyperlink w:anchor="_Toc237270759" w:history="1">
+            <w:r>
+              <w:rPr>
+                <w:rStyle w:val="Hyperlink"/>
+                <w:noProof/>
+              </w:rPr>
+              <w:t>Updated Justifications/Assumptions (From Part 1)</w:t>
+            </w:r>
+            <w:r>
+              <w:rPr>
+                <w:noProof/>
+                <w:webHidden/>
+              </w:rPr>
+              <w:tab/>
+            </w:r>
+            <w:r>
+              <w:rPr>
+                <w:noProof/>
+                <w:webHidden/>
+              </w:rPr>
+              <w:fldChar w:fldCharType="begin"/>
+            </w:r>
+            <w:r>
+              <w:rPr>
+                <w:noProof/>
+                <w:webHidden/>
+              </w:rPr>
+              <w:instrText xml:space="preserve"> PAGEREF _Toc237270759 \h </w:instrText>
+            </w:r>
+            <w:r>
+              <w:rPr>
+                <w:noProof/>
+                <w:webHidden/>
+              </w:rPr>
+            </w:r>
+            <w:r>
+              <w:rPr>
+                <w:noProof/>
+                <w:webHidden/>
+              </w:rPr>
+              <w:fldChar w:fldCharType="separate"/>
+            </w:r>
+            <w:r>
+              <w:rPr>
+                <w:noProof/>
+                <w:webHidden/>
+              </w:rPr>
+              <w:t>4</w:t>
+            </w:r>
+            <w:r>
+              <w:rPr>
+                <w:noProof/>
+                <w:webHidden/>
+              </w:rPr>
+              <w:fldChar w:fldCharType="end"/>
+            </w:r>
+          </w:hyperlink>
+        </w:p>
+        <w:p>
+          <w:pPr>
+            <w:pStyle w:val="TOC2"/>
+            <w:tabs>
+              <w:tab w:val="right" w:leader="dot" w:pos="9350"/>
+            </w:tabs>
+            <w:rPr>
+              <w:rFonts w:asciiTheme="minorHAnsi" w:eastAsiaTheme="minorEastAsia" w:hAnsiTheme="minorHAnsi"/>
+              <w:noProof/>
+            </w:rPr>
+          </w:pPr>
+          <w:hyperlink w:anchor="_Toc237270760" w:history="1">
+            <w:r>
+              <w:rPr>
+                <w:rStyle w:val="Hyperlink"/>
+                <w:noProof/>
+              </w:rPr>
+              <w:t>Justification/Assumption for keys</w:t>
+            </w:r>
+            <w:r>
+              <w:rPr>
+                <w:noProof/>
+                <w:webHidden/>
+              </w:rPr>
+              <w:tab/>
+            </w:r>
+            <w:r>
+              <w:rPr>
+                <w:noProof/>
+                <w:webHidden/>
+              </w:rPr>
+              <w:fldChar w:fldCharType="begin"/>
+            </w:r>
+            <w:r>
+              <w:rPr>
+                <w:noProof/>
+                <w:webHidden/>
+              </w:rPr>
+              <w:instrText xml:space="preserve"> PAGEREF _Toc237270760 \h </w:instrText>
+            </w:r>
+            <w:r>
+              <w:rPr>
+                <w:noProof/>
+                <w:webHidden/>
+              </w:rPr>
+            </w:r>
+            <w:r>
+              <w:rPr>
+                <w:noProof/>
+                <w:webHidden/>
+              </w:rPr>
+              <w:fldChar w:fldCharType="separate"/>
+            </w:r>
+            <w:r>
+              <w:rPr>
+                <w:noProof/>
+                <w:webHidden/>
+              </w:rPr>
+              <w:t>5</w:t>
+            </w:r>
+            <w:r>
+              <w:rPr>
+                <w:noProof/>
+                <w:webHidden/>
+              </w:rPr>
+              <w:fldChar w:fldCharType="end"/>
+            </w:r>
+          </w:hyperlink>
+        </w:p>
+        <w:p>
+          <w:pPr>
+            <w:pStyle w:val="TOC2"/>
+            <w:tabs>
+              <w:tab w:val="right" w:leader="dot" w:pos="9350"/>
+            </w:tabs>
+            <w:rPr>
+              <w:rFonts w:asciiTheme="minorHAnsi" w:eastAsiaTheme="minorEastAsia" w:hAnsiTheme="minorHAnsi"/>
+              <w:noProof/>
+            </w:rPr>
+          </w:pPr>
+          <w:hyperlink w:anchor="_Toc237270761" w:history="1">
+            <w:r>
+              <w:rPr>
+                <w:rStyle w:val="Hyperlink"/>
+                <w:noProof/>
+              </w:rPr>
+              <w:t>Updated Queries and Test Plan</w:t>
+            </w:r>
+            <w:r>
+              <w:rPr>
+                <w:noProof/>
+                <w:webHidden/>
+              </w:rPr>
+              <w:tab/>
+            </w:r>
+            <w:r>
+              <w:rPr>
+                <w:noProof/>
+                <w:webHidden/>
+              </w:rPr>
+              <w:fldChar w:fldCharType="begin"/>
+            </w:r>
+            <w:r>
+              <w:rPr>
+                <w:noProof/>
+                <w:webHidden/>
+              </w:rPr>
+              <w:instrText xml:space="preserve"> PAGEREF _Toc237270761 \h </w:instrText>
+            </w:r>
+            <w:r>
+              <w:rPr>
+                <w:noProof/>
+                <w:webHidden/>
+              </w:rPr>
+            </w:r>
+            <w:r>
+              <w:rPr>
+                <w:noProof/>
+                <w:webHidden/>
+              </w:rPr>
+              <w:fldChar w:fldCharType="separate"/>
+            </w:r>
+            <w:r>
+              <w:rPr>
+                <w:noProof/>
+                <w:webHidden/>
+              </w:rPr>
+              <w:t>5</w:t>
+            </w:r>
+            <w:r>
+              <w:rPr>
+                <w:noProof/>
+                <w:webHidden/>
+              </w:rPr>
+              <w:fldChar w:fldCharType="end"/>
+            </w:r>
+          </w:hyperlink>
+        </w:p>
+        <w:p>
+          <w:pPr>
+            <w:pStyle w:val="TOC3"/>
+            <w:tabs>
+              <w:tab w:val="right" w:leader="dot" w:pos="9350"/>
+            </w:tabs>
+            <w:rPr>
+              <w:rFonts w:asciiTheme="minorHAnsi" w:eastAsiaTheme="minorEastAsia" w:hAnsiTheme="minorHAnsi"/>
+              <w:noProof/>
+            </w:rPr>
+          </w:pPr>
+          <w:hyperlink w:anchor="_Toc237270762" w:history="1">
+            <w:r>
+              <w:rPr>
+                <w:rStyle w:val="Hyperlink"/>
+                <w:noProof/>
+              </w:rPr>
+              <w:t>Aircraft Test Performance Summary (Query 1)</w:t>
+            </w:r>
+            <w:r>
+              <w:rPr>
+                <w:noProof/>
+                <w:webHidden/>
+              </w:rPr>
+              <w:tab/>
+            </w:r>
+            <w:r>
+              <w:rPr>
+                <w:noProof/>
+                <w:webHidden/>
+              </w:rPr>
+              <w:fldChar w:fldCharType="begin"/>
+            </w:r>
+            <w:r>
+              <w:rPr>
+                <w:noProof/>
+                <w:webHidden/>
+              </w:rPr>
+              <w:instrText xml:space="preserve"> PAGEREF _Toc237270762 \h </w:instrText>
+            </w:r>
+            <w:r>
+              <w:rPr>
+                <w:noProof/>
+                <w:webHidden/>
+              </w:rPr>
+            </w:r>
+            <w:r>
+              <w:rPr>
+                <w:noProof/>
+                <w:webHidden/>
+              </w:rPr>
+              <w:fldChar w:fldCharType="separate"/>
+            </w:r>
+            <w:r>
+              <w:rPr>
+                <w:noProof/>
+                <w:webHidden/>
+              </w:rPr>
+              <w:t>5</w:t>
+            </w:r>
+            <w:r>
+              <w:rPr>
+                <w:noProof/>
+                <w:webHidden/>
+              </w:rPr>
+              <w:fldChar w:fldCharType="end"/>
+            </w:r>
+          </w:hyperlink>
+        </w:p>
+        <w:p>
+          <w:pPr>
+            <w:pStyle w:val="TOC3"/>
+            <w:tabs>
+              <w:tab w:val="right" w:leader="dot" w:pos="9350"/>
+            </w:tabs>
+            <w:rPr>
+              <w:rFonts w:asciiTheme="minorHAnsi" w:eastAsiaTheme="minorEastAsia" w:hAnsiTheme="minorHAnsi"/>
+              <w:noProof/>
+            </w:rPr>
+          </w:pPr>
+          <w:hyperlink w:anchor="_Toc237270763" w:history="1">
+            <w:r>
+              <w:rPr>
+                <w:rStyle w:val="Hyperlink"/>
+                <w:noProof/>
+              </w:rPr>
+              <w:t>Technician Annual Performance (Query 2)</w:t>
+            </w:r>
+            <w:r>
+              <w:rPr>
+                <w:noProof/>
+                <w:webHidden/>
+              </w:rPr>
+              <w:tab/>
+            </w:r>
+            <w:r>
+              <w:rPr>
+                <w:noProof/>
+                <w:webHidden/>
+              </w:rPr>
+              <w:fldChar w:fldCharType="begin"/>
+            </w:r>
+            <w:r>
+              <w:rPr>
+                <w:noProof/>
+                <w:webHidden/>
+              </w:rPr>
+              <w:instrText xml:space="preserve"> PAGEREF _Toc237270763 \h </w:instrText>
+            </w:r>
+            <w:r>
+              <w:rPr>
+                <w:noProof/>
+                <w:webHidden/>
+              </w:rPr>
+            </w:r>
+            <w:r>
+              <w:rPr>
+                <w:noProof/>
+                <w:webHidden/>
+              </w:rPr>
+              <w:fldChar w:fldCharType="separate"/>
+            </w:r>
+            <w:r>
+              <w:rPr>
+                <w:noProof/>
+                <w:webHidden/>
+              </w:rPr>
+              <w:t>5</w:t>
+            </w:r>
+            <w:r>
+              <w:rPr>
+                <w:noProof/>
+                <w:webHidden/>
+              </w:rPr>
+              <w:fldChar w:fldCharType="end"/>
+            </w:r>
+          </w:hyperlink>
+        </w:p>
+        <w:p>
+          <w:pPr>
+            <w:pStyle w:val="TOC3"/>
+            <w:tabs>
+              <w:tab w:val="right" w:leader="dot" w:pos="9350"/>
+            </w:tabs>
+            <w:rPr>
+              <w:rFonts w:asciiTheme="minorHAnsi" w:eastAsiaTheme="minorEastAsia" w:hAnsiTheme="minorHAnsi"/>
+              <w:noProof/>
+            </w:rPr>
+          </w:pPr>
+          <w:hyperlink w:anchor="_Toc237270764" w:history="1">
+            <w:r>
+              <w:rPr>
+                <w:rStyle w:val="Hyperlink"/>
+                <w:noProof/>
+              </w:rPr>
+              <w:t>Recently Examined Traffic Controllers (Query 3)</w:t>
+            </w:r>
+            <w:r>
+              <w:rPr>
+                <w:noProof/>
+                <w:webHidden/>
+              </w:rPr>
+              <w:tab/>
+            </w:r>
+            <w:r>
+              <w:rPr>
+                <w:noProof/>
+                <w:webHidden/>
+              </w:rPr>
+              <w:fldChar w:fldCharType="begin"/>
+            </w:r>
+            <w:r>
+              <w:rPr>
+                <w:noProof/>
+                <w:webHidden/>
+              </w:rPr>
+              <w:instrText xml:space="preserve"> PAGEREF _Toc237270764 \h </w:instrText>
+            </w:r>
+            <w:r>
+              <w:rPr>
+                <w:noProof/>
+                <w:webHidden/>
+              </w:rPr>
+            </w:r>
+            <w:r>
+              <w:rPr>
+                <w:noProof/>
+                <w:webHidden/>
+              </w:rPr>
+              <w:fldChar w:fldCharType="separate"/>
+            </w:r>
+            <w:r>
+              <w:rPr>
+                <w:noProof/>
+                <w:webHidden/>
+              </w:rPr>
+              <w:t>6</w:t>
+            </w:r>
+            <w:r>
+              <w:rPr>
+                <w:noProof/>
+                <w:webHidden/>
+              </w:rPr>
+              <w:fldChar w:fldCharType="end"/>
+            </w:r>
+          </w:hyperlink>
+        </w:p>
+        <w:p>
+          <w:pPr>
+            <w:pStyle w:val="TOC3"/>
+            <w:tabs>
+              <w:tab w:val="right" w:leader="dot" w:pos="9350"/>
+            </w:tabs>
+            <w:rPr>
+              <w:rFonts w:asciiTheme="minorHAnsi" w:eastAsiaTheme="minorEastAsia" w:hAnsiTheme="minorHAnsi"/>
+              <w:noProof/>
+            </w:rPr>
+          </w:pPr>
+          <w:hyperlink w:anchor="_Toc237270765" w:history="1">
+            <w:r>
+              <w:rPr>
+                <w:rStyle w:val="Hyperlink"/>
+                <w:noProof/>
+              </w:rPr>
+              <w:t>Aircraft safety check (Query 4)</w:t>
+            </w:r>
+            <w:r>
+              <w:rPr>
+                <w:noProof/>
+                <w:webHidden/>
+              </w:rPr>
+              <w:tab/>
+            </w:r>
+            <w:r>
+              <w:rPr>
+                <w:noProof/>
+                <w:webHidden/>
+              </w:rPr>
+              <w:fldChar w:fldCharType="begin"/>
+            </w:r>
+            <w:r>
+              <w:rPr>
+                <w:noProof/>
+                <w:webHidden/>
+              </w:rPr>
+              <w:instrText xml:space="preserve"> PAGEREF _Toc237270765 \h </w:instrText>
+            </w:r>
+            <w:r>
+              <w:rPr>
+                <w:noProof/>
+                <w:webHidden/>
+              </w:rPr>
+            </w:r>
+            <w:r>
+              <w:rPr>
+                <w:noProof/>
+                <w:webHidden/>
+              </w:rPr>
+              <w:fldChar w:fldCharType="separate"/>
+            </w:r>
+            <w:r>
+              <w:rPr>
+                <w:noProof/>
+                <w:webHidden/>
+              </w:rPr>
+              <w:t>6</w:t>
+            </w:r>
+            <w:r>
+              <w:rPr>
+                <w:noProof/>
+                <w:webHidden/>
+              </w:rPr>
+              <w:fldChar w:fldCharType="end"/>
+            </w:r>
+          </w:hyperlink>
+        </w:p>
+        <w:p>
+          <w:pPr>
+            <w:pStyle w:val="TOC3"/>
+            <w:tabs>
+              <w:tab w:val="right" w:leader="dot" w:pos="9350"/>
+            </w:tabs>
+            <w:rPr>
+              <w:rFonts w:asciiTheme="minorHAnsi" w:eastAsiaTheme="minorEastAsia" w:hAnsiTheme="minorHAnsi"/>
+              <w:noProof/>
+            </w:rPr>
+          </w:pPr>
+          <w:hyperlink w:anchor="_Toc237270766" w:history="1">
+            <w:r>
+              <w:rPr>
+                <w:rStyle w:val="Hyperlink"/>
+                <w:noProof/>
+              </w:rPr>
+              <w:t>Technician Expertise and Aircraft model summary</w:t>
+            </w:r>
+            <w:r>
+              <w:rPr>
+                <w:noProof/>
+                <w:webHidden/>
+              </w:rPr>
+              <w:tab/>
+            </w:r>
+            <w:r>
+              <w:rPr>
+                <w:noProof/>
+                <w:webHidden/>
+              </w:rPr>
+              <w:fldChar w:fldCharType="begin"/>
+            </w:r>
+            <w:r>
+              <w:rPr>
+                <w:noProof/>
+                <w:webHidden/>
+              </w:rPr>
+              <w:instrText xml:space="preserve"> PAGEREF _Toc237270766 \h </w:instrText>
+            </w:r>
+            <w:r>
+              <w:rPr>
+                <w:noProof/>
+                <w:webHidden/>
+              </w:rPr>
+            </w:r>
+            <w:r>
+              <w:rPr>
+                <w:noProof/>
+                <w:webHidden/>
+              </w:rPr>
+              <w:fldChar w:fldCharType="separate"/>
+            </w:r>
+            <w:r>
+              <w:rPr>
+                <w:noProof/>
+                <w:webHidden/>
+              </w:rPr>
+              <w:t>6</w:t>
+            </w:r>
+            <w:r>
+              <w:rPr>
+                <w:noProof/>
+                <w:webHidden/>
+              </w:rPr>
+              <w:fldChar w:fldCharType="end"/>
+            </w:r>
+          </w:hyperlink>
+        </w:p>
+        <w:p>
+          <w:pPr>
+            <w:pStyle w:val="TOC3"/>
+            <w:tabs>
+              <w:tab w:val="right" w:leader="dot" w:pos="9350"/>
+            </w:tabs>
+            <w:rPr>
+              <w:rFonts w:asciiTheme="minorHAnsi" w:eastAsiaTheme="minorEastAsia" w:hAnsiTheme="minorHAnsi"/>
+              <w:noProof/>
+            </w:rPr>
+          </w:pPr>
+          <w:hyperlink w:anchor="_Toc237270767" w:history="1">
+            <w:r>
+              <w:rPr>
+                <w:rStyle w:val="Hyperlink"/>
+                <w:noProof/>
+              </w:rPr>
+              <w:t>Query Test Plane</w:t>
+            </w:r>
+            <w:r>
+              <w:rPr>
+                <w:noProof/>
+                <w:webHidden/>
+              </w:rPr>
+              <w:tab/>
+            </w:r>
+            <w:r>
+              <w:rPr>
+                <w:noProof/>
+                <w:webHidden/>
+              </w:rPr>
+              <w:fldChar w:fldCharType="begin"/>
+            </w:r>
+            <w:r>
+              <w:rPr>
+                <w:noProof/>
+                <w:webHidden/>
+              </w:rPr>
+              <w:instrText xml:space="preserve"> PAGEREF _Toc237270767 \h </w:instrText>
+            </w:r>
+            <w:r>
+              <w:rPr>
+                <w:noProof/>
+                <w:webHidden/>
+              </w:rPr>
+            </w:r>
+            <w:r>
+              <w:rPr>
+                <w:noProof/>
+                <w:webHidden/>
+              </w:rPr>
+              <w:fldChar w:fldCharType="separate"/>
+            </w:r>
+            <w:r>
+              <w:rPr>
+                <w:noProof/>
+                <w:webHidden/>
+              </w:rPr>
+              <w:t>7</w:t>
             </w:r>
             <w:r>
               <w:rPr>
@@ -275,7 +965,7 @@
               <w:noProof/>
             </w:rPr>
           </w:pPr>
-          <w:hyperlink w:anchor="_Toc237254950" w:history="1">
+          <w:hyperlink w:anchor="_Toc237270768" w:history="1">
             <w:r>
               <w:rPr>
                 <w:rStyle w:val="Hyperlink"/>
@@ -302,7 +992,7 @@
                 <w:noProof/>
                 <w:webHidden/>
               </w:rPr>
-              <w:instrText xml:space="preserve"> PAGEREF _Toc237254950 \h </w:instrText>
+              <w:instrText xml:space="preserve"> PAGEREF _Toc237270768 \h </w:instrText>
             </w:r>
             <w:r>
               <w:rPr>
@@ -322,7 +1012,7 @@
                 <w:noProof/>
                 <w:webHidden/>
               </w:rPr>
-              <w:t>4</w:t>
+              <w:t>9</w:t>
             </w:r>
             <w:r>
               <w:rPr>
@@ -344,7 +1034,7 @@
               <w:noProof/>
             </w:rPr>
           </w:pPr>
-          <w:hyperlink w:anchor="_Toc237254951" w:history="1">
+          <w:hyperlink w:anchor="_Toc237270769" w:history="1">
             <w:r>
               <w:rPr>
                 <w:rStyle w:val="Hyperlink"/>
@@ -371,7 +1061,7 @@
                 <w:noProof/>
                 <w:webHidden/>
               </w:rPr>
-              <w:instrText xml:space="preserve"> PAGEREF _Toc237254951 \h </w:instrText>
+              <w:instrText xml:space="preserve"> PAGEREF _Toc237270769 \h </w:instrText>
             </w:r>
             <w:r>
               <w:rPr>
@@ -391,7 +1081,7 @@
                 <w:noProof/>
                 <w:webHidden/>
               </w:rPr>
-              <w:t>4</w:t>
+              <w:t>9</w:t>
             </w:r>
             <w:r>
               <w:rPr>
@@ -413,7 +1103,7 @@
               <w:noProof/>
             </w:rPr>
           </w:pPr>
-          <w:hyperlink w:anchor="_Toc237254952" w:history="1">
+          <w:hyperlink w:anchor="_Toc237270770" w:history="1">
             <w:r>
               <w:rPr>
                 <w:rStyle w:val="Hyperlink"/>
@@ -440,7 +1130,7 @@
                 <w:noProof/>
                 <w:webHidden/>
               </w:rPr>
-              <w:instrText xml:space="preserve"> PAGEREF _Toc237254952 \h </w:instrText>
+              <w:instrText xml:space="preserve"> PAGEREF _Toc237270770 \h </w:instrText>
             </w:r>
             <w:r>
               <w:rPr>
@@ -460,7 +1150,7 @@
                 <w:noProof/>
                 <w:webHidden/>
               </w:rPr>
-              <w:t>5</w:t>
+              <w:t>10</w:t>
             </w:r>
             <w:r>
               <w:rPr>
@@ -482,7 +1172,7 @@
               <w:noProof/>
             </w:rPr>
           </w:pPr>
-          <w:hyperlink w:anchor="_Toc237254953" w:history="1">
+          <w:hyperlink w:anchor="_Toc237270771" w:history="1">
             <w:r>
               <w:rPr>
                 <w:rStyle w:val="Hyperlink"/>
@@ -509,7 +1199,7 @@
                 <w:noProof/>
                 <w:webHidden/>
               </w:rPr>
-              <w:instrText xml:space="preserve"> PAGEREF _Toc237254953 \h </w:instrText>
+              <w:instrText xml:space="preserve"> PAGEREF _Toc237270771 \h </w:instrText>
             </w:r>
             <w:r>
               <w:rPr>
@@ -529,7 +1219,7 @@
                 <w:noProof/>
                 <w:webHidden/>
               </w:rPr>
-              <w:t>6</w:t>
+              <w:t>11</w:t>
             </w:r>
             <w:r>
               <w:rPr>
@@ -551,7 +1241,7 @@
               <w:noProof/>
             </w:rPr>
           </w:pPr>
-          <w:hyperlink w:anchor="_Toc237254954" w:history="1">
+          <w:hyperlink w:anchor="_Toc237270772" w:history="1">
             <w:r>
               <w:rPr>
                 <w:rStyle w:val="Hyperlink"/>
@@ -578,7 +1268,7 @@
                 <w:noProof/>
                 <w:webHidden/>
               </w:rPr>
-              <w:instrText xml:space="preserve"> PAGEREF _Toc237254954 \h </w:instrText>
+              <w:instrText xml:space="preserve"> PAGEREF _Toc237270772 \h </w:instrText>
             </w:r>
             <w:r>
               <w:rPr>
@@ -598,7 +1288,7 @@
                 <w:noProof/>
                 <w:webHidden/>
               </w:rPr>
-              <w:t>6</w:t>
+              <w:t>11</w:t>
             </w:r>
             <w:r>
               <w:rPr>
@@ -620,7 +1310,7 @@
               <w:noProof/>
             </w:rPr>
           </w:pPr>
-          <w:hyperlink w:anchor="_Toc237254955" w:history="1">
+          <w:hyperlink w:anchor="_Toc237270773" w:history="1">
             <w:r>
               <w:rPr>
                 <w:rStyle w:val="Hyperlink"/>
@@ -647,7 +1337,7 @@
                 <w:noProof/>
                 <w:webHidden/>
               </w:rPr>
-              <w:instrText xml:space="preserve"> PAGEREF _Toc237254955 \h </w:instrText>
+              <w:instrText xml:space="preserve"> PAGEREF _Toc237270773 \h </w:instrText>
             </w:r>
             <w:r>
               <w:rPr>
@@ -667,7 +1357,7 @@
                 <w:noProof/>
                 <w:webHidden/>
               </w:rPr>
-              <w:t>7</w:t>
+              <w:t>12</w:t>
             </w:r>
             <w:r>
               <w:rPr>
@@ -689,7 +1379,7 @@
               <w:noProof/>
             </w:rPr>
           </w:pPr>
-          <w:hyperlink w:anchor="_Toc237254956" w:history="1">
+          <w:hyperlink w:anchor="_Toc237270774" w:history="1">
             <w:r>
               <w:rPr>
                 <w:rStyle w:val="Hyperlink"/>
@@ -716,7 +1406,7 @@
                 <w:noProof/>
                 <w:webHidden/>
               </w:rPr>
-              <w:instrText xml:space="preserve"> PAGEREF _Toc237254956 \h </w:instrText>
+              <w:instrText xml:space="preserve"> PAGEREF _Toc237270774 \h </w:instrText>
             </w:r>
             <w:r>
               <w:rPr>
@@ -736,7 +1426,76 @@
                 <w:noProof/>
                 <w:webHidden/>
               </w:rPr>
-              <w:t>7</w:t>
+              <w:t>12</w:t>
+            </w:r>
+            <w:r>
+              <w:rPr>
+                <w:noProof/>
+                <w:webHidden/>
+              </w:rPr>
+              <w:fldChar w:fldCharType="end"/>
+            </w:r>
+          </w:hyperlink>
+        </w:p>
+        <w:p>
+          <w:pPr>
+            <w:pStyle w:val="TOC2"/>
+            <w:tabs>
+              <w:tab w:val="right" w:leader="dot" w:pos="9350"/>
+            </w:tabs>
+            <w:rPr>
+              <w:rFonts w:asciiTheme="minorHAnsi" w:eastAsiaTheme="minorEastAsia" w:hAnsiTheme="minorHAnsi"/>
+              <w:noProof/>
+            </w:rPr>
+          </w:pPr>
+          <w:hyperlink w:anchor="_Toc237270775" w:history="1">
+            <w:r>
+              <w:rPr>
+                <w:rStyle w:val="Hyperlink"/>
+                <w:noProof/>
+              </w:rPr>
+              <w:t>Task D</w:t>
+            </w:r>
+            <w:r>
+              <w:rPr>
+                <w:noProof/>
+                <w:webHidden/>
+              </w:rPr>
+              <w:tab/>
+            </w:r>
+            <w:r>
+              <w:rPr>
+                <w:noProof/>
+                <w:webHidden/>
+              </w:rPr>
+              <w:fldChar w:fldCharType="begin"/>
+            </w:r>
+            <w:r>
+              <w:rPr>
+                <w:noProof/>
+                <w:webHidden/>
+              </w:rPr>
+              <w:instrText xml:space="preserve"> PAGEREF _Toc237270775 \h </w:instrText>
+            </w:r>
+            <w:r>
+              <w:rPr>
+                <w:noProof/>
+                <w:webHidden/>
+              </w:rPr>
+            </w:r>
+            <w:r>
+              <w:rPr>
+                <w:noProof/>
+                <w:webHidden/>
+              </w:rPr>
+              <w:fldChar w:fldCharType="separate"/>
+            </w:r>
+            <w:r>
+              <w:rPr>
+                <w:noProof/>
+                <w:webHidden/>
+              </w:rPr>
+              <w:t>13</w:t>
             </w:r>
             <w:r>
               <w:rPr>
@@ -771,7 +1530,7 @@
       <w:pPr>
         <w:pStyle w:val="Heading1"/>
       </w:pPr>
-      <w:bookmarkStart w:id="0" w:name="_Toc237254948"/>
+      <w:bookmarkStart w:id="0" w:name="_Toc237270756"/>
       <w:r>
         <w:lastRenderedPageBreak/>
         <w:t>Feedback Updates</w:t>
@@ -790,7 +1549,7 @@
       <w:pPr>
         <w:pStyle w:val="Heading2"/>
       </w:pPr>
-      <w:bookmarkStart w:id="1" w:name="_Toc237254949"/>
+      <w:bookmarkStart w:id="1" w:name="_Toc237270757"/>
       <w:r>
         <w:t>Union Table Separation</w:t>
       </w:r>
@@ -895,9 +1654,11 @@
       <w:pPr>
         <w:pStyle w:val="Heading2"/>
       </w:pPr>
+      <w:bookmarkStart w:id="2" w:name="_Toc237270758"/>
       <w:r>
         <w:t>Additional Attributes for technicians and traffic controllers</w:t>
       </w:r>
+      <w:bookmarkEnd w:id="2"/>
     </w:p>
     <w:p>
       <w:pPr>
@@ -915,7 +1676,23 @@
           <w:b/>
           <w:bCs/>
         </w:rPr>
-        <w:t>Hourly rates can be seen in both technicians and traffic controllers.</w:t>
+        <w:t xml:space="preserve">Hourly rates can be seen </w:t>
+      </w:r>
+      <w:proofErr w:type="gramStart"/>
+      <w:r>
+        <w:rPr>
+          <w:b/>
+          <w:bCs/>
+        </w:rPr>
+        <w:t>in</w:t>
+      </w:r>
+      <w:proofErr w:type="gramEnd"/>
+      <w:r>
+        <w:rPr>
+          <w:b/>
+          <w:bCs/>
+        </w:rPr>
+        <w:t xml:space="preserve"> both technicians and traffic controllers.</w:t>
       </w:r>
     </w:p>
     <w:p>
@@ -936,6 +1713,7 @@
       <w:pPr>
         <w:pStyle w:val="Heading2"/>
       </w:pPr>
+      <w:bookmarkStart w:id="3" w:name="_Toc237270759"/>
       <w:r>
         <w:lastRenderedPageBreak/>
         <w:t>Updated Justifications/Assumptions</w:t>
@@ -943,6 +1721,7 @@
       <w:r>
         <w:t xml:space="preserve"> (From Part 1)</w:t>
       </w:r>
+      <w:bookmarkEnd w:id="3"/>
     </w:p>
     <w:p>
       <w:r>
@@ -986,7 +1765,15 @@
         <w:t>relationships</w:t>
       </w:r>
       <w:r>
-        <w:t xml:space="preserve"> where an employee can belong to at most one labor union, while a single union can represent multiple employees. Union Table’s primary key union_id acts as foreign key in Employee table.</w:t>
+        <w:t xml:space="preserve"> where an employee can belong to at most one labor union, while a single union can represent multiple employees. Union Table’s primary key </w:t>
+      </w:r>
+      <w:proofErr w:type="spellStart"/>
+      <w:r>
+        <w:t>union_id</w:t>
+      </w:r>
+      <w:proofErr w:type="spellEnd"/>
+      <w:r>
+        <w:t xml:space="preserve"> acts as foreign key in Employee table.</w:t>
       </w:r>
     </w:p>
     <w:p>
@@ -1055,7 +1842,15 @@
         <w:t xml:space="preserve">(Test events 1: *-------1:1 Airworthy test model) – </w:t>
       </w:r>
       <w:r>
-        <w:t>one to many relations where a airworthiness test template can be used across many test events. However, each test event is used in exactly one test model.</w:t>
+        <w:t xml:space="preserve">one to many relations where </w:t>
+      </w:r>
+      <w:proofErr w:type="gramStart"/>
+      <w:r>
+        <w:t>a</w:t>
+      </w:r>
+      <w:proofErr w:type="gramEnd"/>
+      <w:r>
+        <w:t xml:space="preserve"> airworthiness test template can be used across many test events. However, each test event is used in exactly one test model.</w:t>
       </w:r>
     </w:p>
     <w:p>
@@ -1085,7 +1880,15 @@
         <w:t xml:space="preserve">(Technicians 1:1-------1:1 Employee) – </w:t>
       </w:r>
       <w:r>
-        <w:t>one to one parent and child table relation. Employee stores shared personal attributes for both technicians and traffic controllers, while technician specific attributes are stored in Technicians using ssn as a primary key and foreign key.</w:t>
+        <w:t xml:space="preserve">one to one parent and child table relation. Employee stores shared personal attributes for both technicians and traffic controllers, while technician specific attributes are stored in Technicians using </w:t>
+      </w:r>
+      <w:proofErr w:type="spellStart"/>
+      <w:r>
+        <w:t>ssn</w:t>
+      </w:r>
+      <w:proofErr w:type="spellEnd"/>
+      <w:r>
+        <w:t xml:space="preserve"> as a primary key and foreign key.</w:t>
       </w:r>
     </w:p>
     <w:p>
@@ -1169,10 +1972,12 @@
       <w:pPr>
         <w:pStyle w:val="Heading2"/>
       </w:pPr>
+      <w:bookmarkStart w:id="4" w:name="_Toc237270760"/>
       <w:r>
         <w:lastRenderedPageBreak/>
         <w:t>Justification/Assumption for keys</w:t>
       </w:r>
+      <w:bookmarkEnd w:id="4"/>
     </w:p>
     <w:p>
       <w:r>
@@ -1194,7 +1999,15 @@
         <w:t>Natural Primary Key</w:t>
       </w:r>
       <w:r>
-        <w:t xml:space="preserve"> – ssn from Employee table, registration number from Airplane table are chosen because they are guaranteed to be unique for each employee and airplane.</w:t>
+        <w:t xml:space="preserve"> – </w:t>
+      </w:r>
+      <w:proofErr w:type="spellStart"/>
+      <w:r>
+        <w:t>ssn</w:t>
+      </w:r>
+      <w:proofErr w:type="spellEnd"/>
+      <w:r>
+        <w:t xml:space="preserve"> from Employee table, registration number from Airplane table are chosen because they are guaranteed to be unique for each employee and airplane.</w:t>
       </w:r>
     </w:p>
     <w:p>
@@ -1218,13 +2031,2233 @@
         </w:numPr>
       </w:pPr>
       <w:r>
-        <w:t xml:space="preserve">Shared Primary/Foreign Keys – Technicians table’s ssn and Traffic controller’s table’s ssn are used as both primary key and foreign key to reference employee table. This is to ensure that the relation enforce strict one-to-one </w:t>
+        <w:t xml:space="preserve">Shared Primary/Foreign Keys – Technicians table’s </w:t>
+      </w:r>
+      <w:proofErr w:type="spellStart"/>
+      <w:r>
+        <w:t>ssn</w:t>
+      </w:r>
+      <w:proofErr w:type="spellEnd"/>
+      <w:r>
+        <w:t xml:space="preserve"> and Traffic controller’s table’s </w:t>
+      </w:r>
+      <w:proofErr w:type="spellStart"/>
+      <w:r>
+        <w:t>ssn</w:t>
+      </w:r>
+      <w:proofErr w:type="spellEnd"/>
+      <w:r>
+        <w:t xml:space="preserve"> are used as both primary key and foreign key to reference employee table. This is to ensure that the relation </w:t>
+      </w:r>
+      <w:r>
+        <w:t>enforces</w:t>
+      </w:r>
+      <w:r>
+        <w:t xml:space="preserve"> strict one-to-one </w:t>
       </w:r>
       <w:r>
         <w:t>relations</w:t>
       </w:r>
       <w:r>
         <w:t>.</w:t>
+      </w:r>
+    </w:p>
+    <w:p>
+      <w:pPr>
+        <w:pStyle w:val="Heading2"/>
+      </w:pPr>
+      <w:bookmarkStart w:id="5" w:name="_Toc237270761"/>
+      <w:r>
+        <w:t xml:space="preserve">Updated </w:t>
+      </w:r>
+      <w:r>
+        <w:t xml:space="preserve">Queries and </w:t>
+      </w:r>
+      <w:r>
+        <w:t>Test Plan</w:t>
+      </w:r>
+      <w:bookmarkEnd w:id="5"/>
+    </w:p>
+    <w:p>
+      <w:pPr>
+        <w:pStyle w:val="Heading3"/>
+      </w:pPr>
+      <w:bookmarkStart w:id="6" w:name="_Toc237270762"/>
+      <w:r>
+        <w:t>Aircraft Test Performance Summary (Query 1)</w:t>
+      </w:r>
+      <w:bookmarkEnd w:id="6"/>
+    </w:p>
+    <w:p>
+      <w:r>
+        <w:tab/>
+      </w:r>
+      <w:r>
+        <w:t>This query monitors how aircraft are tested and how many hours the test event takes, and average test scores the test achieved. This ensures the aircraft are airworthy and can perform flights. By looking at this query management can also monitor the planes’ health and performance.</w:t>
+      </w:r>
+    </w:p>
+    <w:p>
+      <w:r>
+        <w:t>Tables</w:t>
+      </w:r>
+      <w:r>
+        <w:t xml:space="preserve"> used</w:t>
+      </w:r>
+      <w:r>
+        <w:t xml:space="preserve"> – Test events, Airplane, Airplane models, Technicians</w:t>
+      </w:r>
+    </w:p>
+    <w:p>
+      <w:r>
+        <w:t>Aggregated Functions – COUNT, SUM, and AVG</w:t>
+      </w:r>
+    </w:p>
+    <w:p>
+      <w:pPr>
+        <w:pStyle w:val="Heading3"/>
+      </w:pPr>
+      <w:bookmarkStart w:id="7" w:name="_Toc237270763"/>
+      <w:r>
+        <w:t>Technician Annual Performance (Query 2)</w:t>
+      </w:r>
+      <w:bookmarkEnd w:id="7"/>
+    </w:p>
+    <w:p>
+      <w:r>
+        <w:tab/>
+      </w:r>
+      <w:r>
+        <w:t>For this query, management wants to identify which technicians conduct the most aircraft tests each year. This can help management recognize technicians with high performance and allocate testing work, as well as awarding properly.</w:t>
+      </w:r>
+    </w:p>
+    <w:p>
+      <w:r>
+        <w:t>Tables used – Employee, Technicians, Test events</w:t>
+      </w:r>
+    </w:p>
+    <w:p>
+      <w:r>
+        <w:t>Aggregated Functions – COUNT, GROUP BY</w:t>
+      </w:r>
+    </w:p>
+    <w:p/>
+    <w:p/>
+    <w:p>
+      <w:pPr>
+        <w:pStyle w:val="Heading3"/>
+      </w:pPr>
+      <w:bookmarkStart w:id="8" w:name="_Toc237270764"/>
+      <w:r>
+        <w:lastRenderedPageBreak/>
+        <w:t>Recently Examined Traffic Controllers</w:t>
+      </w:r>
+      <w:r>
+        <w:t xml:space="preserve"> (Query 3)</w:t>
+      </w:r>
+      <w:bookmarkEnd w:id="8"/>
+    </w:p>
+    <w:p>
+      <w:r>
+        <w:tab/>
+        <w:t>This query can provide management with the list of traffic controllers who have recently completed their medical examination. With this query, they can determine which controllers have current medical records and who need another examination.</w:t>
+      </w:r>
+    </w:p>
+    <w:p>
+      <w:r>
+        <w:t>Tables used – Employee, Traffic controllers</w:t>
+      </w:r>
+    </w:p>
+    <w:p>
+      <w:pPr>
+        <w:pStyle w:val="Heading3"/>
+      </w:pPr>
+      <w:bookmarkStart w:id="9" w:name="_Toc237270765"/>
+      <w:r>
+        <w:t>Aircraft safety check</w:t>
+      </w:r>
+      <w:r>
+        <w:t xml:space="preserve"> (Query 4)</w:t>
+      </w:r>
+      <w:bookmarkEnd w:id="9"/>
+    </w:p>
+    <w:p>
+      <w:r>
+        <w:tab/>
+      </w:r>
+      <w:r>
+        <w:t>This query can help management determine whether the latest test performed on an aircraft has achieved a score that could satisfy historical average score. This can help management determine if a plane is in good condition and if higher than average score the plane is safe to fly.</w:t>
+      </w:r>
+    </w:p>
+    <w:p>
+      <w:r>
+        <w:t>Tables used – Test events, Airplane, Airplane models, Technicians, Employee</w:t>
+      </w:r>
+    </w:p>
+    <w:p>
+      <w:r>
+        <w:t xml:space="preserve">Aggregated Functions </w:t>
+      </w:r>
+      <w:r>
+        <w:t>–</w:t>
+      </w:r>
+      <w:r>
+        <w:t xml:space="preserve"> AVG</w:t>
+      </w:r>
+    </w:p>
+    <w:p>
+      <w:pPr>
+        <w:pStyle w:val="Heading3"/>
+      </w:pPr>
+      <w:bookmarkStart w:id="10" w:name="_Toc237270766"/>
+      <w:r>
+        <w:t>Technician Expertise and Aircraft model summary</w:t>
+      </w:r>
+      <w:bookmarkEnd w:id="10"/>
+    </w:p>
+    <w:p>
+      <w:r>
+        <w:tab/>
+      </w:r>
+      <w:r>
+        <w:t>Management wants to identify which technicians are qualified to work on each aircraft model. This is useful for management to assign technicians properly to each plane that require testing</w:t>
+      </w:r>
+      <w:r>
+        <w:t xml:space="preserve"> or repair.</w:t>
+      </w:r>
+    </w:p>
+    <w:p>
+      <w:r>
+        <w:t>Tables used – Technician expertise, Technicians, Airplane models, Employee</w:t>
+      </w:r>
+    </w:p>
+    <w:p/>
+    <w:p/>
+    <w:p/>
+    <w:p/>
+    <w:p/>
+    <w:p/>
+    <w:p/>
+    <w:p>
+      <w:pPr>
+        <w:pStyle w:val="Heading3"/>
+      </w:pPr>
+      <w:bookmarkStart w:id="11" w:name="_Toc237270767"/>
+      <w:r>
+        <w:lastRenderedPageBreak/>
+        <w:t>Query Test Plane</w:t>
+      </w:r>
+      <w:bookmarkEnd w:id="11"/>
+    </w:p>
+    <w:tbl>
+      <w:tblPr>
+        <w:tblW w:w="9604" w:type="dxa"/>
+        <w:tblInd w:w="-38" w:type="dxa"/>
+        <w:tblLayout w:type="fixed"/>
+        <w:tblLook w:val="0000" w:firstRow="0" w:lastRow="0" w:firstColumn="0" w:lastColumn="0" w:noHBand="0" w:noVBand="0"/>
+      </w:tblPr>
+      <w:tblGrid>
+        <w:gridCol w:w="1057"/>
+        <w:gridCol w:w="3084"/>
+        <w:gridCol w:w="2379"/>
+        <w:gridCol w:w="3084"/>
+      </w:tblGrid>
+      <w:tr>
+        <w:tblPrEx>
+          <w:tblCellMar>
+            <w:top w:w="0" w:type="dxa"/>
+            <w:bottom w:w="0" w:type="dxa"/>
+          </w:tblCellMar>
+        </w:tblPrEx>
+        <w:trPr>
+          <w:trHeight w:val="368"/>
+        </w:trPr>
+        <w:tc>
+          <w:tcPr>
+            <w:tcW w:w="1057" w:type="dxa"/>
+            <w:tcBorders>
+              <w:top w:val="single" w:sz="6" w:space="0" w:color="auto"/>
+              <w:left w:val="single" w:sz="6" w:space="0" w:color="auto"/>
+              <w:bottom w:val="single" w:sz="6" w:space="0" w:color="auto"/>
+              <w:right w:val="single" w:sz="6" w:space="0" w:color="auto"/>
+            </w:tcBorders>
+            <w:shd w:val="solid" w:color="CCFFFF" w:fill="FFFFFF"/>
+          </w:tcPr>
+          <w:p>
+            <w:pPr>
+              <w:autoSpaceDE w:val="0"/>
+              <w:autoSpaceDN w:val="0"/>
+              <w:adjustRightInd w:val="0"/>
+              <w:spacing w:after="0" w:line="240" w:lineRule="auto"/>
+              <w:jc w:val="left"/>
+              <w:rPr>
+                <w:rFonts w:ascii="Calibri" w:hAnsi="Calibri" w:cs="Calibri"/>
+                <w:b/>
+                <w:bCs/>
+                <w:color w:val="000000"/>
+                <w:kern w:val="0"/>
+                <w:sz w:val="22"/>
+                <w:szCs w:val="22"/>
+              </w:rPr>
+            </w:pPr>
+            <w:r>
+              <w:rPr>
+                <w:rFonts w:ascii="Calibri" w:hAnsi="Calibri" w:cs="Calibri"/>
+                <w:b/>
+                <w:bCs/>
+                <w:color w:val="000000"/>
+                <w:kern w:val="0"/>
+                <w:sz w:val="22"/>
+                <w:szCs w:val="22"/>
+              </w:rPr>
+              <w:t>Test Case</w:t>
+            </w:r>
+          </w:p>
+        </w:tc>
+        <w:tc>
+          <w:tcPr>
+            <w:tcW w:w="3084" w:type="dxa"/>
+            <w:tcBorders>
+              <w:top w:val="single" w:sz="6" w:space="0" w:color="auto"/>
+              <w:left w:val="single" w:sz="6" w:space="0" w:color="auto"/>
+              <w:bottom w:val="single" w:sz="6" w:space="0" w:color="auto"/>
+              <w:right w:val="single" w:sz="6" w:space="0" w:color="auto"/>
+            </w:tcBorders>
+            <w:shd w:val="solid" w:color="CCFFFF" w:fill="FFFFFF"/>
+          </w:tcPr>
+          <w:p>
+            <w:pPr>
+              <w:autoSpaceDE w:val="0"/>
+              <w:autoSpaceDN w:val="0"/>
+              <w:adjustRightInd w:val="0"/>
+              <w:spacing w:after="0" w:line="240" w:lineRule="auto"/>
+              <w:jc w:val="left"/>
+              <w:rPr>
+                <w:rFonts w:ascii="Calibri" w:hAnsi="Calibri" w:cs="Calibri"/>
+                <w:b/>
+                <w:bCs/>
+                <w:color w:val="000000"/>
+                <w:kern w:val="0"/>
+                <w:sz w:val="22"/>
+                <w:szCs w:val="22"/>
+              </w:rPr>
+            </w:pPr>
+            <w:r>
+              <w:rPr>
+                <w:rFonts w:ascii="Calibri" w:hAnsi="Calibri" w:cs="Calibri"/>
+                <w:b/>
+                <w:bCs/>
+                <w:color w:val="000000"/>
+                <w:kern w:val="0"/>
+                <w:sz w:val="22"/>
+                <w:szCs w:val="22"/>
+              </w:rPr>
+              <w:t>Query</w:t>
+            </w:r>
+          </w:p>
+        </w:tc>
+        <w:tc>
+          <w:tcPr>
+            <w:tcW w:w="2379" w:type="dxa"/>
+            <w:tcBorders>
+              <w:top w:val="single" w:sz="6" w:space="0" w:color="auto"/>
+              <w:left w:val="single" w:sz="6" w:space="0" w:color="auto"/>
+              <w:bottom w:val="single" w:sz="6" w:space="0" w:color="auto"/>
+              <w:right w:val="single" w:sz="6" w:space="0" w:color="auto"/>
+            </w:tcBorders>
+            <w:shd w:val="solid" w:color="CCFFFF" w:fill="FFFFFF"/>
+          </w:tcPr>
+          <w:p>
+            <w:pPr>
+              <w:autoSpaceDE w:val="0"/>
+              <w:autoSpaceDN w:val="0"/>
+              <w:adjustRightInd w:val="0"/>
+              <w:spacing w:after="0" w:line="240" w:lineRule="auto"/>
+              <w:jc w:val="left"/>
+              <w:rPr>
+                <w:rFonts w:ascii="Calibri" w:hAnsi="Calibri" w:cs="Calibri"/>
+                <w:b/>
+                <w:bCs/>
+                <w:color w:val="000000"/>
+                <w:kern w:val="0"/>
+                <w:sz w:val="22"/>
+                <w:szCs w:val="22"/>
+              </w:rPr>
+            </w:pPr>
+            <w:r>
+              <w:rPr>
+                <w:rFonts w:ascii="Calibri" w:hAnsi="Calibri" w:cs="Calibri"/>
+                <w:b/>
+                <w:bCs/>
+                <w:color w:val="000000"/>
+                <w:kern w:val="0"/>
+                <w:sz w:val="22"/>
+                <w:szCs w:val="22"/>
+              </w:rPr>
+              <w:t>Main Test</w:t>
+            </w:r>
+          </w:p>
+        </w:tc>
+        <w:tc>
+          <w:tcPr>
+            <w:tcW w:w="3084" w:type="dxa"/>
+            <w:tcBorders>
+              <w:top w:val="single" w:sz="6" w:space="0" w:color="auto"/>
+              <w:left w:val="single" w:sz="6" w:space="0" w:color="auto"/>
+              <w:bottom w:val="single" w:sz="6" w:space="0" w:color="auto"/>
+              <w:right w:val="single" w:sz="6" w:space="0" w:color="auto"/>
+            </w:tcBorders>
+            <w:shd w:val="solid" w:color="CCFFFF" w:fill="FFFFFF"/>
+          </w:tcPr>
+          <w:p>
+            <w:pPr>
+              <w:autoSpaceDE w:val="0"/>
+              <w:autoSpaceDN w:val="0"/>
+              <w:adjustRightInd w:val="0"/>
+              <w:spacing w:after="0" w:line="240" w:lineRule="auto"/>
+              <w:jc w:val="left"/>
+              <w:rPr>
+                <w:rFonts w:ascii="Calibri" w:hAnsi="Calibri" w:cs="Calibri"/>
+                <w:b/>
+                <w:bCs/>
+                <w:color w:val="000000"/>
+                <w:kern w:val="0"/>
+                <w:sz w:val="22"/>
+                <w:szCs w:val="22"/>
+              </w:rPr>
+            </w:pPr>
+            <w:r>
+              <w:rPr>
+                <w:rFonts w:ascii="Calibri" w:hAnsi="Calibri" w:cs="Calibri"/>
+                <w:b/>
+                <w:bCs/>
+                <w:color w:val="000000"/>
+                <w:kern w:val="0"/>
+                <w:sz w:val="22"/>
+                <w:szCs w:val="22"/>
+              </w:rPr>
+              <w:t>Expected Result</w:t>
+            </w:r>
+          </w:p>
+        </w:tc>
+      </w:tr>
+      <w:tr>
+        <w:tblPrEx>
+          <w:tblCellMar>
+            <w:top w:w="0" w:type="dxa"/>
+            <w:bottom w:w="0" w:type="dxa"/>
+          </w:tblCellMar>
+        </w:tblPrEx>
+        <w:trPr>
+          <w:trHeight w:val="737"/>
+        </w:trPr>
+        <w:tc>
+          <w:tcPr>
+            <w:tcW w:w="1057" w:type="dxa"/>
+            <w:tcBorders>
+              <w:top w:val="single" w:sz="6" w:space="0" w:color="auto"/>
+              <w:left w:val="single" w:sz="6" w:space="0" w:color="auto"/>
+              <w:bottom w:val="single" w:sz="6" w:space="0" w:color="auto"/>
+              <w:right w:val="single" w:sz="6" w:space="0" w:color="auto"/>
+            </w:tcBorders>
+          </w:tcPr>
+          <w:p>
+            <w:pPr>
+              <w:autoSpaceDE w:val="0"/>
+              <w:autoSpaceDN w:val="0"/>
+              <w:adjustRightInd w:val="0"/>
+              <w:spacing w:after="0" w:line="240" w:lineRule="auto"/>
+              <w:jc w:val="left"/>
+              <w:rPr>
+                <w:rFonts w:ascii="Calibri" w:hAnsi="Calibri" w:cs="Calibri"/>
+                <w:color w:val="000000"/>
+                <w:kern w:val="0"/>
+                <w:sz w:val="22"/>
+                <w:szCs w:val="22"/>
+              </w:rPr>
+            </w:pPr>
+            <w:r>
+              <w:rPr>
+                <w:rFonts w:ascii="Calibri" w:hAnsi="Calibri" w:cs="Calibri"/>
+                <w:color w:val="000000"/>
+                <w:kern w:val="0"/>
+                <w:sz w:val="22"/>
+                <w:szCs w:val="22"/>
+              </w:rPr>
+              <w:t>TC1</w:t>
+            </w:r>
+          </w:p>
+        </w:tc>
+        <w:tc>
+          <w:tcPr>
+            <w:tcW w:w="3084" w:type="dxa"/>
+            <w:tcBorders>
+              <w:top w:val="single" w:sz="6" w:space="0" w:color="auto"/>
+              <w:left w:val="single" w:sz="6" w:space="0" w:color="auto"/>
+              <w:bottom w:val="single" w:sz="6" w:space="0" w:color="auto"/>
+              <w:right w:val="single" w:sz="6" w:space="0" w:color="auto"/>
+            </w:tcBorders>
+          </w:tcPr>
+          <w:p>
+            <w:pPr>
+              <w:autoSpaceDE w:val="0"/>
+              <w:autoSpaceDN w:val="0"/>
+              <w:adjustRightInd w:val="0"/>
+              <w:spacing w:after="0" w:line="240" w:lineRule="auto"/>
+              <w:jc w:val="left"/>
+              <w:rPr>
+                <w:rFonts w:ascii="Calibri" w:hAnsi="Calibri" w:cs="Calibri"/>
+                <w:color w:val="000000"/>
+                <w:kern w:val="0"/>
+                <w:sz w:val="22"/>
+                <w:szCs w:val="22"/>
+              </w:rPr>
+            </w:pPr>
+            <w:r>
+              <w:rPr>
+                <w:rFonts w:ascii="Calibri" w:hAnsi="Calibri" w:cs="Calibri"/>
+                <w:color w:val="000000"/>
+                <w:kern w:val="0"/>
+                <w:sz w:val="22"/>
+                <w:szCs w:val="22"/>
+              </w:rPr>
+              <w:t>Aircraft Test Performance Summary</w:t>
+            </w:r>
+          </w:p>
+        </w:tc>
+        <w:tc>
+          <w:tcPr>
+            <w:tcW w:w="2379" w:type="dxa"/>
+            <w:tcBorders>
+              <w:top w:val="single" w:sz="6" w:space="0" w:color="auto"/>
+              <w:left w:val="single" w:sz="6" w:space="0" w:color="auto"/>
+              <w:bottom w:val="single" w:sz="6" w:space="0" w:color="auto"/>
+              <w:right w:val="single" w:sz="6" w:space="0" w:color="auto"/>
+            </w:tcBorders>
+          </w:tcPr>
+          <w:p>
+            <w:pPr>
+              <w:autoSpaceDE w:val="0"/>
+              <w:autoSpaceDN w:val="0"/>
+              <w:adjustRightInd w:val="0"/>
+              <w:spacing w:after="0" w:line="240" w:lineRule="auto"/>
+              <w:jc w:val="left"/>
+              <w:rPr>
+                <w:rFonts w:ascii="Calibri" w:hAnsi="Calibri" w:cs="Calibri"/>
+                <w:color w:val="000000"/>
+                <w:kern w:val="0"/>
+                <w:sz w:val="22"/>
+                <w:szCs w:val="22"/>
+              </w:rPr>
+            </w:pPr>
+            <w:r>
+              <w:rPr>
+                <w:rFonts w:ascii="Calibri" w:hAnsi="Calibri" w:cs="Calibri"/>
+                <w:color w:val="000000"/>
+                <w:kern w:val="0"/>
+                <w:sz w:val="22"/>
+                <w:szCs w:val="22"/>
+              </w:rPr>
+              <w:t>COUNT, SUM, AVG</w:t>
+            </w:r>
+          </w:p>
+        </w:tc>
+        <w:tc>
+          <w:tcPr>
+            <w:tcW w:w="3084" w:type="dxa"/>
+            <w:tcBorders>
+              <w:top w:val="single" w:sz="6" w:space="0" w:color="auto"/>
+              <w:left w:val="single" w:sz="6" w:space="0" w:color="auto"/>
+              <w:bottom w:val="single" w:sz="6" w:space="0" w:color="auto"/>
+              <w:right w:val="single" w:sz="6" w:space="0" w:color="auto"/>
+            </w:tcBorders>
+          </w:tcPr>
+          <w:p>
+            <w:pPr>
+              <w:autoSpaceDE w:val="0"/>
+              <w:autoSpaceDN w:val="0"/>
+              <w:adjustRightInd w:val="0"/>
+              <w:spacing w:after="0" w:line="240" w:lineRule="auto"/>
+              <w:jc w:val="left"/>
+              <w:rPr>
+                <w:rFonts w:ascii="Calibri" w:hAnsi="Calibri" w:cs="Calibri"/>
+                <w:color w:val="000000"/>
+                <w:kern w:val="0"/>
+                <w:sz w:val="22"/>
+                <w:szCs w:val="22"/>
+              </w:rPr>
+            </w:pPr>
+            <w:r>
+              <w:rPr>
+                <w:rFonts w:ascii="Calibri" w:hAnsi="Calibri" w:cs="Calibri"/>
+                <w:color w:val="000000"/>
+                <w:kern w:val="0"/>
+                <w:sz w:val="22"/>
+                <w:szCs w:val="22"/>
+              </w:rPr>
+              <w:t>Correct test counts, total hours and average scores</w:t>
+            </w:r>
+          </w:p>
+        </w:tc>
+      </w:tr>
+      <w:tr>
+        <w:tblPrEx>
+          <w:tblCellMar>
+            <w:top w:w="0" w:type="dxa"/>
+            <w:bottom w:w="0" w:type="dxa"/>
+          </w:tblCellMar>
+        </w:tblPrEx>
+        <w:trPr>
+          <w:trHeight w:val="737"/>
+        </w:trPr>
+        <w:tc>
+          <w:tcPr>
+            <w:tcW w:w="1057" w:type="dxa"/>
+            <w:tcBorders>
+              <w:top w:val="single" w:sz="6" w:space="0" w:color="auto"/>
+              <w:left w:val="single" w:sz="6" w:space="0" w:color="auto"/>
+              <w:bottom w:val="single" w:sz="6" w:space="0" w:color="auto"/>
+              <w:right w:val="single" w:sz="6" w:space="0" w:color="auto"/>
+            </w:tcBorders>
+          </w:tcPr>
+          <w:p>
+            <w:pPr>
+              <w:autoSpaceDE w:val="0"/>
+              <w:autoSpaceDN w:val="0"/>
+              <w:adjustRightInd w:val="0"/>
+              <w:spacing w:after="0" w:line="240" w:lineRule="auto"/>
+              <w:jc w:val="left"/>
+              <w:rPr>
+                <w:rFonts w:ascii="Calibri" w:hAnsi="Calibri" w:cs="Calibri"/>
+                <w:color w:val="000000"/>
+                <w:kern w:val="0"/>
+                <w:sz w:val="22"/>
+                <w:szCs w:val="22"/>
+              </w:rPr>
+            </w:pPr>
+            <w:r>
+              <w:rPr>
+                <w:rFonts w:ascii="Calibri" w:hAnsi="Calibri" w:cs="Calibri"/>
+                <w:color w:val="000000"/>
+                <w:kern w:val="0"/>
+                <w:sz w:val="22"/>
+                <w:szCs w:val="22"/>
+              </w:rPr>
+              <w:t>TC2</w:t>
+            </w:r>
+          </w:p>
+        </w:tc>
+        <w:tc>
+          <w:tcPr>
+            <w:tcW w:w="3084" w:type="dxa"/>
+            <w:tcBorders>
+              <w:top w:val="single" w:sz="6" w:space="0" w:color="auto"/>
+              <w:left w:val="single" w:sz="6" w:space="0" w:color="auto"/>
+              <w:bottom w:val="single" w:sz="6" w:space="0" w:color="auto"/>
+              <w:right w:val="single" w:sz="6" w:space="0" w:color="auto"/>
+            </w:tcBorders>
+          </w:tcPr>
+          <w:p>
+            <w:pPr>
+              <w:autoSpaceDE w:val="0"/>
+              <w:autoSpaceDN w:val="0"/>
+              <w:adjustRightInd w:val="0"/>
+              <w:spacing w:after="0" w:line="240" w:lineRule="auto"/>
+              <w:jc w:val="left"/>
+              <w:rPr>
+                <w:rFonts w:ascii="Calibri" w:hAnsi="Calibri" w:cs="Calibri"/>
+                <w:color w:val="000000"/>
+                <w:kern w:val="0"/>
+                <w:sz w:val="22"/>
+                <w:szCs w:val="22"/>
+              </w:rPr>
+            </w:pPr>
+            <w:r>
+              <w:rPr>
+                <w:rFonts w:ascii="Calibri" w:hAnsi="Calibri" w:cs="Calibri"/>
+                <w:color w:val="000000"/>
+                <w:kern w:val="0"/>
+                <w:sz w:val="22"/>
+                <w:szCs w:val="22"/>
+              </w:rPr>
+              <w:t>Technician Annual Performance</w:t>
+            </w:r>
+          </w:p>
+        </w:tc>
+        <w:tc>
+          <w:tcPr>
+            <w:tcW w:w="2379" w:type="dxa"/>
+            <w:tcBorders>
+              <w:top w:val="single" w:sz="6" w:space="0" w:color="auto"/>
+              <w:left w:val="single" w:sz="6" w:space="0" w:color="auto"/>
+              <w:bottom w:val="single" w:sz="6" w:space="0" w:color="auto"/>
+              <w:right w:val="single" w:sz="6" w:space="0" w:color="auto"/>
+            </w:tcBorders>
+          </w:tcPr>
+          <w:p>
+            <w:pPr>
+              <w:autoSpaceDE w:val="0"/>
+              <w:autoSpaceDN w:val="0"/>
+              <w:adjustRightInd w:val="0"/>
+              <w:spacing w:after="0" w:line="240" w:lineRule="auto"/>
+              <w:jc w:val="left"/>
+              <w:rPr>
+                <w:rFonts w:ascii="Calibri" w:hAnsi="Calibri" w:cs="Calibri"/>
+                <w:color w:val="000000"/>
+                <w:kern w:val="0"/>
+                <w:sz w:val="22"/>
+                <w:szCs w:val="22"/>
+              </w:rPr>
+            </w:pPr>
+            <w:r>
+              <w:rPr>
+                <w:rFonts w:ascii="Calibri" w:hAnsi="Calibri" w:cs="Calibri"/>
+                <w:color w:val="000000"/>
+                <w:kern w:val="0"/>
+                <w:sz w:val="22"/>
+                <w:szCs w:val="22"/>
+              </w:rPr>
+              <w:t>COUNT, SUM, GROUP BY</w:t>
+            </w:r>
+          </w:p>
+        </w:tc>
+        <w:tc>
+          <w:tcPr>
+            <w:tcW w:w="3084" w:type="dxa"/>
+            <w:tcBorders>
+              <w:top w:val="single" w:sz="6" w:space="0" w:color="auto"/>
+              <w:left w:val="single" w:sz="6" w:space="0" w:color="auto"/>
+              <w:bottom w:val="single" w:sz="6" w:space="0" w:color="auto"/>
+              <w:right w:val="single" w:sz="6" w:space="0" w:color="auto"/>
+            </w:tcBorders>
+          </w:tcPr>
+          <w:p>
+            <w:pPr>
+              <w:autoSpaceDE w:val="0"/>
+              <w:autoSpaceDN w:val="0"/>
+              <w:adjustRightInd w:val="0"/>
+              <w:spacing w:after="0" w:line="240" w:lineRule="auto"/>
+              <w:jc w:val="left"/>
+              <w:rPr>
+                <w:rFonts w:ascii="Calibri" w:hAnsi="Calibri" w:cs="Calibri"/>
+                <w:color w:val="000000"/>
+                <w:kern w:val="0"/>
+                <w:sz w:val="22"/>
+                <w:szCs w:val="22"/>
+              </w:rPr>
+            </w:pPr>
+            <w:r>
+              <w:rPr>
+                <w:rFonts w:ascii="Calibri" w:hAnsi="Calibri" w:cs="Calibri"/>
+                <w:color w:val="000000"/>
+                <w:kern w:val="0"/>
+                <w:sz w:val="22"/>
+                <w:szCs w:val="22"/>
+              </w:rPr>
+              <w:t>Correct tests and total hours per technician</w:t>
+            </w:r>
+          </w:p>
+        </w:tc>
+      </w:tr>
+      <w:tr>
+        <w:tblPrEx>
+          <w:tblCellMar>
+            <w:top w:w="0" w:type="dxa"/>
+            <w:bottom w:w="0" w:type="dxa"/>
+          </w:tblCellMar>
+        </w:tblPrEx>
+        <w:trPr>
+          <w:trHeight w:val="737"/>
+        </w:trPr>
+        <w:tc>
+          <w:tcPr>
+            <w:tcW w:w="1057" w:type="dxa"/>
+            <w:tcBorders>
+              <w:top w:val="single" w:sz="6" w:space="0" w:color="auto"/>
+              <w:left w:val="single" w:sz="6" w:space="0" w:color="auto"/>
+              <w:bottom w:val="single" w:sz="6" w:space="0" w:color="auto"/>
+              <w:right w:val="single" w:sz="6" w:space="0" w:color="auto"/>
+            </w:tcBorders>
+          </w:tcPr>
+          <w:p>
+            <w:pPr>
+              <w:autoSpaceDE w:val="0"/>
+              <w:autoSpaceDN w:val="0"/>
+              <w:adjustRightInd w:val="0"/>
+              <w:spacing w:after="0" w:line="240" w:lineRule="auto"/>
+              <w:jc w:val="left"/>
+              <w:rPr>
+                <w:rFonts w:ascii="Calibri" w:hAnsi="Calibri" w:cs="Calibri"/>
+                <w:color w:val="000000"/>
+                <w:kern w:val="0"/>
+                <w:sz w:val="22"/>
+                <w:szCs w:val="22"/>
+              </w:rPr>
+            </w:pPr>
+            <w:r>
+              <w:rPr>
+                <w:rFonts w:ascii="Calibri" w:hAnsi="Calibri" w:cs="Calibri"/>
+                <w:color w:val="000000"/>
+                <w:kern w:val="0"/>
+                <w:sz w:val="22"/>
+                <w:szCs w:val="22"/>
+              </w:rPr>
+              <w:t>TC3</w:t>
+            </w:r>
+          </w:p>
+        </w:tc>
+        <w:tc>
+          <w:tcPr>
+            <w:tcW w:w="3084" w:type="dxa"/>
+            <w:tcBorders>
+              <w:top w:val="single" w:sz="6" w:space="0" w:color="auto"/>
+              <w:left w:val="single" w:sz="6" w:space="0" w:color="auto"/>
+              <w:bottom w:val="single" w:sz="6" w:space="0" w:color="auto"/>
+              <w:right w:val="single" w:sz="6" w:space="0" w:color="auto"/>
+            </w:tcBorders>
+          </w:tcPr>
+          <w:p>
+            <w:pPr>
+              <w:autoSpaceDE w:val="0"/>
+              <w:autoSpaceDN w:val="0"/>
+              <w:adjustRightInd w:val="0"/>
+              <w:spacing w:after="0" w:line="240" w:lineRule="auto"/>
+              <w:jc w:val="left"/>
+              <w:rPr>
+                <w:rFonts w:ascii="Calibri" w:hAnsi="Calibri" w:cs="Calibri"/>
+                <w:color w:val="000000"/>
+                <w:kern w:val="0"/>
+                <w:sz w:val="22"/>
+                <w:szCs w:val="22"/>
+              </w:rPr>
+            </w:pPr>
+            <w:r>
+              <w:rPr>
+                <w:rFonts w:ascii="Calibri" w:hAnsi="Calibri" w:cs="Calibri"/>
+                <w:color w:val="000000"/>
+                <w:kern w:val="0"/>
+                <w:sz w:val="22"/>
+                <w:szCs w:val="22"/>
+              </w:rPr>
+              <w:t>Recently Examined Traffic Controllers</w:t>
+            </w:r>
+          </w:p>
+        </w:tc>
+        <w:tc>
+          <w:tcPr>
+            <w:tcW w:w="2379" w:type="dxa"/>
+            <w:tcBorders>
+              <w:top w:val="single" w:sz="6" w:space="0" w:color="auto"/>
+              <w:left w:val="single" w:sz="6" w:space="0" w:color="auto"/>
+              <w:bottom w:val="single" w:sz="6" w:space="0" w:color="auto"/>
+              <w:right w:val="single" w:sz="6" w:space="0" w:color="auto"/>
+            </w:tcBorders>
+          </w:tcPr>
+          <w:p>
+            <w:pPr>
+              <w:autoSpaceDE w:val="0"/>
+              <w:autoSpaceDN w:val="0"/>
+              <w:adjustRightInd w:val="0"/>
+              <w:spacing w:after="0" w:line="240" w:lineRule="auto"/>
+              <w:jc w:val="left"/>
+              <w:rPr>
+                <w:rFonts w:ascii="Calibri" w:hAnsi="Calibri" w:cs="Calibri"/>
+                <w:color w:val="000000"/>
+                <w:kern w:val="0"/>
+                <w:sz w:val="22"/>
+                <w:szCs w:val="22"/>
+              </w:rPr>
+            </w:pPr>
+            <w:r>
+              <w:rPr>
+                <w:rFonts w:ascii="Calibri" w:hAnsi="Calibri" w:cs="Calibri"/>
+                <w:color w:val="000000"/>
+                <w:kern w:val="0"/>
+                <w:sz w:val="22"/>
+                <w:szCs w:val="22"/>
+              </w:rPr>
+              <w:t>Date filtering</w:t>
+            </w:r>
+          </w:p>
+        </w:tc>
+        <w:tc>
+          <w:tcPr>
+            <w:tcW w:w="3084" w:type="dxa"/>
+            <w:tcBorders>
+              <w:top w:val="single" w:sz="6" w:space="0" w:color="auto"/>
+              <w:left w:val="single" w:sz="6" w:space="0" w:color="auto"/>
+              <w:bottom w:val="single" w:sz="6" w:space="0" w:color="auto"/>
+              <w:right w:val="single" w:sz="6" w:space="0" w:color="auto"/>
+            </w:tcBorders>
+          </w:tcPr>
+          <w:p>
+            <w:pPr>
+              <w:autoSpaceDE w:val="0"/>
+              <w:autoSpaceDN w:val="0"/>
+              <w:adjustRightInd w:val="0"/>
+              <w:spacing w:after="0" w:line="240" w:lineRule="auto"/>
+              <w:jc w:val="left"/>
+              <w:rPr>
+                <w:rFonts w:ascii="Calibri" w:hAnsi="Calibri" w:cs="Calibri"/>
+                <w:color w:val="000000"/>
+                <w:kern w:val="0"/>
+                <w:sz w:val="22"/>
+                <w:szCs w:val="22"/>
+              </w:rPr>
+            </w:pPr>
+            <w:r>
+              <w:rPr>
+                <w:rFonts w:ascii="Calibri" w:hAnsi="Calibri" w:cs="Calibri"/>
+                <w:color w:val="000000"/>
+                <w:kern w:val="0"/>
+                <w:sz w:val="22"/>
+                <w:szCs w:val="22"/>
+              </w:rPr>
+              <w:t>Only recently examined controller returned</w:t>
+            </w:r>
+          </w:p>
+        </w:tc>
+      </w:tr>
+      <w:tr>
+        <w:tblPrEx>
+          <w:tblCellMar>
+            <w:top w:w="0" w:type="dxa"/>
+            <w:bottom w:w="0" w:type="dxa"/>
+          </w:tblCellMar>
+        </w:tblPrEx>
+        <w:trPr>
+          <w:trHeight w:val="737"/>
+        </w:trPr>
+        <w:tc>
+          <w:tcPr>
+            <w:tcW w:w="1057" w:type="dxa"/>
+            <w:tcBorders>
+              <w:top w:val="single" w:sz="6" w:space="0" w:color="auto"/>
+              <w:left w:val="single" w:sz="6" w:space="0" w:color="auto"/>
+              <w:bottom w:val="single" w:sz="6" w:space="0" w:color="auto"/>
+              <w:right w:val="single" w:sz="6" w:space="0" w:color="auto"/>
+            </w:tcBorders>
+          </w:tcPr>
+          <w:p>
+            <w:pPr>
+              <w:autoSpaceDE w:val="0"/>
+              <w:autoSpaceDN w:val="0"/>
+              <w:adjustRightInd w:val="0"/>
+              <w:spacing w:after="0" w:line="240" w:lineRule="auto"/>
+              <w:jc w:val="left"/>
+              <w:rPr>
+                <w:rFonts w:ascii="Calibri" w:hAnsi="Calibri" w:cs="Calibri"/>
+                <w:color w:val="000000"/>
+                <w:kern w:val="0"/>
+                <w:sz w:val="22"/>
+                <w:szCs w:val="22"/>
+              </w:rPr>
+            </w:pPr>
+            <w:r>
+              <w:rPr>
+                <w:rFonts w:ascii="Calibri" w:hAnsi="Calibri" w:cs="Calibri"/>
+                <w:color w:val="000000"/>
+                <w:kern w:val="0"/>
+                <w:sz w:val="22"/>
+                <w:szCs w:val="22"/>
+              </w:rPr>
+              <w:t>TC4</w:t>
+            </w:r>
+          </w:p>
+        </w:tc>
+        <w:tc>
+          <w:tcPr>
+            <w:tcW w:w="3084" w:type="dxa"/>
+            <w:tcBorders>
+              <w:top w:val="single" w:sz="6" w:space="0" w:color="auto"/>
+              <w:left w:val="single" w:sz="6" w:space="0" w:color="auto"/>
+              <w:bottom w:val="single" w:sz="6" w:space="0" w:color="auto"/>
+              <w:right w:val="single" w:sz="6" w:space="0" w:color="auto"/>
+            </w:tcBorders>
+          </w:tcPr>
+          <w:p>
+            <w:pPr>
+              <w:autoSpaceDE w:val="0"/>
+              <w:autoSpaceDN w:val="0"/>
+              <w:adjustRightInd w:val="0"/>
+              <w:spacing w:after="0" w:line="240" w:lineRule="auto"/>
+              <w:jc w:val="left"/>
+              <w:rPr>
+                <w:rFonts w:ascii="Calibri" w:hAnsi="Calibri" w:cs="Calibri"/>
+                <w:color w:val="000000"/>
+                <w:kern w:val="0"/>
+                <w:sz w:val="22"/>
+                <w:szCs w:val="22"/>
+              </w:rPr>
+            </w:pPr>
+            <w:r>
+              <w:rPr>
+                <w:rFonts w:ascii="Calibri" w:hAnsi="Calibri" w:cs="Calibri"/>
+                <w:color w:val="000000"/>
+                <w:kern w:val="0"/>
+                <w:sz w:val="22"/>
+                <w:szCs w:val="22"/>
+              </w:rPr>
+              <w:t>Aircraft Safety Check</w:t>
+            </w:r>
+          </w:p>
+        </w:tc>
+        <w:tc>
+          <w:tcPr>
+            <w:tcW w:w="2379" w:type="dxa"/>
+            <w:tcBorders>
+              <w:top w:val="single" w:sz="6" w:space="0" w:color="auto"/>
+              <w:left w:val="single" w:sz="6" w:space="0" w:color="auto"/>
+              <w:bottom w:val="single" w:sz="6" w:space="0" w:color="auto"/>
+              <w:right w:val="single" w:sz="6" w:space="0" w:color="auto"/>
+            </w:tcBorders>
+          </w:tcPr>
+          <w:p>
+            <w:pPr>
+              <w:autoSpaceDE w:val="0"/>
+              <w:autoSpaceDN w:val="0"/>
+              <w:adjustRightInd w:val="0"/>
+              <w:spacing w:after="0" w:line="240" w:lineRule="auto"/>
+              <w:jc w:val="left"/>
+              <w:rPr>
+                <w:rFonts w:ascii="Calibri" w:hAnsi="Calibri" w:cs="Calibri"/>
+                <w:color w:val="000000"/>
+                <w:kern w:val="0"/>
+                <w:sz w:val="22"/>
+                <w:szCs w:val="22"/>
+              </w:rPr>
+            </w:pPr>
+            <w:r>
+              <w:rPr>
+                <w:rFonts w:ascii="Calibri" w:hAnsi="Calibri" w:cs="Calibri"/>
+                <w:color w:val="000000"/>
+                <w:kern w:val="0"/>
+                <w:sz w:val="22"/>
+                <w:szCs w:val="22"/>
+              </w:rPr>
+              <w:t>Correlated subquery + AVG</w:t>
+            </w:r>
+          </w:p>
+        </w:tc>
+        <w:tc>
+          <w:tcPr>
+            <w:tcW w:w="3084" w:type="dxa"/>
+            <w:tcBorders>
+              <w:top w:val="single" w:sz="6" w:space="0" w:color="auto"/>
+              <w:left w:val="single" w:sz="6" w:space="0" w:color="auto"/>
+              <w:bottom w:val="single" w:sz="6" w:space="0" w:color="auto"/>
+              <w:right w:val="single" w:sz="6" w:space="0" w:color="auto"/>
+            </w:tcBorders>
+          </w:tcPr>
+          <w:p>
+            <w:pPr>
+              <w:autoSpaceDE w:val="0"/>
+              <w:autoSpaceDN w:val="0"/>
+              <w:adjustRightInd w:val="0"/>
+              <w:spacing w:after="0" w:line="240" w:lineRule="auto"/>
+              <w:jc w:val="left"/>
+              <w:rPr>
+                <w:rFonts w:ascii="Calibri" w:hAnsi="Calibri" w:cs="Calibri"/>
+                <w:color w:val="000000"/>
+                <w:kern w:val="0"/>
+                <w:sz w:val="22"/>
+                <w:szCs w:val="22"/>
+              </w:rPr>
+            </w:pPr>
+            <w:r>
+              <w:rPr>
+                <w:rFonts w:ascii="Calibri" w:hAnsi="Calibri" w:cs="Calibri"/>
+                <w:color w:val="000000"/>
+                <w:kern w:val="0"/>
+                <w:sz w:val="22"/>
+                <w:szCs w:val="22"/>
+              </w:rPr>
+              <w:t>Correct model average and Pass / Review Required results</w:t>
+            </w:r>
+          </w:p>
+        </w:tc>
+      </w:tr>
+      <w:tr>
+        <w:tblPrEx>
+          <w:tblCellMar>
+            <w:top w:w="0" w:type="dxa"/>
+            <w:bottom w:w="0" w:type="dxa"/>
+          </w:tblCellMar>
+        </w:tblPrEx>
+        <w:trPr>
+          <w:trHeight w:val="368"/>
+        </w:trPr>
+        <w:tc>
+          <w:tcPr>
+            <w:tcW w:w="1057" w:type="dxa"/>
+            <w:tcBorders>
+              <w:top w:val="single" w:sz="6" w:space="0" w:color="auto"/>
+              <w:left w:val="single" w:sz="6" w:space="0" w:color="auto"/>
+              <w:bottom w:val="single" w:sz="6" w:space="0" w:color="auto"/>
+              <w:right w:val="single" w:sz="6" w:space="0" w:color="auto"/>
+            </w:tcBorders>
+          </w:tcPr>
+          <w:p>
+            <w:pPr>
+              <w:autoSpaceDE w:val="0"/>
+              <w:autoSpaceDN w:val="0"/>
+              <w:adjustRightInd w:val="0"/>
+              <w:spacing w:after="0" w:line="240" w:lineRule="auto"/>
+              <w:jc w:val="left"/>
+              <w:rPr>
+                <w:rFonts w:ascii="Calibri" w:hAnsi="Calibri" w:cs="Calibri"/>
+                <w:color w:val="000000"/>
+                <w:kern w:val="0"/>
+                <w:sz w:val="22"/>
+                <w:szCs w:val="22"/>
+              </w:rPr>
+            </w:pPr>
+            <w:r>
+              <w:rPr>
+                <w:rFonts w:ascii="Calibri" w:hAnsi="Calibri" w:cs="Calibri"/>
+                <w:color w:val="000000"/>
+                <w:kern w:val="0"/>
+                <w:sz w:val="22"/>
+                <w:szCs w:val="22"/>
+              </w:rPr>
+              <w:t>TC5</w:t>
+            </w:r>
+          </w:p>
+        </w:tc>
+        <w:tc>
+          <w:tcPr>
+            <w:tcW w:w="3084" w:type="dxa"/>
+            <w:tcBorders>
+              <w:top w:val="single" w:sz="6" w:space="0" w:color="auto"/>
+              <w:left w:val="single" w:sz="6" w:space="0" w:color="auto"/>
+              <w:bottom w:val="single" w:sz="6" w:space="0" w:color="auto"/>
+              <w:right w:val="single" w:sz="6" w:space="0" w:color="auto"/>
+            </w:tcBorders>
+          </w:tcPr>
+          <w:p>
+            <w:pPr>
+              <w:autoSpaceDE w:val="0"/>
+              <w:autoSpaceDN w:val="0"/>
+              <w:adjustRightInd w:val="0"/>
+              <w:spacing w:after="0" w:line="240" w:lineRule="auto"/>
+              <w:jc w:val="left"/>
+              <w:rPr>
+                <w:rFonts w:ascii="Calibri" w:hAnsi="Calibri" w:cs="Calibri"/>
+                <w:color w:val="000000"/>
+                <w:kern w:val="0"/>
+                <w:sz w:val="22"/>
+                <w:szCs w:val="22"/>
+              </w:rPr>
+            </w:pPr>
+            <w:r>
+              <w:rPr>
+                <w:rFonts w:ascii="Calibri" w:hAnsi="Calibri" w:cs="Calibri"/>
+                <w:color w:val="000000"/>
+                <w:kern w:val="0"/>
+                <w:sz w:val="22"/>
+                <w:szCs w:val="22"/>
+              </w:rPr>
+              <w:t>Technician Expertise Summary</w:t>
+            </w:r>
+          </w:p>
+        </w:tc>
+        <w:tc>
+          <w:tcPr>
+            <w:tcW w:w="2379" w:type="dxa"/>
+            <w:tcBorders>
+              <w:top w:val="single" w:sz="6" w:space="0" w:color="auto"/>
+              <w:left w:val="single" w:sz="6" w:space="0" w:color="auto"/>
+              <w:bottom w:val="single" w:sz="6" w:space="0" w:color="auto"/>
+              <w:right w:val="single" w:sz="6" w:space="0" w:color="auto"/>
+            </w:tcBorders>
+          </w:tcPr>
+          <w:p>
+            <w:pPr>
+              <w:autoSpaceDE w:val="0"/>
+              <w:autoSpaceDN w:val="0"/>
+              <w:adjustRightInd w:val="0"/>
+              <w:spacing w:after="0" w:line="240" w:lineRule="auto"/>
+              <w:jc w:val="left"/>
+              <w:rPr>
+                <w:rFonts w:ascii="Calibri" w:hAnsi="Calibri" w:cs="Calibri"/>
+                <w:color w:val="000000"/>
+                <w:kern w:val="0"/>
+                <w:sz w:val="22"/>
+                <w:szCs w:val="22"/>
+              </w:rPr>
+            </w:pPr>
+            <w:r>
+              <w:rPr>
+                <w:rFonts w:ascii="Calibri" w:hAnsi="Calibri" w:cs="Calibri"/>
+                <w:color w:val="000000"/>
+                <w:kern w:val="0"/>
+                <w:sz w:val="22"/>
+                <w:szCs w:val="22"/>
+              </w:rPr>
+              <w:t>Multiple joins</w:t>
+            </w:r>
+          </w:p>
+        </w:tc>
+        <w:tc>
+          <w:tcPr>
+            <w:tcW w:w="3084" w:type="dxa"/>
+            <w:tcBorders>
+              <w:top w:val="single" w:sz="6" w:space="0" w:color="auto"/>
+              <w:left w:val="single" w:sz="6" w:space="0" w:color="auto"/>
+              <w:bottom w:val="single" w:sz="6" w:space="0" w:color="auto"/>
+              <w:right w:val="single" w:sz="6" w:space="0" w:color="auto"/>
+            </w:tcBorders>
+          </w:tcPr>
+          <w:p>
+            <w:pPr>
+              <w:keepNext/>
+              <w:autoSpaceDE w:val="0"/>
+              <w:autoSpaceDN w:val="0"/>
+              <w:adjustRightInd w:val="0"/>
+              <w:spacing w:after="0" w:line="240" w:lineRule="auto"/>
+              <w:jc w:val="left"/>
+              <w:rPr>
+                <w:rFonts w:ascii="Calibri" w:hAnsi="Calibri" w:cs="Calibri"/>
+                <w:color w:val="000000"/>
+                <w:kern w:val="0"/>
+                <w:sz w:val="22"/>
+                <w:szCs w:val="22"/>
+              </w:rPr>
+            </w:pPr>
+            <w:r>
+              <w:rPr>
+                <w:rFonts w:ascii="Calibri" w:hAnsi="Calibri" w:cs="Calibri"/>
+                <w:color w:val="000000"/>
+                <w:kern w:val="0"/>
+                <w:sz w:val="22"/>
+                <w:szCs w:val="22"/>
+              </w:rPr>
+              <w:t>Correct technician-model relationships</w:t>
+            </w:r>
+          </w:p>
+        </w:tc>
+      </w:tr>
+    </w:tbl>
+    <w:p>
+      <w:pPr>
+        <w:jc w:val="center"/>
+      </w:pPr>
+      <w:r>
+        <w:t xml:space="preserve">Table </w:t>
+      </w:r>
+      <w:fldSimple w:instr=" SEQ Table \* ARABIC ">
+        <w:r>
+          <w:rPr>
+            <w:noProof/>
+          </w:rPr>
+          <w:t>1</w:t>
+        </w:r>
+      </w:fldSimple>
+      <w:r>
+        <w:t xml:space="preserve"> Query Test Plan Table</w:t>
+      </w:r>
+    </w:p>
+    <w:p>
+      <w:pPr>
+        <w:pStyle w:val="Heading4"/>
+      </w:pPr>
+      <w:r>
+        <w:t>Expected Result for Query 1</w:t>
+      </w:r>
+      <w:r>
+        <w:t xml:space="preserve"> with sample data</w:t>
+      </w:r>
+    </w:p>
+    <w:tbl>
+      <w:tblPr>
+        <w:tblStyle w:val="TableGrid"/>
+        <w:tblW w:w="0" w:type="auto"/>
+        <w:tblLook w:val="04A0" w:firstRow="1" w:lastRow="0" w:firstColumn="1" w:lastColumn="0" w:noHBand="0" w:noVBand="1"/>
+      </w:tblPr>
+      <w:tblGrid>
+        <w:gridCol w:w="1558"/>
+        <w:gridCol w:w="1558"/>
+        <w:gridCol w:w="1558"/>
+        <w:gridCol w:w="1558"/>
+        <w:gridCol w:w="1559"/>
+        <w:gridCol w:w="1559"/>
+      </w:tblGrid>
+      <w:tr>
+        <w:tc>
+          <w:tcPr>
+            <w:tcW w:w="1558" w:type="dxa"/>
+          </w:tcPr>
+          <w:p>
+            <w:r>
+              <w:t>Model Number</w:t>
+            </w:r>
+          </w:p>
+        </w:tc>
+        <w:tc>
+          <w:tcPr>
+            <w:tcW w:w="1558" w:type="dxa"/>
+          </w:tcPr>
+          <w:p>
+            <w:r>
+              <w:t>Registration Number</w:t>
+            </w:r>
+          </w:p>
+        </w:tc>
+        <w:tc>
+          <w:tcPr>
+            <w:tcW w:w="1558" w:type="dxa"/>
+          </w:tcPr>
+          <w:p>
+            <w:r>
+              <w:t>Technician SSN</w:t>
+            </w:r>
+          </w:p>
+        </w:tc>
+        <w:tc>
+          <w:tcPr>
+            <w:tcW w:w="1558" w:type="dxa"/>
+          </w:tcPr>
+          <w:p>
+            <w:r>
+              <w:t>Number of Tests</w:t>
+            </w:r>
+          </w:p>
+        </w:tc>
+        <w:tc>
+          <w:tcPr>
+            <w:tcW w:w="1559" w:type="dxa"/>
+          </w:tcPr>
+          <w:p>
+            <w:r>
+              <w:t>Total Test Hours</w:t>
+            </w:r>
+          </w:p>
+        </w:tc>
+        <w:tc>
+          <w:tcPr>
+            <w:tcW w:w="1559" w:type="dxa"/>
+          </w:tcPr>
+          <w:p>
+            <w:r>
+              <w:t>Average Test Score</w:t>
+            </w:r>
+          </w:p>
+        </w:tc>
+      </w:tr>
+      <w:tr>
+        <w:tc>
+          <w:tcPr>
+            <w:tcW w:w="1558" w:type="dxa"/>
+          </w:tcPr>
+          <w:p>
+            <w:r>
+              <w:t>A320</w:t>
+            </w:r>
+          </w:p>
+        </w:tc>
+        <w:tc>
+          <w:tcPr>
+            <w:tcW w:w="1558" w:type="dxa"/>
+          </w:tcPr>
+          <w:p>
+            <w:r>
+              <w:t>101</w:t>
+            </w:r>
+          </w:p>
+        </w:tc>
+        <w:tc>
+          <w:tcPr>
+            <w:tcW w:w="1558" w:type="dxa"/>
+          </w:tcPr>
+          <w:p>
+            <w:r>
+              <w:t>1001</w:t>
+            </w:r>
+          </w:p>
+        </w:tc>
+        <w:tc>
+          <w:tcPr>
+            <w:tcW w:w="1558" w:type="dxa"/>
+          </w:tcPr>
+          <w:p>
+            <w:r>
+              <w:t>3</w:t>
+            </w:r>
+          </w:p>
+        </w:tc>
+        <w:tc>
+          <w:tcPr>
+            <w:tcW w:w="1559" w:type="dxa"/>
+          </w:tcPr>
+          <w:p>
+            <w:r>
+              <w:t>7.5</w:t>
+            </w:r>
+          </w:p>
+        </w:tc>
+        <w:tc>
+          <w:tcPr>
+            <w:tcW w:w="1559" w:type="dxa"/>
+          </w:tcPr>
+          <w:p>
+            <w:r>
+              <w:t>88.33</w:t>
+            </w:r>
+          </w:p>
+        </w:tc>
+      </w:tr>
+      <w:tr>
+        <w:tc>
+          <w:tcPr>
+            <w:tcW w:w="1558" w:type="dxa"/>
+          </w:tcPr>
+          <w:p>
+            <w:r>
+              <w:t>A320</w:t>
+            </w:r>
+          </w:p>
+        </w:tc>
+        <w:tc>
+          <w:tcPr>
+            <w:tcW w:w="1558" w:type="dxa"/>
+          </w:tcPr>
+          <w:p>
+            <w:r>
+              <w:t>102</w:t>
+            </w:r>
+          </w:p>
+        </w:tc>
+        <w:tc>
+          <w:tcPr>
+            <w:tcW w:w="1558" w:type="dxa"/>
+          </w:tcPr>
+          <w:p>
+            <w:r>
+              <w:t>1002</w:t>
+            </w:r>
+          </w:p>
+        </w:tc>
+        <w:tc>
+          <w:tcPr>
+            <w:tcW w:w="1558" w:type="dxa"/>
+          </w:tcPr>
+          <w:p>
+            <w:r>
+              <w:t>2</w:t>
+            </w:r>
+          </w:p>
+        </w:tc>
+        <w:tc>
+          <w:tcPr>
+            <w:tcW w:w="1559" w:type="dxa"/>
+          </w:tcPr>
+          <w:p>
+            <w:r>
+              <w:t>7.0</w:t>
+            </w:r>
+          </w:p>
+        </w:tc>
+        <w:tc>
+          <w:tcPr>
+            <w:tcW w:w="1559" w:type="dxa"/>
+          </w:tcPr>
+          <w:p>
+            <w:r>
+              <w:t>75.00</w:t>
+            </w:r>
+          </w:p>
+        </w:tc>
+      </w:tr>
+      <w:tr>
+        <w:tc>
+          <w:tcPr>
+            <w:tcW w:w="1558" w:type="dxa"/>
+          </w:tcPr>
+          <w:p>
+            <w:r>
+              <w:t>B737</w:t>
+            </w:r>
+          </w:p>
+        </w:tc>
+        <w:tc>
+          <w:tcPr>
+            <w:tcW w:w="1558" w:type="dxa"/>
+          </w:tcPr>
+          <w:p>
+            <w:r>
+              <w:t>103</w:t>
+            </w:r>
+          </w:p>
+        </w:tc>
+        <w:tc>
+          <w:tcPr>
+            <w:tcW w:w="1558" w:type="dxa"/>
+          </w:tcPr>
+          <w:p>
+            <w:r>
+              <w:t>1003</w:t>
+            </w:r>
+          </w:p>
+        </w:tc>
+        <w:tc>
+          <w:tcPr>
+            <w:tcW w:w="1558" w:type="dxa"/>
+          </w:tcPr>
+          <w:p>
+            <w:r>
+              <w:t>2</w:t>
+            </w:r>
+          </w:p>
+        </w:tc>
+        <w:tc>
+          <w:tcPr>
+            <w:tcW w:w="1559" w:type="dxa"/>
+          </w:tcPr>
+          <w:p>
+            <w:r>
+              <w:t>4.5</w:t>
+            </w:r>
+          </w:p>
+        </w:tc>
+        <w:tc>
+          <w:tcPr>
+            <w:tcW w:w="1559" w:type="dxa"/>
+          </w:tcPr>
+          <w:p>
+            <w:pPr>
+              <w:keepNext/>
+            </w:pPr>
+            <w:r>
+              <w:t>90.00</w:t>
+            </w:r>
+          </w:p>
+        </w:tc>
+      </w:tr>
+    </w:tbl>
+    <w:p>
+      <w:pPr>
+        <w:jc w:val="center"/>
+      </w:pPr>
+      <w:r>
+        <w:t xml:space="preserve">Table </w:t>
+      </w:r>
+      <w:fldSimple w:instr=" SEQ Table \* ARABIC ">
+        <w:r>
+          <w:rPr>
+            <w:noProof/>
+          </w:rPr>
+          <w:t>2</w:t>
+        </w:r>
+      </w:fldSimple>
+      <w:r>
+        <w:t xml:space="preserve"> Expected Results for Query 1</w:t>
+      </w:r>
+    </w:p>
+    <w:p>
+      <w:pPr>
+        <w:pStyle w:val="Heading4"/>
+      </w:pPr>
+      <w:r>
+        <w:t>Expected Result for Query 2 with sample data</w:t>
+      </w:r>
+    </w:p>
+    <w:tbl>
+      <w:tblPr>
+        <w:tblStyle w:val="TableGrid"/>
+        <w:tblW w:w="0" w:type="auto"/>
+        <w:tblLook w:val="04A0" w:firstRow="1" w:lastRow="0" w:firstColumn="1" w:lastColumn="0" w:noHBand="0" w:noVBand="1"/>
+      </w:tblPr>
+      <w:tblGrid>
+        <w:gridCol w:w="1870"/>
+        <w:gridCol w:w="1870"/>
+        <w:gridCol w:w="1870"/>
+        <w:gridCol w:w="1870"/>
+        <w:gridCol w:w="1870"/>
+      </w:tblGrid>
+      <w:tr>
+        <w:tc>
+          <w:tcPr>
+            <w:tcW w:w="1870" w:type="dxa"/>
+          </w:tcPr>
+          <w:p>
+            <w:r>
+              <w:t>SSN</w:t>
+            </w:r>
+          </w:p>
+        </w:tc>
+        <w:tc>
+          <w:tcPr>
+            <w:tcW w:w="1870" w:type="dxa"/>
+          </w:tcPr>
+          <w:p>
+            <w:r>
+              <w:t>Technician Name</w:t>
+            </w:r>
+          </w:p>
+        </w:tc>
+        <w:tc>
+          <w:tcPr>
+            <w:tcW w:w="1870" w:type="dxa"/>
+          </w:tcPr>
+          <w:p>
+            <w:r>
+              <w:t>Test Year</w:t>
+            </w:r>
+          </w:p>
+        </w:tc>
+        <w:tc>
+          <w:tcPr>
+            <w:tcW w:w="1870" w:type="dxa"/>
+          </w:tcPr>
+          <w:p>
+            <w:r>
+              <w:t>Total Tests</w:t>
+            </w:r>
+          </w:p>
+        </w:tc>
+        <w:tc>
+          <w:tcPr>
+            <w:tcW w:w="1870" w:type="dxa"/>
+          </w:tcPr>
+          <w:p>
+            <w:r>
+              <w:t>Total Hours</w:t>
+            </w:r>
+          </w:p>
+        </w:tc>
+      </w:tr>
+      <w:tr>
+        <w:tc>
+          <w:tcPr>
+            <w:tcW w:w="1870" w:type="dxa"/>
+          </w:tcPr>
+          <w:p>
+            <w:r>
+              <w:t>1001</w:t>
+            </w:r>
+          </w:p>
+        </w:tc>
+        <w:tc>
+          <w:tcPr>
+            <w:tcW w:w="1870" w:type="dxa"/>
+          </w:tcPr>
+          <w:p>
+            <w:r>
+              <w:t>John Smith</w:t>
+            </w:r>
+          </w:p>
+        </w:tc>
+        <w:tc>
+          <w:tcPr>
+            <w:tcW w:w="1870" w:type="dxa"/>
+          </w:tcPr>
+          <w:p>
+            <w:r>
+              <w:t>2026</w:t>
+            </w:r>
+          </w:p>
+        </w:tc>
+        <w:tc>
+          <w:tcPr>
+            <w:tcW w:w="1870" w:type="dxa"/>
+          </w:tcPr>
+          <w:p>
+            <w:r>
+              <w:t>5</w:t>
+            </w:r>
+          </w:p>
+        </w:tc>
+        <w:tc>
+          <w:tcPr>
+            <w:tcW w:w="1870" w:type="dxa"/>
+          </w:tcPr>
+          <w:p>
+            <w:r>
+              <w:t>12.5</w:t>
+            </w:r>
+          </w:p>
+        </w:tc>
+      </w:tr>
+      <w:tr>
+        <w:tc>
+          <w:tcPr>
+            <w:tcW w:w="1870" w:type="dxa"/>
+          </w:tcPr>
+          <w:p>
+            <w:r>
+              <w:t>1002</w:t>
+            </w:r>
+          </w:p>
+        </w:tc>
+        <w:tc>
+          <w:tcPr>
+            <w:tcW w:w="1870" w:type="dxa"/>
+          </w:tcPr>
+          <w:p>
+            <w:r>
+              <w:t>Sarah Brown</w:t>
+            </w:r>
+          </w:p>
+        </w:tc>
+        <w:tc>
+          <w:tcPr>
+            <w:tcW w:w="1870" w:type="dxa"/>
+          </w:tcPr>
+          <w:p>
+            <w:r>
+              <w:t>2026</w:t>
+            </w:r>
+          </w:p>
+        </w:tc>
+        <w:tc>
+          <w:tcPr>
+            <w:tcW w:w="1870" w:type="dxa"/>
+          </w:tcPr>
+          <w:p>
+            <w:r>
+              <w:t>2</w:t>
+            </w:r>
+          </w:p>
+        </w:tc>
+        <w:tc>
+          <w:tcPr>
+            <w:tcW w:w="1870" w:type="dxa"/>
+          </w:tcPr>
+          <w:p>
+            <w:pPr>
+              <w:keepNext/>
+            </w:pPr>
+            <w:r>
+              <w:t>7.0</w:t>
+            </w:r>
+          </w:p>
+        </w:tc>
+      </w:tr>
+    </w:tbl>
+    <w:p>
+      <w:pPr>
+        <w:jc w:val="center"/>
+      </w:pPr>
+      <w:r>
+        <w:t xml:space="preserve">Table </w:t>
+      </w:r>
+      <w:fldSimple w:instr=" SEQ Table \* ARABIC ">
+        <w:r>
+          <w:rPr>
+            <w:noProof/>
+          </w:rPr>
+          <w:t>3</w:t>
+        </w:r>
+      </w:fldSimple>
+      <w:r>
+        <w:t xml:space="preserve"> Expected Results for Query 2</w:t>
+      </w:r>
+    </w:p>
+    <w:p>
+      <w:pPr>
+        <w:pStyle w:val="Heading4"/>
+      </w:pPr>
+      <w:r>
+        <w:t>Expected Result for Query 3 with sample data</w:t>
+      </w:r>
+    </w:p>
+    <w:tbl>
+      <w:tblPr>
+        <w:tblStyle w:val="TableGrid"/>
+        <w:tblW w:w="0" w:type="auto"/>
+        <w:tblLook w:val="04A0" w:firstRow="1" w:lastRow="0" w:firstColumn="1" w:lastColumn="0" w:noHBand="0" w:noVBand="1"/>
+      </w:tblPr>
+      <w:tblGrid>
+        <w:gridCol w:w="3116"/>
+        <w:gridCol w:w="3117"/>
+        <w:gridCol w:w="3117"/>
+      </w:tblGrid>
+      <w:tr>
+        <w:tc>
+          <w:tcPr>
+            <w:tcW w:w="3116" w:type="dxa"/>
+          </w:tcPr>
+          <w:p>
+            <w:r>
+              <w:t>SSN</w:t>
+            </w:r>
+          </w:p>
+        </w:tc>
+        <w:tc>
+          <w:tcPr>
+            <w:tcW w:w="3117" w:type="dxa"/>
+          </w:tcPr>
+          <w:p>
+            <w:r>
+              <w:t>Name</w:t>
+            </w:r>
+          </w:p>
+        </w:tc>
+        <w:tc>
+          <w:tcPr>
+            <w:tcW w:w="3117" w:type="dxa"/>
+          </w:tcPr>
+          <w:p>
+            <w:r>
+              <w:t>Last Examination Date</w:t>
+            </w:r>
+          </w:p>
+        </w:tc>
+      </w:tr>
+      <w:tr>
+        <w:tc>
+          <w:tcPr>
+            <w:tcW w:w="3116" w:type="dxa"/>
+          </w:tcPr>
+          <w:p>
+            <w:r>
+              <w:t>1004</w:t>
+            </w:r>
+          </w:p>
+        </w:tc>
+        <w:tc>
+          <w:tcPr>
+            <w:tcW w:w="3117" w:type="dxa"/>
+          </w:tcPr>
+          <w:p>
+            <w:r>
+              <w:t>Emily Davis</w:t>
+            </w:r>
+          </w:p>
+        </w:tc>
+        <w:tc>
+          <w:tcPr>
+            <w:tcW w:w="3117" w:type="dxa"/>
+          </w:tcPr>
+          <w:p>
+            <w:pPr>
+              <w:keepNext/>
+            </w:pPr>
+            <w:r>
+              <w:t>2026-06-15</w:t>
+            </w:r>
+          </w:p>
+        </w:tc>
+      </w:tr>
+    </w:tbl>
+    <w:p>
+      <w:pPr>
+        <w:jc w:val="center"/>
+      </w:pPr>
+      <w:r>
+        <w:t xml:space="preserve">Table </w:t>
+      </w:r>
+      <w:fldSimple w:instr=" SEQ Table \* ARABIC ">
+        <w:r>
+          <w:rPr>
+            <w:noProof/>
+          </w:rPr>
+          <w:t>4</w:t>
+        </w:r>
+      </w:fldSimple>
+      <w:r>
+        <w:t xml:space="preserve"> Expected Results for Query 3</w:t>
+      </w:r>
+    </w:p>
+    <w:p>
+      <w:pPr>
+        <w:pStyle w:val="Heading4"/>
+      </w:pPr>
+      <w:r>
+        <w:lastRenderedPageBreak/>
+        <w:t>Expected Result for Query 4 with sample data</w:t>
+      </w:r>
+    </w:p>
+    <w:tbl>
+      <w:tblPr>
+        <w:tblStyle w:val="TableGrid"/>
+        <w:tblW w:w="0" w:type="auto"/>
+        <w:tblLook w:val="04A0" w:firstRow="1" w:lastRow="0" w:firstColumn="1" w:lastColumn="0" w:noHBand="0" w:noVBand="1"/>
+      </w:tblPr>
+      <w:tblGrid>
+        <w:gridCol w:w="1558"/>
+        <w:gridCol w:w="1558"/>
+        <w:gridCol w:w="1558"/>
+        <w:gridCol w:w="1558"/>
+        <w:gridCol w:w="1559"/>
+        <w:gridCol w:w="1559"/>
+      </w:tblGrid>
+      <w:tr>
+        <w:tc>
+          <w:tcPr>
+            <w:tcW w:w="1558" w:type="dxa"/>
+          </w:tcPr>
+          <w:p>
+            <w:r>
+              <w:t>Model Number</w:t>
+            </w:r>
+          </w:p>
+        </w:tc>
+        <w:tc>
+          <w:tcPr>
+            <w:tcW w:w="1558" w:type="dxa"/>
+          </w:tcPr>
+          <w:p>
+            <w:r>
+              <w:t>Registration Number</w:t>
+            </w:r>
+          </w:p>
+        </w:tc>
+        <w:tc>
+          <w:tcPr>
+            <w:tcW w:w="1558" w:type="dxa"/>
+          </w:tcPr>
+          <w:p>
+            <w:r>
+              <w:t>Technician Name</w:t>
+            </w:r>
+          </w:p>
+        </w:tc>
+        <w:tc>
+          <w:tcPr>
+            <w:tcW w:w="1558" w:type="dxa"/>
+          </w:tcPr>
+          <w:p>
+            <w:r>
+              <w:t>Latest Score</w:t>
+            </w:r>
+          </w:p>
+        </w:tc>
+        <w:tc>
+          <w:tcPr>
+            <w:tcW w:w="1559" w:type="dxa"/>
+          </w:tcPr>
+          <w:p>
+            <w:r>
+              <w:t>Model Average Score</w:t>
+            </w:r>
+          </w:p>
+        </w:tc>
+        <w:tc>
+          <w:tcPr>
+            <w:tcW w:w="1559" w:type="dxa"/>
+          </w:tcPr>
+          <w:p>
+            <w:r>
+              <w:t>Safety Status</w:t>
+            </w:r>
+          </w:p>
+        </w:tc>
+      </w:tr>
+      <w:tr>
+        <w:tc>
+          <w:tcPr>
+            <w:tcW w:w="1558" w:type="dxa"/>
+          </w:tcPr>
+          <w:p>
+            <w:r>
+              <w:t>A320</w:t>
+            </w:r>
+          </w:p>
+        </w:tc>
+        <w:tc>
+          <w:tcPr>
+            <w:tcW w:w="1558" w:type="dxa"/>
+          </w:tcPr>
+          <w:p>
+            <w:r>
+              <w:t>101</w:t>
+            </w:r>
+          </w:p>
+        </w:tc>
+        <w:tc>
+          <w:tcPr>
+            <w:tcW w:w="1558" w:type="dxa"/>
+          </w:tcPr>
+          <w:p>
+            <w:r>
+              <w:t>John Smith</w:t>
+            </w:r>
+          </w:p>
+        </w:tc>
+        <w:tc>
+          <w:tcPr>
+            <w:tcW w:w="1558" w:type="dxa"/>
+          </w:tcPr>
+          <w:p>
+            <w:r>
+              <w:t>95</w:t>
+            </w:r>
+          </w:p>
+        </w:tc>
+        <w:tc>
+          <w:tcPr>
+            <w:tcW w:w="1559" w:type="dxa"/>
+          </w:tcPr>
+          <w:p>
+            <w:r>
+              <w:t>83.00</w:t>
+            </w:r>
+          </w:p>
+        </w:tc>
+        <w:tc>
+          <w:tcPr>
+            <w:tcW w:w="1559" w:type="dxa"/>
+          </w:tcPr>
+          <w:p>
+            <w:r>
+              <w:t>Pass</w:t>
+            </w:r>
+          </w:p>
+        </w:tc>
+      </w:tr>
+      <w:tr>
+        <w:tc>
+          <w:tcPr>
+            <w:tcW w:w="1558" w:type="dxa"/>
+          </w:tcPr>
+          <w:p>
+            <w:r>
+              <w:t>A320</w:t>
+            </w:r>
+          </w:p>
+        </w:tc>
+        <w:tc>
+          <w:tcPr>
+            <w:tcW w:w="1558" w:type="dxa"/>
+          </w:tcPr>
+          <w:p>
+            <w:r>
+              <w:t>102</w:t>
+            </w:r>
+          </w:p>
+        </w:tc>
+        <w:tc>
+          <w:tcPr>
+            <w:tcW w:w="1558" w:type="dxa"/>
+          </w:tcPr>
+          <w:p>
+            <w:r>
+              <w:t>Sarah Brown</w:t>
+            </w:r>
+          </w:p>
+        </w:tc>
+        <w:tc>
+          <w:tcPr>
+            <w:tcW w:w="1558" w:type="dxa"/>
+          </w:tcPr>
+          <w:p>
+            <w:r>
+              <w:t>80</w:t>
+            </w:r>
+          </w:p>
+        </w:tc>
+        <w:tc>
+          <w:tcPr>
+            <w:tcW w:w="1559" w:type="dxa"/>
+          </w:tcPr>
+          <w:p>
+            <w:r>
+              <w:t>83.00</w:t>
+            </w:r>
+          </w:p>
+        </w:tc>
+        <w:tc>
+          <w:tcPr>
+            <w:tcW w:w="1559" w:type="dxa"/>
+          </w:tcPr>
+          <w:p>
+            <w:pPr>
+              <w:keepNext/>
+            </w:pPr>
+            <w:r>
+              <w:t>Review Required</w:t>
+            </w:r>
+          </w:p>
+        </w:tc>
+      </w:tr>
+    </w:tbl>
+    <w:p>
+      <w:pPr>
+        <w:jc w:val="center"/>
+      </w:pPr>
+      <w:r>
+        <w:t xml:space="preserve">Table </w:t>
+      </w:r>
+      <w:fldSimple w:instr=" SEQ Table \* ARABIC ">
+        <w:r>
+          <w:rPr>
+            <w:noProof/>
+          </w:rPr>
+          <w:t>5</w:t>
+        </w:r>
+      </w:fldSimple>
+      <w:r>
+        <w:t xml:space="preserve"> Expected Results for Query 4</w:t>
+      </w:r>
+    </w:p>
+    <w:p>
+      <w:pPr>
+        <w:pStyle w:val="Heading4"/>
+      </w:pPr>
+      <w:r>
+        <w:t>Expected Result for Query 5 with sample data</w:t>
+      </w:r>
+    </w:p>
+    <w:tbl>
+      <w:tblPr>
+        <w:tblStyle w:val="TableGrid"/>
+        <w:tblW w:w="0" w:type="auto"/>
+        <w:tblLook w:val="04A0" w:firstRow="1" w:lastRow="0" w:firstColumn="1" w:lastColumn="0" w:noHBand="0" w:noVBand="1"/>
+      </w:tblPr>
+      <w:tblGrid>
+        <w:gridCol w:w="3116"/>
+        <w:gridCol w:w="3117"/>
+        <w:gridCol w:w="3117"/>
+      </w:tblGrid>
+      <w:tr>
+        <w:tc>
+          <w:tcPr>
+            <w:tcW w:w="3116" w:type="dxa"/>
+          </w:tcPr>
+          <w:p>
+            <w:r>
+              <w:t>SSN</w:t>
+            </w:r>
+          </w:p>
+        </w:tc>
+        <w:tc>
+          <w:tcPr>
+            <w:tcW w:w="3117" w:type="dxa"/>
+          </w:tcPr>
+          <w:p>
+            <w:r>
+              <w:t>Technician Name</w:t>
+            </w:r>
+          </w:p>
+        </w:tc>
+        <w:tc>
+          <w:tcPr>
+            <w:tcW w:w="3117" w:type="dxa"/>
+          </w:tcPr>
+          <w:p>
+            <w:r>
+              <w:t>Model Number</w:t>
+            </w:r>
+          </w:p>
+        </w:tc>
+      </w:tr>
+      <w:tr>
+        <w:tc>
+          <w:tcPr>
+            <w:tcW w:w="3116" w:type="dxa"/>
+          </w:tcPr>
+          <w:p>
+            <w:r>
+              <w:t>1001</w:t>
+            </w:r>
+          </w:p>
+        </w:tc>
+        <w:tc>
+          <w:tcPr>
+            <w:tcW w:w="3117" w:type="dxa"/>
+          </w:tcPr>
+          <w:p>
+            <w:r>
+              <w:t>John Smith</w:t>
+            </w:r>
+          </w:p>
+        </w:tc>
+        <w:tc>
+          <w:tcPr>
+            <w:tcW w:w="3117" w:type="dxa"/>
+          </w:tcPr>
+          <w:p>
+            <w:r>
+              <w:t>A320</w:t>
+            </w:r>
+          </w:p>
+        </w:tc>
+      </w:tr>
+      <w:tr>
+        <w:tc>
+          <w:tcPr>
+            <w:tcW w:w="3116" w:type="dxa"/>
+          </w:tcPr>
+          <w:p>
+            <w:r>
+              <w:t>1001</w:t>
+            </w:r>
+          </w:p>
+        </w:tc>
+        <w:tc>
+          <w:tcPr>
+            <w:tcW w:w="3117" w:type="dxa"/>
+          </w:tcPr>
+          <w:p>
+            <w:r>
+              <w:t>John Smith</w:t>
+            </w:r>
+          </w:p>
+        </w:tc>
+        <w:tc>
+          <w:tcPr>
+            <w:tcW w:w="3117" w:type="dxa"/>
+          </w:tcPr>
+          <w:p>
+            <w:r>
+              <w:t>A330</w:t>
+            </w:r>
+          </w:p>
+        </w:tc>
+      </w:tr>
+      <w:tr>
+        <w:tc>
+          <w:tcPr>
+            <w:tcW w:w="3116" w:type="dxa"/>
+          </w:tcPr>
+          <w:p>
+            <w:r>
+              <w:t>1002</w:t>
+            </w:r>
+          </w:p>
+        </w:tc>
+        <w:tc>
+          <w:tcPr>
+            <w:tcW w:w="3117" w:type="dxa"/>
+          </w:tcPr>
+          <w:p>
+            <w:r>
+              <w:t>Sarah Brown</w:t>
+            </w:r>
+          </w:p>
+        </w:tc>
+        <w:tc>
+          <w:tcPr>
+            <w:tcW w:w="3117" w:type="dxa"/>
+          </w:tcPr>
+          <w:p>
+            <w:pPr>
+              <w:keepNext/>
+            </w:pPr>
+            <w:r>
+              <w:t>A320</w:t>
+            </w:r>
+          </w:p>
+        </w:tc>
+      </w:tr>
+    </w:tbl>
+    <w:p>
+      <w:pPr>
+        <w:jc w:val="center"/>
+      </w:pPr>
+      <w:r>
+        <w:t xml:space="preserve">Table </w:t>
+      </w:r>
+      <w:fldSimple w:instr=" SEQ Table \* ARABIC ">
+        <w:r>
+          <w:rPr>
+            <w:noProof/>
+          </w:rPr>
+          <w:t>6</w:t>
+        </w:r>
+      </w:fldSimple>
+      <w:r>
+        <w:t xml:space="preserve"> Expected Results for Query 5</w:t>
       </w:r>
     </w:p>
     <w:p>
@@ -1240,22 +4273,22 @@
       <w:pPr>
         <w:pStyle w:val="Heading1"/>
       </w:pPr>
-      <w:bookmarkStart w:id="2" w:name="_Toc237254950"/>
+      <w:bookmarkStart w:id="12" w:name="_Toc237270768"/>
       <w:r>
         <w:lastRenderedPageBreak/>
         <w:t>Task C</w:t>
       </w:r>
-      <w:bookmarkEnd w:id="2"/>
+      <w:bookmarkEnd w:id="12"/>
     </w:p>
     <w:p>
       <w:pPr>
         <w:pStyle w:val="Heading2"/>
       </w:pPr>
-      <w:bookmarkStart w:id="3" w:name="_Toc237254951"/>
+      <w:bookmarkStart w:id="13" w:name="_Toc237270769"/>
       <w:r>
         <w:t>Relational Schema</w:t>
       </w:r>
-      <w:bookmarkEnd w:id="3"/>
+      <w:bookmarkEnd w:id="13"/>
     </w:p>
     <w:p>
       <w:r>
@@ -2050,11 +5083,11 @@
       <w:pPr>
         <w:pStyle w:val="Heading3"/>
       </w:pPr>
-      <w:bookmarkStart w:id="4" w:name="_Toc237254952"/>
+      <w:bookmarkStart w:id="14" w:name="_Toc237270770"/>
       <w:r>
         <w:t>Relational Schema Table</w:t>
       </w:r>
-      <w:bookmarkEnd w:id="4"/>
+      <w:bookmarkEnd w:id="14"/>
     </w:p>
     <w:tbl>
       <w:tblPr>
@@ -2535,7 +5568,7 @@
           <w:rPr>
             <w:noProof/>
           </w:rPr>
-          <w:t>1</w:t>
+          <w:t>7</w:t>
         </w:r>
       </w:fldSimple>
       <w:r>
@@ -2546,29 +5579,35 @@
       <w:pPr>
         <w:pStyle w:val="Heading2"/>
       </w:pPr>
-      <w:bookmarkStart w:id="5" w:name="_Toc237254953"/>
+      <w:bookmarkStart w:id="15" w:name="_Toc237270771"/>
       <w:r>
         <w:t>Normalization</w:t>
       </w:r>
-      <w:bookmarkEnd w:id="5"/>
+      <w:bookmarkEnd w:id="15"/>
     </w:p>
     <w:p>
       <w:r>
         <w:tab/>
       </w:r>
       <w:r>
-        <w:t>The database tables are normalized into 3NF. The normalization was done since the implementation of entity relation diagram, with minor changes in the part 2.</w:t>
+        <w:t xml:space="preserve">The database tables are normalized into 3NF. The normalization was done since the implementation of entity relation diagram, with minor changes in </w:t>
+      </w:r>
+      <w:r>
+        <w:t>part</w:t>
+      </w:r>
+      <w:r>
+        <w:t xml:space="preserve"> 2.</w:t>
       </w:r>
     </w:p>
     <w:p>
       <w:pPr>
         <w:pStyle w:val="Heading3"/>
       </w:pPr>
-      <w:bookmarkStart w:id="6" w:name="_Toc237254954"/>
+      <w:bookmarkStart w:id="16" w:name="_Toc237270772"/>
       <w:r>
         <w:t>First Normal Form (1NF)</w:t>
       </w:r>
-      <w:bookmarkEnd w:id="6"/>
+      <w:bookmarkEnd w:id="16"/>
     </w:p>
     <w:p>
       <w:r>
@@ -2623,12 +5662,12 @@
       <w:pPr>
         <w:pStyle w:val="Heading3"/>
       </w:pPr>
-      <w:bookmarkStart w:id="7" w:name="_Toc237254955"/>
+      <w:bookmarkStart w:id="17" w:name="_Toc237270773"/>
       <w:r>
         <w:lastRenderedPageBreak/>
         <w:t>Second Normal Form (2NF)</w:t>
       </w:r>
-      <w:bookmarkEnd w:id="7"/>
+      <w:bookmarkEnd w:id="17"/>
     </w:p>
     <w:p>
       <w:r>
@@ -2670,11 +5709,11 @@
       <w:pPr>
         <w:pStyle w:val="Heading3"/>
       </w:pPr>
-      <w:bookmarkStart w:id="8" w:name="_Toc237254956"/>
+      <w:bookmarkStart w:id="18" w:name="_Toc237270774"/>
       <w:r>
         <w:t>Third Normal Form (3NF)</w:t>
       </w:r>
-      <w:bookmarkEnd w:id="8"/>
+      <w:bookmarkEnd w:id="18"/>
     </w:p>
     <w:p>
       <w:r>
@@ -2777,6 +5816,27 @@
         <w:t xml:space="preserve"> tables.</w:t>
       </w:r>
     </w:p>
+    <w:p>
+      <w:pPr>
+        <w:spacing w:line="278" w:lineRule="auto"/>
+        <w:jc w:val="left"/>
+      </w:pPr>
+      <w:r>
+        <w:br w:type="page"/>
+      </w:r>
+    </w:p>
+    <w:p>
+      <w:pPr>
+        <w:pStyle w:val="Heading2"/>
+      </w:pPr>
+      <w:bookmarkStart w:id="19" w:name="_Toc237270775"/>
+      <w:r>
+        <w:lastRenderedPageBreak/>
+        <w:t>Task D</w:t>
+      </w:r>
+      <w:bookmarkEnd w:id="19"/>
+    </w:p>
+    <w:p/>
     <w:sectPr>
       <w:pgSz w:w="12240" w:h="15840"/>
       <w:pgMar w:top="1440" w:right="1440" w:bottom="1440" w:left="1440" w:header="720" w:footer="720" w:gutter="0"/>
@@ -5127,10 +8187,9 @@
     <w:next w:val="Normal"/>
     <w:link w:val="Heading4Char"/>
     <w:uiPriority w:val="9"/>
-    <w:semiHidden/>
     <w:unhideWhenUsed/>
     <w:qFormat/>
-    <w:rsid w:val="00FD1316"/>
+    <w:rsid w:val="00041FB9"/>
     <w:pPr>
       <w:keepNext/>
       <w:keepLines/>
@@ -5139,9 +8198,9 @@
     </w:pPr>
     <w:rPr>
       <w:rFonts w:eastAsiaTheme="majorEastAsia" w:cstheme="majorBidi"/>
-      <w:i/>
+      <w:b/>
       <w:iCs/>
-      <w:color w:val="0F4761" w:themeColor="accent1" w:themeShade="BF"/>
+      <w:color w:val="000000" w:themeColor="text1"/>
     </w:rPr>
   </w:style>
   <w:style w:type="paragraph" w:styleId="Heading5">
@@ -5324,13 +8383,12 @@
     <w:basedOn w:val="DefaultParagraphFont"/>
     <w:link w:val="Heading4"/>
     <w:uiPriority w:val="9"/>
-    <w:semiHidden/>
-    <w:rsid w:val="00FD1316"/>
+    <w:rsid w:val="00041FB9"/>
     <w:rPr>
-      <w:rFonts w:eastAsiaTheme="majorEastAsia" w:cstheme="majorBidi"/>
-      <w:i/>
+      <w:rFonts w:ascii="Times New Roman" w:eastAsiaTheme="majorEastAsia" w:hAnsi="Times New Roman" w:cstheme="majorBidi"/>
+      <w:b/>
       <w:iCs/>
-      <w:color w:val="0F4761" w:themeColor="accent1" w:themeShade="BF"/>
+      <w:color w:val="000000" w:themeColor="text1"/>
     </w:rPr>
   </w:style>
   <w:style w:type="character" w:customStyle="1" w:styleId="Heading5Char">

</xml_diff>

<commit_message>
database update report and statements
</commit_message>
<xml_diff>
--- a/2. Airport Database System/40841063_HLUM HTET AUNG Part 2 - Database/40841063_Part 2 Database Report.docx
+++ b/2. Airport Database System/40841063_HLUM HTET AUNG Part 2 - Database/40841063_Part 2 Database Report.docx
@@ -3348,27 +3348,14 @@
       <w:r>
         <w:t xml:space="preserve">Figure </w:t>
       </w:r>
-      <w:r>
-        <w:fldChar w:fldCharType="begin"/>
-      </w:r>
-      <w:r>
-        <w:instrText xml:space="preserve"> SEQ Figure \* ARABIC </w:instrText>
-      </w:r>
-      <w:r>
-        <w:fldChar w:fldCharType="separate"/>
-      </w:r>
-      <w:r>
-        <w:rPr>
-          <w:noProof/>
-        </w:rPr>
-        <w:t>1</w:t>
-      </w:r>
-      <w:r>
-        <w:rPr>
-          <w:noProof/>
-        </w:rPr>
-        <w:fldChar w:fldCharType="end"/>
-      </w:r>
+      <w:fldSimple w:instr=" SEQ Figure \* ARABIC ">
+        <w:r>
+          <w:rPr>
+            <w:noProof/>
+          </w:rPr>
+          <w:t>1</w:t>
+        </w:r>
+      </w:fldSimple>
       <w:r>
         <w:t xml:space="preserve"> Union Table separated</w:t>
       </w:r>
@@ -3414,7 +3401,23 @@
           <w:b/>
           <w:bCs/>
         </w:rPr>
-        <w:t>Hourly rates can be seen in both technicians and traffic controllers.</w:t>
+        <w:t xml:space="preserve">Hourly rates can be seen </w:t>
+      </w:r>
+      <w:proofErr w:type="gramStart"/>
+      <w:r>
+        <w:rPr>
+          <w:b/>
+          <w:bCs/>
+        </w:rPr>
+        <w:t>in</w:t>
+      </w:r>
+      <w:proofErr w:type="gramEnd"/>
+      <w:r>
+        <w:rPr>
+          <w:b/>
+          <w:bCs/>
+        </w:rPr>
+        <w:t xml:space="preserve"> both technicians and traffic controllers.</w:t>
       </w:r>
     </w:p>
     <w:p>
@@ -3487,7 +3490,15 @@
         <w:t>relationships</w:t>
       </w:r>
       <w:r>
-        <w:t xml:space="preserve"> where an employee can belong to at most one labor union, while a single union can represent multiple employees. Union Table’s primary key union_id acts as foreign key in Employee table.</w:t>
+        <w:t xml:space="preserve"> where an employee can belong to at most one labor union, while a single union can represent multiple employees. Union Table’s primary key </w:t>
+      </w:r>
+      <w:proofErr w:type="spellStart"/>
+      <w:r>
+        <w:t>union_id</w:t>
+      </w:r>
+      <w:proofErr w:type="spellEnd"/>
+      <w:r>
+        <w:t xml:space="preserve"> acts as foreign key in Employee table.</w:t>
       </w:r>
     </w:p>
     <w:p>
@@ -3556,7 +3567,15 @@
         <w:t xml:space="preserve">(Test events 1: *-------1:1 Airworthy test model) – </w:t>
       </w:r>
       <w:r>
-        <w:t>one to many relations where a airworthiness test template can be used across many test events. However, each test event is used in exactly one test model.</w:t>
+        <w:t xml:space="preserve">one to many relations where </w:t>
+      </w:r>
+      <w:proofErr w:type="gramStart"/>
+      <w:r>
+        <w:t>a</w:t>
+      </w:r>
+      <w:proofErr w:type="gramEnd"/>
+      <w:r>
+        <w:t xml:space="preserve"> airworthiness test template can be used across many test events. However, each test event is used in exactly one test model.</w:t>
       </w:r>
     </w:p>
     <w:p>
@@ -3586,7 +3605,15 @@
         <w:t xml:space="preserve">(Technicians 1:1-------1:1 Employee) – </w:t>
       </w:r>
       <w:r>
-        <w:t>one to one parent and child table relation. Employee stores shared personal attributes for both technicians and traffic controllers, while technician specific attributes are stored in Technicians using ssn as a primary key and foreign key.</w:t>
+        <w:t xml:space="preserve">one to one parent and child table relation. Employee stores shared personal attributes for both technicians and traffic controllers, while technician specific attributes are stored in Technicians using </w:t>
+      </w:r>
+      <w:proofErr w:type="spellStart"/>
+      <w:r>
+        <w:t>ssn</w:t>
+      </w:r>
+      <w:proofErr w:type="spellEnd"/>
+      <w:r>
+        <w:t xml:space="preserve"> as a primary key and foreign key.</w:t>
       </w:r>
     </w:p>
     <w:p>
@@ -3697,7 +3724,15 @@
         <w:t>Natural Primary Key</w:t>
       </w:r>
       <w:r>
-        <w:t xml:space="preserve"> – ssn from Employee table, registration number from Airplane table are chosen because they are guaranteed to be unique for each employee and airplane.</w:t>
+        <w:t xml:space="preserve"> – </w:t>
+      </w:r>
+      <w:proofErr w:type="spellStart"/>
+      <w:r>
+        <w:t>ssn</w:t>
+      </w:r>
+      <w:proofErr w:type="spellEnd"/>
+      <w:r>
+        <w:t xml:space="preserve"> from Employee table, registration number from Airplane table are chosen because they are guaranteed to be unique for each employee and airplane.</w:t>
       </w:r>
     </w:p>
     <w:p>
@@ -3721,7 +3756,23 @@
         </w:numPr>
       </w:pPr>
       <w:r>
-        <w:t xml:space="preserve">Shared Primary/Foreign Keys – Technicians table’s ssn and Traffic controller’s table’s ssn are used as both primary key and foreign key to reference employee table. This is to ensure that the relation </w:t>
+        <w:t xml:space="preserve">Shared Primary/Foreign Keys – Technicians table’s </w:t>
+      </w:r>
+      <w:proofErr w:type="spellStart"/>
+      <w:r>
+        <w:t>ssn</w:t>
+      </w:r>
+      <w:proofErr w:type="spellEnd"/>
+      <w:r>
+        <w:t xml:space="preserve"> and Traffic controller’s table’s </w:t>
+      </w:r>
+      <w:proofErr w:type="spellStart"/>
+      <w:r>
+        <w:t>ssn</w:t>
+      </w:r>
+      <w:proofErr w:type="spellEnd"/>
+      <w:r>
+        <w:t xml:space="preserve"> are used as both primary key and foreign key to reference employee table. This is to ensure that the relation </w:t>
       </w:r>
       <w:r>
         <w:t>enforces</w:t>
@@ -4885,27 +4936,14 @@
       <w:r>
         <w:t xml:space="preserve">Table </w:t>
       </w:r>
-      <w:r>
-        <w:fldChar w:fldCharType="begin"/>
-      </w:r>
-      <w:r>
-        <w:instrText xml:space="preserve"> SEQ Table \* ARABIC </w:instrText>
-      </w:r>
-      <w:r>
-        <w:fldChar w:fldCharType="separate"/>
-      </w:r>
-      <w:r>
-        <w:rPr>
-          <w:noProof/>
-        </w:rPr>
-        <w:t>1</w:t>
-      </w:r>
-      <w:r>
-        <w:rPr>
-          <w:noProof/>
-        </w:rPr>
-        <w:fldChar w:fldCharType="end"/>
-      </w:r>
+      <w:fldSimple w:instr=" SEQ Table \* ARABIC ">
+        <w:r>
+          <w:rPr>
+            <w:noProof/>
+          </w:rPr>
+          <w:t>1</w:t>
+        </w:r>
+      </w:fldSimple>
       <w:r>
         <w:t xml:space="preserve"> Query Test Plan Table</w:t>
       </w:r>
@@ -5194,27 +5232,14 @@
       <w:r>
         <w:t xml:space="preserve">Table </w:t>
       </w:r>
-      <w:r>
-        <w:fldChar w:fldCharType="begin"/>
-      </w:r>
-      <w:r>
-        <w:instrText xml:space="preserve"> SEQ Table \* ARABIC </w:instrText>
-      </w:r>
-      <w:r>
-        <w:fldChar w:fldCharType="separate"/>
-      </w:r>
-      <w:r>
-        <w:rPr>
-          <w:noProof/>
-        </w:rPr>
-        <w:t>2</w:t>
-      </w:r>
-      <w:r>
-        <w:rPr>
-          <w:noProof/>
-        </w:rPr>
-        <w:fldChar w:fldCharType="end"/>
-      </w:r>
+      <w:fldSimple w:instr=" SEQ Table \* ARABIC ">
+        <w:r>
+          <w:rPr>
+            <w:noProof/>
+          </w:rPr>
+          <w:t>2</w:t>
+        </w:r>
+      </w:fldSimple>
       <w:r>
         <w:t xml:space="preserve"> Expected Results for Query 1</w:t>
       </w:r>
@@ -5407,27 +5432,14 @@
       <w:r>
         <w:t xml:space="preserve">Table </w:t>
       </w:r>
-      <w:r>
-        <w:fldChar w:fldCharType="begin"/>
-      </w:r>
-      <w:r>
-        <w:instrText xml:space="preserve"> SEQ Table \* ARABIC </w:instrText>
-      </w:r>
-      <w:r>
-        <w:fldChar w:fldCharType="separate"/>
-      </w:r>
-      <w:r>
-        <w:rPr>
-          <w:noProof/>
-        </w:rPr>
-        <w:t>3</w:t>
-      </w:r>
-      <w:r>
-        <w:rPr>
-          <w:noProof/>
-        </w:rPr>
-        <w:fldChar w:fldCharType="end"/>
-      </w:r>
+      <w:fldSimple w:instr=" SEQ Table \* ARABIC ">
+        <w:r>
+          <w:rPr>
+            <w:noProof/>
+          </w:rPr>
+          <w:t>3</w:t>
+        </w:r>
+      </w:fldSimple>
       <w:r>
         <w:t xml:space="preserve"> Expected Results for Query 2</w:t>
       </w:r>
@@ -5526,27 +5538,14 @@
       <w:r>
         <w:t xml:space="preserve">Table </w:t>
       </w:r>
-      <w:r>
-        <w:fldChar w:fldCharType="begin"/>
-      </w:r>
-      <w:r>
-        <w:instrText xml:space="preserve"> SEQ Table \* ARABIC </w:instrText>
-      </w:r>
-      <w:r>
-        <w:fldChar w:fldCharType="separate"/>
-      </w:r>
-      <w:r>
-        <w:rPr>
-          <w:noProof/>
-        </w:rPr>
-        <w:t>4</w:t>
-      </w:r>
-      <w:r>
-        <w:rPr>
-          <w:noProof/>
-        </w:rPr>
-        <w:fldChar w:fldCharType="end"/>
-      </w:r>
+      <w:fldSimple w:instr=" SEQ Table \* ARABIC ">
+        <w:r>
+          <w:rPr>
+            <w:noProof/>
+          </w:rPr>
+          <w:t>4</w:t>
+        </w:r>
+      </w:fldSimple>
       <w:r>
         <w:t xml:space="preserve"> Expected Results for Query 3</w:t>
       </w:r>
@@ -5771,27 +5770,14 @@
       <w:r>
         <w:t xml:space="preserve">Table </w:t>
       </w:r>
-      <w:r>
-        <w:fldChar w:fldCharType="begin"/>
-      </w:r>
-      <w:r>
-        <w:instrText xml:space="preserve"> SEQ Table \* ARABIC </w:instrText>
-      </w:r>
-      <w:r>
-        <w:fldChar w:fldCharType="separate"/>
-      </w:r>
-      <w:r>
-        <w:rPr>
-          <w:noProof/>
-        </w:rPr>
-        <w:t>5</w:t>
-      </w:r>
-      <w:r>
-        <w:rPr>
-          <w:noProof/>
-        </w:rPr>
-        <w:fldChar w:fldCharType="end"/>
-      </w:r>
+      <w:fldSimple w:instr=" SEQ Table \* ARABIC ">
+        <w:r>
+          <w:rPr>
+            <w:noProof/>
+          </w:rPr>
+          <w:t>5</w:t>
+        </w:r>
+      </w:fldSimple>
       <w:r>
         <w:t xml:space="preserve"> Expected Results for Query 4</w:t>
       </w:r>
@@ -5811,14 +5797,15 @@
         <w:tblLook w:val="04A0" w:firstRow="1" w:lastRow="0" w:firstColumn="1" w:lastColumn="0" w:noHBand="0" w:noVBand="1"/>
       </w:tblPr>
       <w:tblGrid>
-        <w:gridCol w:w="3116"/>
-        <w:gridCol w:w="3117"/>
-        <w:gridCol w:w="3117"/>
+        <w:gridCol w:w="2303"/>
+        <w:gridCol w:w="2495"/>
+        <w:gridCol w:w="2407"/>
+        <w:gridCol w:w="2145"/>
       </w:tblGrid>
       <w:tr>
         <w:tc>
           <w:tcPr>
-            <w:tcW w:w="3116" w:type="dxa"/>
+            <w:tcW w:w="2303" w:type="dxa"/>
           </w:tcPr>
           <w:p>
             <w:r>
@@ -5828,7 +5815,7 @@
         </w:tc>
         <w:tc>
           <w:tcPr>
-            <w:tcW w:w="3117" w:type="dxa"/>
+            <w:tcW w:w="2495" w:type="dxa"/>
           </w:tcPr>
           <w:p>
             <w:r>
@@ -5838,11 +5825,21 @@
         </w:tc>
         <w:tc>
           <w:tcPr>
-            <w:tcW w:w="3117" w:type="dxa"/>
+            <w:tcW w:w="2407" w:type="dxa"/>
           </w:tcPr>
           <w:p>
             <w:r>
               <w:t>Model Number</w:t>
+            </w:r>
+          </w:p>
+        </w:tc>
+        <w:tc>
+          <w:tcPr>
+            <w:tcW w:w="2145" w:type="dxa"/>
+          </w:tcPr>
+          <w:p>
+            <w:r>
+              <w:t>Specialization Area</w:t>
             </w:r>
           </w:p>
         </w:tc>
@@ -5850,7 +5847,7 @@
       <w:tr>
         <w:tc>
           <w:tcPr>
-            <w:tcW w:w="3116" w:type="dxa"/>
+            <w:tcW w:w="2303" w:type="dxa"/>
           </w:tcPr>
           <w:p>
             <w:r>
@@ -5860,7 +5857,7 @@
         </w:tc>
         <w:tc>
           <w:tcPr>
-            <w:tcW w:w="3117" w:type="dxa"/>
+            <w:tcW w:w="2495" w:type="dxa"/>
           </w:tcPr>
           <w:p>
             <w:r>
@@ -5870,11 +5867,21 @@
         </w:tc>
         <w:tc>
           <w:tcPr>
-            <w:tcW w:w="3117" w:type="dxa"/>
+            <w:tcW w:w="2407" w:type="dxa"/>
           </w:tcPr>
           <w:p>
             <w:r>
               <w:t>A320</w:t>
+            </w:r>
+          </w:p>
+        </w:tc>
+        <w:tc>
+          <w:tcPr>
+            <w:tcW w:w="2145" w:type="dxa"/>
+          </w:tcPr>
+          <w:p>
+            <w:r>
+              <w:t>Maintenance</w:t>
             </w:r>
           </w:p>
         </w:tc>
@@ -5882,7 +5889,7 @@
       <w:tr>
         <w:tc>
           <w:tcPr>
-            <w:tcW w:w="3116" w:type="dxa"/>
+            <w:tcW w:w="2303" w:type="dxa"/>
           </w:tcPr>
           <w:p>
             <w:r>
@@ -5892,7 +5899,7 @@
         </w:tc>
         <w:tc>
           <w:tcPr>
-            <w:tcW w:w="3117" w:type="dxa"/>
+            <w:tcW w:w="2495" w:type="dxa"/>
           </w:tcPr>
           <w:p>
             <w:r>
@@ -5902,11 +5909,21 @@
         </w:tc>
         <w:tc>
           <w:tcPr>
-            <w:tcW w:w="3117" w:type="dxa"/>
+            <w:tcW w:w="2407" w:type="dxa"/>
           </w:tcPr>
           <w:p>
             <w:r>
               <w:t>A330</w:t>
+            </w:r>
+          </w:p>
+        </w:tc>
+        <w:tc>
+          <w:tcPr>
+            <w:tcW w:w="2145" w:type="dxa"/>
+          </w:tcPr>
+          <w:p>
+            <w:r>
+              <w:t>Technical</w:t>
             </w:r>
           </w:p>
         </w:tc>
@@ -5914,7 +5931,7 @@
       <w:tr>
         <w:tc>
           <w:tcPr>
-            <w:tcW w:w="3116" w:type="dxa"/>
+            <w:tcW w:w="2303" w:type="dxa"/>
           </w:tcPr>
           <w:p>
             <w:r>
@@ -5924,7 +5941,7 @@
         </w:tc>
         <w:tc>
           <w:tcPr>
-            <w:tcW w:w="3117" w:type="dxa"/>
+            <w:tcW w:w="2495" w:type="dxa"/>
           </w:tcPr>
           <w:p>
             <w:r>
@@ -5934,7 +5951,7 @@
         </w:tc>
         <w:tc>
           <w:tcPr>
-            <w:tcW w:w="3117" w:type="dxa"/>
+            <w:tcW w:w="2407" w:type="dxa"/>
           </w:tcPr>
           <w:p>
             <w:pPr>
@@ -5945,6 +5962,19 @@
             </w:r>
           </w:p>
         </w:tc>
+        <w:tc>
+          <w:tcPr>
+            <w:tcW w:w="2145" w:type="dxa"/>
+          </w:tcPr>
+          <w:p>
+            <w:pPr>
+              <w:keepNext/>
+            </w:pPr>
+            <w:r>
+              <w:t>Storage</w:t>
+            </w:r>
+          </w:p>
+        </w:tc>
       </w:tr>
     </w:tbl>
     <w:p>
@@ -5954,27 +5984,14 @@
       <w:r>
         <w:t xml:space="preserve">Table </w:t>
       </w:r>
-      <w:r>
-        <w:fldChar w:fldCharType="begin"/>
-      </w:r>
-      <w:r>
-        <w:instrText xml:space="preserve"> SEQ Table \* ARABIC </w:instrText>
-      </w:r>
-      <w:r>
-        <w:fldChar w:fldCharType="separate"/>
-      </w:r>
-      <w:r>
-        <w:rPr>
-          <w:noProof/>
-        </w:rPr>
-        <w:t>6</w:t>
-      </w:r>
-      <w:r>
-        <w:rPr>
-          <w:noProof/>
-        </w:rPr>
-        <w:fldChar w:fldCharType="end"/>
-      </w:r>
+      <w:fldSimple w:instr=" SEQ Table \* ARABIC ">
+        <w:r>
+          <w:rPr>
+            <w:noProof/>
+          </w:rPr>
+          <w:t>6</w:t>
+        </w:r>
+      </w:fldSimple>
       <w:r>
         <w:t xml:space="preserve"> Expected Results for Query 5</w:t>
       </w:r>
@@ -6874,27 +6891,14 @@
       <w:r>
         <w:t xml:space="preserve">Figure </w:t>
       </w:r>
-      <w:r>
-        <w:fldChar w:fldCharType="begin"/>
-      </w:r>
-      <w:r>
-        <w:instrText xml:space="preserve"> SEQ Figure \* ARABIC </w:instrText>
-      </w:r>
-      <w:r>
-        <w:fldChar w:fldCharType="separate"/>
-      </w:r>
-      <w:r>
-        <w:rPr>
-          <w:noProof/>
-        </w:rPr>
-        <w:t>2</w:t>
-      </w:r>
-      <w:r>
-        <w:rPr>
-          <w:noProof/>
-        </w:rPr>
-        <w:fldChar w:fldCharType="end"/>
-      </w:r>
+      <w:fldSimple w:instr=" SEQ Figure \* ARABIC ">
+        <w:r>
+          <w:rPr>
+            <w:noProof/>
+          </w:rPr>
+          <w:t>2</w:t>
+        </w:r>
+      </w:fldSimple>
       <w:r>
         <w:t xml:space="preserve"> Updated Airport Database ERD</w:t>
       </w:r>
@@ -7383,27 +7387,14 @@
       <w:r>
         <w:t xml:space="preserve">Table </w:t>
       </w:r>
-      <w:r>
-        <w:fldChar w:fldCharType="begin"/>
-      </w:r>
-      <w:r>
-        <w:instrText xml:space="preserve"> SEQ Table \* ARABIC </w:instrText>
-      </w:r>
-      <w:r>
-        <w:fldChar w:fldCharType="separate"/>
-      </w:r>
-      <w:r>
-        <w:rPr>
-          <w:noProof/>
-        </w:rPr>
-        <w:t>7</w:t>
-      </w:r>
-      <w:r>
-        <w:rPr>
-          <w:noProof/>
-        </w:rPr>
-        <w:fldChar w:fldCharType="end"/>
-      </w:r>
+      <w:fldSimple w:instr=" SEQ Table \* ARABIC ">
+        <w:r>
+          <w:rPr>
+            <w:noProof/>
+          </w:rPr>
+          <w:t>7</w:t>
+        </w:r>
+      </w:fldSimple>
       <w:r>
         <w:t xml:space="preserve"> Relational Schema Table</w:t>
       </w:r>
@@ -7806,27 +7797,14 @@
       <w:r>
         <w:t xml:space="preserve">Figure </w:t>
       </w:r>
-      <w:r>
-        <w:fldChar w:fldCharType="begin"/>
-      </w:r>
-      <w:r>
-        <w:instrText xml:space="preserve"> SEQ Figure \* ARABIC </w:instrText>
-      </w:r>
-      <w:r>
-        <w:fldChar w:fldCharType="separate"/>
-      </w:r>
-      <w:r>
-        <w:rPr>
-          <w:noProof/>
-        </w:rPr>
-        <w:t>3</w:t>
-      </w:r>
-      <w:r>
-        <w:rPr>
-          <w:noProof/>
-        </w:rPr>
-        <w:fldChar w:fldCharType="end"/>
-      </w:r>
+      <w:fldSimple w:instr=" SEQ Figure \* ARABIC ">
+        <w:r>
+          <w:rPr>
+            <w:noProof/>
+          </w:rPr>
+          <w:t>3</w:t>
+        </w:r>
+      </w:fldSimple>
       <w:r>
         <w:t xml:space="preserve"> </w:t>
       </w:r>
@@ -7916,27 +7894,14 @@
       <w:r>
         <w:t xml:space="preserve">Figure </w:t>
       </w:r>
-      <w:r>
-        <w:fldChar w:fldCharType="begin"/>
-      </w:r>
-      <w:r>
-        <w:instrText xml:space="preserve"> SEQ Figure \* ARABIC </w:instrText>
-      </w:r>
-      <w:r>
-        <w:fldChar w:fldCharType="separate"/>
-      </w:r>
-      <w:r>
-        <w:rPr>
-          <w:noProof/>
-        </w:rPr>
-        <w:t>4</w:t>
-      </w:r>
-      <w:r>
-        <w:rPr>
-          <w:noProof/>
-        </w:rPr>
-        <w:fldChar w:fldCharType="end"/>
-      </w:r>
+      <w:fldSimple w:instr=" SEQ Figure \* ARABIC ">
+        <w:r>
+          <w:rPr>
+            <w:noProof/>
+          </w:rPr>
+          <w:t>4</w:t>
+        </w:r>
+      </w:fldSimple>
       <w:r>
         <w:t xml:space="preserve"> Employee Table</w:t>
       </w:r>
@@ -8020,27 +7985,14 @@
       <w:r>
         <w:t xml:space="preserve">Figure </w:t>
       </w:r>
-      <w:r>
-        <w:fldChar w:fldCharType="begin"/>
-      </w:r>
-      <w:r>
-        <w:instrText xml:space="preserve"> SEQ Figure \* ARABIC </w:instrText>
-      </w:r>
-      <w:r>
-        <w:fldChar w:fldCharType="separate"/>
-      </w:r>
-      <w:r>
-        <w:rPr>
-          <w:noProof/>
-        </w:rPr>
-        <w:t>5</w:t>
-      </w:r>
-      <w:r>
-        <w:rPr>
-          <w:noProof/>
-        </w:rPr>
-        <w:fldChar w:fldCharType="end"/>
-      </w:r>
+      <w:fldSimple w:instr=" SEQ Figure \* ARABIC ">
+        <w:r>
+          <w:rPr>
+            <w:noProof/>
+          </w:rPr>
+          <w:t>5</w:t>
+        </w:r>
+      </w:fldSimple>
       <w:r>
         <w:t xml:space="preserve"> Airplane model table</w:t>
       </w:r>
@@ -8124,27 +8076,14 @@
       <w:r>
         <w:t xml:space="preserve">Figure </w:t>
       </w:r>
-      <w:r>
-        <w:fldChar w:fldCharType="begin"/>
-      </w:r>
-      <w:r>
-        <w:instrText xml:space="preserve"> SEQ Figure \* ARABIC </w:instrText>
-      </w:r>
-      <w:r>
-        <w:fldChar w:fldCharType="separate"/>
-      </w:r>
-      <w:r>
-        <w:rPr>
-          <w:noProof/>
-        </w:rPr>
-        <w:t>6</w:t>
-      </w:r>
-      <w:r>
-        <w:rPr>
-          <w:noProof/>
-        </w:rPr>
-        <w:fldChar w:fldCharType="end"/>
-      </w:r>
+      <w:fldSimple w:instr=" SEQ Figure \* ARABIC ">
+        <w:r>
+          <w:rPr>
+            <w:noProof/>
+          </w:rPr>
+          <w:t>6</w:t>
+        </w:r>
+      </w:fldSimple>
       <w:r>
         <w:t xml:space="preserve"> Airplane Table</w:t>
       </w:r>
@@ -8228,27 +8167,14 @@
       <w:r>
         <w:t xml:space="preserve">Figure </w:t>
       </w:r>
-      <w:r>
-        <w:fldChar w:fldCharType="begin"/>
-      </w:r>
-      <w:r>
-        <w:instrText xml:space="preserve"> SEQ Figure \* ARABIC </w:instrText>
-      </w:r>
-      <w:r>
-        <w:fldChar w:fldCharType="separate"/>
-      </w:r>
-      <w:r>
-        <w:rPr>
-          <w:noProof/>
-        </w:rPr>
-        <w:t>7</w:t>
-      </w:r>
-      <w:r>
-        <w:rPr>
-          <w:noProof/>
-        </w:rPr>
-        <w:fldChar w:fldCharType="end"/>
-      </w:r>
+      <w:fldSimple w:instr=" SEQ Figure \* ARABIC ">
+        <w:r>
+          <w:rPr>
+            <w:noProof/>
+          </w:rPr>
+          <w:t>7</w:t>
+        </w:r>
+      </w:fldSimple>
       <w:r>
         <w:t xml:space="preserve"> Technician Table</w:t>
       </w:r>
@@ -8332,27 +8258,14 @@
       <w:r>
         <w:t xml:space="preserve">Figure </w:t>
       </w:r>
-      <w:r>
-        <w:fldChar w:fldCharType="begin"/>
-      </w:r>
-      <w:r>
-        <w:instrText xml:space="preserve"> SEQ Figure \* ARABIC </w:instrText>
-      </w:r>
-      <w:r>
-        <w:fldChar w:fldCharType="separate"/>
-      </w:r>
-      <w:r>
-        <w:rPr>
-          <w:noProof/>
-        </w:rPr>
-        <w:t>8</w:t>
-      </w:r>
-      <w:r>
-        <w:rPr>
-          <w:noProof/>
-        </w:rPr>
-        <w:fldChar w:fldCharType="end"/>
-      </w:r>
+      <w:fldSimple w:instr=" SEQ Figure \* ARABIC ">
+        <w:r>
+          <w:rPr>
+            <w:noProof/>
+          </w:rPr>
+          <w:t>8</w:t>
+        </w:r>
+      </w:fldSimple>
       <w:r>
         <w:t xml:space="preserve"> Traffic controller</w:t>
       </w:r>
@@ -8436,27 +8349,14 @@
       <w:r>
         <w:t xml:space="preserve">Figure </w:t>
       </w:r>
-      <w:r>
-        <w:fldChar w:fldCharType="begin"/>
-      </w:r>
-      <w:r>
-        <w:instrText xml:space="preserve"> SEQ Figure \* ARABIC </w:instrText>
-      </w:r>
-      <w:r>
-        <w:fldChar w:fldCharType="separate"/>
-      </w:r>
-      <w:r>
-        <w:rPr>
-          <w:noProof/>
-        </w:rPr>
-        <w:t>9</w:t>
-      </w:r>
-      <w:r>
-        <w:rPr>
-          <w:noProof/>
-        </w:rPr>
-        <w:fldChar w:fldCharType="end"/>
-      </w:r>
+      <w:fldSimple w:instr=" SEQ Figure \* ARABIC ">
+        <w:r>
+          <w:rPr>
+            <w:noProof/>
+          </w:rPr>
+          <w:t>9</w:t>
+        </w:r>
+      </w:fldSimple>
       <w:r>
         <w:t xml:space="preserve"> Technician expertise table</w:t>
       </w:r>
@@ -8540,27 +8440,14 @@
       <w:r>
         <w:t xml:space="preserve">Figure </w:t>
       </w:r>
-      <w:r>
-        <w:fldChar w:fldCharType="begin"/>
-      </w:r>
-      <w:r>
-        <w:instrText xml:space="preserve"> SEQ Figure \* ARABIC </w:instrText>
-      </w:r>
-      <w:r>
-        <w:fldChar w:fldCharType="separate"/>
-      </w:r>
-      <w:r>
-        <w:rPr>
-          <w:noProof/>
-        </w:rPr>
-        <w:t>10</w:t>
-      </w:r>
-      <w:r>
-        <w:rPr>
-          <w:noProof/>
-        </w:rPr>
-        <w:fldChar w:fldCharType="end"/>
-      </w:r>
+      <w:fldSimple w:instr=" SEQ Figure \* ARABIC ">
+        <w:r>
+          <w:rPr>
+            <w:noProof/>
+          </w:rPr>
+          <w:t>10</w:t>
+        </w:r>
+      </w:fldSimple>
       <w:r>
         <w:t xml:space="preserve"> Airworthiness test model table</w:t>
       </w:r>
@@ -8644,27 +8531,14 @@
       <w:r>
         <w:t xml:space="preserve">Figure </w:t>
       </w:r>
-      <w:r>
-        <w:fldChar w:fldCharType="begin"/>
-      </w:r>
-      <w:r>
-        <w:instrText xml:space="preserve"> SEQ Figure \* ARABIC </w:instrText>
-      </w:r>
-      <w:r>
-        <w:fldChar w:fldCharType="separate"/>
-      </w:r>
-      <w:r>
-        <w:rPr>
-          <w:noProof/>
-        </w:rPr>
-        <w:t>11</w:t>
-      </w:r>
-      <w:r>
-        <w:rPr>
-          <w:noProof/>
-        </w:rPr>
-        <w:fldChar w:fldCharType="end"/>
-      </w:r>
+      <w:fldSimple w:instr=" SEQ Figure \* ARABIC ">
+        <w:r>
+          <w:rPr>
+            <w:noProof/>
+          </w:rPr>
+          <w:t>11</w:t>
+        </w:r>
+      </w:fldSimple>
       <w:r>
         <w:t xml:space="preserve"> Test events table</w:t>
       </w:r>
@@ -8760,27 +8634,14 @@
       <w:r>
         <w:t xml:space="preserve">Figure </w:t>
       </w:r>
-      <w:r>
-        <w:fldChar w:fldCharType="begin"/>
-      </w:r>
-      <w:r>
-        <w:instrText xml:space="preserve"> SEQ Figure \* ARABIC </w:instrText>
-      </w:r>
-      <w:r>
-        <w:fldChar w:fldCharType="separate"/>
-      </w:r>
-      <w:r>
-        <w:rPr>
-          <w:noProof/>
-        </w:rPr>
-        <w:t>12</w:t>
-      </w:r>
-      <w:r>
-        <w:rPr>
-          <w:noProof/>
-        </w:rPr>
-        <w:fldChar w:fldCharType="end"/>
-      </w:r>
+      <w:fldSimple w:instr=" SEQ Figure \* ARABIC ">
+        <w:r>
+          <w:rPr>
+            <w:noProof/>
+          </w:rPr>
+          <w:t>12</w:t>
+        </w:r>
+      </w:fldSimple>
       <w:r>
         <w:t xml:space="preserve"> Union Table Data insertion</w:t>
       </w:r>
@@ -8854,27 +8715,14 @@
       <w:r>
         <w:t xml:space="preserve">Figure </w:t>
       </w:r>
-      <w:r>
-        <w:fldChar w:fldCharType="begin"/>
-      </w:r>
-      <w:r>
-        <w:instrText xml:space="preserve"> SEQ Figure \* ARABIC </w:instrText>
-      </w:r>
-      <w:r>
-        <w:fldChar w:fldCharType="separate"/>
-      </w:r>
-      <w:r>
-        <w:rPr>
-          <w:noProof/>
-        </w:rPr>
-        <w:t>13</w:t>
-      </w:r>
-      <w:r>
-        <w:rPr>
-          <w:noProof/>
-        </w:rPr>
-        <w:fldChar w:fldCharType="end"/>
-      </w:r>
+      <w:fldSimple w:instr=" SEQ Figure \* ARABIC ">
+        <w:r>
+          <w:rPr>
+            <w:noProof/>
+          </w:rPr>
+          <w:t>13</w:t>
+        </w:r>
+      </w:fldSimple>
       <w:r>
         <w:t xml:space="preserve"> Employee Table Data Insertion</w:t>
       </w:r>
@@ -8948,27 +8796,14 @@
       <w:r>
         <w:t xml:space="preserve">Figure </w:t>
       </w:r>
-      <w:r>
-        <w:fldChar w:fldCharType="begin"/>
-      </w:r>
-      <w:r>
-        <w:instrText xml:space="preserve"> SEQ Figure \* ARABIC </w:instrText>
-      </w:r>
-      <w:r>
-        <w:fldChar w:fldCharType="separate"/>
-      </w:r>
-      <w:r>
-        <w:rPr>
-          <w:noProof/>
-        </w:rPr>
-        <w:t>14</w:t>
-      </w:r>
-      <w:r>
-        <w:rPr>
-          <w:noProof/>
-        </w:rPr>
-        <w:fldChar w:fldCharType="end"/>
-      </w:r>
+      <w:fldSimple w:instr=" SEQ Figure \* ARABIC ">
+        <w:r>
+          <w:rPr>
+            <w:noProof/>
+          </w:rPr>
+          <w:t>14</w:t>
+        </w:r>
+      </w:fldSimple>
       <w:r>
         <w:t xml:space="preserve"> Airplane Model Data Insertion</w:t>
       </w:r>
@@ -9042,27 +8877,14 @@
       <w:r>
         <w:t xml:space="preserve">Figure </w:t>
       </w:r>
-      <w:r>
-        <w:fldChar w:fldCharType="begin"/>
-      </w:r>
-      <w:r>
-        <w:instrText xml:space="preserve"> SEQ Figure \* ARABIC </w:instrText>
-      </w:r>
-      <w:r>
-        <w:fldChar w:fldCharType="separate"/>
-      </w:r>
-      <w:r>
-        <w:rPr>
-          <w:noProof/>
-        </w:rPr>
-        <w:t>15</w:t>
-      </w:r>
-      <w:r>
-        <w:rPr>
-          <w:noProof/>
-        </w:rPr>
-        <w:fldChar w:fldCharType="end"/>
-      </w:r>
+      <w:fldSimple w:instr=" SEQ Figure \* ARABIC ">
+        <w:r>
+          <w:rPr>
+            <w:noProof/>
+          </w:rPr>
+          <w:t>15</w:t>
+        </w:r>
+      </w:fldSimple>
       <w:r>
         <w:t xml:space="preserve"> Airplane Data Insertion</w:t>
       </w:r>
@@ -9136,27 +8958,14 @@
       <w:r>
         <w:t xml:space="preserve">Figure </w:t>
       </w:r>
-      <w:r>
-        <w:fldChar w:fldCharType="begin"/>
-      </w:r>
-      <w:r>
-        <w:instrText xml:space="preserve"> SEQ Figure \* ARABIC </w:instrText>
-      </w:r>
-      <w:r>
-        <w:fldChar w:fldCharType="separate"/>
-      </w:r>
-      <w:r>
-        <w:rPr>
-          <w:noProof/>
-        </w:rPr>
-        <w:t>16</w:t>
-      </w:r>
-      <w:r>
-        <w:rPr>
-          <w:noProof/>
-        </w:rPr>
-        <w:fldChar w:fldCharType="end"/>
-      </w:r>
+      <w:fldSimple w:instr=" SEQ Figure \* ARABIC ">
+        <w:r>
+          <w:rPr>
+            <w:noProof/>
+          </w:rPr>
+          <w:t>16</w:t>
+        </w:r>
+      </w:fldSimple>
       <w:r>
         <w:t xml:space="preserve"> Technicians Data Insertion</w:t>
       </w:r>
@@ -9230,27 +9039,14 @@
       <w:r>
         <w:t xml:space="preserve">Figure </w:t>
       </w:r>
-      <w:r>
-        <w:fldChar w:fldCharType="begin"/>
-      </w:r>
-      <w:r>
-        <w:instrText xml:space="preserve"> SEQ Figure \* ARABIC </w:instrText>
-      </w:r>
-      <w:r>
-        <w:fldChar w:fldCharType="separate"/>
-      </w:r>
-      <w:r>
-        <w:rPr>
-          <w:noProof/>
-        </w:rPr>
-        <w:t>17</w:t>
-      </w:r>
-      <w:r>
-        <w:rPr>
-          <w:noProof/>
-        </w:rPr>
-        <w:fldChar w:fldCharType="end"/>
-      </w:r>
+      <w:fldSimple w:instr=" SEQ Figure \* ARABIC ">
+        <w:r>
+          <w:rPr>
+            <w:noProof/>
+          </w:rPr>
+          <w:t>17</w:t>
+        </w:r>
+      </w:fldSimple>
       <w:r>
         <w:t xml:space="preserve"> Traffic Controller Data Insertion</w:t>
       </w:r>
@@ -9324,27 +9120,14 @@
       <w:r>
         <w:t xml:space="preserve">Figure </w:t>
       </w:r>
-      <w:r>
-        <w:fldChar w:fldCharType="begin"/>
-      </w:r>
-      <w:r>
-        <w:instrText xml:space="preserve"> SEQ Figure \* ARABIC </w:instrText>
-      </w:r>
-      <w:r>
-        <w:fldChar w:fldCharType="separate"/>
-      </w:r>
-      <w:r>
-        <w:rPr>
-          <w:noProof/>
-        </w:rPr>
-        <w:t>18</w:t>
-      </w:r>
-      <w:r>
-        <w:rPr>
-          <w:noProof/>
-        </w:rPr>
-        <w:fldChar w:fldCharType="end"/>
-      </w:r>
+      <w:fldSimple w:instr=" SEQ Figure \* ARABIC ">
+        <w:r>
+          <w:rPr>
+            <w:noProof/>
+          </w:rPr>
+          <w:t>18</w:t>
+        </w:r>
+      </w:fldSimple>
       <w:r>
         <w:t xml:space="preserve"> Technician expertise Data Insertion</w:t>
       </w:r>
@@ -9418,27 +9201,14 @@
       <w:r>
         <w:t xml:space="preserve">Figure </w:t>
       </w:r>
-      <w:r>
-        <w:fldChar w:fldCharType="begin"/>
-      </w:r>
-      <w:r>
-        <w:instrText xml:space="preserve"> SEQ Figure \* ARABIC </w:instrText>
-      </w:r>
-      <w:r>
-        <w:fldChar w:fldCharType="separate"/>
-      </w:r>
-      <w:r>
-        <w:rPr>
-          <w:noProof/>
-        </w:rPr>
-        <w:t>19</w:t>
-      </w:r>
-      <w:r>
-        <w:rPr>
-          <w:noProof/>
-        </w:rPr>
-        <w:fldChar w:fldCharType="end"/>
-      </w:r>
+      <w:fldSimple w:instr=" SEQ Figure \* ARABIC ">
+        <w:r>
+          <w:rPr>
+            <w:noProof/>
+          </w:rPr>
+          <w:t>19</w:t>
+        </w:r>
+      </w:fldSimple>
       <w:r>
         <w:t xml:space="preserve"> Airworthiness Tests Data Insertion</w:t>
       </w:r>
@@ -9522,27 +9292,14 @@
       <w:r>
         <w:t xml:space="preserve">Figure </w:t>
       </w:r>
-      <w:r>
-        <w:fldChar w:fldCharType="begin"/>
-      </w:r>
-      <w:r>
-        <w:instrText xml:space="preserve"> SEQ Figure \* ARABIC </w:instrText>
-      </w:r>
-      <w:r>
-        <w:fldChar w:fldCharType="separate"/>
-      </w:r>
-      <w:r>
-        <w:rPr>
-          <w:noProof/>
-        </w:rPr>
-        <w:t>20</w:t>
-      </w:r>
-      <w:r>
-        <w:rPr>
-          <w:noProof/>
-        </w:rPr>
-        <w:fldChar w:fldCharType="end"/>
-      </w:r>
+      <w:fldSimple w:instr=" SEQ Figure \* ARABIC ">
+        <w:r>
+          <w:rPr>
+            <w:noProof/>
+          </w:rPr>
+          <w:t>20</w:t>
+        </w:r>
+      </w:fldSimple>
       <w:r>
         <w:t xml:space="preserve"> Test event data insertion</w:t>
       </w:r>
@@ -9607,27 +9364,14 @@
       <w:r>
         <w:t xml:space="preserve">Figure </w:t>
       </w:r>
-      <w:r>
-        <w:fldChar w:fldCharType="begin"/>
-      </w:r>
-      <w:r>
-        <w:instrText xml:space="preserve"> SEQ Figure \* ARABIC </w:instrText>
-      </w:r>
-      <w:r>
-        <w:fldChar w:fldCharType="separate"/>
-      </w:r>
-      <w:r>
-        <w:rPr>
-          <w:noProof/>
-        </w:rPr>
-        <w:t>21</w:t>
-      </w:r>
-      <w:r>
-        <w:rPr>
-          <w:noProof/>
-        </w:rPr>
-        <w:fldChar w:fldCharType="end"/>
-      </w:r>
+      <w:fldSimple w:instr=" SEQ Figure \* ARABIC ">
+        <w:r>
+          <w:rPr>
+            <w:noProof/>
+          </w:rPr>
+          <w:t>21</w:t>
+        </w:r>
+      </w:fldSimple>
       <w:r>
         <w:t xml:space="preserve"> Inserting more rows in Test events for screenshot</w:t>
       </w:r>
@@ -9670,35 +9414,15 @@
       </w:r>
     </w:p>
     <w:p>
-      <w:r>
-        <w:tab/>
-      </w:r>
-      <w:r>
-        <w:t>This query takes the average of testing metrics for each airplane model number. Links to the test events table and also airplane model details and the technician's records to determine the overall number of test events, total hours elapsed and average score per model. This gives an in-depth view of the degree of testing and evaluation of every aircraft model.</w:t>
-      </w:r>
-    </w:p>
-    <w:p>
-      <w:pPr>
-        <w:pStyle w:val="Heading3"/>
-      </w:pPr>
-      <w:r>
-        <w:t>Query 2 – Employee Annual Performance</w:t>
-      </w:r>
-    </w:p>
-    <w:p>
       <w:pPr>
         <w:keepNext/>
-        <w:jc w:val="center"/>
-      </w:pPr>
-      <w:r>
-        <w:rPr>
-          <w:noProof/>
-        </w:rPr>
+      </w:pPr>
+      <w:r>
         <w:drawing>
-          <wp:inline distT="0" distB="0" distL="0" distR="0" wp14:anchorId="0FAEBB0C" wp14:editId="3D4A6A31">
-            <wp:extent cx="5819637" cy="3905250"/>
-            <wp:effectExtent l="19050" t="19050" r="10160" b="19050"/>
-            <wp:docPr id="1676746442" name="Picture 9"/>
+          <wp:inline distT="0" distB="0" distL="0" distR="0" wp14:anchorId="5AFD2CCC" wp14:editId="07634B91">
+            <wp:extent cx="5943600" cy="3716020"/>
+            <wp:effectExtent l="19050" t="19050" r="19050" b="17780"/>
+            <wp:docPr id="1234336673" name="Picture 1"/>
             <wp:cNvGraphicFramePr>
               <a:graphicFrameLocks xmlns:a="http://schemas.openxmlformats.org/drawingml/2006/main" noChangeAspect="1"/>
             </wp:cNvGraphicFramePr>
@@ -9706,33 +9430,23 @@
               <a:graphicData uri="http://schemas.openxmlformats.org/drawingml/2006/picture">
                 <pic:pic xmlns:pic="http://schemas.openxmlformats.org/drawingml/2006/picture">
                   <pic:nvPicPr>
-                    <pic:cNvPr id="0" name="Picture 9"/>
-                    <pic:cNvPicPr>
-                      <a:picLocks noChangeAspect="1" noChangeArrowheads="1"/>
-                    </pic:cNvPicPr>
+                    <pic:cNvPr id="1234336673" name=""/>
+                    <pic:cNvPicPr/>
                   </pic:nvPicPr>
                   <pic:blipFill>
-                    <a:blip r:embed="rId28">
-                      <a:extLst>
-                        <a:ext uri="{28A0092B-C50C-407E-A947-70E740481C1C}">
-                          <a14:useLocalDpi xmlns:a14="http://schemas.microsoft.com/office/drawing/2010/main" val="0"/>
-                        </a:ext>
-                      </a:extLst>
-                    </a:blip>
-                    <a:srcRect/>
+                    <a:blip r:embed="rId28"/>
                     <a:stretch>
                       <a:fillRect/>
                     </a:stretch>
                   </pic:blipFill>
-                  <pic:spPr bwMode="auto">
+                  <pic:spPr>
                     <a:xfrm>
                       <a:off x="0" y="0"/>
-                      <a:ext cx="5828535" cy="3911221"/>
+                      <a:ext cx="5943600" cy="3716020"/>
                     </a:xfrm>
                     <a:prstGeom prst="rect">
                       <a:avLst/>
                     </a:prstGeom>
-                    <a:noFill/>
                     <a:ln>
                       <a:solidFill>
                         <a:schemeClr val="tx1"/>
@@ -9753,24 +9467,98 @@
       <w:r>
         <w:t xml:space="preserve">Figure </w:t>
       </w:r>
-      <w:r>
-        <w:fldChar w:fldCharType="begin"/>
-      </w:r>
-      <w:r>
-        <w:instrText xml:space="preserve"> SEQ Figure \* ARABIC </w:instrText>
-      </w:r>
-      <w:r>
-        <w:fldChar w:fldCharType="separate"/>
-      </w:r>
-      <w:r>
-        <w:rPr>
-          <w:noProof/>
-        </w:rPr>
-        <w:t>22</w:t>
-      </w:r>
-      <w:r>
-        <w:fldChar w:fldCharType="end"/>
-      </w:r>
+      <w:fldSimple w:instr=" SEQ Figure \* ARABIC ">
+        <w:r>
+          <w:rPr>
+            <w:noProof/>
+          </w:rPr>
+          <w:t>22</w:t>
+        </w:r>
+      </w:fldSimple>
+      <w:r>
+        <w:t xml:space="preserve"> Airplane Test Performance Summary</w:t>
+      </w:r>
+    </w:p>
+    <w:p>
+      <w:r>
+        <w:tab/>
+      </w:r>
+      <w:r>
+        <w:t>This query takes the average of testing metrics for each airplane model number. Links to the test events table and also airplane model details and the technician's records to determine the overall number of test events, total hours elapsed and average score per model. This gives an in-depth view of the degree of testing and evaluation of every aircraft model.</w:t>
+      </w:r>
+    </w:p>
+    <w:p>
+      <w:pPr>
+        <w:pStyle w:val="Heading3"/>
+      </w:pPr>
+      <w:r>
+        <w:lastRenderedPageBreak/>
+        <w:t>Query 2 – Employee Annual Performance</w:t>
+      </w:r>
+    </w:p>
+    <w:p>
+      <w:pPr>
+        <w:keepNext/>
+        <w:jc w:val="center"/>
+      </w:pPr>
+      <w:r>
+        <w:drawing>
+          <wp:inline distT="0" distB="0" distL="0" distR="0" wp14:anchorId="4DFF17C8" wp14:editId="58770DB8">
+            <wp:extent cx="5943600" cy="3764915"/>
+            <wp:effectExtent l="19050" t="19050" r="19050" b="26035"/>
+            <wp:docPr id="1214279355" name="Picture 1"/>
+            <wp:cNvGraphicFramePr>
+              <a:graphicFrameLocks xmlns:a="http://schemas.openxmlformats.org/drawingml/2006/main" noChangeAspect="1"/>
+            </wp:cNvGraphicFramePr>
+            <a:graphic xmlns:a="http://schemas.openxmlformats.org/drawingml/2006/main">
+              <a:graphicData uri="http://schemas.openxmlformats.org/drawingml/2006/picture">
+                <pic:pic xmlns:pic="http://schemas.openxmlformats.org/drawingml/2006/picture">
+                  <pic:nvPicPr>
+                    <pic:cNvPr id="1214279355" name=""/>
+                    <pic:cNvPicPr/>
+                  </pic:nvPicPr>
+                  <pic:blipFill>
+                    <a:blip r:embed="rId29"/>
+                    <a:stretch>
+                      <a:fillRect/>
+                    </a:stretch>
+                  </pic:blipFill>
+                  <pic:spPr>
+                    <a:xfrm>
+                      <a:off x="0" y="0"/>
+                      <a:ext cx="5943600" cy="3764915"/>
+                    </a:xfrm>
+                    <a:prstGeom prst="rect">
+                      <a:avLst/>
+                    </a:prstGeom>
+                    <a:ln>
+                      <a:solidFill>
+                        <a:schemeClr val="tx1"/>
+                      </a:solidFill>
+                    </a:ln>
+                  </pic:spPr>
+                </pic:pic>
+              </a:graphicData>
+            </a:graphic>
+          </wp:inline>
+        </w:drawing>
+      </w:r>
+    </w:p>
+    <w:p>
+      <w:pPr>
+        <w:jc w:val="center"/>
+      </w:pPr>
+      <w:r>
+        <w:t xml:space="preserve">Figure </w:t>
+      </w:r>
+      <w:fldSimple w:instr=" SEQ Figure \* ARABIC ">
+        <w:r>
+          <w:rPr>
+            <w:noProof/>
+          </w:rPr>
+          <w:t>23</w:t>
+        </w:r>
+      </w:fldSimple>
       <w:r>
         <w:t xml:space="preserve"> Employee Annual Performance Query</w:t>
       </w:r>
@@ -9780,19 +9568,28 @@
         <w:tab/>
       </w:r>
       <w:r>
-        <w:t xml:space="preserve">This query returns productivity which is the number of test events performed by the technician in a calendar year. It pulls the year from the test date, and also merges the employee and </w:t>
-      </w:r>
+        <w:t xml:space="preserve">This query returns productivity which is the number of test events performed by the technician in a calendar year. It pulls the year from the test </w:t>
+      </w:r>
+      <w:r>
+        <w:t>date and</w:t>
+      </w:r>
+      <w:r>
+        <w:t xml:space="preserve"> also merges the employee and technician table to obtain employee name matches with the corresponding ID numbers. The results can be sorted in descending order so you can see at a </w:t>
+      </w:r>
+      <w:r>
+        <w:t>glance which</w:t>
+      </w:r>
+      <w:r>
+        <w:t xml:space="preserve"> technicians are doing better.</w:t>
+      </w:r>
+    </w:p>
+    <w:p/>
+    <w:p>
+      <w:pPr>
+        <w:pStyle w:val="Heading3"/>
+      </w:pPr>
       <w:r>
         <w:lastRenderedPageBreak/>
-        <w:t>technician table to obtain employee name matches with the corresponding ID numbers. The results can be sorted in descending order so you can see at a glance, which technicians are doing better.</w:t>
-      </w:r>
-    </w:p>
-    <w:p/>
-    <w:p>
-      <w:pPr>
-        <w:pStyle w:val="Heading3"/>
-      </w:pPr>
-      <w:r>
         <w:t>Query 3 – Recently Examined Traffic Controllers</w:t>
       </w:r>
     </w:p>
@@ -9823,7 +9620,7 @@
                     </pic:cNvPicPr>
                   </pic:nvPicPr>
                   <pic:blipFill>
-                    <a:blip r:embed="rId29">
+                    <a:blip r:embed="rId30">
                       <a:extLst>
                         <a:ext uri="{28A0092B-C50C-407E-A947-70E740481C1C}">
                           <a14:useLocalDpi xmlns:a14="http://schemas.microsoft.com/office/drawing/2010/main" val="0"/>
@@ -9864,55 +9661,45 @@
       <w:r>
         <w:t xml:space="preserve">Figure </w:t>
       </w:r>
-      <w:r>
-        <w:fldChar w:fldCharType="begin"/>
-      </w:r>
-      <w:r>
-        <w:instrText xml:space="preserve"> SEQ Figure \* ARABIC </w:instrText>
-      </w:r>
-      <w:r>
-        <w:fldChar w:fldCharType="separate"/>
-      </w:r>
+      <w:fldSimple w:instr=" SEQ Figure \* ARABIC ">
+        <w:r>
+          <w:rPr>
+            <w:noProof/>
+          </w:rPr>
+          <w:t>24</w:t>
+        </w:r>
+      </w:fldSimple>
+      <w:r>
+        <w:t xml:space="preserve"> Recently examined traffic controllers</w:t>
+      </w:r>
+    </w:p>
+    <w:p>
+      <w:r>
+        <w:tab/>
+      </w:r>
+      <w:r>
+        <w:t>This query is used to obtain personal data from traffic controllers, and the date of their last medical or professional examination. This will merge this table with the core employee table and return a cleaned sorted list with the most recent examination date at the top. This enables administrators to easily keep track of compliance and determine when the controllers are due for renewal.</w:t>
+      </w:r>
+    </w:p>
+    <w:p/>
+    <w:p>
+      <w:pPr>
+        <w:pStyle w:val="Heading3"/>
+      </w:pPr>
+      <w:r>
+        <w:lastRenderedPageBreak/>
+        <w:t>Query 4 – Aircraft safety check</w:t>
+      </w:r>
+    </w:p>
+    <w:p>
+      <w:pPr>
+        <w:keepNext/>
+        <w:jc w:val="center"/>
+      </w:pPr>
       <w:r>
         <w:rPr>
           <w:noProof/>
         </w:rPr>
-        <w:t>23</w:t>
-      </w:r>
-      <w:r>
-        <w:fldChar w:fldCharType="end"/>
-      </w:r>
-      <w:r>
-        <w:t xml:space="preserve"> Recently examined traffic controllers</w:t>
-      </w:r>
-    </w:p>
-    <w:p>
-      <w:r>
-        <w:tab/>
-      </w:r>
-      <w:r>
-        <w:t xml:space="preserve">This query is used to obtain personal data from traffic controllers, and the date of their last medical or professional examination. This will merge this table with the core employee table and return a cleaned sorted list with the most recent examination date at the top. This enables </w:t>
-      </w:r>
-      <w:r>
-        <w:lastRenderedPageBreak/>
-        <w:t>administrators to easily keep track of compliance and determine when the controllers are due for renewal.</w:t>
-      </w:r>
-    </w:p>
-    <w:p/>
-    <w:p>
-      <w:pPr>
-        <w:pStyle w:val="Heading3"/>
-      </w:pPr>
-      <w:r>
-        <w:t>Query 4 – Aircraft safety check</w:t>
-      </w:r>
-    </w:p>
-    <w:p>
-      <w:pPr>
-        <w:keepNext/>
-        <w:jc w:val="center"/>
-      </w:pPr>
-      <w:r>
         <w:drawing>
           <wp:inline distT="0" distB="0" distL="0" distR="0" wp14:anchorId="10FF37FB" wp14:editId="5E46C6B2">
             <wp:extent cx="4400979" cy="3067050"/>
@@ -9929,7 +9716,7 @@
                     <pic:cNvPicPr/>
                   </pic:nvPicPr>
                   <pic:blipFill>
-                    <a:blip r:embed="rId30"/>
+                    <a:blip r:embed="rId31"/>
                     <a:stretch>
                       <a:fillRect/>
                     </a:stretch>
@@ -9962,34 +9749,27 @@
       <w:r>
         <w:t xml:space="preserve">Figure </w:t>
       </w:r>
-      <w:r>
-        <w:fldChar w:fldCharType="begin"/>
-      </w:r>
-      <w:r>
-        <w:instrText xml:space="preserve"> SEQ Figure \* ARABIC </w:instrText>
-      </w:r>
-      <w:r>
-        <w:fldChar w:fldCharType="separate"/>
-      </w:r>
+      <w:fldSimple w:instr=" SEQ Figure \* ARABIC ">
+        <w:r>
+          <w:rPr>
+            <w:noProof/>
+          </w:rPr>
+          <w:t>25</w:t>
+        </w:r>
+      </w:fldSimple>
+      <w:r>
+        <w:t xml:space="preserve"> Airplane safety check query</w:t>
+      </w:r>
+    </w:p>
+    <w:p>
+      <w:pPr>
+        <w:keepNext/>
+        <w:jc w:val="center"/>
+      </w:pPr>
       <w:r>
         <w:rPr>
           <w:noProof/>
         </w:rPr>
-        <w:t>24</w:t>
-      </w:r>
-      <w:r>
-        <w:fldChar w:fldCharType="end"/>
-      </w:r>
-      <w:r>
-        <w:t xml:space="preserve"> Airplane safety check query</w:t>
-      </w:r>
-    </w:p>
-    <w:p>
-      <w:pPr>
-        <w:keepNext/>
-        <w:jc w:val="center"/>
-      </w:pPr>
-      <w:r>
         <w:drawing>
           <wp:inline distT="0" distB="0" distL="0" distR="0" wp14:anchorId="3780A9D2" wp14:editId="7BAD3CDA">
             <wp:extent cx="4491990" cy="1706092"/>
@@ -10006,7 +9786,7 @@
                     <pic:cNvPicPr/>
                   </pic:nvPicPr>
                   <pic:blipFill>
-                    <a:blip r:embed="rId31"/>
+                    <a:blip r:embed="rId32"/>
                     <a:stretch>
                       <a:fillRect/>
                     </a:stretch>
@@ -10039,24 +9819,14 @@
       <w:r>
         <w:t xml:space="preserve">Figure </w:t>
       </w:r>
-      <w:r>
-        <w:fldChar w:fldCharType="begin"/>
-      </w:r>
-      <w:r>
-        <w:instrText xml:space="preserve"> SEQ Figure \* ARABIC </w:instrText>
-      </w:r>
-      <w:r>
-        <w:fldChar w:fldCharType="separate"/>
-      </w:r>
-      <w:r>
-        <w:rPr>
-          <w:noProof/>
-        </w:rPr>
-        <w:t>25</w:t>
-      </w:r>
-      <w:r>
-        <w:fldChar w:fldCharType="end"/>
-      </w:r>
+      <w:fldSimple w:instr=" SEQ Figure \* ARABIC ">
+        <w:r>
+          <w:rPr>
+            <w:noProof/>
+          </w:rPr>
+          <w:t>26</w:t>
+        </w:r>
+      </w:fldSimple>
       <w:r>
         <w:t xml:space="preserve"> Aircraft safety check results</w:t>
       </w:r>
@@ -10066,18 +9836,15 @@
         <w:tab/>
       </w:r>
       <w:r>
-        <w:t xml:space="preserve">This query will compare the latest test score of an aircraft to the average test score for all previous tests conducted by that aircraft. This uses one set of nested subqueries to select the most recent date of the test for each registration number, and another to obtain the baseline average </w:t>
-      </w:r>
+        <w:t>This query will compare the latest test score of an aircraft to the average test score for all previous tests conducted by that aircraft. This uses one set of nested subqueries to select the most recent date of the test for each registration number, and another to obtain the baseline average score. Conditional logic then automatically applies a "Pass" rating to the aircraft if the score remains within the historical ratings, or a "Review Required" rating if the score falls outside of the historical ratings.</w:t>
+      </w:r>
+    </w:p>
+    <w:p>
+      <w:pPr>
+        <w:pStyle w:val="Heading3"/>
+      </w:pPr>
       <w:r>
         <w:lastRenderedPageBreak/>
-        <w:t>score. Conditional logic then automatically applies a "Pass" rating to the aircraft if the score remains within the historical ratings, or a "Review Required" rating if the score falls outside of the historical ratings.</w:t>
-      </w:r>
-    </w:p>
-    <w:p>
-      <w:pPr>
-        <w:pStyle w:val="Heading3"/>
-      </w:pPr>
-      <w:r>
         <w:t>Query 5 – Technician Expertise summary</w:t>
       </w:r>
     </w:p>
@@ -10108,7 +9875,7 @@
                     </pic:cNvPicPr>
                   </pic:nvPicPr>
                   <pic:blipFill>
-                    <a:blip r:embed="rId32">
+                    <a:blip r:embed="rId33">
                       <a:extLst>
                         <a:ext uri="{28A0092B-C50C-407E-A947-70E740481C1C}">
                           <a14:useLocalDpi xmlns:a14="http://schemas.microsoft.com/office/drawing/2010/main" val="0"/>
@@ -10149,26 +9916,24 @@
       <w:r>
         <w:t xml:space="preserve">Figure </w:t>
       </w:r>
-      <w:r>
-        <w:fldChar w:fldCharType="begin"/>
-      </w:r>
-      <w:r>
-        <w:instrText xml:space="preserve"> SEQ Figure \* ARABIC </w:instrText>
-      </w:r>
-      <w:r>
-        <w:fldChar w:fldCharType="separate"/>
-      </w:r>
-      <w:r>
-        <w:rPr>
-          <w:noProof/>
-        </w:rPr>
-        <w:t>26</w:t>
-      </w:r>
-      <w:r>
-        <w:fldChar w:fldCharType="end"/>
-      </w:r>
-      <w:r>
-        <w:t xml:space="preserve"> Technician Experties Summary</w:t>
+      <w:fldSimple w:instr=" SEQ Figure \* ARABIC ">
+        <w:r>
+          <w:rPr>
+            <w:noProof/>
+          </w:rPr>
+          <w:t>27</w:t>
+        </w:r>
+      </w:fldSimple>
+      <w:r>
+        <w:t xml:space="preserve"> Technician </w:t>
+      </w:r>
+      <w:proofErr w:type="spellStart"/>
+      <w:r>
+        <w:t>Experties</w:t>
+      </w:r>
+      <w:proofErr w:type="spellEnd"/>
+      <w:r>
+        <w:t xml:space="preserve"> Summary</w:t>
       </w:r>
     </w:p>
     <w:p>
@@ -10176,17 +9941,7 @@
         <w:tab/>
       </w:r>
       <w:r>
-        <w:t xml:space="preserve">This query </w:t>
-      </w:r>
-      <w:r>
-        <w:t>relates</w:t>
-      </w:r>
-      <w:r>
-        <w:t xml:space="preserve"> to a specific type of aircraft that they can work on and also a specific type of expertise, like engine or avionics. Linking employee records via technician expertise tables </w:t>
-      </w:r>
-      <w:r>
-        <w:lastRenderedPageBreak/>
-        <w:t>to produce a comprehensive list of employees' technical skills. By listing them in order of model number and technician name it is much easier to assign an appropriate technician to a maintenance issue.</w:t>
+        <w:t>This query relates to a specific type of aircraft that they can work on and also a specific type of expertise, like engine or avionics. Linking employee records via technician expertise tables to produce a comprehensive list of employees' technical skills. By listing them in order of model number and technician name it is much easier to assign an appropriate technician to a maintenance issue.</w:t>
       </w:r>
     </w:p>
     <w:sectPr>
@@ -12667,6 +12422,7 @@
   <w:style w:type="character" w:default="1" w:styleId="DefaultParagraphFont">
     <w:name w:val="Default Paragraph Font"/>
     <w:uiPriority w:val="1"/>
+    <w:semiHidden/>
     <w:unhideWhenUsed/>
   </w:style>
   <w:style w:type="table" w:default="1" w:styleId="TableNormal">

</xml_diff>

<commit_message>
Recording done Final preparation for airport ready
</commit_message>
<xml_diff>
--- a/2. Airport Database System/40841063_HLUM HTET AUNG Part 2 - Database/40841063_Part 2 Database Report.docx
+++ b/2. Airport Database System/40841063_HLUM HTET AUNG Part 2 - Database/40841063_Part 2 Database Report.docx
@@ -4383,14 +4383,27 @@
       <w:r>
         <w:t xml:space="preserve">Figure </w:t>
       </w:r>
-      <w:fldSimple w:instr=" SEQ Figure \* ARABIC ">
-        <w:r>
-          <w:rPr>
-            <w:noProof/>
-          </w:rPr>
-          <w:t>1</w:t>
-        </w:r>
-      </w:fldSimple>
+      <w:r>
+        <w:fldChar w:fldCharType="begin"/>
+      </w:r>
+      <w:r>
+        <w:instrText xml:space="preserve"> SEQ Figure \* ARABIC </w:instrText>
+      </w:r>
+      <w:r>
+        <w:fldChar w:fldCharType="separate"/>
+      </w:r>
+      <w:r>
+        <w:rPr>
+          <w:noProof/>
+        </w:rPr>
+        <w:t>1</w:t>
+      </w:r>
+      <w:r>
+        <w:rPr>
+          <w:noProof/>
+        </w:rPr>
+        <w:fldChar w:fldCharType="end"/>
+      </w:r>
       <w:r>
         <w:t xml:space="preserve"> Union Table separated</w:t>
       </w:r>
@@ -4436,23 +4449,7 @@
           <w:b/>
           <w:bCs/>
         </w:rPr>
-        <w:t xml:space="preserve">Hourly rates can be seen </w:t>
-      </w:r>
-      <w:proofErr w:type="gramStart"/>
-      <w:r>
-        <w:rPr>
-          <w:b/>
-          <w:bCs/>
-        </w:rPr>
-        <w:t>in</w:t>
-      </w:r>
-      <w:proofErr w:type="gramEnd"/>
-      <w:r>
-        <w:rPr>
-          <w:b/>
-          <w:bCs/>
-        </w:rPr>
-        <w:t xml:space="preserve"> both technicians and traffic controllers.</w:t>
+        <w:t>Hourly rates can be seen in both technicians and traffic controllers.</w:t>
       </w:r>
     </w:p>
     <w:p>
@@ -4602,15 +4599,7 @@
         <w:t xml:space="preserve">(Test events 1: *-------1:1 Airworthy test model) – </w:t>
       </w:r>
       <w:r>
-        <w:t xml:space="preserve">one to many relations where </w:t>
-      </w:r>
-      <w:proofErr w:type="gramStart"/>
-      <w:r>
-        <w:t>a</w:t>
-      </w:r>
-      <w:proofErr w:type="gramEnd"/>
-      <w:r>
-        <w:t xml:space="preserve"> airworthiness test template can be used across many test events. However, each test event is used in exactly one test model.</w:t>
+        <w:t>one to many relations where a airworthiness test template can be used across many test events. However, each test event is used in exactly one test model.</w:t>
       </w:r>
     </w:p>
     <w:p>
@@ -5971,14 +5960,27 @@
       <w:r>
         <w:t xml:space="preserve">Table </w:t>
       </w:r>
-      <w:fldSimple w:instr=" SEQ Table \* ARABIC ">
-        <w:r>
-          <w:rPr>
-            <w:noProof/>
-          </w:rPr>
-          <w:t>1</w:t>
-        </w:r>
-      </w:fldSimple>
+      <w:r>
+        <w:fldChar w:fldCharType="begin"/>
+      </w:r>
+      <w:r>
+        <w:instrText xml:space="preserve"> SEQ Table \* ARABIC </w:instrText>
+      </w:r>
+      <w:r>
+        <w:fldChar w:fldCharType="separate"/>
+      </w:r>
+      <w:r>
+        <w:rPr>
+          <w:noProof/>
+        </w:rPr>
+        <w:t>1</w:t>
+      </w:r>
+      <w:r>
+        <w:rPr>
+          <w:noProof/>
+        </w:rPr>
+        <w:fldChar w:fldCharType="end"/>
+      </w:r>
       <w:r>
         <w:t xml:space="preserve"> Query Test Plan Table</w:t>
       </w:r>
@@ -6267,14 +6269,27 @@
       <w:r>
         <w:t xml:space="preserve">Table </w:t>
       </w:r>
-      <w:fldSimple w:instr=" SEQ Table \* ARABIC ">
-        <w:r>
-          <w:rPr>
-            <w:noProof/>
-          </w:rPr>
-          <w:t>2</w:t>
-        </w:r>
-      </w:fldSimple>
+      <w:r>
+        <w:fldChar w:fldCharType="begin"/>
+      </w:r>
+      <w:r>
+        <w:instrText xml:space="preserve"> SEQ Table \* ARABIC </w:instrText>
+      </w:r>
+      <w:r>
+        <w:fldChar w:fldCharType="separate"/>
+      </w:r>
+      <w:r>
+        <w:rPr>
+          <w:noProof/>
+        </w:rPr>
+        <w:t>2</w:t>
+      </w:r>
+      <w:r>
+        <w:rPr>
+          <w:noProof/>
+        </w:rPr>
+        <w:fldChar w:fldCharType="end"/>
+      </w:r>
       <w:r>
         <w:t xml:space="preserve"> Expected Results for Query 1</w:t>
       </w:r>
@@ -6467,14 +6482,27 @@
       <w:r>
         <w:t xml:space="preserve">Table </w:t>
       </w:r>
-      <w:fldSimple w:instr=" SEQ Table \* ARABIC ">
-        <w:r>
-          <w:rPr>
-            <w:noProof/>
-          </w:rPr>
-          <w:t>3</w:t>
-        </w:r>
-      </w:fldSimple>
+      <w:r>
+        <w:fldChar w:fldCharType="begin"/>
+      </w:r>
+      <w:r>
+        <w:instrText xml:space="preserve"> SEQ Table \* ARABIC </w:instrText>
+      </w:r>
+      <w:r>
+        <w:fldChar w:fldCharType="separate"/>
+      </w:r>
+      <w:r>
+        <w:rPr>
+          <w:noProof/>
+        </w:rPr>
+        <w:t>3</w:t>
+      </w:r>
+      <w:r>
+        <w:rPr>
+          <w:noProof/>
+        </w:rPr>
+        <w:fldChar w:fldCharType="end"/>
+      </w:r>
       <w:r>
         <w:t xml:space="preserve"> Expected Results for Query 2</w:t>
       </w:r>
@@ -6573,14 +6601,27 @@
       <w:r>
         <w:t xml:space="preserve">Table </w:t>
       </w:r>
-      <w:fldSimple w:instr=" SEQ Table \* ARABIC ">
-        <w:r>
-          <w:rPr>
-            <w:noProof/>
-          </w:rPr>
-          <w:t>4</w:t>
-        </w:r>
-      </w:fldSimple>
+      <w:r>
+        <w:fldChar w:fldCharType="begin"/>
+      </w:r>
+      <w:r>
+        <w:instrText xml:space="preserve"> SEQ Table \* ARABIC </w:instrText>
+      </w:r>
+      <w:r>
+        <w:fldChar w:fldCharType="separate"/>
+      </w:r>
+      <w:r>
+        <w:rPr>
+          <w:noProof/>
+        </w:rPr>
+        <w:t>4</w:t>
+      </w:r>
+      <w:r>
+        <w:rPr>
+          <w:noProof/>
+        </w:rPr>
+        <w:fldChar w:fldCharType="end"/>
+      </w:r>
       <w:r>
         <w:t xml:space="preserve"> Expected Results for Query 3</w:t>
       </w:r>
@@ -6805,14 +6846,27 @@
       <w:r>
         <w:t xml:space="preserve">Table </w:t>
       </w:r>
-      <w:fldSimple w:instr=" SEQ Table \* ARABIC ">
-        <w:r>
-          <w:rPr>
-            <w:noProof/>
-          </w:rPr>
-          <w:t>5</w:t>
-        </w:r>
-      </w:fldSimple>
+      <w:r>
+        <w:fldChar w:fldCharType="begin"/>
+      </w:r>
+      <w:r>
+        <w:instrText xml:space="preserve"> SEQ Table \* ARABIC </w:instrText>
+      </w:r>
+      <w:r>
+        <w:fldChar w:fldCharType="separate"/>
+      </w:r>
+      <w:r>
+        <w:rPr>
+          <w:noProof/>
+        </w:rPr>
+        <w:t>5</w:t>
+      </w:r>
+      <w:r>
+        <w:rPr>
+          <w:noProof/>
+        </w:rPr>
+        <w:fldChar w:fldCharType="end"/>
+      </w:r>
       <w:r>
         <w:t xml:space="preserve"> Expected Results for Query 4</w:t>
       </w:r>
@@ -7019,14 +7073,27 @@
       <w:r>
         <w:t xml:space="preserve">Table </w:t>
       </w:r>
-      <w:fldSimple w:instr=" SEQ Table \* ARABIC ">
-        <w:r>
-          <w:rPr>
-            <w:noProof/>
-          </w:rPr>
-          <w:t>6</w:t>
-        </w:r>
-      </w:fldSimple>
+      <w:r>
+        <w:fldChar w:fldCharType="begin"/>
+      </w:r>
+      <w:r>
+        <w:instrText xml:space="preserve"> SEQ Table \* ARABIC </w:instrText>
+      </w:r>
+      <w:r>
+        <w:fldChar w:fldCharType="separate"/>
+      </w:r>
+      <w:r>
+        <w:rPr>
+          <w:noProof/>
+        </w:rPr>
+        <w:t>6</w:t>
+      </w:r>
+      <w:r>
+        <w:rPr>
+          <w:noProof/>
+        </w:rPr>
+        <w:fldChar w:fldCharType="end"/>
+      </w:r>
       <w:r>
         <w:t xml:space="preserve"> Expected Results for Query 5</w:t>
       </w:r>
@@ -7926,14 +7993,27 @@
       <w:r>
         <w:t xml:space="preserve">Figure </w:t>
       </w:r>
-      <w:fldSimple w:instr=" SEQ Figure \* ARABIC ">
-        <w:r>
-          <w:rPr>
-            <w:noProof/>
-          </w:rPr>
-          <w:t>2</w:t>
-        </w:r>
-      </w:fldSimple>
+      <w:r>
+        <w:fldChar w:fldCharType="begin"/>
+      </w:r>
+      <w:r>
+        <w:instrText xml:space="preserve"> SEQ Figure \* ARABIC </w:instrText>
+      </w:r>
+      <w:r>
+        <w:fldChar w:fldCharType="separate"/>
+      </w:r>
+      <w:r>
+        <w:rPr>
+          <w:noProof/>
+        </w:rPr>
+        <w:t>2</w:t>
+      </w:r>
+      <w:r>
+        <w:rPr>
+          <w:noProof/>
+        </w:rPr>
+        <w:fldChar w:fldCharType="end"/>
+      </w:r>
       <w:r>
         <w:t xml:space="preserve"> Updated Airport Database ERD</w:t>
       </w:r>
@@ -8422,14 +8502,27 @@
       <w:r>
         <w:t xml:space="preserve">Table </w:t>
       </w:r>
-      <w:fldSimple w:instr=" SEQ Table \* ARABIC ">
-        <w:r>
-          <w:rPr>
-            <w:noProof/>
-          </w:rPr>
-          <w:t>7</w:t>
-        </w:r>
-      </w:fldSimple>
+      <w:r>
+        <w:fldChar w:fldCharType="begin"/>
+      </w:r>
+      <w:r>
+        <w:instrText xml:space="preserve"> SEQ Table \* ARABIC </w:instrText>
+      </w:r>
+      <w:r>
+        <w:fldChar w:fldCharType="separate"/>
+      </w:r>
+      <w:r>
+        <w:rPr>
+          <w:noProof/>
+        </w:rPr>
+        <w:t>7</w:t>
+      </w:r>
+      <w:r>
+        <w:rPr>
+          <w:noProof/>
+        </w:rPr>
+        <w:fldChar w:fldCharType="end"/>
+      </w:r>
       <w:r>
         <w:t xml:space="preserve"> Relational Schema Table</w:t>
       </w:r>
@@ -8832,14 +8925,27 @@
       <w:r>
         <w:t xml:space="preserve">Figure </w:t>
       </w:r>
-      <w:fldSimple w:instr=" SEQ Figure \* ARABIC ">
-        <w:r>
-          <w:rPr>
-            <w:noProof/>
-          </w:rPr>
-          <w:t>3</w:t>
-        </w:r>
-      </w:fldSimple>
+      <w:r>
+        <w:fldChar w:fldCharType="begin"/>
+      </w:r>
+      <w:r>
+        <w:instrText xml:space="preserve"> SEQ Figure \* ARABIC </w:instrText>
+      </w:r>
+      <w:r>
+        <w:fldChar w:fldCharType="separate"/>
+      </w:r>
+      <w:r>
+        <w:rPr>
+          <w:noProof/>
+        </w:rPr>
+        <w:t>3</w:t>
+      </w:r>
+      <w:r>
+        <w:rPr>
+          <w:noProof/>
+        </w:rPr>
+        <w:fldChar w:fldCharType="end"/>
+      </w:r>
       <w:r>
         <w:t xml:space="preserve"> </w:t>
       </w:r>
@@ -8929,14 +9035,27 @@
       <w:r>
         <w:t xml:space="preserve">Figure </w:t>
       </w:r>
-      <w:fldSimple w:instr=" SEQ Figure \* ARABIC ">
-        <w:r>
-          <w:rPr>
-            <w:noProof/>
-          </w:rPr>
-          <w:t>4</w:t>
-        </w:r>
-      </w:fldSimple>
+      <w:r>
+        <w:fldChar w:fldCharType="begin"/>
+      </w:r>
+      <w:r>
+        <w:instrText xml:space="preserve"> SEQ Figure \* ARABIC </w:instrText>
+      </w:r>
+      <w:r>
+        <w:fldChar w:fldCharType="separate"/>
+      </w:r>
+      <w:r>
+        <w:rPr>
+          <w:noProof/>
+        </w:rPr>
+        <w:t>4</w:t>
+      </w:r>
+      <w:r>
+        <w:rPr>
+          <w:noProof/>
+        </w:rPr>
+        <w:fldChar w:fldCharType="end"/>
+      </w:r>
       <w:r>
         <w:t xml:space="preserve"> Employee Table</w:t>
       </w:r>
@@ -9020,14 +9139,27 @@
       <w:r>
         <w:t xml:space="preserve">Figure </w:t>
       </w:r>
-      <w:fldSimple w:instr=" SEQ Figure \* ARABIC ">
-        <w:r>
-          <w:rPr>
-            <w:noProof/>
-          </w:rPr>
-          <w:t>5</w:t>
-        </w:r>
-      </w:fldSimple>
+      <w:r>
+        <w:fldChar w:fldCharType="begin"/>
+      </w:r>
+      <w:r>
+        <w:instrText xml:space="preserve"> SEQ Figure \* ARABIC </w:instrText>
+      </w:r>
+      <w:r>
+        <w:fldChar w:fldCharType="separate"/>
+      </w:r>
+      <w:r>
+        <w:rPr>
+          <w:noProof/>
+        </w:rPr>
+        <w:t>5</w:t>
+      </w:r>
+      <w:r>
+        <w:rPr>
+          <w:noProof/>
+        </w:rPr>
+        <w:fldChar w:fldCharType="end"/>
+      </w:r>
       <w:r>
         <w:t xml:space="preserve"> Airplane model table</w:t>
       </w:r>
@@ -9111,14 +9243,27 @@
       <w:r>
         <w:t xml:space="preserve">Figure </w:t>
       </w:r>
-      <w:fldSimple w:instr=" SEQ Figure \* ARABIC ">
-        <w:r>
-          <w:rPr>
-            <w:noProof/>
-          </w:rPr>
-          <w:t>6</w:t>
-        </w:r>
-      </w:fldSimple>
+      <w:r>
+        <w:fldChar w:fldCharType="begin"/>
+      </w:r>
+      <w:r>
+        <w:instrText xml:space="preserve"> SEQ Figure \* ARABIC </w:instrText>
+      </w:r>
+      <w:r>
+        <w:fldChar w:fldCharType="separate"/>
+      </w:r>
+      <w:r>
+        <w:rPr>
+          <w:noProof/>
+        </w:rPr>
+        <w:t>6</w:t>
+      </w:r>
+      <w:r>
+        <w:rPr>
+          <w:noProof/>
+        </w:rPr>
+        <w:fldChar w:fldCharType="end"/>
+      </w:r>
       <w:r>
         <w:t xml:space="preserve"> Airplane Table</w:t>
       </w:r>
@@ -9202,14 +9347,27 @@
       <w:r>
         <w:t xml:space="preserve">Figure </w:t>
       </w:r>
-      <w:fldSimple w:instr=" SEQ Figure \* ARABIC ">
-        <w:r>
-          <w:rPr>
-            <w:noProof/>
-          </w:rPr>
-          <w:t>7</w:t>
-        </w:r>
-      </w:fldSimple>
+      <w:r>
+        <w:fldChar w:fldCharType="begin"/>
+      </w:r>
+      <w:r>
+        <w:instrText xml:space="preserve"> SEQ Figure \* ARABIC </w:instrText>
+      </w:r>
+      <w:r>
+        <w:fldChar w:fldCharType="separate"/>
+      </w:r>
+      <w:r>
+        <w:rPr>
+          <w:noProof/>
+        </w:rPr>
+        <w:t>7</w:t>
+      </w:r>
+      <w:r>
+        <w:rPr>
+          <w:noProof/>
+        </w:rPr>
+        <w:fldChar w:fldCharType="end"/>
+      </w:r>
       <w:r>
         <w:t xml:space="preserve"> Technician Table</w:t>
       </w:r>
@@ -9293,14 +9451,27 @@
       <w:r>
         <w:t xml:space="preserve">Figure </w:t>
       </w:r>
-      <w:fldSimple w:instr=" SEQ Figure \* ARABIC ">
-        <w:r>
-          <w:rPr>
-            <w:noProof/>
-          </w:rPr>
-          <w:t>8</w:t>
-        </w:r>
-      </w:fldSimple>
+      <w:r>
+        <w:fldChar w:fldCharType="begin"/>
+      </w:r>
+      <w:r>
+        <w:instrText xml:space="preserve"> SEQ Figure \* ARABIC </w:instrText>
+      </w:r>
+      <w:r>
+        <w:fldChar w:fldCharType="separate"/>
+      </w:r>
+      <w:r>
+        <w:rPr>
+          <w:noProof/>
+        </w:rPr>
+        <w:t>8</w:t>
+      </w:r>
+      <w:r>
+        <w:rPr>
+          <w:noProof/>
+        </w:rPr>
+        <w:fldChar w:fldCharType="end"/>
+      </w:r>
       <w:r>
         <w:t xml:space="preserve"> Traffic controller</w:t>
       </w:r>
@@ -9384,14 +9555,27 @@
       <w:r>
         <w:t xml:space="preserve">Figure </w:t>
       </w:r>
-      <w:fldSimple w:instr=" SEQ Figure \* ARABIC ">
-        <w:r>
-          <w:rPr>
-            <w:noProof/>
-          </w:rPr>
-          <w:t>9</w:t>
-        </w:r>
-      </w:fldSimple>
+      <w:r>
+        <w:fldChar w:fldCharType="begin"/>
+      </w:r>
+      <w:r>
+        <w:instrText xml:space="preserve"> SEQ Figure \* ARABIC </w:instrText>
+      </w:r>
+      <w:r>
+        <w:fldChar w:fldCharType="separate"/>
+      </w:r>
+      <w:r>
+        <w:rPr>
+          <w:noProof/>
+        </w:rPr>
+        <w:t>9</w:t>
+      </w:r>
+      <w:r>
+        <w:rPr>
+          <w:noProof/>
+        </w:rPr>
+        <w:fldChar w:fldCharType="end"/>
+      </w:r>
       <w:r>
         <w:t xml:space="preserve"> Technician expertise table</w:t>
       </w:r>
@@ -9475,14 +9659,27 @@
       <w:r>
         <w:t xml:space="preserve">Figure </w:t>
       </w:r>
-      <w:fldSimple w:instr=" SEQ Figure \* ARABIC ">
-        <w:r>
-          <w:rPr>
-            <w:noProof/>
-          </w:rPr>
-          <w:t>10</w:t>
-        </w:r>
-      </w:fldSimple>
+      <w:r>
+        <w:fldChar w:fldCharType="begin"/>
+      </w:r>
+      <w:r>
+        <w:instrText xml:space="preserve"> SEQ Figure \* ARABIC </w:instrText>
+      </w:r>
+      <w:r>
+        <w:fldChar w:fldCharType="separate"/>
+      </w:r>
+      <w:r>
+        <w:rPr>
+          <w:noProof/>
+        </w:rPr>
+        <w:t>10</w:t>
+      </w:r>
+      <w:r>
+        <w:rPr>
+          <w:noProof/>
+        </w:rPr>
+        <w:fldChar w:fldCharType="end"/>
+      </w:r>
       <w:r>
         <w:t xml:space="preserve"> Airworthiness test model table</w:t>
       </w:r>
@@ -9566,14 +9763,27 @@
       <w:r>
         <w:t xml:space="preserve">Figure </w:t>
       </w:r>
-      <w:fldSimple w:instr=" SEQ Figure \* ARABIC ">
-        <w:r>
-          <w:rPr>
-            <w:noProof/>
-          </w:rPr>
-          <w:t>11</w:t>
-        </w:r>
-      </w:fldSimple>
+      <w:r>
+        <w:fldChar w:fldCharType="begin"/>
+      </w:r>
+      <w:r>
+        <w:instrText xml:space="preserve"> SEQ Figure \* ARABIC </w:instrText>
+      </w:r>
+      <w:r>
+        <w:fldChar w:fldCharType="separate"/>
+      </w:r>
+      <w:r>
+        <w:rPr>
+          <w:noProof/>
+        </w:rPr>
+        <w:t>11</w:t>
+      </w:r>
+      <w:r>
+        <w:rPr>
+          <w:noProof/>
+        </w:rPr>
+        <w:fldChar w:fldCharType="end"/>
+      </w:r>
       <w:r>
         <w:t xml:space="preserve"> Test events table</w:t>
       </w:r>
@@ -9669,14 +9879,27 @@
       <w:r>
         <w:t xml:space="preserve">Figure </w:t>
       </w:r>
-      <w:fldSimple w:instr=" SEQ Figure \* ARABIC ">
-        <w:r>
-          <w:rPr>
-            <w:noProof/>
-          </w:rPr>
-          <w:t>12</w:t>
-        </w:r>
-      </w:fldSimple>
+      <w:r>
+        <w:fldChar w:fldCharType="begin"/>
+      </w:r>
+      <w:r>
+        <w:instrText xml:space="preserve"> SEQ Figure \* ARABIC </w:instrText>
+      </w:r>
+      <w:r>
+        <w:fldChar w:fldCharType="separate"/>
+      </w:r>
+      <w:r>
+        <w:rPr>
+          <w:noProof/>
+        </w:rPr>
+        <w:t>12</w:t>
+      </w:r>
+      <w:r>
+        <w:rPr>
+          <w:noProof/>
+        </w:rPr>
+        <w:fldChar w:fldCharType="end"/>
+      </w:r>
       <w:r>
         <w:t xml:space="preserve"> Union Table Data insertion</w:t>
       </w:r>
@@ -9750,14 +9973,27 @@
       <w:r>
         <w:t xml:space="preserve">Figure </w:t>
       </w:r>
-      <w:fldSimple w:instr=" SEQ Figure \* ARABIC ">
-        <w:r>
-          <w:rPr>
-            <w:noProof/>
-          </w:rPr>
-          <w:t>13</w:t>
-        </w:r>
-      </w:fldSimple>
+      <w:r>
+        <w:fldChar w:fldCharType="begin"/>
+      </w:r>
+      <w:r>
+        <w:instrText xml:space="preserve"> SEQ Figure \* ARABIC </w:instrText>
+      </w:r>
+      <w:r>
+        <w:fldChar w:fldCharType="separate"/>
+      </w:r>
+      <w:r>
+        <w:rPr>
+          <w:noProof/>
+        </w:rPr>
+        <w:t>13</w:t>
+      </w:r>
+      <w:r>
+        <w:rPr>
+          <w:noProof/>
+        </w:rPr>
+        <w:fldChar w:fldCharType="end"/>
+      </w:r>
       <w:r>
         <w:t xml:space="preserve"> Employee Table Data Insertion</w:t>
       </w:r>
@@ -9831,14 +10067,27 @@
       <w:r>
         <w:t xml:space="preserve">Figure </w:t>
       </w:r>
-      <w:fldSimple w:instr=" SEQ Figure \* ARABIC ">
-        <w:r>
-          <w:rPr>
-            <w:noProof/>
-          </w:rPr>
-          <w:t>14</w:t>
-        </w:r>
-      </w:fldSimple>
+      <w:r>
+        <w:fldChar w:fldCharType="begin"/>
+      </w:r>
+      <w:r>
+        <w:instrText xml:space="preserve"> SEQ Figure \* ARABIC </w:instrText>
+      </w:r>
+      <w:r>
+        <w:fldChar w:fldCharType="separate"/>
+      </w:r>
+      <w:r>
+        <w:rPr>
+          <w:noProof/>
+        </w:rPr>
+        <w:t>14</w:t>
+      </w:r>
+      <w:r>
+        <w:rPr>
+          <w:noProof/>
+        </w:rPr>
+        <w:fldChar w:fldCharType="end"/>
+      </w:r>
       <w:r>
         <w:t xml:space="preserve"> Airplane Model Data Insertion</w:t>
       </w:r>
@@ -9912,14 +10161,27 @@
       <w:r>
         <w:t xml:space="preserve">Figure </w:t>
       </w:r>
-      <w:fldSimple w:instr=" SEQ Figure \* ARABIC ">
-        <w:r>
-          <w:rPr>
-            <w:noProof/>
-          </w:rPr>
-          <w:t>15</w:t>
-        </w:r>
-      </w:fldSimple>
+      <w:r>
+        <w:fldChar w:fldCharType="begin"/>
+      </w:r>
+      <w:r>
+        <w:instrText xml:space="preserve"> SEQ Figure \* ARABIC </w:instrText>
+      </w:r>
+      <w:r>
+        <w:fldChar w:fldCharType="separate"/>
+      </w:r>
+      <w:r>
+        <w:rPr>
+          <w:noProof/>
+        </w:rPr>
+        <w:t>15</w:t>
+      </w:r>
+      <w:r>
+        <w:rPr>
+          <w:noProof/>
+        </w:rPr>
+        <w:fldChar w:fldCharType="end"/>
+      </w:r>
       <w:r>
         <w:t xml:space="preserve"> Airplane Data Insertion</w:t>
       </w:r>
@@ -9993,14 +10255,27 @@
       <w:r>
         <w:t xml:space="preserve">Figure </w:t>
       </w:r>
-      <w:fldSimple w:instr=" SEQ Figure \* ARABIC ">
-        <w:r>
-          <w:rPr>
-            <w:noProof/>
-          </w:rPr>
-          <w:t>16</w:t>
-        </w:r>
-      </w:fldSimple>
+      <w:r>
+        <w:fldChar w:fldCharType="begin"/>
+      </w:r>
+      <w:r>
+        <w:instrText xml:space="preserve"> SEQ Figure \* ARABIC </w:instrText>
+      </w:r>
+      <w:r>
+        <w:fldChar w:fldCharType="separate"/>
+      </w:r>
+      <w:r>
+        <w:rPr>
+          <w:noProof/>
+        </w:rPr>
+        <w:t>16</w:t>
+      </w:r>
+      <w:r>
+        <w:rPr>
+          <w:noProof/>
+        </w:rPr>
+        <w:fldChar w:fldCharType="end"/>
+      </w:r>
       <w:r>
         <w:t xml:space="preserve"> Technicians Data Insertion</w:t>
       </w:r>
@@ -10074,14 +10349,27 @@
       <w:r>
         <w:t xml:space="preserve">Figure </w:t>
       </w:r>
-      <w:fldSimple w:instr=" SEQ Figure \* ARABIC ">
-        <w:r>
-          <w:rPr>
-            <w:noProof/>
-          </w:rPr>
-          <w:t>17</w:t>
-        </w:r>
-      </w:fldSimple>
+      <w:r>
+        <w:fldChar w:fldCharType="begin"/>
+      </w:r>
+      <w:r>
+        <w:instrText xml:space="preserve"> SEQ Figure \* ARABIC </w:instrText>
+      </w:r>
+      <w:r>
+        <w:fldChar w:fldCharType="separate"/>
+      </w:r>
+      <w:r>
+        <w:rPr>
+          <w:noProof/>
+        </w:rPr>
+        <w:t>17</w:t>
+      </w:r>
+      <w:r>
+        <w:rPr>
+          <w:noProof/>
+        </w:rPr>
+        <w:fldChar w:fldCharType="end"/>
+      </w:r>
       <w:r>
         <w:t xml:space="preserve"> Traffic Controller Data Insertion</w:t>
       </w:r>
@@ -10155,14 +10443,27 @@
       <w:r>
         <w:t xml:space="preserve">Figure </w:t>
       </w:r>
-      <w:fldSimple w:instr=" SEQ Figure \* ARABIC ">
-        <w:r>
-          <w:rPr>
-            <w:noProof/>
-          </w:rPr>
-          <w:t>18</w:t>
-        </w:r>
-      </w:fldSimple>
+      <w:r>
+        <w:fldChar w:fldCharType="begin"/>
+      </w:r>
+      <w:r>
+        <w:instrText xml:space="preserve"> SEQ Figure \* ARABIC </w:instrText>
+      </w:r>
+      <w:r>
+        <w:fldChar w:fldCharType="separate"/>
+      </w:r>
+      <w:r>
+        <w:rPr>
+          <w:noProof/>
+        </w:rPr>
+        <w:t>18</w:t>
+      </w:r>
+      <w:r>
+        <w:rPr>
+          <w:noProof/>
+        </w:rPr>
+        <w:fldChar w:fldCharType="end"/>
+      </w:r>
       <w:r>
         <w:t xml:space="preserve"> Technician expertise Data Insertion</w:t>
       </w:r>
@@ -10236,14 +10537,27 @@
       <w:r>
         <w:t xml:space="preserve">Figure </w:t>
       </w:r>
-      <w:fldSimple w:instr=" SEQ Figure \* ARABIC ">
-        <w:r>
-          <w:rPr>
-            <w:noProof/>
-          </w:rPr>
-          <w:t>19</w:t>
-        </w:r>
-      </w:fldSimple>
+      <w:r>
+        <w:fldChar w:fldCharType="begin"/>
+      </w:r>
+      <w:r>
+        <w:instrText xml:space="preserve"> SEQ Figure \* ARABIC </w:instrText>
+      </w:r>
+      <w:r>
+        <w:fldChar w:fldCharType="separate"/>
+      </w:r>
+      <w:r>
+        <w:rPr>
+          <w:noProof/>
+        </w:rPr>
+        <w:t>19</w:t>
+      </w:r>
+      <w:r>
+        <w:rPr>
+          <w:noProof/>
+        </w:rPr>
+        <w:fldChar w:fldCharType="end"/>
+      </w:r>
       <w:r>
         <w:t xml:space="preserve"> Airworthiness Tests Data Insertion</w:t>
       </w:r>
@@ -10327,14 +10641,27 @@
       <w:r>
         <w:t xml:space="preserve">Figure </w:t>
       </w:r>
-      <w:fldSimple w:instr=" SEQ Figure \* ARABIC ">
-        <w:r>
-          <w:rPr>
-            <w:noProof/>
-          </w:rPr>
-          <w:t>20</w:t>
-        </w:r>
-      </w:fldSimple>
+      <w:r>
+        <w:fldChar w:fldCharType="begin"/>
+      </w:r>
+      <w:r>
+        <w:instrText xml:space="preserve"> SEQ Figure \* ARABIC </w:instrText>
+      </w:r>
+      <w:r>
+        <w:fldChar w:fldCharType="separate"/>
+      </w:r>
+      <w:r>
+        <w:rPr>
+          <w:noProof/>
+        </w:rPr>
+        <w:t>20</w:t>
+      </w:r>
+      <w:r>
+        <w:rPr>
+          <w:noProof/>
+        </w:rPr>
+        <w:fldChar w:fldCharType="end"/>
+      </w:r>
       <w:r>
         <w:t xml:space="preserve"> Test event data insertion</w:t>
       </w:r>
@@ -10399,14 +10726,27 @@
       <w:r>
         <w:t xml:space="preserve">Figure </w:t>
       </w:r>
-      <w:fldSimple w:instr=" SEQ Figure \* ARABIC ">
-        <w:r>
-          <w:rPr>
-            <w:noProof/>
-          </w:rPr>
-          <w:t>21</w:t>
-        </w:r>
-      </w:fldSimple>
+      <w:r>
+        <w:fldChar w:fldCharType="begin"/>
+      </w:r>
+      <w:r>
+        <w:instrText xml:space="preserve"> SEQ Figure \* ARABIC </w:instrText>
+      </w:r>
+      <w:r>
+        <w:fldChar w:fldCharType="separate"/>
+      </w:r>
+      <w:r>
+        <w:rPr>
+          <w:noProof/>
+        </w:rPr>
+        <w:t>21</w:t>
+      </w:r>
+      <w:r>
+        <w:rPr>
+          <w:noProof/>
+        </w:rPr>
+        <w:fldChar w:fldCharType="end"/>
+      </w:r>
       <w:r>
         <w:t xml:space="preserve"> Inserting more rows in Test events for screenshot</w:t>
       </w:r>
@@ -10507,14 +10847,27 @@
       <w:r>
         <w:t xml:space="preserve">Figure </w:t>
       </w:r>
-      <w:fldSimple w:instr=" SEQ Figure \* ARABIC ">
-        <w:r>
-          <w:rPr>
-            <w:noProof/>
-          </w:rPr>
-          <w:t>22</w:t>
-        </w:r>
-      </w:fldSimple>
+      <w:r>
+        <w:fldChar w:fldCharType="begin"/>
+      </w:r>
+      <w:r>
+        <w:instrText xml:space="preserve"> SEQ Figure \* ARABIC </w:instrText>
+      </w:r>
+      <w:r>
+        <w:fldChar w:fldCharType="separate"/>
+      </w:r>
+      <w:r>
+        <w:rPr>
+          <w:noProof/>
+        </w:rPr>
+        <w:t>22</w:t>
+      </w:r>
+      <w:r>
+        <w:rPr>
+          <w:noProof/>
+        </w:rPr>
+        <w:fldChar w:fldCharType="end"/>
+      </w:r>
       <w:r>
         <w:t xml:space="preserve"> Airplane Test Performance Summary</w:t>
       </w:r>
@@ -10596,14 +10949,27 @@
       <w:r>
         <w:t xml:space="preserve">Figure </w:t>
       </w:r>
-      <w:fldSimple w:instr=" SEQ Figure \* ARABIC ">
-        <w:r>
-          <w:rPr>
-            <w:noProof/>
-          </w:rPr>
-          <w:t>23</w:t>
-        </w:r>
-      </w:fldSimple>
+      <w:r>
+        <w:fldChar w:fldCharType="begin"/>
+      </w:r>
+      <w:r>
+        <w:instrText xml:space="preserve"> SEQ Figure \* ARABIC </w:instrText>
+      </w:r>
+      <w:r>
+        <w:fldChar w:fldCharType="separate"/>
+      </w:r>
+      <w:r>
+        <w:rPr>
+          <w:noProof/>
+        </w:rPr>
+        <w:t>23</w:t>
+      </w:r>
+      <w:r>
+        <w:rPr>
+          <w:noProof/>
+        </w:rPr>
+        <w:fldChar w:fldCharType="end"/>
+      </w:r>
       <w:r>
         <w:t xml:space="preserve"> Employee Annual Performance Query</w:t>
       </w:r>
@@ -10708,14 +11074,27 @@
       <w:r>
         <w:t xml:space="preserve">Figure </w:t>
       </w:r>
-      <w:fldSimple w:instr=" SEQ Figure \* ARABIC ">
-        <w:r>
-          <w:rPr>
-            <w:noProof/>
-          </w:rPr>
-          <w:t>24</w:t>
-        </w:r>
-      </w:fldSimple>
+      <w:r>
+        <w:fldChar w:fldCharType="begin"/>
+      </w:r>
+      <w:r>
+        <w:instrText xml:space="preserve"> SEQ Figure \* ARABIC </w:instrText>
+      </w:r>
+      <w:r>
+        <w:fldChar w:fldCharType="separate"/>
+      </w:r>
+      <w:r>
+        <w:rPr>
+          <w:noProof/>
+        </w:rPr>
+        <w:t>24</w:t>
+      </w:r>
+      <w:r>
+        <w:rPr>
+          <w:noProof/>
+        </w:rPr>
+        <w:fldChar w:fldCharType="end"/>
+      </w:r>
       <w:r>
         <w:t xml:space="preserve"> Recently examined traffic controllers</w:t>
       </w:r>
@@ -10798,14 +11177,27 @@
       <w:r>
         <w:t xml:space="preserve">Figure </w:t>
       </w:r>
-      <w:fldSimple w:instr=" SEQ Figure \* ARABIC ">
-        <w:r>
-          <w:rPr>
-            <w:noProof/>
-          </w:rPr>
-          <w:t>25</w:t>
-        </w:r>
-      </w:fldSimple>
+      <w:r>
+        <w:fldChar w:fldCharType="begin"/>
+      </w:r>
+      <w:r>
+        <w:instrText xml:space="preserve"> SEQ Figure \* ARABIC </w:instrText>
+      </w:r>
+      <w:r>
+        <w:fldChar w:fldCharType="separate"/>
+      </w:r>
+      <w:r>
+        <w:rPr>
+          <w:noProof/>
+        </w:rPr>
+        <w:t>25</w:t>
+      </w:r>
+      <w:r>
+        <w:rPr>
+          <w:noProof/>
+        </w:rPr>
+        <w:fldChar w:fldCharType="end"/>
+      </w:r>
       <w:r>
         <w:t xml:space="preserve"> Airplane safety check query</w:t>
       </w:r>
@@ -10868,14 +11260,27 @@
       <w:r>
         <w:t xml:space="preserve">Figure </w:t>
       </w:r>
-      <w:fldSimple w:instr=" SEQ Figure \* ARABIC ">
-        <w:r>
-          <w:rPr>
-            <w:noProof/>
-          </w:rPr>
-          <w:t>26</w:t>
-        </w:r>
-      </w:fldSimple>
+      <w:r>
+        <w:fldChar w:fldCharType="begin"/>
+      </w:r>
+      <w:r>
+        <w:instrText xml:space="preserve"> SEQ Figure \* ARABIC </w:instrText>
+      </w:r>
+      <w:r>
+        <w:fldChar w:fldCharType="separate"/>
+      </w:r>
+      <w:r>
+        <w:rPr>
+          <w:noProof/>
+        </w:rPr>
+        <w:t>26</w:t>
+      </w:r>
+      <w:r>
+        <w:rPr>
+          <w:noProof/>
+        </w:rPr>
+        <w:fldChar w:fldCharType="end"/>
+      </w:r>
       <w:r>
         <w:t xml:space="preserve"> Aircraft safety check results</w:t>
       </w:r>
@@ -10967,14 +11372,27 @@
       <w:r>
         <w:t xml:space="preserve">Figure </w:t>
       </w:r>
-      <w:fldSimple w:instr=" SEQ Figure \* ARABIC ">
-        <w:r>
-          <w:rPr>
-            <w:noProof/>
-          </w:rPr>
-          <w:t>27</w:t>
-        </w:r>
-      </w:fldSimple>
+      <w:r>
+        <w:fldChar w:fldCharType="begin"/>
+      </w:r>
+      <w:r>
+        <w:instrText xml:space="preserve"> SEQ Figure \* ARABIC </w:instrText>
+      </w:r>
+      <w:r>
+        <w:fldChar w:fldCharType="separate"/>
+      </w:r>
+      <w:r>
+        <w:rPr>
+          <w:noProof/>
+        </w:rPr>
+        <w:t>27</w:t>
+      </w:r>
+      <w:r>
+        <w:rPr>
+          <w:noProof/>
+        </w:rPr>
+        <w:fldChar w:fldCharType="end"/>
+      </w:r>
       <w:r>
         <w:t xml:space="preserve"> Technician </w:t>
       </w:r>
@@ -11295,14 +11713,27 @@
       <w:r>
         <w:t xml:space="preserve">Table </w:t>
       </w:r>
-      <w:fldSimple w:instr=" SEQ Table \* ARABIC ">
-        <w:r>
-          <w:rPr>
-            <w:noProof/>
-          </w:rPr>
-          <w:t>8</w:t>
-        </w:r>
-      </w:fldSimple>
+      <w:r>
+        <w:fldChar w:fldCharType="begin"/>
+      </w:r>
+      <w:r>
+        <w:instrText xml:space="preserve"> SEQ Table \* ARABIC </w:instrText>
+      </w:r>
+      <w:r>
+        <w:fldChar w:fldCharType="separate"/>
+      </w:r>
+      <w:r>
+        <w:rPr>
+          <w:noProof/>
+        </w:rPr>
+        <w:t>8</w:t>
+      </w:r>
+      <w:r>
+        <w:rPr>
+          <w:noProof/>
+        </w:rPr>
+        <w:fldChar w:fldCharType="end"/>
+      </w:r>
       <w:r>
         <w:t xml:space="preserve"> Query 1 Test Plan</w:t>
       </w:r>
@@ -11360,14 +11791,27 @@
       <w:r>
         <w:t xml:space="preserve">Table </w:t>
       </w:r>
-      <w:fldSimple w:instr=" SEQ Table \* ARABIC ">
-        <w:r>
-          <w:rPr>
-            <w:noProof/>
-          </w:rPr>
-          <w:t>9</w:t>
-        </w:r>
-      </w:fldSimple>
+      <w:r>
+        <w:fldChar w:fldCharType="begin"/>
+      </w:r>
+      <w:r>
+        <w:instrText xml:space="preserve"> SEQ Table \* ARABIC </w:instrText>
+      </w:r>
+      <w:r>
+        <w:fldChar w:fldCharType="separate"/>
+      </w:r>
+      <w:r>
+        <w:rPr>
+          <w:noProof/>
+        </w:rPr>
+        <w:t>9</w:t>
+      </w:r>
+      <w:r>
+        <w:rPr>
+          <w:noProof/>
+        </w:rPr>
+        <w:fldChar w:fldCharType="end"/>
+      </w:r>
       <w:r>
         <w:t xml:space="preserve"> Query 1 Actual Results</w:t>
       </w:r>
@@ -11562,14 +12006,27 @@
       <w:r>
         <w:t xml:space="preserve">Table </w:t>
       </w:r>
-      <w:fldSimple w:instr=" SEQ Table \* ARABIC ">
-        <w:r>
-          <w:rPr>
-            <w:noProof/>
-          </w:rPr>
-          <w:t>10</w:t>
-        </w:r>
-      </w:fldSimple>
+      <w:r>
+        <w:fldChar w:fldCharType="begin"/>
+      </w:r>
+      <w:r>
+        <w:instrText xml:space="preserve"> SEQ Table \* ARABIC </w:instrText>
+      </w:r>
+      <w:r>
+        <w:fldChar w:fldCharType="separate"/>
+      </w:r>
+      <w:r>
+        <w:rPr>
+          <w:noProof/>
+        </w:rPr>
+        <w:t>10</w:t>
+      </w:r>
+      <w:r>
+        <w:rPr>
+          <w:noProof/>
+        </w:rPr>
+        <w:fldChar w:fldCharType="end"/>
+      </w:r>
       <w:r>
         <w:t xml:space="preserve"> Query 2 Test Plan</w:t>
       </w:r>
@@ -11628,14 +12085,27 @@
       <w:r>
         <w:t xml:space="preserve">Table </w:t>
       </w:r>
-      <w:fldSimple w:instr=" SEQ Table \* ARABIC ">
-        <w:r>
-          <w:rPr>
-            <w:noProof/>
-          </w:rPr>
-          <w:t>11</w:t>
-        </w:r>
-      </w:fldSimple>
+      <w:r>
+        <w:fldChar w:fldCharType="begin"/>
+      </w:r>
+      <w:r>
+        <w:instrText xml:space="preserve"> SEQ Table \* ARABIC </w:instrText>
+      </w:r>
+      <w:r>
+        <w:fldChar w:fldCharType="separate"/>
+      </w:r>
+      <w:r>
+        <w:rPr>
+          <w:noProof/>
+        </w:rPr>
+        <w:t>11</w:t>
+      </w:r>
+      <w:r>
+        <w:rPr>
+          <w:noProof/>
+        </w:rPr>
+        <w:fldChar w:fldCharType="end"/>
+      </w:r>
       <w:r>
         <w:t xml:space="preserve"> Query 2 Actual Results</w:t>
       </w:r>
@@ -11736,14 +12206,27 @@
       <w:r>
         <w:t xml:space="preserve">Table </w:t>
       </w:r>
-      <w:fldSimple w:instr=" SEQ Table \* ARABIC ">
-        <w:r>
-          <w:rPr>
-            <w:noProof/>
-          </w:rPr>
-          <w:t>12</w:t>
-        </w:r>
-      </w:fldSimple>
+      <w:r>
+        <w:fldChar w:fldCharType="begin"/>
+      </w:r>
+      <w:r>
+        <w:instrText xml:space="preserve"> SEQ Table \* ARABIC </w:instrText>
+      </w:r>
+      <w:r>
+        <w:fldChar w:fldCharType="separate"/>
+      </w:r>
+      <w:r>
+        <w:rPr>
+          <w:noProof/>
+        </w:rPr>
+        <w:t>12</w:t>
+      </w:r>
+      <w:r>
+        <w:rPr>
+          <w:noProof/>
+        </w:rPr>
+        <w:fldChar w:fldCharType="end"/>
+      </w:r>
       <w:r>
         <w:t xml:space="preserve"> Query 3 Test Plan</w:t>
       </w:r>
@@ -11802,14 +12285,27 @@
       <w:r>
         <w:t xml:space="preserve">Table </w:t>
       </w:r>
-      <w:fldSimple w:instr=" SEQ Table \* ARABIC ">
-        <w:r>
-          <w:rPr>
-            <w:noProof/>
-          </w:rPr>
-          <w:t>13</w:t>
-        </w:r>
-      </w:fldSimple>
+      <w:r>
+        <w:fldChar w:fldCharType="begin"/>
+      </w:r>
+      <w:r>
+        <w:instrText xml:space="preserve"> SEQ Table \* ARABIC </w:instrText>
+      </w:r>
+      <w:r>
+        <w:fldChar w:fldCharType="separate"/>
+      </w:r>
+      <w:r>
+        <w:rPr>
+          <w:noProof/>
+        </w:rPr>
+        <w:t>13</w:t>
+      </w:r>
+      <w:r>
+        <w:rPr>
+          <w:noProof/>
+        </w:rPr>
+        <w:fldChar w:fldCharType="end"/>
+      </w:r>
       <w:r>
         <w:t xml:space="preserve"> Query 3 Actual Results</w:t>
       </w:r>
@@ -12035,14 +12531,27 @@
       <w:r>
         <w:t xml:space="preserve">Table </w:t>
       </w:r>
-      <w:fldSimple w:instr=" SEQ Table \* ARABIC ">
-        <w:r>
-          <w:rPr>
-            <w:noProof/>
-          </w:rPr>
-          <w:t>14</w:t>
-        </w:r>
-      </w:fldSimple>
+      <w:r>
+        <w:fldChar w:fldCharType="begin"/>
+      </w:r>
+      <w:r>
+        <w:instrText xml:space="preserve"> SEQ Table \* ARABIC </w:instrText>
+      </w:r>
+      <w:r>
+        <w:fldChar w:fldCharType="separate"/>
+      </w:r>
+      <w:r>
+        <w:rPr>
+          <w:noProof/>
+        </w:rPr>
+        <w:t>14</w:t>
+      </w:r>
+      <w:r>
+        <w:rPr>
+          <w:noProof/>
+        </w:rPr>
+        <w:fldChar w:fldCharType="end"/>
+      </w:r>
       <w:r>
         <w:t xml:space="preserve"> Query 4 Test Plan</w:t>
       </w:r>
@@ -12106,14 +12615,27 @@
       <w:r>
         <w:t xml:space="preserve">Table </w:t>
       </w:r>
-      <w:fldSimple w:instr=" SEQ Table \* ARABIC ">
-        <w:r>
-          <w:rPr>
-            <w:noProof/>
-          </w:rPr>
-          <w:t>15</w:t>
-        </w:r>
-      </w:fldSimple>
+      <w:r>
+        <w:fldChar w:fldCharType="begin"/>
+      </w:r>
+      <w:r>
+        <w:instrText xml:space="preserve"> SEQ Table \* ARABIC </w:instrText>
+      </w:r>
+      <w:r>
+        <w:fldChar w:fldCharType="separate"/>
+      </w:r>
+      <w:r>
+        <w:rPr>
+          <w:noProof/>
+        </w:rPr>
+        <w:t>15</w:t>
+      </w:r>
+      <w:r>
+        <w:rPr>
+          <w:noProof/>
+        </w:rPr>
+        <w:fldChar w:fldCharType="end"/>
+      </w:r>
       <w:r>
         <w:t xml:space="preserve"> Query 4 Actual Results</w:t>
       </w:r>
@@ -12322,14 +12844,27 @@
       <w:r>
         <w:t xml:space="preserve">Table </w:t>
       </w:r>
-      <w:fldSimple w:instr=" SEQ Table \* ARABIC ">
-        <w:r>
-          <w:rPr>
-            <w:noProof/>
-          </w:rPr>
-          <w:t>16</w:t>
-        </w:r>
-      </w:fldSimple>
+      <w:r>
+        <w:fldChar w:fldCharType="begin"/>
+      </w:r>
+      <w:r>
+        <w:instrText xml:space="preserve"> SEQ Table \* ARABIC </w:instrText>
+      </w:r>
+      <w:r>
+        <w:fldChar w:fldCharType="separate"/>
+      </w:r>
+      <w:r>
+        <w:rPr>
+          <w:noProof/>
+        </w:rPr>
+        <w:t>16</w:t>
+      </w:r>
+      <w:r>
+        <w:rPr>
+          <w:noProof/>
+        </w:rPr>
+        <w:fldChar w:fldCharType="end"/>
+      </w:r>
       <w:r>
         <w:t xml:space="preserve"> Query 5 Test Plan</w:t>
       </w:r>
@@ -12387,14 +12922,27 @@
       <w:r>
         <w:t xml:space="preserve">Table </w:t>
       </w:r>
-      <w:fldSimple w:instr=" SEQ Table \* ARABIC ">
-        <w:r>
-          <w:rPr>
-            <w:noProof/>
-          </w:rPr>
-          <w:t>17</w:t>
-        </w:r>
-      </w:fldSimple>
+      <w:r>
+        <w:fldChar w:fldCharType="begin"/>
+      </w:r>
+      <w:r>
+        <w:instrText xml:space="preserve"> SEQ Table \* ARABIC </w:instrText>
+      </w:r>
+      <w:r>
+        <w:fldChar w:fldCharType="separate"/>
+      </w:r>
+      <w:r>
+        <w:rPr>
+          <w:noProof/>
+        </w:rPr>
+        <w:t>17</w:t>
+      </w:r>
+      <w:r>
+        <w:rPr>
+          <w:noProof/>
+        </w:rPr>
+        <w:fldChar w:fldCharType="end"/>
+      </w:r>
       <w:r>
         <w:t xml:space="preserve"> Query 5 Actual Results</w:t>
       </w:r>
@@ -12492,14 +13040,27 @@
       <w:r>
         <w:t xml:space="preserve">Figure </w:t>
       </w:r>
-      <w:fldSimple w:instr=" SEQ Figure \* ARABIC ">
-        <w:r>
-          <w:rPr>
-            <w:noProof/>
-          </w:rPr>
-          <w:t>28</w:t>
-        </w:r>
-      </w:fldSimple>
+      <w:r>
+        <w:fldChar w:fldCharType="begin"/>
+      </w:r>
+      <w:r>
+        <w:instrText xml:space="preserve"> SEQ Figure \* ARABIC </w:instrText>
+      </w:r>
+      <w:r>
+        <w:fldChar w:fldCharType="separate"/>
+      </w:r>
+      <w:r>
+        <w:rPr>
+          <w:noProof/>
+        </w:rPr>
+        <w:t>28</w:t>
+      </w:r>
+      <w:r>
+        <w:rPr>
+          <w:noProof/>
+        </w:rPr>
+        <w:fldChar w:fldCharType="end"/>
+      </w:r>
       <w:r>
         <w:t xml:space="preserve"> Name Length Constraints</w:t>
       </w:r>
@@ -12570,14 +13131,27 @@
       <w:r>
         <w:t xml:space="preserve">Figure </w:t>
       </w:r>
-      <w:fldSimple w:instr=" SEQ Figure \* ARABIC ">
-        <w:r>
-          <w:rPr>
-            <w:noProof/>
-          </w:rPr>
-          <w:t>29</w:t>
-        </w:r>
-      </w:fldSimple>
+      <w:r>
+        <w:fldChar w:fldCharType="begin"/>
+      </w:r>
+      <w:r>
+        <w:instrText xml:space="preserve"> SEQ Figure \* ARABIC </w:instrText>
+      </w:r>
+      <w:r>
+        <w:fldChar w:fldCharType="separate"/>
+      </w:r>
+      <w:r>
+        <w:rPr>
+          <w:noProof/>
+        </w:rPr>
+        <w:t>29</w:t>
+      </w:r>
+      <w:r>
+        <w:rPr>
+          <w:noProof/>
+        </w:rPr>
+        <w:fldChar w:fldCharType="end"/>
+      </w:r>
       <w:r>
         <w:t xml:space="preserve"> Union name length</w:t>
       </w:r>
@@ -12706,14 +13280,27 @@
       <w:r>
         <w:t xml:space="preserve">Figure </w:t>
       </w:r>
-      <w:fldSimple w:instr=" SEQ Figure \* ARABIC ">
-        <w:r>
-          <w:rPr>
-            <w:noProof/>
-          </w:rPr>
-          <w:t>30</w:t>
-        </w:r>
-      </w:fldSimple>
+      <w:r>
+        <w:fldChar w:fldCharType="begin"/>
+      </w:r>
+      <w:r>
+        <w:instrText xml:space="preserve"> SEQ Figure \* ARABIC </w:instrText>
+      </w:r>
+      <w:r>
+        <w:fldChar w:fldCharType="separate"/>
+      </w:r>
+      <w:r>
+        <w:rPr>
+          <w:noProof/>
+        </w:rPr>
+        <w:t>30</w:t>
+      </w:r>
+      <w:r>
+        <w:rPr>
+          <w:noProof/>
+        </w:rPr>
+        <w:fldChar w:fldCharType="end"/>
+      </w:r>
       <w:r>
         <w:t xml:space="preserve"> Employee and Union Table relation testing</w:t>
       </w:r>
@@ -12725,11 +13312,9 @@
       <w:r>
         <w:t xml:space="preserve">This test checks referential integrity by trying to insert a record into </w:t>
       </w:r>
-      <w:proofErr w:type="gramStart"/>
-      <w:r>
-        <w:t>a EMP</w:t>
-      </w:r>
-      <w:proofErr w:type="gramEnd"/>
+      <w:r>
+        <w:t>an EMP</w:t>
+      </w:r>
       <w:r>
         <w:t xml:space="preserve"> table (EMP031) with an </w:t>
       </w:r>
@@ -12772,6 +13357,228 @@
       <w:r>
         <w:tab/>
         <w:t>By looking at these test results, it is evidence that relation and constraints between the tables are working accordingly. Other constraints such as Primary Key not null values and other constraints will be tested in the demonstration recording.</w:t>
+      </w:r>
+      <w:r>
+        <w:t xml:space="preserve"> To test primary keys the tester will try to insert duplicated key value, and the database will throw an error. For not null attribute values the test will include ‘Null’ for the value and the database will throw an error.</w:t>
+      </w:r>
+    </w:p>
+    <w:p>
+      <w:pPr>
+        <w:spacing w:line="278" w:lineRule="auto"/>
+        <w:jc w:val="left"/>
+      </w:pPr>
+      <w:r>
+        <w:br w:type="page"/>
+      </w:r>
+    </w:p>
+    <w:p>
+      <w:pPr>
+        <w:pStyle w:val="Heading2"/>
+      </w:pPr>
+      <w:r>
+        <w:lastRenderedPageBreak/>
+        <w:t>Additional Feature – Trigger</w:t>
+      </w:r>
+    </w:p>
+    <w:p>
+      <w:r>
+        <w:tab/>
+      </w:r>
+      <w:r>
+        <w:t xml:space="preserve">A trigger was added to the </w:t>
+      </w:r>
+      <w:proofErr w:type="spellStart"/>
+      <w:r>
+        <w:t>Test_events</w:t>
+      </w:r>
+      <w:proofErr w:type="spellEnd"/>
+      <w:r>
+        <w:t xml:space="preserve"> table, that logs any changes to test event information automatically. The trigger will store the name of the table, the record id, the type of action taken, the old value, the new value, the date of the update and the username of the user who changed the record in the </w:t>
+      </w:r>
+      <w:proofErr w:type="spellStart"/>
+      <w:r>
+        <w:t>Update_Log</w:t>
+      </w:r>
+      <w:proofErr w:type="spellEnd"/>
+      <w:r>
+        <w:t xml:space="preserve"> table when updating a record. This will give an audit trail for tracking changes and enhance accountability and reliability of the database.</w:t>
+      </w:r>
+    </w:p>
+    <w:p>
+      <w:pPr>
+        <w:keepNext/>
+        <w:jc w:val="center"/>
+      </w:pPr>
+      <w:r>
+        <w:drawing>
+          <wp:inline distT="0" distB="0" distL="0" distR="0" wp14:anchorId="6D71F517" wp14:editId="0F7A05E1">
+            <wp:extent cx="5943600" cy="2415540"/>
+            <wp:effectExtent l="19050" t="19050" r="19050" b="22860"/>
+            <wp:docPr id="666734795" name="Picture 1"/>
+            <wp:cNvGraphicFramePr>
+              <a:graphicFrameLocks xmlns:a="http://schemas.openxmlformats.org/drawingml/2006/main" noChangeAspect="1"/>
+            </wp:cNvGraphicFramePr>
+            <a:graphic xmlns:a="http://schemas.openxmlformats.org/drawingml/2006/main">
+              <a:graphicData uri="http://schemas.openxmlformats.org/drawingml/2006/picture">
+                <pic:pic xmlns:pic="http://schemas.openxmlformats.org/drawingml/2006/picture">
+                  <pic:nvPicPr>
+                    <pic:cNvPr id="666734795" name=""/>
+                    <pic:cNvPicPr/>
+                  </pic:nvPicPr>
+                  <pic:blipFill>
+                    <a:blip r:embed="rId41"/>
+                    <a:stretch>
+                      <a:fillRect/>
+                    </a:stretch>
+                  </pic:blipFill>
+                  <pic:spPr>
+                    <a:xfrm>
+                      <a:off x="0" y="0"/>
+                      <a:ext cx="5943600" cy="2415540"/>
+                    </a:xfrm>
+                    <a:prstGeom prst="rect">
+                      <a:avLst/>
+                    </a:prstGeom>
+                    <a:ln>
+                      <a:solidFill>
+                        <a:schemeClr val="tx1"/>
+                      </a:solidFill>
+                    </a:ln>
+                  </pic:spPr>
+                </pic:pic>
+              </a:graphicData>
+            </a:graphic>
+          </wp:inline>
+        </w:drawing>
+      </w:r>
+    </w:p>
+    <w:p>
+      <w:pPr>
+        <w:jc w:val="center"/>
+      </w:pPr>
+      <w:r>
+        <w:t xml:space="preserve">Figure </w:t>
+      </w:r>
+      <w:r>
+        <w:fldChar w:fldCharType="begin"/>
+      </w:r>
+      <w:r>
+        <w:instrText xml:space="preserve"> SEQ Figure \* ARABIC </w:instrText>
+      </w:r>
+      <w:r>
+        <w:fldChar w:fldCharType="separate"/>
+      </w:r>
+      <w:r>
+        <w:rPr>
+          <w:noProof/>
+        </w:rPr>
+        <w:t>31</w:t>
+      </w:r>
+      <w:r>
+        <w:fldChar w:fldCharType="end"/>
+      </w:r>
+      <w:r>
+        <w:t xml:space="preserve"> Test events trigger table</w:t>
+      </w:r>
+    </w:p>
+    <w:p>
+      <w:r>
+        <w:tab/>
+        <w:t>The table is not included in the ERD because it has no relation or attributes since its automatically updating table.</w:t>
+      </w:r>
+    </w:p>
+    <w:p>
+      <w:pPr>
+        <w:keepNext/>
+        <w:jc w:val="center"/>
+      </w:pPr>
+      <w:r>
+        <w:lastRenderedPageBreak/>
+        <w:drawing>
+          <wp:inline distT="0" distB="0" distL="0" distR="0" wp14:anchorId="4ED6EEAD" wp14:editId="4F358380">
+            <wp:extent cx="3666374" cy="6480810"/>
+            <wp:effectExtent l="19050" t="19050" r="10795" b="15240"/>
+            <wp:docPr id="559954853" name="Picture 1"/>
+            <wp:cNvGraphicFramePr>
+              <a:graphicFrameLocks xmlns:a="http://schemas.openxmlformats.org/drawingml/2006/main" noChangeAspect="1"/>
+            </wp:cNvGraphicFramePr>
+            <a:graphic xmlns:a="http://schemas.openxmlformats.org/drawingml/2006/main">
+              <a:graphicData uri="http://schemas.openxmlformats.org/drawingml/2006/picture">
+                <pic:pic xmlns:pic="http://schemas.openxmlformats.org/drawingml/2006/picture">
+                  <pic:nvPicPr>
+                    <pic:cNvPr id="559954853" name=""/>
+                    <pic:cNvPicPr/>
+                  </pic:nvPicPr>
+                  <pic:blipFill>
+                    <a:blip r:embed="rId42"/>
+                    <a:stretch>
+                      <a:fillRect/>
+                    </a:stretch>
+                  </pic:blipFill>
+                  <pic:spPr>
+                    <a:xfrm>
+                      <a:off x="0" y="0"/>
+                      <a:ext cx="3668800" cy="6485099"/>
+                    </a:xfrm>
+                    <a:prstGeom prst="rect">
+                      <a:avLst/>
+                    </a:prstGeom>
+                    <a:ln>
+                      <a:solidFill>
+                        <a:schemeClr val="tx1"/>
+                      </a:solidFill>
+                    </a:ln>
+                  </pic:spPr>
+                </pic:pic>
+              </a:graphicData>
+            </a:graphic>
+          </wp:inline>
+        </w:drawing>
+      </w:r>
+    </w:p>
+    <w:p>
+      <w:pPr>
+        <w:jc w:val="center"/>
+      </w:pPr>
+      <w:r>
+        <w:t xml:space="preserve">Figure </w:t>
+      </w:r>
+      <w:r>
+        <w:fldChar w:fldCharType="begin"/>
+      </w:r>
+      <w:r>
+        <w:instrText xml:space="preserve"> SEQ Figure \* ARABIC </w:instrText>
+      </w:r>
+      <w:r>
+        <w:fldChar w:fldCharType="separate"/>
+      </w:r>
+      <w:r>
+        <w:rPr>
+          <w:noProof/>
+        </w:rPr>
+        <w:t>32</w:t>
+      </w:r>
+      <w:r>
+        <w:fldChar w:fldCharType="end"/>
+      </w:r>
+      <w:r>
+        <w:t xml:space="preserve"> Test event trigger</w:t>
+      </w:r>
+    </w:p>
+    <w:p>
+      <w:r>
+        <w:tab/>
+      </w:r>
+      <w:r>
+        <w:t xml:space="preserve">The trigger compares OLD and NEW values before and after an update is made to the database, so that it can maintain a clean history of updates. The CURRENT_USER() function is also used to identify the database account that is used to modify the database. The logged information can be viewed in the </w:t>
+      </w:r>
+      <w:proofErr w:type="spellStart"/>
+      <w:r>
+        <w:t>Update_Log</w:t>
+      </w:r>
+      <w:proofErr w:type="spellEnd"/>
+      <w:r>
+        <w:t xml:space="preserve"> table to help monitor and audit database changes.</w:t>
       </w:r>
     </w:p>
     <w:sectPr>
@@ -15252,7 +16059,6 @@
   <w:style w:type="character" w:default="1" w:styleId="DefaultParagraphFont">
     <w:name w:val="Default Paragraph Font"/>
     <w:uiPriority w:val="1"/>
-    <w:semiHidden/>
     <w:unhideWhenUsed/>
   </w:style>
   <w:style w:type="table" w:default="1" w:styleId="TableNormal">

</xml_diff>